<commit_message>
setting up local environment with node.js and testing it
</commit_message>
<xml_diff>
--- a/JAVASCRIPT NOTES.docx
+++ b/JAVASCRIPT NOTES.docx
@@ -40,7 +40,263 @@
     </w:p>
     <w:p>
       <w:r>
-        <w:t>Video me sabse pehle ye bataya gaya hai ki hume thoda mind ka setup change karna padega. JavaScript ab sirf browser (Google Chrome, Firefox) tak limited nahi hai. Pehle kya hota tha ki hume JS run karne ke liye ek HTML file banani padti thi, fir use browser me kholna padta tha. Par ab hum JS ko apne system (Local Machine) par direct run kar sakte hain, bilkul Python ya C++ ki tarah.</w:t>
+        <w:t xml:space="preserve">Video me </w:t>
+      </w:r>
+      <w:proofErr w:type="spellStart"/>
+      <w:r>
+        <w:t>sabse</w:t>
+      </w:r>
+      <w:proofErr w:type="spellEnd"/>
+      <w:r>
+        <w:t xml:space="preserve"> </w:t>
+      </w:r>
+      <w:proofErr w:type="spellStart"/>
+      <w:r>
+        <w:t>pehle</w:t>
+      </w:r>
+      <w:proofErr w:type="spellEnd"/>
+      <w:r>
+        <w:t xml:space="preserve"> ye </w:t>
+      </w:r>
+      <w:proofErr w:type="spellStart"/>
+      <w:r>
+        <w:t>bataya</w:t>
+      </w:r>
+      <w:proofErr w:type="spellEnd"/>
+      <w:r>
+        <w:t xml:space="preserve"> </w:t>
+      </w:r>
+      <w:proofErr w:type="spellStart"/>
+      <w:r>
+        <w:t>gaya</w:t>
+      </w:r>
+      <w:proofErr w:type="spellEnd"/>
+      <w:r>
+        <w:t xml:space="preserve"> </w:t>
+      </w:r>
+      <w:proofErr w:type="spellStart"/>
+      <w:r>
+        <w:t>hai</w:t>
+      </w:r>
+      <w:proofErr w:type="spellEnd"/>
+      <w:r>
+        <w:t xml:space="preserve"> ki </w:t>
+      </w:r>
+      <w:proofErr w:type="spellStart"/>
+      <w:r>
+        <w:t>hume</w:t>
+      </w:r>
+      <w:proofErr w:type="spellEnd"/>
+      <w:r>
+        <w:t xml:space="preserve"> </w:t>
+      </w:r>
+      <w:proofErr w:type="spellStart"/>
+      <w:r>
+        <w:t>thoda</w:t>
+      </w:r>
+      <w:proofErr w:type="spellEnd"/>
+      <w:r>
+        <w:t xml:space="preserve"> mind ka setup change </w:t>
+      </w:r>
+      <w:proofErr w:type="spellStart"/>
+      <w:r>
+        <w:t>karna</w:t>
+      </w:r>
+      <w:proofErr w:type="spellEnd"/>
+      <w:r>
+        <w:t xml:space="preserve"> </w:t>
+      </w:r>
+      <w:proofErr w:type="spellStart"/>
+      <w:r>
+        <w:t>padega</w:t>
+      </w:r>
+      <w:proofErr w:type="spellEnd"/>
+      <w:r>
+        <w:t xml:space="preserve">. JavaScript ab </w:t>
+      </w:r>
+      <w:proofErr w:type="spellStart"/>
+      <w:r>
+        <w:t>sirf</w:t>
+      </w:r>
+      <w:proofErr w:type="spellEnd"/>
+      <w:r>
+        <w:t xml:space="preserve"> browser (Google Chrome, Firefox) </w:t>
+      </w:r>
+      <w:proofErr w:type="spellStart"/>
+      <w:r>
+        <w:t>tak</w:t>
+      </w:r>
+      <w:proofErr w:type="spellEnd"/>
+      <w:r>
+        <w:t xml:space="preserve"> limited </w:t>
+      </w:r>
+      <w:proofErr w:type="spellStart"/>
+      <w:r>
+        <w:t>nahi</w:t>
+      </w:r>
+      <w:proofErr w:type="spellEnd"/>
+      <w:r>
+        <w:t xml:space="preserve"> </w:t>
+      </w:r>
+      <w:proofErr w:type="spellStart"/>
+      <w:r>
+        <w:t>hai</w:t>
+      </w:r>
+      <w:proofErr w:type="spellEnd"/>
+      <w:r>
+        <w:t xml:space="preserve">. Pehle </w:t>
+      </w:r>
+      <w:proofErr w:type="spellStart"/>
+      <w:r>
+        <w:t>kya</w:t>
+      </w:r>
+      <w:proofErr w:type="spellEnd"/>
+      <w:r>
+        <w:t xml:space="preserve"> </w:t>
+      </w:r>
+      <w:proofErr w:type="spellStart"/>
+      <w:r>
+        <w:t>hota</w:t>
+      </w:r>
+      <w:proofErr w:type="spellEnd"/>
+      <w:r>
+        <w:t xml:space="preserve"> </w:t>
+      </w:r>
+      <w:proofErr w:type="spellStart"/>
+      <w:r>
+        <w:t>tha</w:t>
+      </w:r>
+      <w:proofErr w:type="spellEnd"/>
+      <w:r>
+        <w:t xml:space="preserve"> ki </w:t>
+      </w:r>
+      <w:proofErr w:type="spellStart"/>
+      <w:r>
+        <w:t>hume</w:t>
+      </w:r>
+      <w:proofErr w:type="spellEnd"/>
+      <w:r>
+        <w:t xml:space="preserve"> JS run </w:t>
+      </w:r>
+      <w:proofErr w:type="spellStart"/>
+      <w:r>
+        <w:t>karne</w:t>
+      </w:r>
+      <w:proofErr w:type="spellEnd"/>
+      <w:r>
+        <w:t xml:space="preserve"> </w:t>
+      </w:r>
+      <w:proofErr w:type="spellStart"/>
+      <w:r>
+        <w:t>ke</w:t>
+      </w:r>
+      <w:proofErr w:type="spellEnd"/>
+      <w:r>
+        <w:t xml:space="preserve"> </w:t>
+      </w:r>
+      <w:proofErr w:type="spellStart"/>
+      <w:r>
+        <w:t>liye</w:t>
+      </w:r>
+      <w:proofErr w:type="spellEnd"/>
+      <w:r>
+        <w:t xml:space="preserve"> ek HTML file </w:t>
+      </w:r>
+      <w:proofErr w:type="spellStart"/>
+      <w:r>
+        <w:t>banani</w:t>
+      </w:r>
+      <w:proofErr w:type="spellEnd"/>
+      <w:r>
+        <w:t xml:space="preserve"> </w:t>
+      </w:r>
+      <w:proofErr w:type="spellStart"/>
+      <w:r>
+        <w:t>padti</w:t>
+      </w:r>
+      <w:proofErr w:type="spellEnd"/>
+      <w:r>
+        <w:t xml:space="preserve"> </w:t>
+      </w:r>
+      <w:proofErr w:type="spellStart"/>
+      <w:r>
+        <w:t>thi</w:t>
+      </w:r>
+      <w:proofErr w:type="spellEnd"/>
+      <w:r>
+        <w:t xml:space="preserve">, fir use browser me </w:t>
+      </w:r>
+      <w:proofErr w:type="spellStart"/>
+      <w:r>
+        <w:t>kholna</w:t>
+      </w:r>
+      <w:proofErr w:type="spellEnd"/>
+      <w:r>
+        <w:t xml:space="preserve"> </w:t>
+      </w:r>
+      <w:proofErr w:type="spellStart"/>
+      <w:r>
+        <w:t>padta</w:t>
+      </w:r>
+      <w:proofErr w:type="spellEnd"/>
+      <w:r>
+        <w:t xml:space="preserve"> </w:t>
+      </w:r>
+      <w:proofErr w:type="spellStart"/>
+      <w:r>
+        <w:t>tha</w:t>
+      </w:r>
+      <w:proofErr w:type="spellEnd"/>
+      <w:r>
+        <w:t xml:space="preserve">. Par ab hum JS ko </w:t>
+      </w:r>
+      <w:proofErr w:type="spellStart"/>
+      <w:r>
+        <w:t>apne</w:t>
+      </w:r>
+      <w:proofErr w:type="spellEnd"/>
+      <w:r>
+        <w:t xml:space="preserve"> system (Local Machine) par direct run </w:t>
+      </w:r>
+      <w:proofErr w:type="spellStart"/>
+      <w:r>
+        <w:t>kar</w:t>
+      </w:r>
+      <w:proofErr w:type="spellEnd"/>
+      <w:r>
+        <w:t xml:space="preserve"> </w:t>
+      </w:r>
+      <w:proofErr w:type="spellStart"/>
+      <w:r>
+        <w:t>sakte</w:t>
+      </w:r>
+      <w:proofErr w:type="spellEnd"/>
+      <w:r>
+        <w:t xml:space="preserve"> hain, </w:t>
+      </w:r>
+      <w:proofErr w:type="spellStart"/>
+      <w:r>
+        <w:t>bilkul</w:t>
+      </w:r>
+      <w:proofErr w:type="spellEnd"/>
+      <w:r>
+        <w:t xml:space="preserve"> Python </w:t>
+      </w:r>
+      <w:proofErr w:type="spellStart"/>
+      <w:r>
+        <w:t>ya</w:t>
+      </w:r>
+      <w:proofErr w:type="spellEnd"/>
+      <w:r>
+        <w:t xml:space="preserve"> C++ ki </w:t>
+      </w:r>
+      <w:proofErr w:type="spellStart"/>
+      <w:r>
+        <w:t>tarah</w:t>
+      </w:r>
+      <w:proofErr w:type="spellEnd"/>
+      <w:r>
+        <w:t>.</w:t>
       </w:r>
       <w:r>
         <w:pict w14:anchorId="3AAAF809">
@@ -52,12 +308,100 @@
           <w:b/>
           <w:bCs/>
         </w:rPr>
-        <w:t xml:space="preserve">2. .js File vs .txt File (The Secret) </w:t>
-      </w:r>
-    </w:p>
-    <w:p>
-      <w:r>
-        <w:t>Ye bahut interesting part hai. Hitesh sir ne bataya ki ek simple .txt file aur ek .js file me technical level par koi bahut bada fark nahi hota. Dono me text hi likha hota hai.</w:t>
+        <w:t>2. .</w:t>
+      </w:r>
+      <w:proofErr w:type="spellStart"/>
+      <w:r>
+        <w:rPr>
+          <w:b/>
+          <w:bCs/>
+        </w:rPr>
+        <w:t>js</w:t>
+      </w:r>
+      <w:proofErr w:type="spellEnd"/>
+      <w:r>
+        <w:rPr>
+          <w:b/>
+          <w:bCs/>
+        </w:rPr>
+        <w:t xml:space="preserve"> File vs .txt File (The Secret) </w:t>
+      </w:r>
+    </w:p>
+    <w:p>
+      <w:r>
+        <w:t xml:space="preserve">Ye bahut interesting part </w:t>
+      </w:r>
+      <w:proofErr w:type="spellStart"/>
+      <w:r>
+        <w:t>hai</w:t>
+      </w:r>
+      <w:proofErr w:type="spellEnd"/>
+      <w:r>
+        <w:t xml:space="preserve">. Hitesh sir ne </w:t>
+      </w:r>
+      <w:proofErr w:type="spellStart"/>
+      <w:r>
+        <w:t>bataya</w:t>
+      </w:r>
+      <w:proofErr w:type="spellEnd"/>
+      <w:r>
+        <w:t xml:space="preserve"> ki ek simple .txt file aur ek .</w:t>
+      </w:r>
+      <w:proofErr w:type="spellStart"/>
+      <w:r>
+        <w:t>js</w:t>
+      </w:r>
+      <w:proofErr w:type="spellEnd"/>
+      <w:r>
+        <w:t xml:space="preserve"> file me technical level par koi bahut </w:t>
+      </w:r>
+      <w:proofErr w:type="spellStart"/>
+      <w:r>
+        <w:t>bada</w:t>
+      </w:r>
+      <w:proofErr w:type="spellEnd"/>
+      <w:r>
+        <w:t xml:space="preserve"> fark </w:t>
+      </w:r>
+      <w:proofErr w:type="spellStart"/>
+      <w:r>
+        <w:t>nahi</w:t>
+      </w:r>
+      <w:proofErr w:type="spellEnd"/>
+      <w:r>
+        <w:t xml:space="preserve"> </w:t>
+      </w:r>
+      <w:proofErr w:type="spellStart"/>
+      <w:r>
+        <w:t>hota</w:t>
+      </w:r>
+      <w:proofErr w:type="spellEnd"/>
+      <w:r>
+        <w:t xml:space="preserve">. Dono me text hi </w:t>
+      </w:r>
+      <w:proofErr w:type="spellStart"/>
+      <w:r>
+        <w:t>likha</w:t>
+      </w:r>
+      <w:proofErr w:type="spellEnd"/>
+      <w:r>
+        <w:t xml:space="preserve"> </w:t>
+      </w:r>
+      <w:proofErr w:type="spellStart"/>
+      <w:r>
+        <w:t>hota</w:t>
+      </w:r>
+      <w:proofErr w:type="spellEnd"/>
+      <w:r>
+        <w:t xml:space="preserve"> </w:t>
+      </w:r>
+      <w:proofErr w:type="spellStart"/>
+      <w:r>
+        <w:t>hai</w:t>
+      </w:r>
+      <w:proofErr w:type="spellEnd"/>
+      <w:r>
+        <w:t>.</w:t>
       </w:r>
     </w:p>
     <w:p>
@@ -72,10 +416,50 @@
           <w:b/>
           <w:bCs/>
         </w:rPr>
-        <w:t>Fark kya hai?</w:t>
-      </w:r>
-      <w:r>
-        <w:t xml:space="preserve"> Fark hai </w:t>
+        <w:t xml:space="preserve">Fark </w:t>
+      </w:r>
+      <w:proofErr w:type="spellStart"/>
+      <w:r>
+        <w:rPr>
+          <w:b/>
+          <w:bCs/>
+        </w:rPr>
+        <w:t>kya</w:t>
+      </w:r>
+      <w:proofErr w:type="spellEnd"/>
+      <w:r>
+        <w:rPr>
+          <w:b/>
+          <w:bCs/>
+        </w:rPr>
+        <w:t xml:space="preserve"> </w:t>
+      </w:r>
+      <w:proofErr w:type="spellStart"/>
+      <w:r>
+        <w:rPr>
+          <w:b/>
+          <w:bCs/>
+        </w:rPr>
+        <w:t>hai</w:t>
+      </w:r>
+      <w:proofErr w:type="spellEnd"/>
+      <w:r>
+        <w:rPr>
+          <w:b/>
+          <w:bCs/>
+        </w:rPr>
+        <w:t>?</w:t>
+      </w:r>
+      <w:r>
+        <w:t xml:space="preserve"> Fark </w:t>
+      </w:r>
+      <w:proofErr w:type="spellStart"/>
+      <w:r>
+        <w:t>hai</w:t>
+      </w:r>
+      <w:proofErr w:type="spellEnd"/>
+      <w:r>
+        <w:t xml:space="preserve"> </w:t>
       </w:r>
       <w:r>
         <w:rPr>
@@ -96,7 +480,111 @@
         </w:numPr>
       </w:pPr>
       <w:r>
-        <w:t>Jab hum .js extension dete hain, toh hum computer ko bata rahe hote hain ki is file ke andar ka text "Source Code" hai jise JS ka engine (jaise Node.js) samajh sakta hai.</w:t>
+        <w:t>Jab hum .</w:t>
+      </w:r>
+      <w:proofErr w:type="spellStart"/>
+      <w:r>
+        <w:t>js</w:t>
+      </w:r>
+      <w:proofErr w:type="spellEnd"/>
+      <w:r>
+        <w:t xml:space="preserve"> extension </w:t>
+      </w:r>
+      <w:proofErr w:type="spellStart"/>
+      <w:r>
+        <w:t>dete</w:t>
+      </w:r>
+      <w:proofErr w:type="spellEnd"/>
+      <w:r>
+        <w:t xml:space="preserve"> hain, </w:t>
+      </w:r>
+      <w:proofErr w:type="spellStart"/>
+      <w:r>
+        <w:t>toh</w:t>
+      </w:r>
+      <w:proofErr w:type="spellEnd"/>
+      <w:r>
+        <w:t xml:space="preserve"> hum computer ko bata </w:t>
+      </w:r>
+      <w:proofErr w:type="spellStart"/>
+      <w:r>
+        <w:t>rahe</w:t>
+      </w:r>
+      <w:proofErr w:type="spellEnd"/>
+      <w:r>
+        <w:t xml:space="preserve"> </w:t>
+      </w:r>
+      <w:proofErr w:type="spellStart"/>
+      <w:r>
+        <w:t>hote</w:t>
+      </w:r>
+      <w:proofErr w:type="spellEnd"/>
+      <w:r>
+        <w:t xml:space="preserve"> hain ki is file </w:t>
+      </w:r>
+      <w:proofErr w:type="spellStart"/>
+      <w:r>
+        <w:t>ke</w:t>
+      </w:r>
+      <w:proofErr w:type="spellEnd"/>
+      <w:r>
+        <w:t xml:space="preserve"> </w:t>
+      </w:r>
+      <w:proofErr w:type="spellStart"/>
+      <w:r>
+        <w:t>andar</w:t>
+      </w:r>
+      <w:proofErr w:type="spellEnd"/>
+      <w:r>
+        <w:t xml:space="preserve"> ka text "Source Code" </w:t>
+      </w:r>
+      <w:proofErr w:type="spellStart"/>
+      <w:r>
+        <w:t>hai</w:t>
+      </w:r>
+      <w:proofErr w:type="spellEnd"/>
+      <w:r>
+        <w:t xml:space="preserve"> </w:t>
+      </w:r>
+      <w:proofErr w:type="spellStart"/>
+      <w:r>
+        <w:t>jise</w:t>
+      </w:r>
+      <w:proofErr w:type="spellEnd"/>
+      <w:r>
+        <w:t xml:space="preserve"> JS ka engine (</w:t>
+      </w:r>
+      <w:proofErr w:type="spellStart"/>
+      <w:r>
+        <w:t>jaise</w:t>
+      </w:r>
+      <w:proofErr w:type="spellEnd"/>
+      <w:r>
+        <w:t xml:space="preserve"> Node.js) </w:t>
+      </w:r>
+      <w:proofErr w:type="spellStart"/>
+      <w:r>
+        <w:t>samajh</w:t>
+      </w:r>
+      <w:proofErr w:type="spellEnd"/>
+      <w:r>
+        <w:t xml:space="preserve"> </w:t>
+      </w:r>
+      <w:proofErr w:type="spellStart"/>
+      <w:r>
+        <w:t>sakta</w:t>
+      </w:r>
+      <w:proofErr w:type="spellEnd"/>
+      <w:r>
+        <w:t xml:space="preserve"> </w:t>
+      </w:r>
+      <w:proofErr w:type="spellStart"/>
+      <w:r>
+        <w:t>hai</w:t>
+      </w:r>
+      <w:proofErr w:type="spellEnd"/>
+      <w:r>
+        <w:t>.</w:t>
       </w:r>
     </w:p>
     <w:p>
@@ -107,7 +595,119 @@
         </w:numPr>
       </w:pPr>
       <w:r>
-        <w:t>Agar tum .txt file me console.log("Hello") likhoge aur use Node.js me run karne ki koshish karoge, toh wo confuse ho jayega kyunki usne sirf .js files ko handle karne ka instruction liya hai.</w:t>
+        <w:t xml:space="preserve">Agar tum .txt file me console.log("Hello") </w:t>
+      </w:r>
+      <w:proofErr w:type="spellStart"/>
+      <w:r>
+        <w:t>likhoge</w:t>
+      </w:r>
+      <w:proofErr w:type="spellEnd"/>
+      <w:r>
+        <w:t xml:space="preserve"> aur use Node.js me run </w:t>
+      </w:r>
+      <w:proofErr w:type="spellStart"/>
+      <w:r>
+        <w:t>karne</w:t>
+      </w:r>
+      <w:proofErr w:type="spellEnd"/>
+      <w:r>
+        <w:t xml:space="preserve"> ki </w:t>
+      </w:r>
+      <w:proofErr w:type="spellStart"/>
+      <w:r>
+        <w:t>koshish</w:t>
+      </w:r>
+      <w:proofErr w:type="spellEnd"/>
+      <w:r>
+        <w:t xml:space="preserve"> </w:t>
+      </w:r>
+      <w:proofErr w:type="spellStart"/>
+      <w:r>
+        <w:t>karoge</w:t>
+      </w:r>
+      <w:proofErr w:type="spellEnd"/>
+      <w:r>
+        <w:t xml:space="preserve">, </w:t>
+      </w:r>
+      <w:proofErr w:type="spellStart"/>
+      <w:r>
+        <w:t>toh</w:t>
+      </w:r>
+      <w:proofErr w:type="spellEnd"/>
+      <w:r>
+        <w:t xml:space="preserve"> wo confuse </w:t>
+      </w:r>
+      <w:proofErr w:type="spellStart"/>
+      <w:r>
+        <w:t>ho</w:t>
+      </w:r>
+      <w:proofErr w:type="spellEnd"/>
+      <w:r>
+        <w:t xml:space="preserve"> </w:t>
+      </w:r>
+      <w:proofErr w:type="spellStart"/>
+      <w:r>
+        <w:t>jayega</w:t>
+      </w:r>
+      <w:proofErr w:type="spellEnd"/>
+      <w:r>
+        <w:t xml:space="preserve"> </w:t>
+      </w:r>
+      <w:proofErr w:type="spellStart"/>
+      <w:r>
+        <w:t>kyunki</w:t>
+      </w:r>
+      <w:proofErr w:type="spellEnd"/>
+      <w:r>
+        <w:t xml:space="preserve"> </w:t>
+      </w:r>
+      <w:proofErr w:type="spellStart"/>
+      <w:r>
+        <w:t>usne</w:t>
+      </w:r>
+      <w:proofErr w:type="spellEnd"/>
+      <w:r>
+        <w:t xml:space="preserve"> </w:t>
+      </w:r>
+      <w:proofErr w:type="spellStart"/>
+      <w:r>
+        <w:t>sirf</w:t>
+      </w:r>
+      <w:proofErr w:type="spellEnd"/>
+      <w:r>
+        <w:t xml:space="preserve"> .</w:t>
+      </w:r>
+      <w:proofErr w:type="spellStart"/>
+      <w:r>
+        <w:t>js</w:t>
+      </w:r>
+      <w:proofErr w:type="spellEnd"/>
+      <w:r>
+        <w:t xml:space="preserve"> files ko handle </w:t>
+      </w:r>
+      <w:proofErr w:type="spellStart"/>
+      <w:r>
+        <w:t>karne</w:t>
+      </w:r>
+      <w:proofErr w:type="spellEnd"/>
+      <w:r>
+        <w:t xml:space="preserve"> ka instruction </w:t>
+      </w:r>
+      <w:proofErr w:type="spellStart"/>
+      <w:r>
+        <w:t>liya</w:t>
+      </w:r>
+      <w:proofErr w:type="spellEnd"/>
+      <w:r>
+        <w:t xml:space="preserve"> </w:t>
+      </w:r>
+      <w:proofErr w:type="spellStart"/>
+      <w:r>
+        <w:t>hai</w:t>
+      </w:r>
+      <w:proofErr w:type="spellEnd"/>
+      <w:r>
+        <w:t>.</w:t>
       </w:r>
     </w:p>
     <w:p>
@@ -140,7 +740,87 @@
     </w:p>
     <w:p>
       <w:r>
-        <w:t xml:space="preserve">JS pehle sirf browser ke andar band thi. Fir developers ne browser se wo software (engine) nikala aur use system ke liye banaya, jise hum </w:t>
+        <w:t xml:space="preserve">JS </w:t>
+      </w:r>
+      <w:proofErr w:type="spellStart"/>
+      <w:r>
+        <w:t>pehle</w:t>
+      </w:r>
+      <w:proofErr w:type="spellEnd"/>
+      <w:r>
+        <w:t xml:space="preserve"> </w:t>
+      </w:r>
+      <w:proofErr w:type="spellStart"/>
+      <w:r>
+        <w:t>sirf</w:t>
+      </w:r>
+      <w:proofErr w:type="spellEnd"/>
+      <w:r>
+        <w:t xml:space="preserve"> browser </w:t>
+      </w:r>
+      <w:proofErr w:type="spellStart"/>
+      <w:r>
+        <w:t>ke</w:t>
+      </w:r>
+      <w:proofErr w:type="spellEnd"/>
+      <w:r>
+        <w:t xml:space="preserve"> </w:t>
+      </w:r>
+      <w:proofErr w:type="spellStart"/>
+      <w:r>
+        <w:t>andar</w:t>
+      </w:r>
+      <w:proofErr w:type="spellEnd"/>
+      <w:r>
+        <w:t xml:space="preserve"> band </w:t>
+      </w:r>
+      <w:proofErr w:type="spellStart"/>
+      <w:r>
+        <w:t>thi</w:t>
+      </w:r>
+      <w:proofErr w:type="spellEnd"/>
+      <w:r>
+        <w:t xml:space="preserve">. Fir developers ne browser se wo software (engine) </w:t>
+      </w:r>
+      <w:proofErr w:type="spellStart"/>
+      <w:r>
+        <w:t>nikala</w:t>
+      </w:r>
+      <w:proofErr w:type="spellEnd"/>
+      <w:r>
+        <w:t xml:space="preserve"> aur use system </w:t>
+      </w:r>
+      <w:proofErr w:type="spellStart"/>
+      <w:r>
+        <w:t>ke</w:t>
+      </w:r>
+      <w:proofErr w:type="spellEnd"/>
+      <w:r>
+        <w:t xml:space="preserve"> </w:t>
+      </w:r>
+      <w:proofErr w:type="spellStart"/>
+      <w:r>
+        <w:t>liye</w:t>
+      </w:r>
+      <w:proofErr w:type="spellEnd"/>
+      <w:r>
+        <w:t xml:space="preserve"> </w:t>
+      </w:r>
+      <w:proofErr w:type="spellStart"/>
+      <w:r>
+        <w:t>banaya</w:t>
+      </w:r>
+      <w:proofErr w:type="spellEnd"/>
+      <w:r>
+        <w:t xml:space="preserve">, </w:t>
+      </w:r>
+      <w:proofErr w:type="spellStart"/>
+      <w:r>
+        <w:t>jise</w:t>
+      </w:r>
+      <w:proofErr w:type="spellEnd"/>
+      <w:r>
+        <w:t xml:space="preserve"> hum </w:t>
       </w:r>
       <w:r>
         <w:rPr>
@@ -150,7 +830,15 @@
         <w:t>Node.js</w:t>
       </w:r>
       <w:r>
-        <w:t xml:space="preserve"> kehte hain.</w:t>
+        <w:t xml:space="preserve"> </w:t>
+      </w:r>
+      <w:proofErr w:type="spellStart"/>
+      <w:r>
+        <w:t>kehte</w:t>
+      </w:r>
+      <w:proofErr w:type="spellEnd"/>
+      <w:r>
+        <w:t xml:space="preserve"> hain.</w:t>
       </w:r>
     </w:p>
     <w:p>
@@ -179,7 +867,31 @@
         </w:r>
       </w:hyperlink>
       <w:r>
-        <w:t xml:space="preserve"> se ise download karna hai.</w:t>
+        <w:t xml:space="preserve"> se </w:t>
+      </w:r>
+      <w:proofErr w:type="spellStart"/>
+      <w:r>
+        <w:t>ise</w:t>
+      </w:r>
+      <w:proofErr w:type="spellEnd"/>
+      <w:r>
+        <w:t xml:space="preserve"> download </w:t>
+      </w:r>
+      <w:proofErr w:type="spellStart"/>
+      <w:r>
+        <w:t>karna</w:t>
+      </w:r>
+      <w:proofErr w:type="spellEnd"/>
+      <w:r>
+        <w:t xml:space="preserve"> </w:t>
+      </w:r>
+      <w:proofErr w:type="spellStart"/>
+      <w:r>
+        <w:t>hai</w:t>
+      </w:r>
+      <w:proofErr w:type="spellEnd"/>
+      <w:r>
+        <w:t>.</w:t>
       </w:r>
     </w:p>
     <w:p>
@@ -197,7 +909,111 @@
         <w:t>LTS vs Current:</w:t>
       </w:r>
       <w:r>
-        <w:t xml:space="preserve"> Video me Hitesh sir ne "Current" version install kiya hai kyunki hum seekh rahe hain aur naye features chahiye. Par agar koi bade project (Production) par kaam kar raha hai toh wo "LTS" (Long Term Support) leta hai.</w:t>
+        <w:t xml:space="preserve"> Video me Hitesh sir ne "Current" version install </w:t>
+      </w:r>
+      <w:proofErr w:type="spellStart"/>
+      <w:r>
+        <w:t>kiya</w:t>
+      </w:r>
+      <w:proofErr w:type="spellEnd"/>
+      <w:r>
+        <w:t xml:space="preserve"> </w:t>
+      </w:r>
+      <w:proofErr w:type="spellStart"/>
+      <w:r>
+        <w:t>hai</w:t>
+      </w:r>
+      <w:proofErr w:type="spellEnd"/>
+      <w:r>
+        <w:t xml:space="preserve"> </w:t>
+      </w:r>
+      <w:proofErr w:type="spellStart"/>
+      <w:r>
+        <w:t>kyunki</w:t>
+      </w:r>
+      <w:proofErr w:type="spellEnd"/>
+      <w:r>
+        <w:t xml:space="preserve"> hum seekh </w:t>
+      </w:r>
+      <w:proofErr w:type="spellStart"/>
+      <w:r>
+        <w:t>rahe</w:t>
+      </w:r>
+      <w:proofErr w:type="spellEnd"/>
+      <w:r>
+        <w:t xml:space="preserve"> hain aur </w:t>
+      </w:r>
+      <w:proofErr w:type="spellStart"/>
+      <w:r>
+        <w:t>naye</w:t>
+      </w:r>
+      <w:proofErr w:type="spellEnd"/>
+      <w:r>
+        <w:t xml:space="preserve"> features </w:t>
+      </w:r>
+      <w:proofErr w:type="spellStart"/>
+      <w:r>
+        <w:t>chahiye</w:t>
+      </w:r>
+      <w:proofErr w:type="spellEnd"/>
+      <w:r>
+        <w:t xml:space="preserve">. Par agar koi bade project (Production) par </w:t>
+      </w:r>
+      <w:proofErr w:type="spellStart"/>
+      <w:r>
+        <w:t>kaam</w:t>
+      </w:r>
+      <w:proofErr w:type="spellEnd"/>
+      <w:r>
+        <w:t xml:space="preserve"> </w:t>
+      </w:r>
+      <w:proofErr w:type="spellStart"/>
+      <w:r>
+        <w:t>kar</w:t>
+      </w:r>
+      <w:proofErr w:type="spellEnd"/>
+      <w:r>
+        <w:t xml:space="preserve"> </w:t>
+      </w:r>
+      <w:proofErr w:type="spellStart"/>
+      <w:r>
+        <w:t>raha</w:t>
+      </w:r>
+      <w:proofErr w:type="spellEnd"/>
+      <w:r>
+        <w:t xml:space="preserve"> </w:t>
+      </w:r>
+      <w:proofErr w:type="spellStart"/>
+      <w:r>
+        <w:t>hai</w:t>
+      </w:r>
+      <w:proofErr w:type="spellEnd"/>
+      <w:r>
+        <w:t xml:space="preserve"> </w:t>
+      </w:r>
+      <w:proofErr w:type="spellStart"/>
+      <w:r>
+        <w:t>toh</w:t>
+      </w:r>
+      <w:proofErr w:type="spellEnd"/>
+      <w:r>
+        <w:t xml:space="preserve"> wo "LTS" (Long Term Support) </w:t>
+      </w:r>
+      <w:proofErr w:type="spellStart"/>
+      <w:r>
+        <w:t>leta</w:t>
+      </w:r>
+      <w:proofErr w:type="spellEnd"/>
+      <w:r>
+        <w:t xml:space="preserve"> </w:t>
+      </w:r>
+      <w:proofErr w:type="spellStart"/>
+      <w:r>
+        <w:t>hai</w:t>
+      </w:r>
+      <w:proofErr w:type="spellEnd"/>
+      <w:r>
+        <w:t>.</w:t>
       </w:r>
     </w:p>
     <w:p>
@@ -225,19 +1041,53 @@
         <w:t>Deno JS</w:t>
       </w:r>
       <w:r>
-        <w:t xml:space="preserve"> bhi ek option hai (jo Node.js ke founder ne hi banaya hai).</w:t>
-      </w:r>
-    </w:p>
-    <w:p>
-      <w:pPr>
-        <w:rPr>
-          <w:b/>
-          <w:bCs/>
-        </w:rPr>
-      </w:pPr>
-      <w:r>
-        <w:pict w14:anchorId="551E7EBC">
-          <v:rect id="_x0000_i1056" style="width:0;height:1.5pt" o:hralign="center" o:hrstd="t" o:hr="t" fillcolor="#a0a0a0" stroked="f"/>
+        <w:t xml:space="preserve"> </w:t>
+      </w:r>
+      <w:proofErr w:type="spellStart"/>
+      <w:r>
+        <w:t>bhi</w:t>
+      </w:r>
+      <w:proofErr w:type="spellEnd"/>
+      <w:r>
+        <w:t xml:space="preserve"> ek option </w:t>
+      </w:r>
+      <w:proofErr w:type="spellStart"/>
+      <w:r>
+        <w:t>hai</w:t>
+      </w:r>
+      <w:proofErr w:type="spellEnd"/>
+      <w:r>
+        <w:t xml:space="preserve"> (jo Node.js </w:t>
+      </w:r>
+      <w:proofErr w:type="spellStart"/>
+      <w:r>
+        <w:t>ke</w:t>
+      </w:r>
+      <w:proofErr w:type="spellEnd"/>
+      <w:r>
+        <w:t xml:space="preserve"> founder ne hi </w:t>
+      </w:r>
+      <w:proofErr w:type="spellStart"/>
+      <w:r>
+        <w:t>banaya</w:t>
+      </w:r>
+      <w:proofErr w:type="spellEnd"/>
+      <w:r>
+        <w:t xml:space="preserve"> </w:t>
+      </w:r>
+      <w:proofErr w:type="spellStart"/>
+      <w:r>
+        <w:t>hai</w:t>
+      </w:r>
+      <w:proofErr w:type="spellEnd"/>
+      <w:r>
+        <w:t>).</w:t>
+      </w:r>
+    </w:p>
+    <w:p>
+      <w:r>
+        <w:pict w14:anchorId="2B20393E">
+          <v:rect id="_x0000_i1068" style="width:0;height:1.5pt" o:hralign="center" o:hrstd="t" o:hr="t" fillcolor="#a0a0a0" stroked="f"/>
         </w:pict>
       </w:r>
     </w:p>
@@ -258,7 +1108,31 @@
     </w:p>
     <w:p>
       <w:r>
-        <w:t xml:space="preserve">Code likhne ke liye </w:t>
+        <w:t xml:space="preserve">Code </w:t>
+      </w:r>
+      <w:proofErr w:type="spellStart"/>
+      <w:r>
+        <w:t>likhne</w:t>
+      </w:r>
+      <w:proofErr w:type="spellEnd"/>
+      <w:r>
+        <w:t xml:space="preserve"> </w:t>
+      </w:r>
+      <w:proofErr w:type="spellStart"/>
+      <w:r>
+        <w:t>ke</w:t>
+      </w:r>
+      <w:proofErr w:type="spellEnd"/>
+      <w:r>
+        <w:t xml:space="preserve"> </w:t>
+      </w:r>
+      <w:proofErr w:type="spellStart"/>
+      <w:r>
+        <w:t>liye</w:t>
+      </w:r>
+      <w:proofErr w:type="spellEnd"/>
+      <w:r>
+        <w:t xml:space="preserve"> </w:t>
       </w:r>
       <w:r>
         <w:rPr>
@@ -268,7 +1142,15 @@
         <w:t>Visual Studio Code (VS Code)</w:t>
       </w:r>
       <w:r>
-        <w:t xml:space="preserve"> best choice hai.</w:t>
+        <w:t xml:space="preserve"> best choice </w:t>
+      </w:r>
+      <w:proofErr w:type="spellStart"/>
+      <w:r>
+        <w:t>hai</w:t>
+      </w:r>
+      <w:proofErr w:type="spellEnd"/>
+      <w:r>
+        <w:t>.</w:t>
       </w:r>
     </w:p>
     <w:p>
@@ -286,7 +1168,71 @@
         <w:t>Kyun?</w:t>
       </w:r>
       <w:r>
-        <w:t xml:space="preserve"> Kyun ki isme "Color Coding," "Auto-Indentation," aur "Intellisense" (apne aap code suggest karna) milta hai.</w:t>
+        <w:t xml:space="preserve"> Kyun ki </w:t>
+      </w:r>
+      <w:proofErr w:type="spellStart"/>
+      <w:r>
+        <w:t>isme</w:t>
+      </w:r>
+      <w:proofErr w:type="spellEnd"/>
+      <w:r>
+        <w:t xml:space="preserve"> "</w:t>
+      </w:r>
+      <w:proofErr w:type="spellStart"/>
+      <w:r>
+        <w:t>Color</w:t>
+      </w:r>
+      <w:proofErr w:type="spellEnd"/>
+      <w:r>
+        <w:t xml:space="preserve"> Coding," "Auto-Indentation," aur "</w:t>
+      </w:r>
+      <w:proofErr w:type="spellStart"/>
+      <w:r>
+        <w:t>Intellisense</w:t>
+      </w:r>
+      <w:proofErr w:type="spellEnd"/>
+      <w:r>
+        <w:t>" (</w:t>
+      </w:r>
+      <w:proofErr w:type="spellStart"/>
+      <w:r>
+        <w:t>apne</w:t>
+      </w:r>
+      <w:proofErr w:type="spellEnd"/>
+      <w:r>
+        <w:t xml:space="preserve"> </w:t>
+      </w:r>
+      <w:proofErr w:type="spellStart"/>
+      <w:r>
+        <w:t>aap</w:t>
+      </w:r>
+      <w:proofErr w:type="spellEnd"/>
+      <w:r>
+        <w:t xml:space="preserve"> code suggest </w:t>
+      </w:r>
+      <w:proofErr w:type="spellStart"/>
+      <w:r>
+        <w:t>karna</w:t>
+      </w:r>
+      <w:proofErr w:type="spellEnd"/>
+      <w:r>
+        <w:t xml:space="preserve">) </w:t>
+      </w:r>
+      <w:proofErr w:type="spellStart"/>
+      <w:r>
+        <w:t>milta</w:t>
+      </w:r>
+      <w:proofErr w:type="spellEnd"/>
+      <w:r>
+        <w:t xml:space="preserve"> </w:t>
+      </w:r>
+      <w:proofErr w:type="spellStart"/>
+      <w:r>
+        <w:t>hai</w:t>
+      </w:r>
+      <w:proofErr w:type="spellEnd"/>
+      <w:r>
+        <w:t>.</w:t>
       </w:r>
     </w:p>
     <w:p>
@@ -305,11 +1251,99 @@
         <w:t>Tip:</w:t>
       </w:r>
       <w:r>
-        <w:t xml:space="preserve"> Hitesh sir ne kaha hai ki NotePad ya WordPad bilkul use mat karna, wo development ke liye nahi hain.</w:t>
-      </w:r>
-    </w:p>
-    <w:p>
-      <w:pPr>
+        <w:t xml:space="preserve"> Hitesh sir ne kaha </w:t>
+      </w:r>
+      <w:proofErr w:type="spellStart"/>
+      <w:r>
+        <w:t>hai</w:t>
+      </w:r>
+      <w:proofErr w:type="spellEnd"/>
+      <w:r>
+        <w:t xml:space="preserve"> ki </w:t>
+      </w:r>
+      <w:proofErr w:type="spellStart"/>
+      <w:r>
+        <w:t>NotePad</w:t>
+      </w:r>
+      <w:proofErr w:type="spellEnd"/>
+      <w:r>
+        <w:t xml:space="preserve"> </w:t>
+      </w:r>
+      <w:proofErr w:type="spellStart"/>
+      <w:r>
+        <w:t>ya</w:t>
+      </w:r>
+      <w:proofErr w:type="spellEnd"/>
+      <w:r>
+        <w:t xml:space="preserve"> WordPad </w:t>
+      </w:r>
+      <w:proofErr w:type="spellStart"/>
+      <w:r>
+        <w:t>bilkul</w:t>
+      </w:r>
+      <w:proofErr w:type="spellEnd"/>
+      <w:r>
+        <w:t xml:space="preserve"> use mat </w:t>
+      </w:r>
+      <w:proofErr w:type="spellStart"/>
+      <w:r>
+        <w:t>karna</w:t>
+      </w:r>
+      <w:proofErr w:type="spellEnd"/>
+      <w:r>
+        <w:t xml:space="preserve">, wo development </w:t>
+      </w:r>
+      <w:proofErr w:type="spellStart"/>
+      <w:r>
+        <w:t>ke</w:t>
+      </w:r>
+      <w:proofErr w:type="spellEnd"/>
+      <w:r>
+        <w:t xml:space="preserve"> </w:t>
+      </w:r>
+      <w:proofErr w:type="spellStart"/>
+      <w:r>
+        <w:t>liye</w:t>
+      </w:r>
+      <w:proofErr w:type="spellEnd"/>
+      <w:r>
+        <w:t xml:space="preserve"> </w:t>
+      </w:r>
+      <w:proofErr w:type="spellStart"/>
+      <w:r>
+        <w:t>nahi</w:t>
+      </w:r>
+      <w:proofErr w:type="spellEnd"/>
+      <w:r>
+        <w:t xml:space="preserve"> hain.</w:t>
+      </w:r>
+    </w:p>
+    <w:p>
+      <w:r>
+        <w:pict w14:anchorId="75C94293">
+          <v:rect id="_x0000_i1069" style="width:0;height:1.5pt" o:hralign="center" o:hrstd="t" o:hr="t" fillcolor="#a0a0a0" stroked="f"/>
+        </w:pict>
+      </w:r>
+    </w:p>
+    <w:p>
+      <w:pPr>
+        <w:rPr>
+          <w:b/>
+          <w:bCs/>
+          <w:sz w:val="32"/>
+          <w:szCs w:val="32"/>
+        </w:rPr>
+      </w:pPr>
+      <w:r>
+        <w:rPr>
+          <w:b/>
+          <w:bCs/>
+          <w:sz w:val="32"/>
+          <w:szCs w:val="32"/>
+        </w:rPr>
+        <w:t xml:space="preserve"># </w:t>
+      </w:r>
+      <w:r>
         <w:rPr>
           <w:b/>
           <w:bCs/>
@@ -317,14 +1351,121 @@
           <w:szCs w:val="32"/>
           <w:u w:val="single"/>
         </w:rPr>
-      </w:pPr>
-      <w:r>
+        <w:t>WHAT IS MSI??</w:t>
+      </w:r>
+    </w:p>
+    <w:p>
+      <w:r>
+        <w:drawing>
+          <wp:inline distT="0" distB="0" distL="0" distR="0" wp14:anchorId="02EA4BE9" wp14:editId="4E7A0519">
+            <wp:extent cx="5731510" cy="5099685"/>
+            <wp:effectExtent l="0" t="0" r="2540" b="5715"/>
+            <wp:docPr id="396387768" name="Picture 1"/>
+            <wp:cNvGraphicFramePr>
+              <a:graphicFrameLocks xmlns:a="http://schemas.openxmlformats.org/drawingml/2006/main" noChangeAspect="1"/>
+            </wp:cNvGraphicFramePr>
+            <a:graphic xmlns:a="http://schemas.openxmlformats.org/drawingml/2006/main">
+              <a:graphicData uri="http://schemas.openxmlformats.org/drawingml/2006/picture">
+                <pic:pic xmlns:pic="http://schemas.openxmlformats.org/drawingml/2006/picture">
+                  <pic:nvPicPr>
+                    <pic:cNvPr id="396387768" name=""/>
+                    <pic:cNvPicPr/>
+                  </pic:nvPicPr>
+                  <pic:blipFill>
+                    <a:blip r:embed="rId6"/>
+                    <a:stretch>
+                      <a:fillRect/>
+                    </a:stretch>
+                  </pic:blipFill>
+                  <pic:spPr>
+                    <a:xfrm>
+                      <a:off x="0" y="0"/>
+                      <a:ext cx="5731510" cy="5099685"/>
+                    </a:xfrm>
+                    <a:prstGeom prst="rect">
+                      <a:avLst/>
+                    </a:prstGeom>
+                  </pic:spPr>
+                </pic:pic>
+              </a:graphicData>
+            </a:graphic>
+          </wp:inline>
+        </w:drawing>
+      </w:r>
+      <w:r>
+        <w:pict w14:anchorId="551E7EBC">
+          <v:rect id="_x0000_i1056" style="width:0;height:1.5pt" o:hralign="center" o:hrstd="t" o:hr="t" fillcolor="#a0a0a0" stroked="f"/>
+        </w:pict>
+      </w:r>
+    </w:p>
+    <w:p>
+      <w:pPr>
         <w:rPr>
           <w:b/>
           <w:bCs/>
           <w:sz w:val="32"/>
           <w:szCs w:val="32"/>
         </w:rPr>
+      </w:pPr>
+    </w:p>
+    <w:p>
+      <w:pPr>
+        <w:rPr>
+          <w:b/>
+          <w:bCs/>
+          <w:sz w:val="32"/>
+          <w:szCs w:val="32"/>
+        </w:rPr>
+      </w:pPr>
+    </w:p>
+    <w:p>
+      <w:pPr>
+        <w:rPr>
+          <w:b/>
+          <w:bCs/>
+          <w:sz w:val="32"/>
+          <w:szCs w:val="32"/>
+        </w:rPr>
+      </w:pPr>
+    </w:p>
+    <w:p>
+      <w:pPr>
+        <w:rPr>
+          <w:b/>
+          <w:bCs/>
+          <w:sz w:val="32"/>
+          <w:szCs w:val="32"/>
+        </w:rPr>
+      </w:pPr>
+    </w:p>
+    <w:p>
+      <w:pPr>
+        <w:rPr>
+          <w:b/>
+          <w:bCs/>
+          <w:sz w:val="32"/>
+          <w:szCs w:val="32"/>
+        </w:rPr>
+      </w:pPr>
+    </w:p>
+    <w:p>
+      <w:pPr>
+        <w:rPr>
+          <w:b/>
+          <w:bCs/>
+          <w:sz w:val="32"/>
+          <w:szCs w:val="32"/>
+          <w:u w:val="single"/>
+        </w:rPr>
+      </w:pPr>
+      <w:r>
+        <w:rPr>
+          <w:b/>
+          <w:bCs/>
+          <w:sz w:val="32"/>
+          <w:szCs w:val="32"/>
+        </w:rPr>
+        <w:lastRenderedPageBreak/>
         <w:t xml:space="preserve"># </w:t>
       </w:r>
       <w:r>
@@ -366,7 +1507,7 @@
                     <pic:cNvPicPr/>
                   </pic:nvPicPr>
                   <pic:blipFill>
-                    <a:blip r:embed="rId6"/>
+                    <a:blip r:embed="rId7"/>
                     <a:stretch>
                       <a:fillRect/>
                     </a:stretch>
@@ -386,25 +1527,78 @@
           </wp:inline>
         </w:drawing>
       </w:r>
-    </w:p>
-    <w:p>
-      <w:pPr>
-        <w:rPr>
-          <w:b/>
-          <w:bCs/>
-        </w:rPr>
-      </w:pPr>
-      <w:r>
-        <w:rPr>
-          <w:b/>
-          <w:bCs/>
-        </w:rPr>
-        <w:t xml:space="preserve">5. Code Kaise Run Karein? (Step-by-Step Example) </w:t>
-      </w:r>
-    </w:p>
-    <w:p>
-      <w:r>
-        <w:t>Video me jo code aur process dikhaya gaya hai, wo ye hai:</w:t>
+      <w:r>
+        <w:pict w14:anchorId="57247818">
+          <v:rect id="_x0000_i1070" style="width:0;height:1.5pt" o:hralign="center" o:hrstd="t" o:hr="t" fillcolor="#a0a0a0" stroked="f"/>
+        </w:pict>
+      </w:r>
+    </w:p>
+    <w:p>
+      <w:pPr>
+        <w:rPr>
+          <w:b/>
+          <w:bCs/>
+        </w:rPr>
+      </w:pPr>
+      <w:r>
+        <w:rPr>
+          <w:b/>
+          <w:bCs/>
+        </w:rPr>
+        <w:t xml:space="preserve">5. Code Kaise Run </w:t>
+      </w:r>
+      <w:proofErr w:type="spellStart"/>
+      <w:r>
+        <w:rPr>
+          <w:b/>
+          <w:bCs/>
+        </w:rPr>
+        <w:t>Karein</w:t>
+      </w:r>
+      <w:proofErr w:type="spellEnd"/>
+      <w:r>
+        <w:rPr>
+          <w:b/>
+          <w:bCs/>
+        </w:rPr>
+        <w:t xml:space="preserve">? (Step-by-Step Example) </w:t>
+      </w:r>
+    </w:p>
+    <w:p>
+      <w:r>
+        <w:t xml:space="preserve">Video me jo code aur process </w:t>
+      </w:r>
+      <w:proofErr w:type="spellStart"/>
+      <w:r>
+        <w:t>dikhaya</w:t>
+      </w:r>
+      <w:proofErr w:type="spellEnd"/>
+      <w:r>
+        <w:t xml:space="preserve"> </w:t>
+      </w:r>
+      <w:proofErr w:type="spellStart"/>
+      <w:r>
+        <w:t>gaya</w:t>
+      </w:r>
+      <w:proofErr w:type="spellEnd"/>
+      <w:r>
+        <w:t xml:space="preserve"> </w:t>
+      </w:r>
+      <w:proofErr w:type="spellStart"/>
+      <w:r>
+        <w:t>hai</w:t>
+      </w:r>
+      <w:proofErr w:type="spellEnd"/>
+      <w:r>
+        <w:t xml:space="preserve">, wo ye </w:t>
+      </w:r>
+      <w:proofErr w:type="spellStart"/>
+      <w:r>
+        <w:t>hai</w:t>
+      </w:r>
+      <w:proofErr w:type="spellEnd"/>
+      <w:r>
+        <w:t>:</w:t>
       </w:r>
     </w:p>
     <w:p>
@@ -422,7 +1616,31 @@
         <w:t>Folder Banao:</w:t>
       </w:r>
       <w:r>
-        <w:t xml:space="preserve"> Apne desktop par ek folder banaya (e.g., js-hindi).</w:t>
+        <w:t xml:space="preserve"> </w:t>
+      </w:r>
+      <w:proofErr w:type="spellStart"/>
+      <w:r>
+        <w:t>Apne</w:t>
+      </w:r>
+      <w:proofErr w:type="spellEnd"/>
+      <w:r>
+        <w:t xml:space="preserve"> desktop par ek folder </w:t>
+      </w:r>
+      <w:proofErr w:type="spellStart"/>
+      <w:r>
+        <w:t>banaya</w:t>
+      </w:r>
+      <w:proofErr w:type="spellEnd"/>
+      <w:r>
+        <w:t xml:space="preserve"> (e.g., </w:t>
+      </w:r>
+      <w:proofErr w:type="spellStart"/>
+      <w:r>
+        <w:t>js-hindi</w:t>
+      </w:r>
+      <w:proofErr w:type="spellEnd"/>
+      <w:r>
+        <w:t>).</w:t>
       </w:r>
     </w:p>
     <w:p>
@@ -440,7 +1658,15 @@
         <w:t>VS Code me Open Karo:</w:t>
       </w:r>
       <w:r>
-        <w:t xml:space="preserve"> Folder ko VS Code me drag and drop kar do.</w:t>
+        <w:t xml:space="preserve"> Folder ko VS Code me drag and drop </w:t>
+      </w:r>
+      <w:proofErr w:type="spellStart"/>
+      <w:r>
+        <w:t>kar</w:t>
+      </w:r>
+      <w:proofErr w:type="spellEnd"/>
+      <w:r>
+        <w:t xml:space="preserve"> do.</w:t>
       </w:r>
     </w:p>
     <w:p>
@@ -458,7 +1684,15 @@
         <w:t>File Create Karo:</w:t>
       </w:r>
       <w:r>
-        <w:t xml:space="preserve"> Ek file banayi test.js.</w:t>
+        <w:t xml:space="preserve"> Ek file </w:t>
+      </w:r>
+      <w:proofErr w:type="spellStart"/>
+      <w:r>
+        <w:t>banayi</w:t>
+      </w:r>
+      <w:proofErr w:type="spellEnd"/>
+      <w:r>
+        <w:t xml:space="preserve"> test.js.</w:t>
       </w:r>
     </w:p>
     <w:p>
@@ -495,7 +1729,7 @@
                     <pic:cNvPicPr/>
                   </pic:nvPicPr>
                   <pic:blipFill>
-                    <a:blip r:embed="rId7"/>
+                    <a:blip r:embed="rId8"/>
                     <a:stretch>
                       <a:fillRect/>
                     </a:stretch>
@@ -531,7 +1765,15 @@
         <w:t>Terminal Open Karo:</w:t>
       </w:r>
       <w:r>
-        <w:t xml:space="preserve"> View &gt; Terminal me jao. </w:t>
+        <w:t xml:space="preserve"> View &gt; Terminal me </w:t>
+      </w:r>
+      <w:proofErr w:type="spellStart"/>
+      <w:r>
+        <w:t>jao</w:t>
+      </w:r>
+      <w:proofErr w:type="spellEnd"/>
+      <w:r>
+        <w:t xml:space="preserve">. </w:t>
       </w:r>
     </w:p>
     <w:p>
@@ -549,7 +1791,78 @@
         <w:t>Check Installation:</w:t>
       </w:r>
       <w:r>
-        <w:t xml:space="preserve"> Pehle check karo Node install hua ya nahi: node -v (Ye version number dikhayega).</w:t>
+        <w:t xml:space="preserve"> Pehle check karo Node install </w:t>
+      </w:r>
+      <w:proofErr w:type="spellStart"/>
+      <w:r>
+        <w:t>hua</w:t>
+      </w:r>
+      <w:proofErr w:type="spellEnd"/>
+      <w:r>
+        <w:t xml:space="preserve"> </w:t>
+      </w:r>
+      <w:proofErr w:type="spellStart"/>
+      <w:r>
+        <w:t>ya</w:t>
+      </w:r>
+      <w:proofErr w:type="spellEnd"/>
+      <w:r>
+        <w:t xml:space="preserve"> </w:t>
+      </w:r>
+      <w:proofErr w:type="spellStart"/>
+      <w:r>
+        <w:t>nahi</w:t>
+      </w:r>
+      <w:proofErr w:type="spellEnd"/>
+      <w:r>
+        <w:t xml:space="preserve">: node -v (Ye version number </w:t>
+      </w:r>
+      <w:proofErr w:type="spellStart"/>
+      <w:r>
+        <w:t>dikhayega</w:t>
+      </w:r>
+      <w:proofErr w:type="spellEnd"/>
+      <w:r>
+        <w:t>).</w:t>
+      </w:r>
+    </w:p>
+    <w:p>
+      <w:r>
+        <w:drawing>
+          <wp:inline distT="0" distB="0" distL="0" distR="0" wp14:anchorId="1FC62FCB" wp14:editId="101E7014">
+            <wp:extent cx="5731510" cy="2297430"/>
+            <wp:effectExtent l="0" t="0" r="2540" b="7620"/>
+            <wp:docPr id="745628284" name="Picture 1"/>
+            <wp:cNvGraphicFramePr>
+              <a:graphicFrameLocks xmlns:a="http://schemas.openxmlformats.org/drawingml/2006/main" noChangeAspect="1"/>
+            </wp:cNvGraphicFramePr>
+            <a:graphic xmlns:a="http://schemas.openxmlformats.org/drawingml/2006/main">
+              <a:graphicData uri="http://schemas.openxmlformats.org/drawingml/2006/picture">
+                <pic:pic xmlns:pic="http://schemas.openxmlformats.org/drawingml/2006/picture">
+                  <pic:nvPicPr>
+                    <pic:cNvPr id="745628284" name=""/>
+                    <pic:cNvPicPr/>
+                  </pic:nvPicPr>
+                  <pic:blipFill>
+                    <a:blip r:embed="rId9"/>
+                    <a:stretch>
+                      <a:fillRect/>
+                    </a:stretch>
+                  </pic:blipFill>
+                  <pic:spPr>
+                    <a:xfrm>
+                      <a:off x="0" y="0"/>
+                      <a:ext cx="5731510" cy="2297430"/>
+                    </a:xfrm>
+                    <a:prstGeom prst="rect">
+                      <a:avLst/>
+                    </a:prstGeom>
+                  </pic:spPr>
+                </pic:pic>
+              </a:graphicData>
+            </a:graphic>
+          </wp:inline>
+        </w:drawing>
       </w:r>
     </w:p>
     <w:p>
@@ -567,7 +1880,39 @@
         <w:t>Run Code:</w:t>
       </w:r>
       <w:r>
-        <w:t xml:space="preserve"> File ko run karne ke liye terminal me ye command likho: node test.js </w:t>
+        <w:t xml:space="preserve"> File ko run </w:t>
+      </w:r>
+      <w:proofErr w:type="spellStart"/>
+      <w:r>
+        <w:t>karne</w:t>
+      </w:r>
+      <w:proofErr w:type="spellEnd"/>
+      <w:r>
+        <w:t xml:space="preserve"> </w:t>
+      </w:r>
+      <w:proofErr w:type="spellStart"/>
+      <w:r>
+        <w:t>ke</w:t>
+      </w:r>
+      <w:proofErr w:type="spellEnd"/>
+      <w:r>
+        <w:t xml:space="preserve"> </w:t>
+      </w:r>
+      <w:proofErr w:type="spellStart"/>
+      <w:r>
+        <w:t>liye</w:t>
+      </w:r>
+      <w:proofErr w:type="spellEnd"/>
+      <w:r>
+        <w:t xml:space="preserve"> terminal me ye command </w:t>
+      </w:r>
+      <w:proofErr w:type="spellStart"/>
+      <w:r>
+        <w:t>likho</w:t>
+      </w:r>
+      <w:proofErr w:type="spellEnd"/>
+      <w:r>
+        <w:t xml:space="preserve">: node test.js </w:t>
       </w:r>
       <w:r>
         <w:rPr>
@@ -581,14 +1926,43 @@
       </w:r>
     </w:p>
     <w:p>
-      <w:pPr>
-        <w:rPr>
-          <w:b/>
-          <w:bCs/>
-          <w:sz w:val="32"/>
-          <w:szCs w:val="32"/>
-        </w:rPr>
-      </w:pPr>
+      <w:r>
+        <w:drawing>
+          <wp:inline distT="0" distB="0" distL="0" distR="0" wp14:anchorId="342E40A4" wp14:editId="7E1065E8">
+            <wp:extent cx="5731510" cy="2603500"/>
+            <wp:effectExtent l="0" t="0" r="2540" b="6350"/>
+            <wp:docPr id="331039847" name="Picture 1"/>
+            <wp:cNvGraphicFramePr>
+              <a:graphicFrameLocks xmlns:a="http://schemas.openxmlformats.org/drawingml/2006/main" noChangeAspect="1"/>
+            </wp:cNvGraphicFramePr>
+            <a:graphic xmlns:a="http://schemas.openxmlformats.org/drawingml/2006/main">
+              <a:graphicData uri="http://schemas.openxmlformats.org/drawingml/2006/picture">
+                <pic:pic xmlns:pic="http://schemas.openxmlformats.org/drawingml/2006/picture">
+                  <pic:nvPicPr>
+                    <pic:cNvPr id="331039847" name=""/>
+                    <pic:cNvPicPr/>
+                  </pic:nvPicPr>
+                  <pic:blipFill>
+                    <a:blip r:embed="rId10"/>
+                    <a:stretch>
+                      <a:fillRect/>
+                    </a:stretch>
+                  </pic:blipFill>
+                  <pic:spPr>
+                    <a:xfrm>
+                      <a:off x="0" y="0"/>
+                      <a:ext cx="5731510" cy="2603500"/>
+                    </a:xfrm>
+                    <a:prstGeom prst="rect">
+                      <a:avLst/>
+                    </a:prstGeom>
+                  </pic:spPr>
+                </pic:pic>
+              </a:graphicData>
+            </a:graphic>
+          </wp:inline>
+        </w:drawing>
+      </w:r>
       <w:r>
         <w:pict w14:anchorId="6C84CE81">
           <v:rect id="_x0000_i1062" style="width:0;height:1.5pt" o:hralign="center" o:hrstd="t" o:hr="t" fillcolor="#a0a0a0" stroked="f"/>
@@ -602,16 +1976,37 @@
           <w:bCs/>
           <w:sz w:val="32"/>
           <w:szCs w:val="32"/>
-          <w:u w:val="single"/>
-        </w:rPr>
-      </w:pPr>
-      <w:r>
+        </w:rPr>
+      </w:pPr>
+    </w:p>
+    <w:p>
+      <w:pPr>
         <w:rPr>
           <w:b/>
           <w:bCs/>
           <w:sz w:val="32"/>
           <w:szCs w:val="32"/>
         </w:rPr>
+      </w:pPr>
+    </w:p>
+    <w:p>
+      <w:pPr>
+        <w:rPr>
+          <w:b/>
+          <w:bCs/>
+          <w:sz w:val="32"/>
+          <w:szCs w:val="32"/>
+          <w:u w:val="single"/>
+        </w:rPr>
+      </w:pPr>
+      <w:r>
+        <w:rPr>
+          <w:b/>
+          <w:bCs/>
+          <w:sz w:val="32"/>
+          <w:szCs w:val="32"/>
+        </w:rPr>
+        <w:lastRenderedPageBreak/>
         <w:t xml:space="preserve"># </w:t>
       </w:r>
       <w:r>
@@ -649,7 +2044,7 @@
                     <pic:cNvPicPr/>
                   </pic:nvPicPr>
                   <pic:blipFill>
-                    <a:blip r:embed="rId8"/>
+                    <a:blip r:embed="rId11"/>
                     <a:stretch>
                       <a:fillRect/>
                     </a:stretch>
@@ -707,7 +2102,7 @@
                     <pic:cNvPicPr/>
                   </pic:nvPicPr>
                   <pic:blipFill>
-                    <a:blip r:embed="rId9"/>
+                    <a:blip r:embed="rId12"/>
                     <a:stretch>
                       <a:fillRect/>
                     </a:stretch>
@@ -755,7 +2150,71 @@
         <w:t>V8 Engine:</w:t>
       </w:r>
       <w:r>
-        <w:t xml:space="preserve"> Google Chrome ke andar ek engine hota hai "V8" jo JS code ko machine code me convert karta hai. Node.js isi V8 engine par based hai.</w:t>
+        <w:t xml:space="preserve"> Google Chrome </w:t>
+      </w:r>
+      <w:proofErr w:type="spellStart"/>
+      <w:r>
+        <w:t>ke</w:t>
+      </w:r>
+      <w:proofErr w:type="spellEnd"/>
+      <w:r>
+        <w:t xml:space="preserve"> </w:t>
+      </w:r>
+      <w:proofErr w:type="spellStart"/>
+      <w:r>
+        <w:t>andar</w:t>
+      </w:r>
+      <w:proofErr w:type="spellEnd"/>
+      <w:r>
+        <w:t xml:space="preserve"> ek engine </w:t>
+      </w:r>
+      <w:proofErr w:type="spellStart"/>
+      <w:r>
+        <w:t>hota</w:t>
+      </w:r>
+      <w:proofErr w:type="spellEnd"/>
+      <w:r>
+        <w:t xml:space="preserve"> </w:t>
+      </w:r>
+      <w:proofErr w:type="spellStart"/>
+      <w:r>
+        <w:t>hai</w:t>
+      </w:r>
+      <w:proofErr w:type="spellEnd"/>
+      <w:r>
+        <w:t xml:space="preserve"> "V8" jo JS code ko machine code me convert </w:t>
+      </w:r>
+      <w:proofErr w:type="spellStart"/>
+      <w:r>
+        <w:t>karta</w:t>
+      </w:r>
+      <w:proofErr w:type="spellEnd"/>
+      <w:r>
+        <w:t xml:space="preserve"> </w:t>
+      </w:r>
+      <w:proofErr w:type="spellStart"/>
+      <w:r>
+        <w:t>hai</w:t>
+      </w:r>
+      <w:proofErr w:type="spellEnd"/>
+      <w:r>
+        <w:t xml:space="preserve">. Node.js </w:t>
+      </w:r>
+      <w:proofErr w:type="spellStart"/>
+      <w:r>
+        <w:t>isi</w:t>
+      </w:r>
+      <w:proofErr w:type="spellEnd"/>
+      <w:r>
+        <w:t xml:space="preserve"> V8 engine par based </w:t>
+      </w:r>
+      <w:proofErr w:type="spellStart"/>
+      <w:r>
+        <w:t>hai</w:t>
+      </w:r>
+      <w:proofErr w:type="spellEnd"/>
+      <w:r>
+        <w:t>.</w:t>
       </w:r>
     </w:p>
     <w:p>
@@ -773,22 +2232,174 @@
         <w:t>Syntax Structure:</w:t>
       </w:r>
       <w:r>
-        <w:t xml:space="preserve"> JS engine file ke andar console, ., log jaise keywords ko pehchanta hai. Agar tum spelling galat karoge (e.g., consol), toh engine error de dega kyunki uska "Parser" use nahi samajh payega.</w:t>
-      </w:r>
-    </w:p>
-    <w:p>
-      <w:pPr>
-        <w:rPr>
-          <w:b/>
-          <w:bCs/>
-        </w:rPr>
-      </w:pPr>
-      <w:r>
-        <w:rPr>
-          <w:b/>
-          <w:bCs/>
-        </w:rPr>
-        <w:t>Summary Checklist tumhare liye:</w:t>
+        <w:t xml:space="preserve"> JS engine file </w:t>
+      </w:r>
+      <w:proofErr w:type="spellStart"/>
+      <w:r>
+        <w:t>ke</w:t>
+      </w:r>
+      <w:proofErr w:type="spellEnd"/>
+      <w:r>
+        <w:t xml:space="preserve"> </w:t>
+      </w:r>
+      <w:proofErr w:type="spellStart"/>
+      <w:r>
+        <w:t>andar</w:t>
+      </w:r>
+      <w:proofErr w:type="spellEnd"/>
+      <w:r>
+        <w:t xml:space="preserve"> console</w:t>
+      </w:r>
+      <w:proofErr w:type="gramStart"/>
+      <w:r>
+        <w:t>, .</w:t>
+      </w:r>
+      <w:proofErr w:type="gramEnd"/>
+      <w:r>
+        <w:t xml:space="preserve">, log </w:t>
+      </w:r>
+      <w:proofErr w:type="spellStart"/>
+      <w:r>
+        <w:t>jaise</w:t>
+      </w:r>
+      <w:proofErr w:type="spellEnd"/>
+      <w:r>
+        <w:t xml:space="preserve"> keywords ko </w:t>
+      </w:r>
+      <w:proofErr w:type="spellStart"/>
+      <w:r>
+        <w:t>pehchanta</w:t>
+      </w:r>
+      <w:proofErr w:type="spellEnd"/>
+      <w:r>
+        <w:t xml:space="preserve"> </w:t>
+      </w:r>
+      <w:proofErr w:type="spellStart"/>
+      <w:r>
+        <w:t>hai</w:t>
+      </w:r>
+      <w:proofErr w:type="spellEnd"/>
+      <w:r>
+        <w:t xml:space="preserve">. Agar tum spelling </w:t>
+      </w:r>
+      <w:proofErr w:type="spellStart"/>
+      <w:r>
+        <w:t>galat</w:t>
+      </w:r>
+      <w:proofErr w:type="spellEnd"/>
+      <w:r>
+        <w:t xml:space="preserve"> </w:t>
+      </w:r>
+      <w:proofErr w:type="spellStart"/>
+      <w:r>
+        <w:t>karoge</w:t>
+      </w:r>
+      <w:proofErr w:type="spellEnd"/>
+      <w:r>
+        <w:t xml:space="preserve"> (e.g., consol), </w:t>
+      </w:r>
+      <w:proofErr w:type="spellStart"/>
+      <w:r>
+        <w:t>toh</w:t>
+      </w:r>
+      <w:proofErr w:type="spellEnd"/>
+      <w:r>
+        <w:t xml:space="preserve"> engine error de </w:t>
+      </w:r>
+      <w:proofErr w:type="spellStart"/>
+      <w:r>
+        <w:t>dega</w:t>
+      </w:r>
+      <w:proofErr w:type="spellEnd"/>
+      <w:r>
+        <w:t xml:space="preserve"> </w:t>
+      </w:r>
+      <w:proofErr w:type="spellStart"/>
+      <w:r>
+        <w:t>kyunki</w:t>
+      </w:r>
+      <w:proofErr w:type="spellEnd"/>
+      <w:r>
+        <w:t xml:space="preserve"> </w:t>
+      </w:r>
+      <w:proofErr w:type="spellStart"/>
+      <w:r>
+        <w:t>uska</w:t>
+      </w:r>
+      <w:proofErr w:type="spellEnd"/>
+      <w:r>
+        <w:t xml:space="preserve"> "Parser" use </w:t>
+      </w:r>
+      <w:proofErr w:type="spellStart"/>
+      <w:r>
+        <w:t>nahi</w:t>
+      </w:r>
+      <w:proofErr w:type="spellEnd"/>
+      <w:r>
+        <w:t xml:space="preserve"> </w:t>
+      </w:r>
+      <w:proofErr w:type="spellStart"/>
+      <w:r>
+        <w:t>samajh</w:t>
+      </w:r>
+      <w:proofErr w:type="spellEnd"/>
+      <w:r>
+        <w:t xml:space="preserve"> </w:t>
+      </w:r>
+      <w:proofErr w:type="spellStart"/>
+      <w:r>
+        <w:t>payega</w:t>
+      </w:r>
+      <w:proofErr w:type="spellEnd"/>
+      <w:r>
+        <w:t>.</w:t>
+      </w:r>
+    </w:p>
+    <w:p>
+      <w:pPr>
+        <w:rPr>
+          <w:b/>
+          <w:bCs/>
+        </w:rPr>
+      </w:pPr>
+      <w:r>
+        <w:rPr>
+          <w:b/>
+          <w:bCs/>
+        </w:rPr>
+        <w:t xml:space="preserve">Summary Checklist </w:t>
+      </w:r>
+      <w:proofErr w:type="spellStart"/>
+      <w:r>
+        <w:rPr>
+          <w:b/>
+          <w:bCs/>
+        </w:rPr>
+        <w:t>tumhare</w:t>
+      </w:r>
+      <w:proofErr w:type="spellEnd"/>
+      <w:r>
+        <w:rPr>
+          <w:b/>
+          <w:bCs/>
+        </w:rPr>
+        <w:t xml:space="preserve"> </w:t>
+      </w:r>
+      <w:proofErr w:type="spellStart"/>
+      <w:r>
+        <w:rPr>
+          <w:b/>
+          <w:bCs/>
+        </w:rPr>
+        <w:t>liye</w:t>
+      </w:r>
+      <w:proofErr w:type="spellEnd"/>
+      <w:r>
+        <w:rPr>
+          <w:b/>
+          <w:bCs/>
+        </w:rPr>
+        <w:t>:</w:t>
       </w:r>
     </w:p>
     <w:p>
@@ -799,7 +2410,15 @@
         </w:numPr>
       </w:pPr>
       <w:r>
-        <w:t>Node.js install kar lo.</w:t>
+        <w:t xml:space="preserve">Node.js install </w:t>
+      </w:r>
+      <w:proofErr w:type="spellStart"/>
+      <w:r>
+        <w:t>kar</w:t>
+      </w:r>
+      <w:proofErr w:type="spellEnd"/>
+      <w:r>
+        <w:t xml:space="preserve"> lo.</w:t>
       </w:r>
     </w:p>
     <w:p>
@@ -810,7 +2429,15 @@
         </w:numPr>
       </w:pPr>
       <w:r>
-        <w:t>VS Code install kar lo.</w:t>
+        <w:t xml:space="preserve">VS Code install </w:t>
+      </w:r>
+      <w:proofErr w:type="spellStart"/>
+      <w:r>
+        <w:t>kar</w:t>
+      </w:r>
+      <w:proofErr w:type="spellEnd"/>
+      <w:r>
+        <w:t xml:space="preserve"> lo.</w:t>
       </w:r>
     </w:p>
     <w:p>
@@ -821,7 +2448,23 @@
         </w:numPr>
       </w:pPr>
       <w:r>
-        <w:t>Ek .js file banao.</w:t>
+        <w:t>Ek .</w:t>
+      </w:r>
+      <w:proofErr w:type="spellStart"/>
+      <w:r>
+        <w:t>js</w:t>
+      </w:r>
+      <w:proofErr w:type="spellEnd"/>
+      <w:r>
+        <w:t xml:space="preserve"> file </w:t>
+      </w:r>
+      <w:proofErr w:type="spellStart"/>
+      <w:r>
+        <w:t>banao</w:t>
+      </w:r>
+      <w:proofErr w:type="spellEnd"/>
+      <w:r>
+        <w:t>.</w:t>
       </w:r>
     </w:p>
     <w:p>
@@ -831,8 +2474,21 @@
           <w:numId w:val="7"/>
         </w:numPr>
       </w:pPr>
-      <w:r>
-        <w:t>console.log("Apna Naam"); likho.</w:t>
+      <w:proofErr w:type="gramStart"/>
+      <w:r>
+        <w:t>console.log(</w:t>
+      </w:r>
+      <w:proofErr w:type="gramEnd"/>
+      <w:r>
+        <w:t xml:space="preserve">"Apna Naam"); </w:t>
+      </w:r>
+      <w:proofErr w:type="spellStart"/>
+      <w:r>
+        <w:t>likho</w:t>
+      </w:r>
+      <w:proofErr w:type="spellEnd"/>
+      <w:r>
+        <w:t>.</w:t>
       </w:r>
     </w:p>
     <w:p>
@@ -843,7 +2499,15 @@
         </w:numPr>
       </w:pPr>
       <w:r>
-        <w:t>Terminal me node filename.js karke run karo.</w:t>
+        <w:t xml:space="preserve">Terminal me node filename.js </w:t>
+      </w:r>
+      <w:proofErr w:type="spellStart"/>
+      <w:r>
+        <w:t>karke</w:t>
+      </w:r>
+      <w:proofErr w:type="spellEnd"/>
+      <w:r>
+        <w:t xml:space="preserve"> run karo.</w:t>
       </w:r>
     </w:p>
     <w:p>

</xml_diff>

<commit_message>
studied  conversion of Datatypes and operations basics
</commit_message>
<xml_diff>
--- a/JAVASCRIPT NOTES.docx
+++ b/JAVASCRIPT NOTES.docx
@@ -858,7 +858,7 @@
       <w:r>
         <w:t xml:space="preserve"> </w:t>
       </w:r>
-      <w:hyperlink r:id="rId5" w:tgtFrame="_blank" w:history="1">
+      <w:hyperlink r:id="rId6" w:tgtFrame="_blank" w:history="1">
         <w:r>
           <w:rPr>
             <w:rStyle w:val="Hyperlink"/>
@@ -1375,7 +1375,7 @@
                     <pic:cNvPicPr/>
                   </pic:nvPicPr>
                   <pic:blipFill>
-                    <a:blip r:embed="rId6"/>
+                    <a:blip r:embed="rId7"/>
                     <a:stretch>
                       <a:fillRect/>
                     </a:stretch>
@@ -1511,7 +1511,7 @@
                     <pic:cNvPicPr/>
                   </pic:nvPicPr>
                   <pic:blipFill>
-                    <a:blip r:embed="rId7"/>
+                    <a:blip r:embed="rId8"/>
                     <a:stretch>
                       <a:fillRect/>
                     </a:stretch>
@@ -1736,7 +1736,7 @@
                     <pic:cNvPicPr/>
                   </pic:nvPicPr>
                   <pic:blipFill>
-                    <a:blip r:embed="rId8"/>
+                    <a:blip r:embed="rId9"/>
                     <a:stretch>
                       <a:fillRect/>
                     </a:stretch>
@@ -1854,7 +1854,7 @@
                     <pic:cNvPicPr/>
                   </pic:nvPicPr>
                   <pic:blipFill>
-                    <a:blip r:embed="rId9"/>
+                    <a:blip r:embed="rId10"/>
                     <a:stretch>
                       <a:fillRect/>
                     </a:stretch>
@@ -1956,7 +1956,7 @@
                     <pic:cNvPicPr/>
                   </pic:nvPicPr>
                   <pic:blipFill>
-                    <a:blip r:embed="rId10"/>
+                    <a:blip r:embed="rId11"/>
                     <a:stretch>
                       <a:fillRect/>
                     </a:stretch>
@@ -2060,7 +2060,7 @@
                     <pic:cNvPicPr/>
                   </pic:nvPicPr>
                   <pic:blipFill>
-                    <a:blip r:embed="rId11"/>
+                    <a:blip r:embed="rId12"/>
                     <a:stretch>
                       <a:fillRect/>
                     </a:stretch>
@@ -2119,7 +2119,7 @@
                     <pic:cNvPicPr/>
                   </pic:nvPicPr>
                   <pic:blipFill>
-                    <a:blip r:embed="rId12"/>
+                    <a:blip r:embed="rId13"/>
                     <a:stretch>
                       <a:fillRect/>
                     </a:stretch>
@@ -3607,7 +3607,7 @@
                     <pic:cNvPicPr/>
                   </pic:nvPicPr>
                   <pic:blipFill>
-                    <a:blip r:embed="rId13"/>
+                    <a:blip r:embed="rId14"/>
                     <a:stretch>
                       <a:fillRect/>
                     </a:stretch>
@@ -4859,7 +4859,7 @@
                     <pic:cNvPicPr/>
                   </pic:nvPicPr>
                   <pic:blipFill>
-                    <a:blip r:embed="rId14"/>
+                    <a:blip r:embed="rId15"/>
                     <a:stretch>
                       <a:fillRect/>
                     </a:stretch>
@@ -5792,7 +5792,7 @@
                     <pic:cNvPicPr/>
                   </pic:nvPicPr>
                   <pic:blipFill>
-                    <a:blip r:embed="rId15"/>
+                    <a:blip r:embed="rId16"/>
                     <a:stretch>
                       <a:fillRect/>
                     </a:stretch>
@@ -6082,7 +6082,7 @@
                     <pic:cNvPicPr/>
                   </pic:nvPicPr>
                   <pic:blipFill>
-                    <a:blip r:embed="rId16"/>
+                    <a:blip r:embed="rId17"/>
                     <a:stretch>
                       <a:fillRect/>
                     </a:stretch>
@@ -6374,7 +6374,7 @@
                     <pic:cNvPicPr/>
                   </pic:nvPicPr>
                   <pic:blipFill>
-                    <a:blip r:embed="rId17"/>
+                    <a:blip r:embed="rId18"/>
                     <a:stretch>
                       <a:fillRect/>
                     </a:stretch>
@@ -6958,6 +6958,9 @@
         <w:t xml:space="preserve">          </w:t>
       </w:r>
       <w:r>
+        <w:rPr>
+          <w:noProof/>
+        </w:rPr>
         <w:drawing>
           <wp:inline distT="0" distB="0" distL="0" distR="0" wp14:anchorId="7CD89ED9" wp14:editId="1D52EBA3">
             <wp:extent cx="5220429" cy="2667372"/>
@@ -6974,7 +6977,7 @@
                     <pic:cNvPicPr/>
                   </pic:nvPicPr>
                   <pic:blipFill>
-                    <a:blip r:embed="rId18"/>
+                    <a:blip r:embed="rId19"/>
                     <a:stretch>
                       <a:fillRect/>
                     </a:stretch>
@@ -7326,7 +7329,7 @@
                     <pic:cNvPicPr/>
                   </pic:nvPicPr>
                   <pic:blipFill>
-                    <a:blip r:embed="rId19">
+                    <a:blip r:embed="rId20">
                       <a:extLst>
                         <a:ext uri="{28A0092B-C50C-407E-A947-70E740481C1C}">
                           <a14:useLocalDpi xmlns:a14="http://schemas.microsoft.com/office/drawing/2010/main" val="0"/>
@@ -7364,6 +7367,7 @@
         <w:rPr>
           <w:b/>
           <w:bCs/>
+          <w:noProof/>
         </w:rPr>
         <w:drawing>
           <wp:inline distT="0" distB="0" distL="0" distR="0" wp14:anchorId="1F6DE1CB" wp14:editId="06CB4261">
@@ -7381,7 +7385,7 @@
                     <pic:cNvPicPr/>
                   </pic:nvPicPr>
                   <pic:blipFill>
-                    <a:blip r:embed="rId20"/>
+                    <a:blip r:embed="rId21"/>
                     <a:stretch>
                       <a:fillRect/>
                     </a:stretch>
@@ -8412,6 +8416,9 @@
     </w:p>
     <w:p>
       <w:r>
+        <w:rPr>
+          <w:noProof/>
+        </w:rPr>
         <w:drawing>
           <wp:inline distT="0" distB="0" distL="0" distR="0" wp14:anchorId="1C7AEF3B" wp14:editId="7DBE3B87">
             <wp:extent cx="5731510" cy="5184775"/>
@@ -8428,7 +8435,7 @@
                     <pic:cNvPicPr/>
                   </pic:nvPicPr>
                   <pic:blipFill>
-                    <a:blip r:embed="rId21"/>
+                    <a:blip r:embed="rId22"/>
                     <a:stretch>
                       <a:fillRect/>
                     </a:stretch>
@@ -9053,6 +9060,1509 @@
         </w:pict>
       </w:r>
     </w:p>
+    <w:p>
+      <w:pPr>
+        <w:rPr>
+          <w:b/>
+          <w:bCs/>
+          <w:sz w:val="32"/>
+          <w:szCs w:val="32"/>
+          <w:u w:val="single"/>
+        </w:rPr>
+      </w:pPr>
+      <w:r>
+        <w:rPr>
+          <w:b/>
+          <w:bCs/>
+          <w:sz w:val="32"/>
+          <w:szCs w:val="32"/>
+        </w:rPr>
+        <w:t xml:space="preserve"># </w:t>
+      </w:r>
+      <w:r>
+        <w:rPr>
+          <w:b/>
+          <w:bCs/>
+          <w:sz w:val="32"/>
+          <w:szCs w:val="32"/>
+          <w:u w:val="single"/>
+        </w:rPr>
+        <w:t>IMPORTANT</w:t>
+      </w:r>
+      <w:r>
+        <w:rPr>
+          <w:b/>
+          <w:bCs/>
+          <w:sz w:val="32"/>
+          <w:szCs w:val="32"/>
+          <w:u w:val="single"/>
+        </w:rPr>
+        <w:t>-&gt; JS IS DYNAMICALLY TYPED??</w:t>
+      </w:r>
+    </w:p>
+    <w:p>
+      <w:r>
+        <w:rPr>
+          <w:noProof/>
+        </w:rPr>
+        <w:drawing>
+          <wp:inline distT="0" distB="0" distL="0" distR="0" wp14:anchorId="111FB232" wp14:editId="1541ED59">
+            <wp:extent cx="5731510" cy="3282950"/>
+            <wp:effectExtent l="0" t="0" r="2540" b="0"/>
+            <wp:docPr id="560294291" name="Picture 1"/>
+            <wp:cNvGraphicFramePr>
+              <a:graphicFrameLocks xmlns:a="http://schemas.openxmlformats.org/drawingml/2006/main" noChangeAspect="1"/>
+            </wp:cNvGraphicFramePr>
+            <a:graphic xmlns:a="http://schemas.openxmlformats.org/drawingml/2006/main">
+              <a:graphicData uri="http://schemas.openxmlformats.org/drawingml/2006/picture">
+                <pic:pic xmlns:pic="http://schemas.openxmlformats.org/drawingml/2006/picture">
+                  <pic:nvPicPr>
+                    <pic:cNvPr id="560294291" name=""/>
+                    <pic:cNvPicPr/>
+                  </pic:nvPicPr>
+                  <pic:blipFill>
+                    <a:blip r:embed="rId23"/>
+                    <a:stretch>
+                      <a:fillRect/>
+                    </a:stretch>
+                  </pic:blipFill>
+                  <pic:spPr>
+                    <a:xfrm>
+                      <a:off x="0" y="0"/>
+                      <a:ext cx="5731510" cy="3282950"/>
+                    </a:xfrm>
+                    <a:prstGeom prst="rect">
+                      <a:avLst/>
+                    </a:prstGeom>
+                  </pic:spPr>
+                </pic:pic>
+              </a:graphicData>
+            </a:graphic>
+          </wp:inline>
+        </w:drawing>
+      </w:r>
+    </w:p>
+    <w:p>
+      <w:r>
+        <w:rPr>
+          <w:noProof/>
+        </w:rPr>
+        <w:drawing>
+          <wp:inline distT="0" distB="0" distL="0" distR="0" wp14:anchorId="032820FA" wp14:editId="3585BA7D">
+            <wp:extent cx="5430008" cy="1028844"/>
+            <wp:effectExtent l="0" t="0" r="0" b="0"/>
+            <wp:docPr id="2139420137" name="Picture 1"/>
+            <wp:cNvGraphicFramePr>
+              <a:graphicFrameLocks xmlns:a="http://schemas.openxmlformats.org/drawingml/2006/main" noChangeAspect="1"/>
+            </wp:cNvGraphicFramePr>
+            <a:graphic xmlns:a="http://schemas.openxmlformats.org/drawingml/2006/main">
+              <a:graphicData uri="http://schemas.openxmlformats.org/drawingml/2006/picture">
+                <pic:pic xmlns:pic="http://schemas.openxmlformats.org/drawingml/2006/picture">
+                  <pic:nvPicPr>
+                    <pic:cNvPr id="2139420137" name=""/>
+                    <pic:cNvPicPr/>
+                  </pic:nvPicPr>
+                  <pic:blipFill>
+                    <a:blip r:embed="rId24"/>
+                    <a:stretch>
+                      <a:fillRect/>
+                    </a:stretch>
+                  </pic:blipFill>
+                  <pic:spPr>
+                    <a:xfrm>
+                      <a:off x="0" y="0"/>
+                      <a:ext cx="5430008" cy="1028844"/>
+                    </a:xfrm>
+                    <a:prstGeom prst="rect">
+                      <a:avLst/>
+                    </a:prstGeom>
+                  </pic:spPr>
+                </pic:pic>
+              </a:graphicData>
+            </a:graphic>
+          </wp:inline>
+        </w:drawing>
+      </w:r>
+    </w:p>
+    <w:p>
+      <w:r>
+        <w:rPr>
+          <w:noProof/>
+        </w:rPr>
+        <w:lastRenderedPageBreak/>
+        <w:drawing>
+          <wp:inline distT="0" distB="0" distL="0" distR="0" wp14:anchorId="65F6ADD5" wp14:editId="758A8642">
+            <wp:extent cx="5731510" cy="5037455"/>
+            <wp:effectExtent l="0" t="0" r="2540" b="0"/>
+            <wp:docPr id="1093703265" name="Picture 1"/>
+            <wp:cNvGraphicFramePr>
+              <a:graphicFrameLocks xmlns:a="http://schemas.openxmlformats.org/drawingml/2006/main" noChangeAspect="1"/>
+            </wp:cNvGraphicFramePr>
+            <a:graphic xmlns:a="http://schemas.openxmlformats.org/drawingml/2006/main">
+              <a:graphicData uri="http://schemas.openxmlformats.org/drawingml/2006/picture">
+                <pic:pic xmlns:pic="http://schemas.openxmlformats.org/drawingml/2006/picture">
+                  <pic:nvPicPr>
+                    <pic:cNvPr id="1093703265" name=""/>
+                    <pic:cNvPicPr/>
+                  </pic:nvPicPr>
+                  <pic:blipFill>
+                    <a:blip r:embed="rId25"/>
+                    <a:stretch>
+                      <a:fillRect/>
+                    </a:stretch>
+                  </pic:blipFill>
+                  <pic:spPr>
+                    <a:xfrm>
+                      <a:off x="0" y="0"/>
+                      <a:ext cx="5731510" cy="5037455"/>
+                    </a:xfrm>
+                    <a:prstGeom prst="rect">
+                      <a:avLst/>
+                    </a:prstGeom>
+                  </pic:spPr>
+                </pic:pic>
+              </a:graphicData>
+            </a:graphic>
+          </wp:inline>
+        </w:drawing>
+      </w:r>
+      <w:r>
+        <w:pict w14:anchorId="6D8BE882">
+          <v:rect id="_x0000_i1041" style="width:0;height:1.5pt" o:hralign="center" o:hrstd="t" o:hr="t" fillcolor="#a0a0a0" stroked="f"/>
+        </w:pict>
+      </w:r>
+    </w:p>
+    <w:p>
+      <w:pPr>
+        <w:rPr>
+          <w:b/>
+          <w:bCs/>
+          <w:sz w:val="36"/>
+          <w:szCs w:val="36"/>
+          <w:u w:val="single"/>
+        </w:rPr>
+      </w:pPr>
+      <w:r>
+        <w:rPr>
+          <w:b/>
+          <w:bCs/>
+          <w:sz w:val="36"/>
+          <w:szCs w:val="36"/>
+          <w:u w:val="single"/>
+        </w:rPr>
+        <w:t>JAVASCRIPT NOTES (</w:t>
+      </w:r>
+      <w:r>
+        <w:rPr>
+          <w:b/>
+          <w:bCs/>
+          <w:sz w:val="36"/>
+          <w:szCs w:val="36"/>
+          <w:u w:val="single"/>
+        </w:rPr>
+        <w:t>5)</w:t>
+      </w:r>
+    </w:p>
+    <w:p>
+      <w:pPr>
+        <w:rPr>
+          <w:b/>
+          <w:bCs/>
+        </w:rPr>
+      </w:pPr>
+      <w:r>
+        <w:rPr>
+          <w:b/>
+          <w:bCs/>
+        </w:rPr>
+        <w:t xml:space="preserve">1. Conversion ki </w:t>
+      </w:r>
+      <w:proofErr w:type="spellStart"/>
+      <w:r>
+        <w:rPr>
+          <w:b/>
+          <w:bCs/>
+        </w:rPr>
+        <w:t>Zaroorat</w:t>
+      </w:r>
+      <w:proofErr w:type="spellEnd"/>
+      <w:r>
+        <w:rPr>
+          <w:b/>
+          <w:bCs/>
+        </w:rPr>
+        <w:t xml:space="preserve"> Kyun?</w:t>
+      </w:r>
+    </w:p>
+    <w:p>
+      <w:r>
+        <w:t xml:space="preserve">Kai </w:t>
+      </w:r>
+      <w:proofErr w:type="spellStart"/>
+      <w:r>
+        <w:t>baar</w:t>
+      </w:r>
+      <w:proofErr w:type="spellEnd"/>
+      <w:r>
+        <w:t xml:space="preserve"> backend </w:t>
+      </w:r>
+      <w:proofErr w:type="spellStart"/>
+      <w:r>
+        <w:t>se</w:t>
+      </w:r>
+      <w:proofErr w:type="spellEnd"/>
+      <w:r>
+        <w:t xml:space="preserve"> </w:t>
+      </w:r>
+      <w:proofErr w:type="spellStart"/>
+      <w:r>
+        <w:t>ya</w:t>
+      </w:r>
+      <w:proofErr w:type="spellEnd"/>
+      <w:r>
+        <w:t xml:space="preserve"> </w:t>
+      </w:r>
+      <w:proofErr w:type="spellStart"/>
+      <w:r>
+        <w:t>kisi</w:t>
+      </w:r>
+      <w:proofErr w:type="spellEnd"/>
+      <w:r>
+        <w:t xml:space="preserve"> form se data </w:t>
+      </w:r>
+      <w:proofErr w:type="spellStart"/>
+      <w:r>
+        <w:t>aata</w:t>
+      </w:r>
+      <w:proofErr w:type="spellEnd"/>
+      <w:r>
+        <w:t xml:space="preserve"> </w:t>
+      </w:r>
+      <w:proofErr w:type="spellStart"/>
+      <w:r>
+        <w:t>hai</w:t>
+      </w:r>
+      <w:proofErr w:type="spellEnd"/>
+      <w:r>
+        <w:t xml:space="preserve">, </w:t>
+      </w:r>
+      <w:proofErr w:type="spellStart"/>
+      <w:r>
+        <w:t>toh</w:t>
+      </w:r>
+      <w:proofErr w:type="spellEnd"/>
+      <w:r>
+        <w:t xml:space="preserve"> wo </w:t>
+      </w:r>
+      <w:proofErr w:type="spellStart"/>
+      <w:r>
+        <w:t>humesha</w:t>
+      </w:r>
+      <w:proofErr w:type="spellEnd"/>
+      <w:r>
+        <w:t xml:space="preserve"> "Number" </w:t>
+      </w:r>
+      <w:proofErr w:type="spellStart"/>
+      <w:r>
+        <w:t>nahi</w:t>
+      </w:r>
+      <w:proofErr w:type="spellEnd"/>
+      <w:r>
+        <w:t xml:space="preserve"> </w:t>
+      </w:r>
+      <w:proofErr w:type="spellStart"/>
+      <w:r>
+        <w:t>hota</w:t>
+      </w:r>
+      <w:proofErr w:type="spellEnd"/>
+      <w:r>
+        <w:t xml:space="preserve">. Ho </w:t>
+      </w:r>
+      <w:proofErr w:type="spellStart"/>
+      <w:r>
+        <w:t>sakta</w:t>
+      </w:r>
+      <w:proofErr w:type="spellEnd"/>
+      <w:r>
+        <w:t xml:space="preserve"> </w:t>
+      </w:r>
+      <w:proofErr w:type="spellStart"/>
+      <w:r>
+        <w:t>hai</w:t>
+      </w:r>
+      <w:proofErr w:type="spellEnd"/>
+      <w:r>
+        <w:t xml:space="preserve"> user ne "33" </w:t>
+      </w:r>
+      <w:proofErr w:type="spellStart"/>
+      <w:r>
+        <w:t>likha</w:t>
+      </w:r>
+      <w:proofErr w:type="spellEnd"/>
+      <w:r>
+        <w:t xml:space="preserve"> </w:t>
+      </w:r>
+      <w:proofErr w:type="spellStart"/>
+      <w:r>
+        <w:t>ho</w:t>
+      </w:r>
+      <w:proofErr w:type="spellEnd"/>
+      <w:r>
+        <w:t xml:space="preserve">, par wo </w:t>
+      </w:r>
+      <w:proofErr w:type="spellStart"/>
+      <w:r>
+        <w:t>aapke</w:t>
+      </w:r>
+      <w:proofErr w:type="spellEnd"/>
+      <w:r>
+        <w:t xml:space="preserve"> </w:t>
+      </w:r>
+      <w:proofErr w:type="spellStart"/>
+      <w:r>
+        <w:t>paas</w:t>
+      </w:r>
+      <w:proofErr w:type="spellEnd"/>
+      <w:r>
+        <w:t xml:space="preserve"> </w:t>
+      </w:r>
+      <w:r>
+        <w:rPr>
+          <w:b/>
+          <w:bCs/>
+        </w:rPr>
+        <w:t>String</w:t>
+      </w:r>
+      <w:r>
+        <w:t xml:space="preserve"> </w:t>
+      </w:r>
+      <w:proofErr w:type="spellStart"/>
+      <w:r>
+        <w:t>bankar</w:t>
+      </w:r>
+      <w:proofErr w:type="spellEnd"/>
+      <w:r>
+        <w:t xml:space="preserve"> </w:t>
+      </w:r>
+      <w:proofErr w:type="spellStart"/>
+      <w:r>
+        <w:t>aaye</w:t>
+      </w:r>
+      <w:proofErr w:type="spellEnd"/>
+      <w:r>
+        <w:t xml:space="preserve">. Ab agar </w:t>
+      </w:r>
+      <w:proofErr w:type="spellStart"/>
+      <w:r>
+        <w:t>aapko</w:t>
+      </w:r>
+      <w:proofErr w:type="spellEnd"/>
+      <w:r>
+        <w:t xml:space="preserve"> </w:t>
+      </w:r>
+      <w:proofErr w:type="spellStart"/>
+      <w:r>
+        <w:t>ispar</w:t>
+      </w:r>
+      <w:proofErr w:type="spellEnd"/>
+      <w:r>
+        <w:t xml:space="preserve"> math </w:t>
+      </w:r>
+      <w:proofErr w:type="spellStart"/>
+      <w:r>
+        <w:t>karna</w:t>
+      </w:r>
+      <w:proofErr w:type="spellEnd"/>
+      <w:r>
+        <w:t xml:space="preserve"> </w:t>
+      </w:r>
+      <w:proofErr w:type="spellStart"/>
+      <w:r>
+        <w:t>hai</w:t>
+      </w:r>
+      <w:proofErr w:type="spellEnd"/>
+      <w:r>
+        <w:t xml:space="preserve">, </w:t>
+      </w:r>
+      <w:proofErr w:type="spellStart"/>
+      <w:r>
+        <w:t>toh</w:t>
+      </w:r>
+      <w:proofErr w:type="spellEnd"/>
+      <w:r>
+        <w:t xml:space="preserve"> </w:t>
+      </w:r>
+      <w:proofErr w:type="spellStart"/>
+      <w:r>
+        <w:t>isey</w:t>
+      </w:r>
+      <w:proofErr w:type="spellEnd"/>
+      <w:r>
+        <w:t xml:space="preserve"> Number </w:t>
+      </w:r>
+      <w:proofErr w:type="spellStart"/>
+      <w:r>
+        <w:t>mein</w:t>
+      </w:r>
+      <w:proofErr w:type="spellEnd"/>
+      <w:r>
+        <w:t xml:space="preserve"> convert </w:t>
+      </w:r>
+      <w:proofErr w:type="spellStart"/>
+      <w:r>
+        <w:t>karna</w:t>
+      </w:r>
+      <w:proofErr w:type="spellEnd"/>
+      <w:r>
+        <w:t xml:space="preserve"> </w:t>
+      </w:r>
+      <w:proofErr w:type="spellStart"/>
+      <w:r>
+        <w:t>padega</w:t>
+      </w:r>
+      <w:proofErr w:type="spellEnd"/>
+      <w:r>
+        <w:t>.</w:t>
+      </w:r>
+      <w:r>
+        <w:pict w14:anchorId="65F7EE79">
+          <v:rect id="_x0000_i1055" style="width:0;height:1.5pt" o:hralign="center" o:hrstd="t" o:hr="t" fillcolor="#a0a0a0" stroked="f"/>
+        </w:pict>
+      </w:r>
+      <w:r>
+        <w:rPr>
+          <w:b/>
+          <w:bCs/>
+        </w:rPr>
+        <w:t>String to Number Conversion</w:t>
+      </w:r>
+    </w:p>
+    <w:p>
+      <w:proofErr w:type="spellStart"/>
+      <w:r>
+        <w:t>Aap</w:t>
+      </w:r>
+      <w:proofErr w:type="spellEnd"/>
+      <w:r>
+        <w:t xml:space="preserve"> </w:t>
+      </w:r>
+      <w:proofErr w:type="gramStart"/>
+      <w:r>
+        <w:t>Number(</w:t>
+      </w:r>
+      <w:proofErr w:type="gramEnd"/>
+      <w:r>
+        <w:t xml:space="preserve">) constructor ka use </w:t>
+      </w:r>
+      <w:proofErr w:type="spellStart"/>
+      <w:r>
+        <w:t>karke</w:t>
+      </w:r>
+      <w:proofErr w:type="spellEnd"/>
+      <w:r>
+        <w:t xml:space="preserve"> </w:t>
+      </w:r>
+      <w:proofErr w:type="spellStart"/>
+      <w:r>
+        <w:t>kisi</w:t>
+      </w:r>
+      <w:proofErr w:type="spellEnd"/>
+      <w:r>
+        <w:t xml:space="preserve"> </w:t>
+      </w:r>
+      <w:proofErr w:type="spellStart"/>
+      <w:r>
+        <w:t>bhi</w:t>
+      </w:r>
+      <w:proofErr w:type="spellEnd"/>
+      <w:r>
+        <w:t xml:space="preserve"> </w:t>
+      </w:r>
+      <w:proofErr w:type="spellStart"/>
+      <w:r>
+        <w:t>cheez</w:t>
+      </w:r>
+      <w:proofErr w:type="spellEnd"/>
+      <w:r>
+        <w:t xml:space="preserve"> ko number </w:t>
+      </w:r>
+      <w:proofErr w:type="spellStart"/>
+      <w:r>
+        <w:t>mein</w:t>
+      </w:r>
+      <w:proofErr w:type="spellEnd"/>
+      <w:r>
+        <w:t xml:space="preserve"> </w:t>
+      </w:r>
+      <w:proofErr w:type="spellStart"/>
+      <w:r>
+        <w:t>badalne</w:t>
+      </w:r>
+      <w:proofErr w:type="spellEnd"/>
+      <w:r>
+        <w:t xml:space="preserve"> ki </w:t>
+      </w:r>
+      <w:proofErr w:type="spellStart"/>
+      <w:r>
+        <w:t>koshish</w:t>
+      </w:r>
+      <w:proofErr w:type="spellEnd"/>
+      <w:r>
+        <w:t xml:space="preserve"> </w:t>
+      </w:r>
+      <w:proofErr w:type="spellStart"/>
+      <w:r>
+        <w:t>kar</w:t>
+      </w:r>
+      <w:proofErr w:type="spellEnd"/>
+      <w:r>
+        <w:t xml:space="preserve"> </w:t>
+      </w:r>
+      <w:proofErr w:type="spellStart"/>
+      <w:r>
+        <w:t>sakte</w:t>
+      </w:r>
+      <w:proofErr w:type="spellEnd"/>
+      <w:r>
+        <w:t xml:space="preserve"> ho. Lekin results </w:t>
+      </w:r>
+      <w:proofErr w:type="spellStart"/>
+      <w:r>
+        <w:t>dhyan</w:t>
+      </w:r>
+      <w:proofErr w:type="spellEnd"/>
+      <w:r>
+        <w:t xml:space="preserve"> se </w:t>
+      </w:r>
+      <w:proofErr w:type="spellStart"/>
+      <w:r>
+        <w:t>dekho</w:t>
+      </w:r>
+      <w:proofErr w:type="spellEnd"/>
+      <w:r>
+        <w:t>:</w:t>
+      </w:r>
+    </w:p>
+    <w:p>
+      <w:r>
+        <w:rPr>
+          <w:b/>
+          <w:bCs/>
+        </w:rPr>
+        <w:lastRenderedPageBreak/>
+        <w:drawing>
+          <wp:inline distT="0" distB="0" distL="0" distR="0" wp14:anchorId="26D7B104" wp14:editId="3BAEBDF8">
+            <wp:extent cx="5515745" cy="2048161"/>
+            <wp:effectExtent l="0" t="0" r="8890" b="9525"/>
+            <wp:docPr id="485469593" name="Picture 1"/>
+            <wp:cNvGraphicFramePr>
+              <a:graphicFrameLocks xmlns:a="http://schemas.openxmlformats.org/drawingml/2006/main" noChangeAspect="1"/>
+            </wp:cNvGraphicFramePr>
+            <a:graphic xmlns:a="http://schemas.openxmlformats.org/drawingml/2006/main">
+              <a:graphicData uri="http://schemas.openxmlformats.org/drawingml/2006/picture">
+                <pic:pic xmlns:pic="http://schemas.openxmlformats.org/drawingml/2006/picture">
+                  <pic:nvPicPr>
+                    <pic:cNvPr id="485469593" name=""/>
+                    <pic:cNvPicPr/>
+                  </pic:nvPicPr>
+                  <pic:blipFill>
+                    <a:blip r:embed="rId26"/>
+                    <a:stretch>
+                      <a:fillRect/>
+                    </a:stretch>
+                  </pic:blipFill>
+                  <pic:spPr>
+                    <a:xfrm>
+                      <a:off x="0" y="0"/>
+                      <a:ext cx="5515745" cy="2048161"/>
+                    </a:xfrm>
+                    <a:prstGeom prst="rect">
+                      <a:avLst/>
+                    </a:prstGeom>
+                  </pic:spPr>
+                </pic:pic>
+              </a:graphicData>
+            </a:graphic>
+          </wp:inline>
+        </w:drawing>
+      </w:r>
+    </w:p>
+    <w:p>
+      <w:r>
+        <w:t>S</w:t>
+      </w:r>
+      <w:r>
+        <w:t xml:space="preserve">ir ne </w:t>
+      </w:r>
+      <w:proofErr w:type="spellStart"/>
+      <w:r>
+        <w:t>dikhaya</w:t>
+      </w:r>
+      <w:proofErr w:type="spellEnd"/>
+      <w:r>
+        <w:t xml:space="preserve"> </w:t>
+      </w:r>
+      <w:proofErr w:type="spellStart"/>
+      <w:r>
+        <w:t>hai</w:t>
+      </w:r>
+      <w:proofErr w:type="spellEnd"/>
+      <w:r>
+        <w:t xml:space="preserve"> ki </w:t>
+      </w:r>
+      <w:proofErr w:type="spellStart"/>
+      <w:r>
+        <w:t>sirf</w:t>
+      </w:r>
+      <w:proofErr w:type="spellEnd"/>
+      <w:r>
+        <w:t xml:space="preserve"> </w:t>
+      </w:r>
+      <w:proofErr w:type="spellStart"/>
+      <w:r>
+        <w:t>typeof</w:t>
+      </w:r>
+      <w:proofErr w:type="spellEnd"/>
+      <w:r>
+        <w:t xml:space="preserve"> par </w:t>
+      </w:r>
+      <w:proofErr w:type="spellStart"/>
+      <w:r>
+        <w:t>bharosa</w:t>
+      </w:r>
+      <w:proofErr w:type="spellEnd"/>
+      <w:r>
+        <w:t xml:space="preserve"> mat karo, value </w:t>
+      </w:r>
+      <w:proofErr w:type="spellStart"/>
+      <w:r>
+        <w:t>bhi</w:t>
+      </w:r>
+      <w:proofErr w:type="spellEnd"/>
+      <w:r>
+        <w:t xml:space="preserve"> print </w:t>
+      </w:r>
+      <w:proofErr w:type="spellStart"/>
+      <w:r>
+        <w:t>karke</w:t>
+      </w:r>
+      <w:proofErr w:type="spellEnd"/>
+      <w:r>
+        <w:t xml:space="preserve"> </w:t>
+      </w:r>
+      <w:proofErr w:type="spellStart"/>
+      <w:r>
+        <w:t>dekho</w:t>
+      </w:r>
+      <w:proofErr w:type="spellEnd"/>
+      <w:r>
+        <w:t xml:space="preserve"> ki wo </w:t>
+      </w:r>
+      <w:proofErr w:type="spellStart"/>
+      <w:r>
+        <w:t>NaN</w:t>
+      </w:r>
+      <w:proofErr w:type="spellEnd"/>
+      <w:r>
+        <w:t xml:space="preserve"> </w:t>
+      </w:r>
+      <w:proofErr w:type="spellStart"/>
+      <w:r>
+        <w:t>toh</w:t>
+      </w:r>
+      <w:proofErr w:type="spellEnd"/>
+      <w:r>
+        <w:t xml:space="preserve"> </w:t>
+      </w:r>
+      <w:proofErr w:type="spellStart"/>
+      <w:r>
+        <w:t>nahi</w:t>
+      </w:r>
+      <w:proofErr w:type="spellEnd"/>
+      <w:r>
+        <w:t xml:space="preserve"> </w:t>
+      </w:r>
+      <w:proofErr w:type="spellStart"/>
+      <w:r>
+        <w:t>ho</w:t>
+      </w:r>
+      <w:proofErr w:type="spellEnd"/>
+      <w:r>
+        <w:t xml:space="preserve"> </w:t>
+      </w:r>
+      <w:proofErr w:type="spellStart"/>
+      <w:r>
+        <w:t>gayi</w:t>
+      </w:r>
+      <w:proofErr w:type="spellEnd"/>
+      <w:r>
+        <w:t>.</w:t>
+      </w:r>
+    </w:p>
+    <w:p>
+      <w:r>
+        <w:drawing>
+          <wp:inline distT="0" distB="0" distL="0" distR="0" wp14:anchorId="084537ED" wp14:editId="6EF6966A">
+            <wp:extent cx="5731510" cy="1802130"/>
+            <wp:effectExtent l="0" t="0" r="2540" b="7620"/>
+            <wp:docPr id="1766346052" name="Picture 1"/>
+            <wp:cNvGraphicFramePr>
+              <a:graphicFrameLocks xmlns:a="http://schemas.openxmlformats.org/drawingml/2006/main" noChangeAspect="1"/>
+            </wp:cNvGraphicFramePr>
+            <a:graphic xmlns:a="http://schemas.openxmlformats.org/drawingml/2006/main">
+              <a:graphicData uri="http://schemas.openxmlformats.org/drawingml/2006/picture">
+                <pic:pic xmlns:pic="http://schemas.openxmlformats.org/drawingml/2006/picture">
+                  <pic:nvPicPr>
+                    <pic:cNvPr id="1766346052" name=""/>
+                    <pic:cNvPicPr/>
+                  </pic:nvPicPr>
+                  <pic:blipFill>
+                    <a:blip r:embed="rId27"/>
+                    <a:stretch>
+                      <a:fillRect/>
+                    </a:stretch>
+                  </pic:blipFill>
+                  <pic:spPr>
+                    <a:xfrm>
+                      <a:off x="0" y="0"/>
+                      <a:ext cx="5731510" cy="1802130"/>
+                    </a:xfrm>
+                    <a:prstGeom prst="rect">
+                      <a:avLst/>
+                    </a:prstGeom>
+                  </pic:spPr>
+                </pic:pic>
+              </a:graphicData>
+            </a:graphic>
+          </wp:inline>
+        </w:drawing>
+      </w:r>
+      <w:r>
+        <w:pict w14:anchorId="02A34EB6">
+          <v:rect id="_x0000_i1053" style="width:0;height:1.5pt" o:hralign="center" o:hrstd="t" o:hr="t" fillcolor="#a0a0a0" stroked="f"/>
+        </w:pict>
+      </w:r>
+      <w:r>
+        <w:rPr>
+          <w:b/>
+          <w:bCs/>
+        </w:rPr>
+        <w:t>3. Boolean Conversion</w:t>
+      </w:r>
+    </w:p>
+    <w:p>
+      <w:r>
+        <w:t xml:space="preserve">Jab </w:t>
+      </w:r>
+      <w:proofErr w:type="spellStart"/>
+      <w:r>
+        <w:t>aap</w:t>
+      </w:r>
+      <w:proofErr w:type="spellEnd"/>
+      <w:r>
+        <w:t xml:space="preserve"> </w:t>
+      </w:r>
+      <w:proofErr w:type="gramStart"/>
+      <w:r>
+        <w:t>Boolean(</w:t>
+      </w:r>
+      <w:proofErr w:type="gramEnd"/>
+      <w:r>
+        <w:t xml:space="preserve">) ka use </w:t>
+      </w:r>
+      <w:proofErr w:type="spellStart"/>
+      <w:r>
+        <w:t>karte</w:t>
+      </w:r>
+      <w:proofErr w:type="spellEnd"/>
+      <w:r>
+        <w:t xml:space="preserve"> </w:t>
+      </w:r>
+      <w:proofErr w:type="spellStart"/>
+      <w:r>
+        <w:t>ho</w:t>
+      </w:r>
+      <w:proofErr w:type="spellEnd"/>
+      <w:r>
+        <w:t xml:space="preserve">, </w:t>
+      </w:r>
+      <w:proofErr w:type="spellStart"/>
+      <w:r>
+        <w:t>toh</w:t>
+      </w:r>
+      <w:proofErr w:type="spellEnd"/>
+      <w:r>
+        <w:t xml:space="preserve"> JS in rules ko follow </w:t>
+      </w:r>
+      <w:proofErr w:type="spellStart"/>
+      <w:r>
+        <w:t>karta</w:t>
+      </w:r>
+      <w:proofErr w:type="spellEnd"/>
+      <w:r>
+        <w:t xml:space="preserve"> </w:t>
+      </w:r>
+      <w:proofErr w:type="spellStart"/>
+      <w:r>
+        <w:t>hai</w:t>
+      </w:r>
+      <w:proofErr w:type="spellEnd"/>
+      <w:r>
+        <w:t>:</w:t>
+      </w:r>
+    </w:p>
+    <w:p>
+      <w:r>
+        <w:rPr>
+          <w:b/>
+          <w:bCs/>
+        </w:rPr>
+        <w:drawing>
+          <wp:inline distT="0" distB="0" distL="0" distR="0" wp14:anchorId="10909519" wp14:editId="6B3BAEE7">
+            <wp:extent cx="5573151" cy="1775011"/>
+            <wp:effectExtent l="0" t="0" r="8890" b="0"/>
+            <wp:docPr id="1971795318" name="Picture 1"/>
+            <wp:cNvGraphicFramePr>
+              <a:graphicFrameLocks xmlns:a="http://schemas.openxmlformats.org/drawingml/2006/main" noChangeAspect="1"/>
+            </wp:cNvGraphicFramePr>
+            <a:graphic xmlns:a="http://schemas.openxmlformats.org/drawingml/2006/main">
+              <a:graphicData uri="http://schemas.openxmlformats.org/drawingml/2006/picture">
+                <pic:pic xmlns:pic="http://schemas.openxmlformats.org/drawingml/2006/picture">
+                  <pic:nvPicPr>
+                    <pic:cNvPr id="1971795318" name=""/>
+                    <pic:cNvPicPr/>
+                  </pic:nvPicPr>
+                  <pic:blipFill>
+                    <a:blip r:embed="rId28"/>
+                    <a:stretch>
+                      <a:fillRect/>
+                    </a:stretch>
+                  </pic:blipFill>
+                  <pic:spPr>
+                    <a:xfrm>
+                      <a:off x="0" y="0"/>
+                      <a:ext cx="5595301" cy="1782066"/>
+                    </a:xfrm>
+                    <a:prstGeom prst="rect">
+                      <a:avLst/>
+                    </a:prstGeom>
+                  </pic:spPr>
+                </pic:pic>
+              </a:graphicData>
+            </a:graphic>
+          </wp:inline>
+        </w:drawing>
+      </w:r>
+    </w:p>
+    <w:p/>
+    <w:p>
+      <w:r>
+        <w:lastRenderedPageBreak/>
+        <w:t xml:space="preserve">    </w:t>
+      </w:r>
+      <w:r>
+        <w:drawing>
+          <wp:inline distT="0" distB="0" distL="0" distR="0" wp14:anchorId="167B559A" wp14:editId="20E46A8E">
+            <wp:extent cx="5422518" cy="4948518"/>
+            <wp:effectExtent l="0" t="0" r="6985" b="5080"/>
+            <wp:docPr id="717126579" name="Picture 1"/>
+            <wp:cNvGraphicFramePr>
+              <a:graphicFrameLocks xmlns:a="http://schemas.openxmlformats.org/drawingml/2006/main" noChangeAspect="1"/>
+            </wp:cNvGraphicFramePr>
+            <a:graphic xmlns:a="http://schemas.openxmlformats.org/drawingml/2006/main">
+              <a:graphicData uri="http://schemas.openxmlformats.org/drawingml/2006/picture">
+                <pic:pic xmlns:pic="http://schemas.openxmlformats.org/drawingml/2006/picture">
+                  <pic:nvPicPr>
+                    <pic:cNvPr id="717126579" name=""/>
+                    <pic:cNvPicPr/>
+                  </pic:nvPicPr>
+                  <pic:blipFill>
+                    <a:blip r:embed="rId29"/>
+                    <a:stretch>
+                      <a:fillRect/>
+                    </a:stretch>
+                  </pic:blipFill>
+                  <pic:spPr>
+                    <a:xfrm>
+                      <a:off x="0" y="0"/>
+                      <a:ext cx="5504965" cy="5023758"/>
+                    </a:xfrm>
+                    <a:prstGeom prst="rect">
+                      <a:avLst/>
+                    </a:prstGeom>
+                  </pic:spPr>
+                </pic:pic>
+              </a:graphicData>
+            </a:graphic>
+          </wp:inline>
+        </w:drawing>
+      </w:r>
+      <w:r>
+        <w:pict w14:anchorId="032ABCA9">
+          <v:rect id="_x0000_i1052" style="width:0;height:1.5pt" o:hralign="center" o:hrstd="t" o:hr="t" fillcolor="#a0a0a0" stroked="f"/>
+        </w:pict>
+      </w:r>
+      <w:r>
+        <w:rPr>
+          <w:b/>
+          <w:bCs/>
+        </w:rPr>
+        <w:t>4. String Conversion</w:t>
+      </w:r>
+    </w:p>
+    <w:p>
+      <w:proofErr w:type="spellStart"/>
+      <w:r>
+        <w:t>Aap</w:t>
+      </w:r>
+      <w:proofErr w:type="spellEnd"/>
+      <w:r>
+        <w:t xml:space="preserve"> </w:t>
+      </w:r>
+      <w:proofErr w:type="spellStart"/>
+      <w:r>
+        <w:t>kisi</w:t>
+      </w:r>
+      <w:proofErr w:type="spellEnd"/>
+      <w:r>
+        <w:t xml:space="preserve"> number ko </w:t>
+      </w:r>
+      <w:proofErr w:type="gramStart"/>
+      <w:r>
+        <w:t>String(</w:t>
+      </w:r>
+      <w:proofErr w:type="gramEnd"/>
+      <w:r>
+        <w:t xml:space="preserve">) use </w:t>
+      </w:r>
+      <w:proofErr w:type="spellStart"/>
+      <w:r>
+        <w:t>karke</w:t>
+      </w:r>
+      <w:proofErr w:type="spellEnd"/>
+      <w:r>
+        <w:t xml:space="preserve"> text </w:t>
+      </w:r>
+      <w:proofErr w:type="spellStart"/>
+      <w:r>
+        <w:t>mein</w:t>
+      </w:r>
+      <w:proofErr w:type="spellEnd"/>
+      <w:r>
+        <w:t xml:space="preserve"> </w:t>
+      </w:r>
+      <w:proofErr w:type="spellStart"/>
+      <w:r>
+        <w:t>badal</w:t>
+      </w:r>
+      <w:proofErr w:type="spellEnd"/>
+      <w:r>
+        <w:t xml:space="preserve"> </w:t>
+      </w:r>
+      <w:proofErr w:type="spellStart"/>
+      <w:r>
+        <w:t>sakte</w:t>
+      </w:r>
+      <w:proofErr w:type="spellEnd"/>
+      <w:r>
+        <w:t xml:space="preserve"> </w:t>
+      </w:r>
+      <w:proofErr w:type="spellStart"/>
+      <w:r>
+        <w:t>ho</w:t>
+      </w:r>
+      <w:proofErr w:type="spellEnd"/>
+      <w:r>
+        <w:t>:</w:t>
+      </w:r>
+    </w:p>
+    <w:p>
+      <w:pPr>
+        <w:numPr>
+          <w:ilvl w:val="0"/>
+          <w:numId w:val="25"/>
+        </w:numPr>
+      </w:pPr>
+      <w:r>
+        <w:rPr>
+          <w:b/>
+          <w:bCs/>
+        </w:rPr>
+        <w:t>33</w:t>
+      </w:r>
+      <w:r>
+        <w:t xml:space="preserve"> </w:t>
+      </w:r>
+      <w:r>
+        <w:t xml:space="preserve">=&gt; </w:t>
+      </w:r>
+      <w:r>
+        <w:t xml:space="preserve">"33". Iska </w:t>
+      </w:r>
+      <w:proofErr w:type="spellStart"/>
+      <w:r>
+        <w:t>typeof</w:t>
+      </w:r>
+      <w:proofErr w:type="spellEnd"/>
+      <w:r>
+        <w:t xml:space="preserve"> check </w:t>
+      </w:r>
+      <w:proofErr w:type="spellStart"/>
+      <w:r>
+        <w:t>karoge</w:t>
+      </w:r>
+      <w:proofErr w:type="spellEnd"/>
+      <w:r>
+        <w:t xml:space="preserve"> </w:t>
+      </w:r>
+      <w:proofErr w:type="spellStart"/>
+      <w:r>
+        <w:t>toh</w:t>
+      </w:r>
+      <w:proofErr w:type="spellEnd"/>
+      <w:r>
+        <w:t xml:space="preserve"> string </w:t>
+      </w:r>
+      <w:proofErr w:type="spellStart"/>
+      <w:r>
+        <w:t>aayega</w:t>
+      </w:r>
+      <w:proofErr w:type="spellEnd"/>
+      <w:r>
+        <w:t>.</w:t>
+      </w:r>
+    </w:p>
+    <w:p>
+      <w:r>
+        <w:drawing>
+          <wp:inline distT="0" distB="0" distL="0" distR="0" wp14:anchorId="49EF31A8" wp14:editId="7850D6CA">
+            <wp:extent cx="3439005" cy="1038370"/>
+            <wp:effectExtent l="0" t="0" r="9525" b="9525"/>
+            <wp:docPr id="45626784" name="Picture 1"/>
+            <wp:cNvGraphicFramePr>
+              <a:graphicFrameLocks xmlns:a="http://schemas.openxmlformats.org/drawingml/2006/main" noChangeAspect="1"/>
+            </wp:cNvGraphicFramePr>
+            <a:graphic xmlns:a="http://schemas.openxmlformats.org/drawingml/2006/main">
+              <a:graphicData uri="http://schemas.openxmlformats.org/drawingml/2006/picture">
+                <pic:pic xmlns:pic="http://schemas.openxmlformats.org/drawingml/2006/picture">
+                  <pic:nvPicPr>
+                    <pic:cNvPr id="45626784" name=""/>
+                    <pic:cNvPicPr/>
+                  </pic:nvPicPr>
+                  <pic:blipFill>
+                    <a:blip r:embed="rId30"/>
+                    <a:stretch>
+                      <a:fillRect/>
+                    </a:stretch>
+                  </pic:blipFill>
+                  <pic:spPr>
+                    <a:xfrm>
+                      <a:off x="0" y="0"/>
+                      <a:ext cx="3439005" cy="1038370"/>
+                    </a:xfrm>
+                    <a:prstGeom prst="rect">
+                      <a:avLst/>
+                    </a:prstGeom>
+                  </pic:spPr>
+                </pic:pic>
+              </a:graphicData>
+            </a:graphic>
+          </wp:inline>
+        </w:drawing>
+      </w:r>
+      <w:r>
+        <w:pict w14:anchorId="7CE10984">
+          <v:rect id="_x0000_i1051" style="width:0;height:1.5pt" o:hralign="center" o:hrstd="t" o:hr="t" fillcolor="#a0a0a0" stroked="f"/>
+        </w:pict>
+      </w:r>
+    </w:p>
+    <w:p>
+      <w:pPr>
+        <w:rPr>
+          <w:b/>
+          <w:bCs/>
+        </w:rPr>
+      </w:pPr>
+      <w:r>
+        <w:rPr>
+          <w:b/>
+          <w:bCs/>
+        </w:rPr>
+        <w:t>Key Takeaways:</w:t>
+      </w:r>
+    </w:p>
+    <w:p>
+      <w:pPr>
+        <w:numPr>
+          <w:ilvl w:val="0"/>
+          <w:numId w:val="26"/>
+        </w:numPr>
+      </w:pPr>
+      <w:proofErr w:type="spellStart"/>
+      <w:r>
+        <w:rPr>
+          <w:b/>
+          <w:bCs/>
+        </w:rPr>
+        <w:t>NaN</w:t>
+      </w:r>
+      <w:proofErr w:type="spellEnd"/>
+      <w:r>
+        <w:rPr>
+          <w:b/>
+          <w:bCs/>
+        </w:rPr>
+        <w:t xml:space="preserve"> (Not a Number):</w:t>
+      </w:r>
+      <w:r>
+        <w:t xml:space="preserve"> Ye tab </w:t>
+      </w:r>
+      <w:proofErr w:type="spellStart"/>
+      <w:r>
+        <w:t>aata</w:t>
+      </w:r>
+      <w:proofErr w:type="spellEnd"/>
+      <w:r>
+        <w:t xml:space="preserve"> </w:t>
+      </w:r>
+      <w:proofErr w:type="spellStart"/>
+      <w:r>
+        <w:t>hai</w:t>
+      </w:r>
+      <w:proofErr w:type="spellEnd"/>
+      <w:r>
+        <w:t xml:space="preserve"> jab JS </w:t>
+      </w:r>
+      <w:proofErr w:type="spellStart"/>
+      <w:r>
+        <w:t>kisi</w:t>
+      </w:r>
+      <w:proofErr w:type="spellEnd"/>
+      <w:r>
+        <w:t xml:space="preserve"> </w:t>
+      </w:r>
+      <w:proofErr w:type="spellStart"/>
+      <w:r>
+        <w:t>aisi</w:t>
+      </w:r>
+      <w:proofErr w:type="spellEnd"/>
+      <w:r>
+        <w:t xml:space="preserve"> </w:t>
+      </w:r>
+      <w:proofErr w:type="spellStart"/>
+      <w:r>
+        <w:t>cheez</w:t>
+      </w:r>
+      <w:proofErr w:type="spellEnd"/>
+      <w:r>
+        <w:t xml:space="preserve"> ko number </w:t>
+      </w:r>
+      <w:proofErr w:type="spellStart"/>
+      <w:r>
+        <w:t>banane</w:t>
+      </w:r>
+      <w:proofErr w:type="spellEnd"/>
+      <w:r>
+        <w:t xml:space="preserve"> ki </w:t>
+      </w:r>
+      <w:proofErr w:type="spellStart"/>
+      <w:r>
+        <w:t>koshish</w:t>
+      </w:r>
+      <w:proofErr w:type="spellEnd"/>
+      <w:r>
+        <w:t xml:space="preserve"> </w:t>
+      </w:r>
+      <w:proofErr w:type="spellStart"/>
+      <w:r>
+        <w:t>kare</w:t>
+      </w:r>
+      <w:proofErr w:type="spellEnd"/>
+      <w:r>
+        <w:t xml:space="preserve"> jo </w:t>
+      </w:r>
+      <w:proofErr w:type="spellStart"/>
+      <w:r>
+        <w:t>asliyat</w:t>
+      </w:r>
+      <w:proofErr w:type="spellEnd"/>
+      <w:r>
+        <w:t xml:space="preserve"> </w:t>
+      </w:r>
+      <w:proofErr w:type="spellStart"/>
+      <w:r>
+        <w:t>mein</w:t>
+      </w:r>
+      <w:proofErr w:type="spellEnd"/>
+      <w:r>
+        <w:t xml:space="preserve"> number </w:t>
+      </w:r>
+      <w:proofErr w:type="spellStart"/>
+      <w:r>
+        <w:t>nahi</w:t>
+      </w:r>
+      <w:proofErr w:type="spellEnd"/>
+      <w:r>
+        <w:t xml:space="preserve"> </w:t>
+      </w:r>
+      <w:proofErr w:type="spellStart"/>
+      <w:r>
+        <w:t>hai</w:t>
+      </w:r>
+      <w:proofErr w:type="spellEnd"/>
+      <w:r>
+        <w:t>.</w:t>
+      </w:r>
+    </w:p>
+    <w:p>
+      <w:pPr>
+        <w:numPr>
+          <w:ilvl w:val="0"/>
+          <w:numId w:val="26"/>
+        </w:numPr>
+      </w:pPr>
+      <w:r>
+        <w:rPr>
+          <w:b/>
+          <w:bCs/>
+        </w:rPr>
+        <w:t>null becomes 0:</w:t>
+      </w:r>
+      <w:r>
+        <w:t xml:space="preserve"> Is </w:t>
+      </w:r>
+      <w:proofErr w:type="spellStart"/>
+      <w:r>
+        <w:t>wajah</w:t>
+      </w:r>
+      <w:proofErr w:type="spellEnd"/>
+      <w:r>
+        <w:t xml:space="preserve"> se logic </w:t>
+      </w:r>
+      <w:proofErr w:type="spellStart"/>
+      <w:r>
+        <w:t>mein</w:t>
+      </w:r>
+      <w:proofErr w:type="spellEnd"/>
+      <w:r>
+        <w:t xml:space="preserve"> </w:t>
+      </w:r>
+      <w:proofErr w:type="spellStart"/>
+      <w:r>
+        <w:t>kabhi-kabhi</w:t>
+      </w:r>
+      <w:proofErr w:type="spellEnd"/>
+      <w:r>
+        <w:t xml:space="preserve"> </w:t>
+      </w:r>
+      <w:proofErr w:type="spellStart"/>
+      <w:r>
+        <w:t>galti</w:t>
+      </w:r>
+      <w:proofErr w:type="spellEnd"/>
+      <w:r>
+        <w:t xml:space="preserve"> </w:t>
+      </w:r>
+      <w:proofErr w:type="spellStart"/>
+      <w:r>
+        <w:t>ho</w:t>
+      </w:r>
+      <w:proofErr w:type="spellEnd"/>
+      <w:r>
+        <w:t xml:space="preserve"> </w:t>
+      </w:r>
+      <w:proofErr w:type="spellStart"/>
+      <w:r>
+        <w:t>sakti</w:t>
+      </w:r>
+      <w:proofErr w:type="spellEnd"/>
+      <w:r>
+        <w:t xml:space="preserve"> </w:t>
+      </w:r>
+      <w:proofErr w:type="spellStart"/>
+      <w:r>
+        <w:t>hai</w:t>
+      </w:r>
+      <w:proofErr w:type="spellEnd"/>
+      <w:r>
+        <w:t xml:space="preserve"> (</w:t>
+      </w:r>
+      <w:proofErr w:type="spellStart"/>
+      <w:r>
+        <w:t>jaise</w:t>
+      </w:r>
+      <w:proofErr w:type="spellEnd"/>
+      <w:r>
+        <w:t xml:space="preserve"> agar zero temperature </w:t>
+      </w:r>
+      <w:proofErr w:type="spellStart"/>
+      <w:r>
+        <w:t>dikhana</w:t>
+      </w:r>
+      <w:proofErr w:type="spellEnd"/>
+      <w:r>
+        <w:t xml:space="preserve"> </w:t>
+      </w:r>
+      <w:proofErr w:type="spellStart"/>
+      <w:r>
+        <w:t>ho</w:t>
+      </w:r>
+      <w:proofErr w:type="spellEnd"/>
+      <w:r>
+        <w:t>).</w:t>
+      </w:r>
+    </w:p>
+    <w:p>
+      <w:pPr>
+        <w:numPr>
+          <w:ilvl w:val="0"/>
+          <w:numId w:val="26"/>
+        </w:numPr>
+      </w:pPr>
+      <w:r>
+        <w:rPr>
+          <w:b/>
+          <w:bCs/>
+        </w:rPr>
+        <w:lastRenderedPageBreak/>
+        <w:t>Investigative Study:</w:t>
+      </w:r>
+      <w:r>
+        <w:t xml:space="preserve"> Hitesh sir ne kaha </w:t>
+      </w:r>
+      <w:proofErr w:type="spellStart"/>
+      <w:r>
+        <w:t>hai</w:t>
+      </w:r>
+      <w:proofErr w:type="spellEnd"/>
+      <w:r>
+        <w:t xml:space="preserve"> ki </w:t>
+      </w:r>
+      <w:proofErr w:type="spellStart"/>
+      <w:r>
+        <w:t>humesha</w:t>
+      </w:r>
+      <w:proofErr w:type="spellEnd"/>
+      <w:r>
+        <w:t xml:space="preserve"> console.log </w:t>
+      </w:r>
+      <w:proofErr w:type="spellStart"/>
+      <w:r>
+        <w:t>karke</w:t>
+      </w:r>
+      <w:proofErr w:type="spellEnd"/>
+      <w:r>
+        <w:t xml:space="preserve"> </w:t>
+      </w:r>
+      <w:proofErr w:type="spellStart"/>
+      <w:r>
+        <w:t>dekho</w:t>
+      </w:r>
+      <w:proofErr w:type="spellEnd"/>
+      <w:r>
+        <w:t xml:space="preserve"> ki conversion </w:t>
+      </w:r>
+      <w:proofErr w:type="spellStart"/>
+      <w:r>
+        <w:t>ke</w:t>
+      </w:r>
+      <w:proofErr w:type="spellEnd"/>
+      <w:r>
+        <w:t xml:space="preserve"> </w:t>
+      </w:r>
+      <w:proofErr w:type="spellStart"/>
+      <w:r>
+        <w:t>baad</w:t>
+      </w:r>
+      <w:proofErr w:type="spellEnd"/>
+      <w:r>
+        <w:t xml:space="preserve"> value </w:t>
+      </w:r>
+      <w:proofErr w:type="spellStart"/>
+      <w:r>
+        <w:t>kya</w:t>
+      </w:r>
+      <w:proofErr w:type="spellEnd"/>
+      <w:r>
+        <w:t xml:space="preserve"> bani </w:t>
+      </w:r>
+      <w:proofErr w:type="spellStart"/>
+      <w:r>
+        <w:t>hai</w:t>
+      </w:r>
+      <w:proofErr w:type="spellEnd"/>
+      <w:r>
+        <w:t xml:space="preserve">, </w:t>
+      </w:r>
+      <w:proofErr w:type="spellStart"/>
+      <w:r>
+        <w:t>sirf</w:t>
+      </w:r>
+      <w:proofErr w:type="spellEnd"/>
+      <w:r>
+        <w:t xml:space="preserve"> </w:t>
+      </w:r>
+      <w:proofErr w:type="spellStart"/>
+      <w:r>
+        <w:t>typeof</w:t>
+      </w:r>
+      <w:proofErr w:type="spellEnd"/>
+      <w:r>
+        <w:t xml:space="preserve"> par mat </w:t>
+      </w:r>
+      <w:proofErr w:type="spellStart"/>
+      <w:r>
+        <w:t>jao</w:t>
+      </w:r>
+      <w:proofErr w:type="spellEnd"/>
+      <w:r>
+        <w:t>.</w:t>
+      </w:r>
+    </w:p>
+    <w:p>
+      <w:r>
+        <w:drawing>
+          <wp:inline distT="0" distB="0" distL="0" distR="0" wp14:anchorId="3D5BA4AF" wp14:editId="4F77F784">
+            <wp:extent cx="5731510" cy="3549650"/>
+            <wp:effectExtent l="0" t="0" r="2540" b="0"/>
+            <wp:docPr id="251605421" name="Picture 1"/>
+            <wp:cNvGraphicFramePr>
+              <a:graphicFrameLocks xmlns:a="http://schemas.openxmlformats.org/drawingml/2006/main" noChangeAspect="1"/>
+            </wp:cNvGraphicFramePr>
+            <a:graphic xmlns:a="http://schemas.openxmlformats.org/drawingml/2006/main">
+              <a:graphicData uri="http://schemas.openxmlformats.org/drawingml/2006/picture">
+                <pic:pic xmlns:pic="http://schemas.openxmlformats.org/drawingml/2006/picture">
+                  <pic:nvPicPr>
+                    <pic:cNvPr id="251605421" name=""/>
+                    <pic:cNvPicPr/>
+                  </pic:nvPicPr>
+                  <pic:blipFill>
+                    <a:blip r:embed="rId31"/>
+                    <a:stretch>
+                      <a:fillRect/>
+                    </a:stretch>
+                  </pic:blipFill>
+                  <pic:spPr>
+                    <a:xfrm>
+                      <a:off x="0" y="0"/>
+                      <a:ext cx="5731510" cy="3549650"/>
+                    </a:xfrm>
+                    <a:prstGeom prst="rect">
+                      <a:avLst/>
+                    </a:prstGeom>
+                  </pic:spPr>
+                </pic:pic>
+              </a:graphicData>
+            </a:graphic>
+          </wp:inline>
+        </w:drawing>
+      </w:r>
+      <w:r>
+        <w:pict w14:anchorId="544A0625">
+          <v:rect id="_x0000_i1046" style="width:0;height:1.5pt" o:hralign="center" o:hrstd="t" o:hr="t" fillcolor="#a0a0a0" stroked="f"/>
+        </w:pict>
+      </w:r>
+    </w:p>
     <w:p/>
     <w:sectPr>
       <w:pgSz w:w="11906" w:h="16838"/>
@@ -9068,7 +10578,7 @@
 <w:numbering xmlns:wpc="http://schemas.microsoft.com/office/word/2010/wordprocessingCanvas" xmlns:cx="http://schemas.microsoft.com/office/drawing/2014/chartex" xmlns:cx1="http://schemas.microsoft.com/office/drawing/2015/9/8/chartex" xmlns:cx2="http://schemas.microsoft.com/office/drawing/2015/10/21/chartex" xmlns:cx3="http://schemas.microsoft.com/office/drawing/2016/5/9/chartex" xmlns:cx4="http://schemas.microsoft.com/office/drawing/2016/5/10/chartex" xmlns:cx5="http://schemas.microsoft.com/office/drawing/2016/5/11/chartex" xmlns:cx6="http://schemas.microsoft.com/office/drawing/2016/5/12/chartex" xmlns:cx7="http://schemas.microsoft.com/office/drawing/2016/5/13/chartex" xmlns:cx8="http://schemas.microsoft.com/office/drawing/2016/5/14/chartex" xmlns:mc="http://schemas.openxmlformats.org/markup-compatibility/2006" xmlns:aink="http://schemas.microsoft.com/office/drawing/2016/ink" xmlns:am3d="http://schemas.microsoft.com/office/drawing/2017/model3d" xmlns:o="urn:schemas-microsoft-com:office:office" xmlns:oel="http://schemas.microsoft.com/office/2019/extlst" xmlns:r="http://schemas.openxmlformats.org/officeDocument/2006/relationships" xmlns:m="http://schemas.openxmlformats.org/officeDocument/2006/math" xmlns:v="urn:schemas-microsoft-com:vml" xmlns:wp14="http://schemas.microsoft.com/office/word/2010/wordprocessingDrawing" xmlns:wp="http://schemas.openxmlformats.org/drawingml/2006/wordprocessingDrawing" xmlns:w10="urn:schemas-microsoft-com:office:word" xmlns:w="http://schemas.openxmlformats.org/wordprocessingml/2006/main" xmlns:w14="http://schemas.microsoft.com/office/word/2010/wordml" xmlns:w15="http://schemas.microsoft.com/office/word/2012/wordml" xmlns:w16cex="http://schemas.microsoft.com/office/word/2018/wordml/cex" xmlns:w16cid="http://schemas.microsoft.com/office/word/2016/wordml/cid" xmlns:w16="http://schemas.microsoft.com/office/word/2018/wordml" xmlns:w16du="http://schemas.microsoft.com/office/word/2023/wordml/word16du" xmlns:w16sdtdh="http://schemas.microsoft.com/office/word/2020/wordml/sdtdatahash" xmlns:w16sdtfl="http://schemas.microsoft.com/office/word/2024/wordml/sdtformatlock" xmlns:w16se="http://schemas.microsoft.com/office/word/2015/wordml/symex" xmlns:wpg="http://schemas.microsoft.com/office/word/2010/wordprocessingGroup" xmlns:wpi="http://schemas.microsoft.com/office/word/2010/wordprocessingInk" xmlns:wne="http://schemas.microsoft.com/office/word/2006/wordml" xmlns:wps="http://schemas.microsoft.com/office/word/2010/wordprocessingShape" mc:Ignorable="w14 w15 w16se w16cid w16 w16cex w16sdtdh w16sdtfl w16du wp14">
   <w:numPicBullet w:numPicBulletId="0">
     <w:pict>
-      <v:rect id="_x0000_i1031" style="width:0;height:1.5pt" o:hralign="center" o:bullet="t" o:hrstd="t" o:hr="t" fillcolor="#a0a0a0" stroked="f"/>
+      <v:rect id="_x0000_i1041" style="width:0;height:1.5pt" o:hralign="center" o:bullet="t" o:hrstd="t" o:hr="t" fillcolor="#a0a0a0" stroked="f"/>
     </w:pict>
   </w:numPicBullet>
   <w:abstractNum w:abstractNumId="0" w15:restartNumberingAfterBreak="0">
@@ -9370,6 +10880,119 @@
     </w:lvl>
   </w:abstractNum>
   <w:abstractNum w:abstractNumId="2" w15:restartNumberingAfterBreak="0">
+    <w:nsid w:val="0A7E2759"/>
+    <w:multiLevelType w:val="multilevel"/>
+    <w:tmpl w:val="5762C7D6"/>
+    <w:lvl w:ilvl="0">
+      <w:start w:val="1"/>
+      <w:numFmt w:val="decimal"/>
+      <w:lvlText w:val="%1."/>
+      <w:lvlJc w:val="left"/>
+      <w:pPr>
+        <w:tabs>
+          <w:tab w:val="num" w:pos="720"/>
+        </w:tabs>
+        <w:ind w:left="720" w:hanging="360"/>
+      </w:pPr>
+    </w:lvl>
+    <w:lvl w:ilvl="1" w:tentative="1">
+      <w:start w:val="1"/>
+      <w:numFmt w:val="decimal"/>
+      <w:lvlText w:val="%2."/>
+      <w:lvlJc w:val="left"/>
+      <w:pPr>
+        <w:tabs>
+          <w:tab w:val="num" w:pos="1440"/>
+        </w:tabs>
+        <w:ind w:left="1440" w:hanging="360"/>
+      </w:pPr>
+    </w:lvl>
+    <w:lvl w:ilvl="2" w:tentative="1">
+      <w:start w:val="1"/>
+      <w:numFmt w:val="decimal"/>
+      <w:lvlText w:val="%3."/>
+      <w:lvlJc w:val="left"/>
+      <w:pPr>
+        <w:tabs>
+          <w:tab w:val="num" w:pos="2160"/>
+        </w:tabs>
+        <w:ind w:left="2160" w:hanging="360"/>
+      </w:pPr>
+    </w:lvl>
+    <w:lvl w:ilvl="3" w:tentative="1">
+      <w:start w:val="1"/>
+      <w:numFmt w:val="decimal"/>
+      <w:lvlText w:val="%4."/>
+      <w:lvlJc w:val="left"/>
+      <w:pPr>
+        <w:tabs>
+          <w:tab w:val="num" w:pos="2880"/>
+        </w:tabs>
+        <w:ind w:left="2880" w:hanging="360"/>
+      </w:pPr>
+    </w:lvl>
+    <w:lvl w:ilvl="4" w:tentative="1">
+      <w:start w:val="1"/>
+      <w:numFmt w:val="decimal"/>
+      <w:lvlText w:val="%5."/>
+      <w:lvlJc w:val="left"/>
+      <w:pPr>
+        <w:tabs>
+          <w:tab w:val="num" w:pos="3600"/>
+        </w:tabs>
+        <w:ind w:left="3600" w:hanging="360"/>
+      </w:pPr>
+    </w:lvl>
+    <w:lvl w:ilvl="5" w:tentative="1">
+      <w:start w:val="1"/>
+      <w:numFmt w:val="decimal"/>
+      <w:lvlText w:val="%6."/>
+      <w:lvlJc w:val="left"/>
+      <w:pPr>
+        <w:tabs>
+          <w:tab w:val="num" w:pos="4320"/>
+        </w:tabs>
+        <w:ind w:left="4320" w:hanging="360"/>
+      </w:pPr>
+    </w:lvl>
+    <w:lvl w:ilvl="6" w:tentative="1">
+      <w:start w:val="1"/>
+      <w:numFmt w:val="decimal"/>
+      <w:lvlText w:val="%7."/>
+      <w:lvlJc w:val="left"/>
+      <w:pPr>
+        <w:tabs>
+          <w:tab w:val="num" w:pos="5040"/>
+        </w:tabs>
+        <w:ind w:left="5040" w:hanging="360"/>
+      </w:pPr>
+    </w:lvl>
+    <w:lvl w:ilvl="7" w:tentative="1">
+      <w:start w:val="1"/>
+      <w:numFmt w:val="decimal"/>
+      <w:lvlText w:val="%8."/>
+      <w:lvlJc w:val="left"/>
+      <w:pPr>
+        <w:tabs>
+          <w:tab w:val="num" w:pos="5760"/>
+        </w:tabs>
+        <w:ind w:left="5760" w:hanging="360"/>
+      </w:pPr>
+    </w:lvl>
+    <w:lvl w:ilvl="8" w:tentative="1">
+      <w:start w:val="1"/>
+      <w:numFmt w:val="decimal"/>
+      <w:lvlText w:val="%9."/>
+      <w:lvlJc w:val="left"/>
+      <w:pPr>
+        <w:tabs>
+          <w:tab w:val="num" w:pos="6480"/>
+        </w:tabs>
+        <w:ind w:left="6480" w:hanging="360"/>
+      </w:pPr>
+    </w:lvl>
+  </w:abstractNum>
+  <w:abstractNum w:abstractNumId="3" w15:restartNumberingAfterBreak="0">
     <w:nsid w:val="0F4A44EE"/>
     <w:multiLevelType w:val="multilevel"/>
     <w:tmpl w:val="54D281CE"/>
@@ -9518,7 +11141,7 @@
       </w:rPr>
     </w:lvl>
   </w:abstractNum>
-  <w:abstractNum w:abstractNumId="3" w15:restartNumberingAfterBreak="0">
+  <w:abstractNum w:abstractNumId="4" w15:restartNumberingAfterBreak="0">
     <w:nsid w:val="146754DF"/>
     <w:multiLevelType w:val="multilevel"/>
     <w:tmpl w:val="82881C24"/>
@@ -9667,7 +11290,7 @@
       </w:rPr>
     </w:lvl>
   </w:abstractNum>
-  <w:abstractNum w:abstractNumId="4" w15:restartNumberingAfterBreak="0">
+  <w:abstractNum w:abstractNumId="5" w15:restartNumberingAfterBreak="0">
     <w:nsid w:val="14831423"/>
     <w:multiLevelType w:val="multilevel"/>
     <w:tmpl w:val="6142A946"/>
@@ -9812,7 +11435,7 @@
       </w:rPr>
     </w:lvl>
   </w:abstractNum>
-  <w:abstractNum w:abstractNumId="5" w15:restartNumberingAfterBreak="0">
+  <w:abstractNum w:abstractNumId="6" w15:restartNumberingAfterBreak="0">
     <w:nsid w:val="17387F48"/>
     <w:multiLevelType w:val="multilevel"/>
     <w:tmpl w:val="827A1642"/>
@@ -9961,7 +11584,7 @@
       </w:rPr>
     </w:lvl>
   </w:abstractNum>
-  <w:abstractNum w:abstractNumId="6" w15:restartNumberingAfterBreak="0">
+  <w:abstractNum w:abstractNumId="7" w15:restartNumberingAfterBreak="0">
     <w:nsid w:val="1B9E2DC0"/>
     <w:multiLevelType w:val="multilevel"/>
     <w:tmpl w:val="9E1C2A48"/>
@@ -10074,7 +11697,7 @@
       </w:pPr>
     </w:lvl>
   </w:abstractNum>
-  <w:abstractNum w:abstractNumId="7" w15:restartNumberingAfterBreak="0">
+  <w:abstractNum w:abstractNumId="8" w15:restartNumberingAfterBreak="0">
     <w:nsid w:val="22344C3B"/>
     <w:multiLevelType w:val="multilevel"/>
     <w:tmpl w:val="8DBE15BE"/>
@@ -10223,7 +11846,7 @@
       </w:rPr>
     </w:lvl>
   </w:abstractNum>
-  <w:abstractNum w:abstractNumId="8" w15:restartNumberingAfterBreak="0">
+  <w:abstractNum w:abstractNumId="9" w15:restartNumberingAfterBreak="0">
     <w:nsid w:val="257838BF"/>
     <w:multiLevelType w:val="multilevel"/>
     <w:tmpl w:val="931E5548"/>
@@ -10372,7 +11995,7 @@
       </w:rPr>
     </w:lvl>
   </w:abstractNum>
-  <w:abstractNum w:abstractNumId="9" w15:restartNumberingAfterBreak="0">
+  <w:abstractNum w:abstractNumId="10" w15:restartNumberingAfterBreak="0">
     <w:nsid w:val="29F31054"/>
     <w:multiLevelType w:val="multilevel"/>
     <w:tmpl w:val="357C58B0"/>
@@ -10521,7 +12144,156 @@
       </w:rPr>
     </w:lvl>
   </w:abstractNum>
-  <w:abstractNum w:abstractNumId="10" w15:restartNumberingAfterBreak="0">
+  <w:abstractNum w:abstractNumId="11" w15:restartNumberingAfterBreak="0">
+    <w:nsid w:val="328F4473"/>
+    <w:multiLevelType w:val="multilevel"/>
+    <w:tmpl w:val="3F7616B4"/>
+    <w:lvl w:ilvl="0">
+      <w:start w:val="1"/>
+      <w:numFmt w:val="bullet"/>
+      <w:lvlText w:val=""/>
+      <w:lvlJc w:val="left"/>
+      <w:pPr>
+        <w:tabs>
+          <w:tab w:val="num" w:pos="720"/>
+        </w:tabs>
+        <w:ind w:left="720" w:hanging="360"/>
+      </w:pPr>
+      <w:rPr>
+        <w:rFonts w:ascii="Symbol" w:hAnsi="Symbol" w:hint="default"/>
+        <w:sz w:val="20"/>
+      </w:rPr>
+    </w:lvl>
+    <w:lvl w:ilvl="1" w:tentative="1">
+      <w:start w:val="1"/>
+      <w:numFmt w:val="bullet"/>
+      <w:lvlText w:val="o"/>
+      <w:lvlJc w:val="left"/>
+      <w:pPr>
+        <w:tabs>
+          <w:tab w:val="num" w:pos="1440"/>
+        </w:tabs>
+        <w:ind w:left="1440" w:hanging="360"/>
+      </w:pPr>
+      <w:rPr>
+        <w:rFonts w:ascii="Courier New" w:hAnsi="Courier New" w:hint="default"/>
+        <w:sz w:val="20"/>
+      </w:rPr>
+    </w:lvl>
+    <w:lvl w:ilvl="2" w:tentative="1">
+      <w:start w:val="1"/>
+      <w:numFmt w:val="bullet"/>
+      <w:lvlText w:val=""/>
+      <w:lvlJc w:val="left"/>
+      <w:pPr>
+        <w:tabs>
+          <w:tab w:val="num" w:pos="2160"/>
+        </w:tabs>
+        <w:ind w:left="2160" w:hanging="360"/>
+      </w:pPr>
+      <w:rPr>
+        <w:rFonts w:ascii="Wingdings" w:hAnsi="Wingdings" w:hint="default"/>
+        <w:sz w:val="20"/>
+      </w:rPr>
+    </w:lvl>
+    <w:lvl w:ilvl="3" w:tentative="1">
+      <w:start w:val="1"/>
+      <w:numFmt w:val="bullet"/>
+      <w:lvlText w:val=""/>
+      <w:lvlJc w:val="left"/>
+      <w:pPr>
+        <w:tabs>
+          <w:tab w:val="num" w:pos="2880"/>
+        </w:tabs>
+        <w:ind w:left="2880" w:hanging="360"/>
+      </w:pPr>
+      <w:rPr>
+        <w:rFonts w:ascii="Wingdings" w:hAnsi="Wingdings" w:hint="default"/>
+        <w:sz w:val="20"/>
+      </w:rPr>
+    </w:lvl>
+    <w:lvl w:ilvl="4" w:tentative="1">
+      <w:start w:val="1"/>
+      <w:numFmt w:val="bullet"/>
+      <w:lvlText w:val=""/>
+      <w:lvlJc w:val="left"/>
+      <w:pPr>
+        <w:tabs>
+          <w:tab w:val="num" w:pos="3600"/>
+        </w:tabs>
+        <w:ind w:left="3600" w:hanging="360"/>
+      </w:pPr>
+      <w:rPr>
+        <w:rFonts w:ascii="Wingdings" w:hAnsi="Wingdings" w:hint="default"/>
+        <w:sz w:val="20"/>
+      </w:rPr>
+    </w:lvl>
+    <w:lvl w:ilvl="5" w:tentative="1">
+      <w:start w:val="1"/>
+      <w:numFmt w:val="bullet"/>
+      <w:lvlText w:val=""/>
+      <w:lvlJc w:val="left"/>
+      <w:pPr>
+        <w:tabs>
+          <w:tab w:val="num" w:pos="4320"/>
+        </w:tabs>
+        <w:ind w:left="4320" w:hanging="360"/>
+      </w:pPr>
+      <w:rPr>
+        <w:rFonts w:ascii="Wingdings" w:hAnsi="Wingdings" w:hint="default"/>
+        <w:sz w:val="20"/>
+      </w:rPr>
+    </w:lvl>
+    <w:lvl w:ilvl="6" w:tentative="1">
+      <w:start w:val="1"/>
+      <w:numFmt w:val="bullet"/>
+      <w:lvlText w:val=""/>
+      <w:lvlJc w:val="left"/>
+      <w:pPr>
+        <w:tabs>
+          <w:tab w:val="num" w:pos="5040"/>
+        </w:tabs>
+        <w:ind w:left="5040" w:hanging="360"/>
+      </w:pPr>
+      <w:rPr>
+        <w:rFonts w:ascii="Wingdings" w:hAnsi="Wingdings" w:hint="default"/>
+        <w:sz w:val="20"/>
+      </w:rPr>
+    </w:lvl>
+    <w:lvl w:ilvl="7" w:tentative="1">
+      <w:start w:val="1"/>
+      <w:numFmt w:val="bullet"/>
+      <w:lvlText w:val=""/>
+      <w:lvlJc w:val="left"/>
+      <w:pPr>
+        <w:tabs>
+          <w:tab w:val="num" w:pos="5760"/>
+        </w:tabs>
+        <w:ind w:left="5760" w:hanging="360"/>
+      </w:pPr>
+      <w:rPr>
+        <w:rFonts w:ascii="Wingdings" w:hAnsi="Wingdings" w:hint="default"/>
+        <w:sz w:val="20"/>
+      </w:rPr>
+    </w:lvl>
+    <w:lvl w:ilvl="8" w:tentative="1">
+      <w:start w:val="1"/>
+      <w:numFmt w:val="bullet"/>
+      <w:lvlText w:val=""/>
+      <w:lvlJc w:val="left"/>
+      <w:pPr>
+        <w:tabs>
+          <w:tab w:val="num" w:pos="6480"/>
+        </w:tabs>
+        <w:ind w:left="6480" w:hanging="360"/>
+      </w:pPr>
+      <w:rPr>
+        <w:rFonts w:ascii="Wingdings" w:hAnsi="Wingdings" w:hint="default"/>
+        <w:sz w:val="20"/>
+      </w:rPr>
+    </w:lvl>
+  </w:abstractNum>
+  <w:abstractNum w:abstractNumId="12" w15:restartNumberingAfterBreak="0">
     <w:nsid w:val="33923578"/>
     <w:multiLevelType w:val="multilevel"/>
     <w:tmpl w:val="EB42FD92"/>
@@ -10670,7 +12442,7 @@
       </w:rPr>
     </w:lvl>
   </w:abstractNum>
-  <w:abstractNum w:abstractNumId="11" w15:restartNumberingAfterBreak="0">
+  <w:abstractNum w:abstractNumId="13" w15:restartNumberingAfterBreak="0">
     <w:nsid w:val="35EE1AD9"/>
     <w:multiLevelType w:val="multilevel"/>
     <w:tmpl w:val="52063FB2"/>
@@ -10819,7 +12591,7 @@
       </w:rPr>
     </w:lvl>
   </w:abstractNum>
-  <w:abstractNum w:abstractNumId="12" w15:restartNumberingAfterBreak="0">
+  <w:abstractNum w:abstractNumId="14" w15:restartNumberingAfterBreak="0">
     <w:nsid w:val="3C763A2D"/>
     <w:multiLevelType w:val="multilevel"/>
     <w:tmpl w:val="373A1C18"/>
@@ -10968,7 +12740,156 @@
       </w:rPr>
     </w:lvl>
   </w:abstractNum>
-  <w:abstractNum w:abstractNumId="13" w15:restartNumberingAfterBreak="0">
+  <w:abstractNum w:abstractNumId="15" w15:restartNumberingAfterBreak="0">
+    <w:nsid w:val="3F991AB3"/>
+    <w:multiLevelType w:val="multilevel"/>
+    <w:tmpl w:val="D7C07BB0"/>
+    <w:lvl w:ilvl="0">
+      <w:start w:val="1"/>
+      <w:numFmt w:val="bullet"/>
+      <w:lvlText w:val=""/>
+      <w:lvlJc w:val="left"/>
+      <w:pPr>
+        <w:tabs>
+          <w:tab w:val="num" w:pos="720"/>
+        </w:tabs>
+        <w:ind w:left="720" w:hanging="360"/>
+      </w:pPr>
+      <w:rPr>
+        <w:rFonts w:ascii="Symbol" w:hAnsi="Symbol" w:hint="default"/>
+        <w:sz w:val="20"/>
+      </w:rPr>
+    </w:lvl>
+    <w:lvl w:ilvl="1" w:tentative="1">
+      <w:start w:val="1"/>
+      <w:numFmt w:val="bullet"/>
+      <w:lvlText w:val="o"/>
+      <w:lvlJc w:val="left"/>
+      <w:pPr>
+        <w:tabs>
+          <w:tab w:val="num" w:pos="1440"/>
+        </w:tabs>
+        <w:ind w:left="1440" w:hanging="360"/>
+      </w:pPr>
+      <w:rPr>
+        <w:rFonts w:ascii="Courier New" w:hAnsi="Courier New" w:hint="default"/>
+        <w:sz w:val="20"/>
+      </w:rPr>
+    </w:lvl>
+    <w:lvl w:ilvl="2" w:tentative="1">
+      <w:start w:val="1"/>
+      <w:numFmt w:val="bullet"/>
+      <w:lvlText w:val=""/>
+      <w:lvlJc w:val="left"/>
+      <w:pPr>
+        <w:tabs>
+          <w:tab w:val="num" w:pos="2160"/>
+        </w:tabs>
+        <w:ind w:left="2160" w:hanging="360"/>
+      </w:pPr>
+      <w:rPr>
+        <w:rFonts w:ascii="Wingdings" w:hAnsi="Wingdings" w:hint="default"/>
+        <w:sz w:val="20"/>
+      </w:rPr>
+    </w:lvl>
+    <w:lvl w:ilvl="3" w:tentative="1">
+      <w:start w:val="1"/>
+      <w:numFmt w:val="bullet"/>
+      <w:lvlText w:val=""/>
+      <w:lvlJc w:val="left"/>
+      <w:pPr>
+        <w:tabs>
+          <w:tab w:val="num" w:pos="2880"/>
+        </w:tabs>
+        <w:ind w:left="2880" w:hanging="360"/>
+      </w:pPr>
+      <w:rPr>
+        <w:rFonts w:ascii="Wingdings" w:hAnsi="Wingdings" w:hint="default"/>
+        <w:sz w:val="20"/>
+      </w:rPr>
+    </w:lvl>
+    <w:lvl w:ilvl="4" w:tentative="1">
+      <w:start w:val="1"/>
+      <w:numFmt w:val="bullet"/>
+      <w:lvlText w:val=""/>
+      <w:lvlJc w:val="left"/>
+      <w:pPr>
+        <w:tabs>
+          <w:tab w:val="num" w:pos="3600"/>
+        </w:tabs>
+        <w:ind w:left="3600" w:hanging="360"/>
+      </w:pPr>
+      <w:rPr>
+        <w:rFonts w:ascii="Wingdings" w:hAnsi="Wingdings" w:hint="default"/>
+        <w:sz w:val="20"/>
+      </w:rPr>
+    </w:lvl>
+    <w:lvl w:ilvl="5" w:tentative="1">
+      <w:start w:val="1"/>
+      <w:numFmt w:val="bullet"/>
+      <w:lvlText w:val=""/>
+      <w:lvlJc w:val="left"/>
+      <w:pPr>
+        <w:tabs>
+          <w:tab w:val="num" w:pos="4320"/>
+        </w:tabs>
+        <w:ind w:left="4320" w:hanging="360"/>
+      </w:pPr>
+      <w:rPr>
+        <w:rFonts w:ascii="Wingdings" w:hAnsi="Wingdings" w:hint="default"/>
+        <w:sz w:val="20"/>
+      </w:rPr>
+    </w:lvl>
+    <w:lvl w:ilvl="6" w:tentative="1">
+      <w:start w:val="1"/>
+      <w:numFmt w:val="bullet"/>
+      <w:lvlText w:val=""/>
+      <w:lvlJc w:val="left"/>
+      <w:pPr>
+        <w:tabs>
+          <w:tab w:val="num" w:pos="5040"/>
+        </w:tabs>
+        <w:ind w:left="5040" w:hanging="360"/>
+      </w:pPr>
+      <w:rPr>
+        <w:rFonts w:ascii="Wingdings" w:hAnsi="Wingdings" w:hint="default"/>
+        <w:sz w:val="20"/>
+      </w:rPr>
+    </w:lvl>
+    <w:lvl w:ilvl="7" w:tentative="1">
+      <w:start w:val="1"/>
+      <w:numFmt w:val="bullet"/>
+      <w:lvlText w:val=""/>
+      <w:lvlJc w:val="left"/>
+      <w:pPr>
+        <w:tabs>
+          <w:tab w:val="num" w:pos="5760"/>
+        </w:tabs>
+        <w:ind w:left="5760" w:hanging="360"/>
+      </w:pPr>
+      <w:rPr>
+        <w:rFonts w:ascii="Wingdings" w:hAnsi="Wingdings" w:hint="default"/>
+        <w:sz w:val="20"/>
+      </w:rPr>
+    </w:lvl>
+    <w:lvl w:ilvl="8" w:tentative="1">
+      <w:start w:val="1"/>
+      <w:numFmt w:val="bullet"/>
+      <w:lvlText w:val=""/>
+      <w:lvlJc w:val="left"/>
+      <w:pPr>
+        <w:tabs>
+          <w:tab w:val="num" w:pos="6480"/>
+        </w:tabs>
+        <w:ind w:left="6480" w:hanging="360"/>
+      </w:pPr>
+      <w:rPr>
+        <w:rFonts w:ascii="Wingdings" w:hAnsi="Wingdings" w:hint="default"/>
+        <w:sz w:val="20"/>
+      </w:rPr>
+    </w:lvl>
+  </w:abstractNum>
+  <w:abstractNum w:abstractNumId="16" w15:restartNumberingAfterBreak="0">
     <w:nsid w:val="53B754AC"/>
     <w:multiLevelType w:val="multilevel"/>
     <w:tmpl w:val="0854C724"/>
@@ -11117,7 +13038,7 @@
       </w:rPr>
     </w:lvl>
   </w:abstractNum>
-  <w:abstractNum w:abstractNumId="14" w15:restartNumberingAfterBreak="0">
+  <w:abstractNum w:abstractNumId="17" w15:restartNumberingAfterBreak="0">
     <w:nsid w:val="55FC7277"/>
     <w:multiLevelType w:val="multilevel"/>
     <w:tmpl w:val="FCEED21E"/>
@@ -11230,7 +13151,7 @@
       </w:pPr>
     </w:lvl>
   </w:abstractNum>
-  <w:abstractNum w:abstractNumId="15" w15:restartNumberingAfterBreak="0">
+  <w:abstractNum w:abstractNumId="18" w15:restartNumberingAfterBreak="0">
     <w:nsid w:val="5A3741C6"/>
     <w:multiLevelType w:val="multilevel"/>
     <w:tmpl w:val="F5BA7EFE"/>
@@ -11379,7 +13300,7 @@
       </w:rPr>
     </w:lvl>
   </w:abstractNum>
-  <w:abstractNum w:abstractNumId="16" w15:restartNumberingAfterBreak="0">
+  <w:abstractNum w:abstractNumId="19" w15:restartNumberingAfterBreak="0">
     <w:nsid w:val="5C5023A8"/>
     <w:multiLevelType w:val="multilevel"/>
     <w:tmpl w:val="3E7EEADA"/>
@@ -11528,7 +13449,156 @@
       </w:rPr>
     </w:lvl>
   </w:abstractNum>
-  <w:abstractNum w:abstractNumId="17" w15:restartNumberingAfterBreak="0">
+  <w:abstractNum w:abstractNumId="20" w15:restartNumberingAfterBreak="0">
+    <w:nsid w:val="5CC41962"/>
+    <w:multiLevelType w:val="multilevel"/>
+    <w:tmpl w:val="F98AD5E6"/>
+    <w:lvl w:ilvl="0">
+      <w:start w:val="1"/>
+      <w:numFmt w:val="bullet"/>
+      <w:lvlText w:val=""/>
+      <w:lvlJc w:val="left"/>
+      <w:pPr>
+        <w:tabs>
+          <w:tab w:val="num" w:pos="720"/>
+        </w:tabs>
+        <w:ind w:left="720" w:hanging="360"/>
+      </w:pPr>
+      <w:rPr>
+        <w:rFonts w:ascii="Symbol" w:hAnsi="Symbol" w:hint="default"/>
+        <w:sz w:val="20"/>
+      </w:rPr>
+    </w:lvl>
+    <w:lvl w:ilvl="1" w:tentative="1">
+      <w:start w:val="1"/>
+      <w:numFmt w:val="bullet"/>
+      <w:lvlText w:val="o"/>
+      <w:lvlJc w:val="left"/>
+      <w:pPr>
+        <w:tabs>
+          <w:tab w:val="num" w:pos="1440"/>
+        </w:tabs>
+        <w:ind w:left="1440" w:hanging="360"/>
+      </w:pPr>
+      <w:rPr>
+        <w:rFonts w:ascii="Courier New" w:hAnsi="Courier New" w:hint="default"/>
+        <w:sz w:val="20"/>
+      </w:rPr>
+    </w:lvl>
+    <w:lvl w:ilvl="2" w:tentative="1">
+      <w:start w:val="1"/>
+      <w:numFmt w:val="bullet"/>
+      <w:lvlText w:val=""/>
+      <w:lvlJc w:val="left"/>
+      <w:pPr>
+        <w:tabs>
+          <w:tab w:val="num" w:pos="2160"/>
+        </w:tabs>
+        <w:ind w:left="2160" w:hanging="360"/>
+      </w:pPr>
+      <w:rPr>
+        <w:rFonts w:ascii="Wingdings" w:hAnsi="Wingdings" w:hint="default"/>
+        <w:sz w:val="20"/>
+      </w:rPr>
+    </w:lvl>
+    <w:lvl w:ilvl="3" w:tentative="1">
+      <w:start w:val="1"/>
+      <w:numFmt w:val="bullet"/>
+      <w:lvlText w:val=""/>
+      <w:lvlJc w:val="left"/>
+      <w:pPr>
+        <w:tabs>
+          <w:tab w:val="num" w:pos="2880"/>
+        </w:tabs>
+        <w:ind w:left="2880" w:hanging="360"/>
+      </w:pPr>
+      <w:rPr>
+        <w:rFonts w:ascii="Wingdings" w:hAnsi="Wingdings" w:hint="default"/>
+        <w:sz w:val="20"/>
+      </w:rPr>
+    </w:lvl>
+    <w:lvl w:ilvl="4" w:tentative="1">
+      <w:start w:val="1"/>
+      <w:numFmt w:val="bullet"/>
+      <w:lvlText w:val=""/>
+      <w:lvlJc w:val="left"/>
+      <w:pPr>
+        <w:tabs>
+          <w:tab w:val="num" w:pos="3600"/>
+        </w:tabs>
+        <w:ind w:left="3600" w:hanging="360"/>
+      </w:pPr>
+      <w:rPr>
+        <w:rFonts w:ascii="Wingdings" w:hAnsi="Wingdings" w:hint="default"/>
+        <w:sz w:val="20"/>
+      </w:rPr>
+    </w:lvl>
+    <w:lvl w:ilvl="5" w:tentative="1">
+      <w:start w:val="1"/>
+      <w:numFmt w:val="bullet"/>
+      <w:lvlText w:val=""/>
+      <w:lvlJc w:val="left"/>
+      <w:pPr>
+        <w:tabs>
+          <w:tab w:val="num" w:pos="4320"/>
+        </w:tabs>
+        <w:ind w:left="4320" w:hanging="360"/>
+      </w:pPr>
+      <w:rPr>
+        <w:rFonts w:ascii="Wingdings" w:hAnsi="Wingdings" w:hint="default"/>
+        <w:sz w:val="20"/>
+      </w:rPr>
+    </w:lvl>
+    <w:lvl w:ilvl="6" w:tentative="1">
+      <w:start w:val="1"/>
+      <w:numFmt w:val="bullet"/>
+      <w:lvlText w:val=""/>
+      <w:lvlJc w:val="left"/>
+      <w:pPr>
+        <w:tabs>
+          <w:tab w:val="num" w:pos="5040"/>
+        </w:tabs>
+        <w:ind w:left="5040" w:hanging="360"/>
+      </w:pPr>
+      <w:rPr>
+        <w:rFonts w:ascii="Wingdings" w:hAnsi="Wingdings" w:hint="default"/>
+        <w:sz w:val="20"/>
+      </w:rPr>
+    </w:lvl>
+    <w:lvl w:ilvl="7" w:tentative="1">
+      <w:start w:val="1"/>
+      <w:numFmt w:val="bullet"/>
+      <w:lvlText w:val=""/>
+      <w:lvlJc w:val="left"/>
+      <w:pPr>
+        <w:tabs>
+          <w:tab w:val="num" w:pos="5760"/>
+        </w:tabs>
+        <w:ind w:left="5760" w:hanging="360"/>
+      </w:pPr>
+      <w:rPr>
+        <w:rFonts w:ascii="Wingdings" w:hAnsi="Wingdings" w:hint="default"/>
+        <w:sz w:val="20"/>
+      </w:rPr>
+    </w:lvl>
+    <w:lvl w:ilvl="8" w:tentative="1">
+      <w:start w:val="1"/>
+      <w:numFmt w:val="bullet"/>
+      <w:lvlText w:val=""/>
+      <w:lvlJc w:val="left"/>
+      <w:pPr>
+        <w:tabs>
+          <w:tab w:val="num" w:pos="6480"/>
+        </w:tabs>
+        <w:ind w:left="6480" w:hanging="360"/>
+      </w:pPr>
+      <w:rPr>
+        <w:rFonts w:ascii="Wingdings" w:hAnsi="Wingdings" w:hint="default"/>
+        <w:sz w:val="20"/>
+      </w:rPr>
+    </w:lvl>
+  </w:abstractNum>
+  <w:abstractNum w:abstractNumId="21" w15:restartNumberingAfterBreak="0">
     <w:nsid w:val="64264E9A"/>
     <w:multiLevelType w:val="multilevel"/>
     <w:tmpl w:val="4196AC08"/>
@@ -11641,7 +13711,7 @@
       </w:pPr>
     </w:lvl>
   </w:abstractNum>
-  <w:abstractNum w:abstractNumId="18" w15:restartNumberingAfterBreak="0">
+  <w:abstractNum w:abstractNumId="22" w15:restartNumberingAfterBreak="0">
     <w:nsid w:val="70732DB6"/>
     <w:multiLevelType w:val="multilevel"/>
     <w:tmpl w:val="A9C67EE8"/>
@@ -11754,7 +13824,7 @@
       </w:pPr>
     </w:lvl>
   </w:abstractNum>
-  <w:abstractNum w:abstractNumId="19" w15:restartNumberingAfterBreak="0">
+  <w:abstractNum w:abstractNumId="23" w15:restartNumberingAfterBreak="0">
     <w:nsid w:val="76DE0254"/>
     <w:multiLevelType w:val="multilevel"/>
     <w:tmpl w:val="24FE7538"/>
@@ -11903,7 +13973,7 @@
       </w:rPr>
     </w:lvl>
   </w:abstractNum>
-  <w:abstractNum w:abstractNumId="20" w15:restartNumberingAfterBreak="0">
+  <w:abstractNum w:abstractNumId="24" w15:restartNumberingAfterBreak="0">
     <w:nsid w:val="7C40730E"/>
     <w:multiLevelType w:val="multilevel"/>
     <w:tmpl w:val="4EC44F78"/>
@@ -12016,7 +14086,7 @@
       </w:pPr>
     </w:lvl>
   </w:abstractNum>
-  <w:abstractNum w:abstractNumId="21" w15:restartNumberingAfterBreak="0">
+  <w:abstractNum w:abstractNumId="25" w15:restartNumberingAfterBreak="0">
     <w:nsid w:val="7CCC01C9"/>
     <w:multiLevelType w:val="multilevel"/>
     <w:tmpl w:val="656C6610"/>
@@ -12130,70 +14200,82 @@
     </w:lvl>
   </w:abstractNum>
   <w:num w:numId="1" w16cid:durableId="305085771">
-    <w:abstractNumId w:val="11"/>
+    <w:abstractNumId w:val="13"/>
   </w:num>
   <w:num w:numId="2" w16cid:durableId="581524277">
-    <w:abstractNumId w:val="8"/>
+    <w:abstractNumId w:val="9"/>
   </w:num>
   <w:num w:numId="3" w16cid:durableId="695161013">
-    <w:abstractNumId w:val="13"/>
+    <w:abstractNumId w:val="16"/>
   </w:num>
   <w:num w:numId="4" w16cid:durableId="1966420648">
-    <w:abstractNumId w:val="18"/>
+    <w:abstractNumId w:val="22"/>
   </w:num>
   <w:num w:numId="5" w16cid:durableId="372508527">
-    <w:abstractNumId w:val="17"/>
+    <w:abstractNumId w:val="21"/>
   </w:num>
   <w:num w:numId="6" w16cid:durableId="988827085">
-    <w:abstractNumId w:val="16"/>
+    <w:abstractNumId w:val="19"/>
   </w:num>
   <w:num w:numId="7" w16cid:durableId="260647793">
-    <w:abstractNumId w:val="20"/>
+    <w:abstractNumId w:val="24"/>
   </w:num>
   <w:num w:numId="8" w16cid:durableId="202527156">
     <w:abstractNumId w:val="1"/>
   </w:num>
   <w:num w:numId="9" w16cid:durableId="706218535">
-    <w:abstractNumId w:val="19"/>
+    <w:abstractNumId w:val="23"/>
   </w:num>
   <w:num w:numId="10" w16cid:durableId="734400429">
-    <w:abstractNumId w:val="6"/>
+    <w:abstractNumId w:val="7"/>
   </w:num>
   <w:num w:numId="11" w16cid:durableId="1295868554">
-    <w:abstractNumId w:val="7"/>
+    <w:abstractNumId w:val="8"/>
   </w:num>
   <w:num w:numId="12" w16cid:durableId="1047141599">
+    <w:abstractNumId w:val="5"/>
+  </w:num>
+  <w:num w:numId="13" w16cid:durableId="583732473">
+    <w:abstractNumId w:val="14"/>
+  </w:num>
+  <w:num w:numId="14" w16cid:durableId="1058015792">
+    <w:abstractNumId w:val="12"/>
+  </w:num>
+  <w:num w:numId="15" w16cid:durableId="2020310721">
     <w:abstractNumId w:val="4"/>
   </w:num>
-  <w:num w:numId="13" w16cid:durableId="583732473">
-    <w:abstractNumId w:val="12"/>
-  </w:num>
-  <w:num w:numId="14" w16cid:durableId="1058015792">
-    <w:abstractNumId w:val="10"/>
-  </w:num>
-  <w:num w:numId="15" w16cid:durableId="2020310721">
+  <w:num w:numId="16" w16cid:durableId="327368084">
     <w:abstractNumId w:val="3"/>
   </w:num>
-  <w:num w:numId="16" w16cid:durableId="327368084">
-    <w:abstractNumId w:val="2"/>
-  </w:num>
   <w:num w:numId="17" w16cid:durableId="34939295">
-    <w:abstractNumId w:val="21"/>
+    <w:abstractNumId w:val="25"/>
   </w:num>
   <w:num w:numId="18" w16cid:durableId="877009161">
     <w:abstractNumId w:val="0"/>
   </w:num>
   <w:num w:numId="19" w16cid:durableId="424228631">
-    <w:abstractNumId w:val="5"/>
+    <w:abstractNumId w:val="6"/>
   </w:num>
   <w:num w:numId="20" w16cid:durableId="1497957781">
-    <w:abstractNumId w:val="9"/>
+    <w:abstractNumId w:val="10"/>
   </w:num>
   <w:num w:numId="21" w16cid:durableId="833765505">
-    <w:abstractNumId w:val="14"/>
+    <w:abstractNumId w:val="17"/>
   </w:num>
   <w:num w:numId="22" w16cid:durableId="995450667">
+    <w:abstractNumId w:val="18"/>
+  </w:num>
+  <w:num w:numId="23" w16cid:durableId="920456383">
+    <w:abstractNumId w:val="20"/>
+  </w:num>
+  <w:num w:numId="24" w16cid:durableId="1360089471">
     <w:abstractNumId w:val="15"/>
+  </w:num>
+  <w:num w:numId="25" w16cid:durableId="729579019">
+    <w:abstractNumId w:val="11"/>
+  </w:num>
+  <w:num w:numId="26" w16cid:durableId="1931309371">
+    <w:abstractNumId w:val="2"/>
   </w:num>
 </w:numbering>
 </file>
@@ -12801,7 +14883,6 @@
   <w:style w:type="character" w:default="1" w:styleId="DefaultParagraphFont">
     <w:name w:val="Default Paragraph Font"/>
     <w:uiPriority w:val="1"/>
-    <w:semiHidden/>
     <w:unhideWhenUsed/>
   </w:style>
   <w:style w:type="table" w:default="1" w:styleId="TableNormal">
@@ -13434,4 +15515,16 @@
     </a:ext>
   </a:extLst>
 </a:theme>
+</file>
+
+<file path=customXml/item1.xml><?xml version="1.0" encoding="utf-8"?>
+<b:Sources xmlns:b="http://schemas.openxmlformats.org/officeDocument/2006/bibliography" xmlns="http://schemas.openxmlformats.org/officeDocument/2006/bibliography" SelectedStyle="\APASixthEditionOfficeOnline.xsl" StyleName="APA" Version="6"/>
+</file>
+
+<file path=customXml/itemProps1.xml><?xml version="1.0" encoding="utf-8"?>
+<ds:datastoreItem xmlns:ds="http://schemas.openxmlformats.org/officeDocument/2006/customXml" ds:itemID="{D87056B6-4C12-4C3D-AC2D-797F19275A0B}">
+  <ds:schemaRefs>
+    <ds:schemaRef ds:uri="http://schemas.openxmlformats.org/officeDocument/2006/bibliography"/>
+  </ds:schemaRefs>
+</ds:datastoreItem>
 </file>
</xml_diff>

<commit_message>
got some extra insights about conversion and updated notes
</commit_message>
<xml_diff>
--- a/JAVASCRIPT NOTES.docx
+++ b/JAVASCRIPT NOTES.docx
@@ -10563,6 +10563,377 @@
         </w:pict>
       </w:r>
     </w:p>
+    <w:p>
+      <w:pPr>
+        <w:rPr>
+          <w:b/>
+          <w:bCs/>
+          <w:sz w:val="36"/>
+          <w:szCs w:val="36"/>
+          <w:u w:val="single"/>
+        </w:rPr>
+      </w:pPr>
+      <w:r>
+        <w:rPr>
+          <w:b/>
+          <w:bCs/>
+          <w:sz w:val="36"/>
+          <w:szCs w:val="36"/>
+          <w:u w:val="single"/>
+        </w:rPr>
+        <w:t>JAVASCRIPT NOTES (</w:t>
+      </w:r>
+      <w:r>
+        <w:rPr>
+          <w:b/>
+          <w:bCs/>
+          <w:sz w:val="36"/>
+          <w:szCs w:val="36"/>
+          <w:u w:val="single"/>
+        </w:rPr>
+        <w:t>6</w:t>
+      </w:r>
+      <w:r>
+        <w:rPr>
+          <w:b/>
+          <w:bCs/>
+          <w:sz w:val="36"/>
+          <w:szCs w:val="36"/>
+          <w:u w:val="single"/>
+        </w:rPr>
+        <w:t>)</w:t>
+      </w:r>
+    </w:p>
+    <w:p>
+      <w:pPr>
+        <w:rPr>
+          <w:b/>
+          <w:bCs/>
+          <w:sz w:val="32"/>
+          <w:szCs w:val="32"/>
+        </w:rPr>
+      </w:pPr>
+      <w:r>
+        <w:rPr>
+          <w:b/>
+          <w:bCs/>
+          <w:sz w:val="32"/>
+          <w:szCs w:val="32"/>
+        </w:rPr>
+        <w:t>#</w:t>
+      </w:r>
+      <w:r>
+        <w:rPr>
+          <w:b/>
+          <w:bCs/>
+          <w:sz w:val="32"/>
+          <w:szCs w:val="32"/>
+        </w:rPr>
+        <w:t xml:space="preserve"> </w:t>
+      </w:r>
+      <w:r>
+        <w:rPr>
+          <w:b/>
+          <w:bCs/>
+          <w:sz w:val="32"/>
+          <w:szCs w:val="32"/>
+          <w:u w:val="single"/>
+        </w:rPr>
+        <w:t>ESSENTIAL EXTRA INFORMATION</w:t>
+      </w:r>
+    </w:p>
+    <w:p>
+      <w:r>
+        <w:drawing>
+          <wp:inline distT="0" distB="0" distL="0" distR="0" wp14:anchorId="17C16AFE" wp14:editId="723242FA">
+            <wp:extent cx="5668166" cy="2686425"/>
+            <wp:effectExtent l="0" t="0" r="8890" b="0"/>
+            <wp:docPr id="666656338" name="Picture 1"/>
+            <wp:cNvGraphicFramePr>
+              <a:graphicFrameLocks xmlns:a="http://schemas.openxmlformats.org/drawingml/2006/main" noChangeAspect="1"/>
+            </wp:cNvGraphicFramePr>
+            <a:graphic xmlns:a="http://schemas.openxmlformats.org/drawingml/2006/main">
+              <a:graphicData uri="http://schemas.openxmlformats.org/drawingml/2006/picture">
+                <pic:pic xmlns:pic="http://schemas.openxmlformats.org/drawingml/2006/picture">
+                  <pic:nvPicPr>
+                    <pic:cNvPr id="666656338" name=""/>
+                    <pic:cNvPicPr/>
+                  </pic:nvPicPr>
+                  <pic:blipFill>
+                    <a:blip r:embed="rId32"/>
+                    <a:stretch>
+                      <a:fillRect/>
+                    </a:stretch>
+                  </pic:blipFill>
+                  <pic:spPr>
+                    <a:xfrm>
+                      <a:off x="0" y="0"/>
+                      <a:ext cx="5668166" cy="2686425"/>
+                    </a:xfrm>
+                    <a:prstGeom prst="rect">
+                      <a:avLst/>
+                    </a:prstGeom>
+                  </pic:spPr>
+                </pic:pic>
+              </a:graphicData>
+            </a:graphic>
+          </wp:inline>
+        </w:drawing>
+      </w:r>
+    </w:p>
+    <w:p>
+      <w:r>
+        <w:lastRenderedPageBreak/>
+        <w:drawing>
+          <wp:inline distT="0" distB="0" distL="0" distR="0" wp14:anchorId="202A4BF3" wp14:editId="76B23AD6">
+            <wp:extent cx="5731510" cy="2084705"/>
+            <wp:effectExtent l="0" t="0" r="2540" b="0"/>
+            <wp:docPr id="1346967535" name="Picture 1"/>
+            <wp:cNvGraphicFramePr>
+              <a:graphicFrameLocks xmlns:a="http://schemas.openxmlformats.org/drawingml/2006/main" noChangeAspect="1"/>
+            </wp:cNvGraphicFramePr>
+            <a:graphic xmlns:a="http://schemas.openxmlformats.org/drawingml/2006/main">
+              <a:graphicData uri="http://schemas.openxmlformats.org/drawingml/2006/picture">
+                <pic:pic xmlns:pic="http://schemas.openxmlformats.org/drawingml/2006/picture">
+                  <pic:nvPicPr>
+                    <pic:cNvPr id="1346967535" name=""/>
+                    <pic:cNvPicPr/>
+                  </pic:nvPicPr>
+                  <pic:blipFill>
+                    <a:blip r:embed="rId33"/>
+                    <a:stretch>
+                      <a:fillRect/>
+                    </a:stretch>
+                  </pic:blipFill>
+                  <pic:spPr>
+                    <a:xfrm>
+                      <a:off x="0" y="0"/>
+                      <a:ext cx="5731510" cy="2084705"/>
+                    </a:xfrm>
+                    <a:prstGeom prst="rect">
+                      <a:avLst/>
+                    </a:prstGeom>
+                  </pic:spPr>
+                </pic:pic>
+              </a:graphicData>
+            </a:graphic>
+          </wp:inline>
+        </w:drawing>
+      </w:r>
+    </w:p>
+    <w:p>
+      <w:pPr>
+        <w:rPr>
+          <w:noProof/>
+        </w:rPr>
+      </w:pPr>
+      <w:r>
+        <w:drawing>
+          <wp:inline distT="0" distB="0" distL="0" distR="0" wp14:anchorId="5FFA2460" wp14:editId="6939E30A">
+            <wp:extent cx="5731510" cy="2537460"/>
+            <wp:effectExtent l="0" t="0" r="2540" b="0"/>
+            <wp:docPr id="152635126" name="Picture 1"/>
+            <wp:cNvGraphicFramePr>
+              <a:graphicFrameLocks xmlns:a="http://schemas.openxmlformats.org/drawingml/2006/main" noChangeAspect="1"/>
+            </wp:cNvGraphicFramePr>
+            <a:graphic xmlns:a="http://schemas.openxmlformats.org/drawingml/2006/main">
+              <a:graphicData uri="http://schemas.openxmlformats.org/drawingml/2006/picture">
+                <pic:pic xmlns:pic="http://schemas.openxmlformats.org/drawingml/2006/picture">
+                  <pic:nvPicPr>
+                    <pic:cNvPr id="152635126" name=""/>
+                    <pic:cNvPicPr/>
+                  </pic:nvPicPr>
+                  <pic:blipFill>
+                    <a:blip r:embed="rId34"/>
+                    <a:stretch>
+                      <a:fillRect/>
+                    </a:stretch>
+                  </pic:blipFill>
+                  <pic:spPr>
+                    <a:xfrm>
+                      <a:off x="0" y="0"/>
+                      <a:ext cx="5731510" cy="2537460"/>
+                    </a:xfrm>
+                    <a:prstGeom prst="rect">
+                      <a:avLst/>
+                    </a:prstGeom>
+                  </pic:spPr>
+                </pic:pic>
+              </a:graphicData>
+            </a:graphic>
+          </wp:inline>
+        </w:drawing>
+      </w:r>
+      <w:r>
+        <w:rPr>
+          <w:noProof/>
+        </w:rPr>
+        <w:t xml:space="preserve"> </w:t>
+      </w:r>
+    </w:p>
+    <w:p>
+      <w:r>
+        <w:drawing>
+          <wp:inline distT="0" distB="0" distL="0" distR="0" wp14:anchorId="3C6E1AB9" wp14:editId="6703FB74">
+            <wp:extent cx="5591955" cy="3867690"/>
+            <wp:effectExtent l="0" t="0" r="0" b="0"/>
+            <wp:docPr id="1293236031" name="Picture 1"/>
+            <wp:cNvGraphicFramePr>
+              <a:graphicFrameLocks xmlns:a="http://schemas.openxmlformats.org/drawingml/2006/main" noChangeAspect="1"/>
+            </wp:cNvGraphicFramePr>
+            <a:graphic xmlns:a="http://schemas.openxmlformats.org/drawingml/2006/main">
+              <a:graphicData uri="http://schemas.openxmlformats.org/drawingml/2006/picture">
+                <pic:pic xmlns:pic="http://schemas.openxmlformats.org/drawingml/2006/picture">
+                  <pic:nvPicPr>
+                    <pic:cNvPr id="1293236031" name=""/>
+                    <pic:cNvPicPr/>
+                  </pic:nvPicPr>
+                  <pic:blipFill>
+                    <a:blip r:embed="rId35"/>
+                    <a:stretch>
+                      <a:fillRect/>
+                    </a:stretch>
+                  </pic:blipFill>
+                  <pic:spPr>
+                    <a:xfrm>
+                      <a:off x="0" y="0"/>
+                      <a:ext cx="5591955" cy="3867690"/>
+                    </a:xfrm>
+                    <a:prstGeom prst="rect">
+                      <a:avLst/>
+                    </a:prstGeom>
+                  </pic:spPr>
+                </pic:pic>
+              </a:graphicData>
+            </a:graphic>
+          </wp:inline>
+        </w:drawing>
+      </w:r>
+    </w:p>
+    <w:p>
+      <w:r>
+        <w:lastRenderedPageBreak/>
+        <w:drawing>
+          <wp:inline distT="0" distB="0" distL="0" distR="0" wp14:anchorId="5CBCFA8E" wp14:editId="58E50BED">
+            <wp:extent cx="5458587" cy="2048161"/>
+            <wp:effectExtent l="0" t="0" r="8890" b="9525"/>
+            <wp:docPr id="1442521888" name="Picture 1"/>
+            <wp:cNvGraphicFramePr>
+              <a:graphicFrameLocks xmlns:a="http://schemas.openxmlformats.org/drawingml/2006/main" noChangeAspect="1"/>
+            </wp:cNvGraphicFramePr>
+            <a:graphic xmlns:a="http://schemas.openxmlformats.org/drawingml/2006/main">
+              <a:graphicData uri="http://schemas.openxmlformats.org/drawingml/2006/picture">
+                <pic:pic xmlns:pic="http://schemas.openxmlformats.org/drawingml/2006/picture">
+                  <pic:nvPicPr>
+                    <pic:cNvPr id="1442521888" name=""/>
+                    <pic:cNvPicPr/>
+                  </pic:nvPicPr>
+                  <pic:blipFill>
+                    <a:blip r:embed="rId36"/>
+                    <a:stretch>
+                      <a:fillRect/>
+                    </a:stretch>
+                  </pic:blipFill>
+                  <pic:spPr>
+                    <a:xfrm>
+                      <a:off x="0" y="0"/>
+                      <a:ext cx="5458587" cy="2048161"/>
+                    </a:xfrm>
+                    <a:prstGeom prst="rect">
+                      <a:avLst/>
+                    </a:prstGeom>
+                  </pic:spPr>
+                </pic:pic>
+              </a:graphicData>
+            </a:graphic>
+          </wp:inline>
+        </w:drawing>
+      </w:r>
+    </w:p>
+    <w:p>
+      <w:pPr>
+        <w:rPr>
+          <w:b/>
+          <w:bCs/>
+          <w:sz w:val="32"/>
+          <w:szCs w:val="32"/>
+          <w:u w:val="single"/>
+        </w:rPr>
+      </w:pPr>
+      <w:r>
+        <w:rPr>
+          <w:b/>
+          <w:bCs/>
+          <w:sz w:val="32"/>
+          <w:szCs w:val="32"/>
+        </w:rPr>
+        <w:t xml:space="preserve"># </w:t>
+      </w:r>
+      <w:r>
+        <w:rPr>
+          <w:b/>
+          <w:bCs/>
+          <w:sz w:val="32"/>
+          <w:szCs w:val="32"/>
+          <w:u w:val="single"/>
+        </w:rPr>
+        <w:t>IMPORTANT</w:t>
+      </w:r>
+      <w:r>
+        <w:rPr>
+          <w:b/>
+          <w:bCs/>
+          <w:sz w:val="32"/>
+          <w:szCs w:val="32"/>
+          <w:u w:val="single"/>
+        </w:rPr>
+        <w:t xml:space="preserve"> -&gt; TYPE CASTING &amp; TYPE COERCION</w:t>
+      </w:r>
+    </w:p>
+    <w:p>
+      <w:r>
+        <w:drawing>
+          <wp:inline distT="0" distB="0" distL="0" distR="0" wp14:anchorId="6D6D34EC" wp14:editId="2FE408F3">
+            <wp:extent cx="5731510" cy="4372610"/>
+            <wp:effectExtent l="0" t="0" r="2540" b="8890"/>
+            <wp:docPr id="1340629164" name="Picture 1"/>
+            <wp:cNvGraphicFramePr>
+              <a:graphicFrameLocks xmlns:a="http://schemas.openxmlformats.org/drawingml/2006/main" noChangeAspect="1"/>
+            </wp:cNvGraphicFramePr>
+            <a:graphic xmlns:a="http://schemas.openxmlformats.org/drawingml/2006/main">
+              <a:graphicData uri="http://schemas.openxmlformats.org/drawingml/2006/picture">
+                <pic:pic xmlns:pic="http://schemas.openxmlformats.org/drawingml/2006/picture">
+                  <pic:nvPicPr>
+                    <pic:cNvPr id="1340629164" name=""/>
+                    <pic:cNvPicPr/>
+                  </pic:nvPicPr>
+                  <pic:blipFill>
+                    <a:blip r:embed="rId37"/>
+                    <a:stretch>
+                      <a:fillRect/>
+                    </a:stretch>
+                  </pic:blipFill>
+                  <pic:spPr>
+                    <a:xfrm>
+                      <a:off x="0" y="0"/>
+                      <a:ext cx="5731510" cy="4372610"/>
+                    </a:xfrm>
+                    <a:prstGeom prst="rect">
+                      <a:avLst/>
+                    </a:prstGeom>
+                  </pic:spPr>
+                </pic:pic>
+              </a:graphicData>
+            </a:graphic>
+          </wp:inline>
+        </w:drawing>
+      </w:r>
+      <w:r>
+        <w:pict w14:anchorId="75FA5BF0">
+          <v:rect id="_x0000_i1059" style="width:0;height:1.5pt" o:hralign="center" o:hrstd="t" o:hr="t" fillcolor="#a0a0a0" stroked="f"/>
+        </w:pict>
+      </w:r>
+    </w:p>
     <w:p/>
     <w:sectPr>
       <w:pgSz w:w="11906" w:h="16838"/>
@@ -10578,7 +10949,7 @@
 <w:numbering xmlns:wpc="http://schemas.microsoft.com/office/word/2010/wordprocessingCanvas" xmlns:cx="http://schemas.microsoft.com/office/drawing/2014/chartex" xmlns:cx1="http://schemas.microsoft.com/office/drawing/2015/9/8/chartex" xmlns:cx2="http://schemas.microsoft.com/office/drawing/2015/10/21/chartex" xmlns:cx3="http://schemas.microsoft.com/office/drawing/2016/5/9/chartex" xmlns:cx4="http://schemas.microsoft.com/office/drawing/2016/5/10/chartex" xmlns:cx5="http://schemas.microsoft.com/office/drawing/2016/5/11/chartex" xmlns:cx6="http://schemas.microsoft.com/office/drawing/2016/5/12/chartex" xmlns:cx7="http://schemas.microsoft.com/office/drawing/2016/5/13/chartex" xmlns:cx8="http://schemas.microsoft.com/office/drawing/2016/5/14/chartex" xmlns:mc="http://schemas.openxmlformats.org/markup-compatibility/2006" xmlns:aink="http://schemas.microsoft.com/office/drawing/2016/ink" xmlns:am3d="http://schemas.microsoft.com/office/drawing/2017/model3d" xmlns:o="urn:schemas-microsoft-com:office:office" xmlns:oel="http://schemas.microsoft.com/office/2019/extlst" xmlns:r="http://schemas.openxmlformats.org/officeDocument/2006/relationships" xmlns:m="http://schemas.openxmlformats.org/officeDocument/2006/math" xmlns:v="urn:schemas-microsoft-com:vml" xmlns:wp14="http://schemas.microsoft.com/office/word/2010/wordprocessingDrawing" xmlns:wp="http://schemas.openxmlformats.org/drawingml/2006/wordprocessingDrawing" xmlns:w10="urn:schemas-microsoft-com:office:word" xmlns:w="http://schemas.openxmlformats.org/wordprocessingml/2006/main" xmlns:w14="http://schemas.microsoft.com/office/word/2010/wordml" xmlns:w15="http://schemas.microsoft.com/office/word/2012/wordml" xmlns:w16cex="http://schemas.microsoft.com/office/word/2018/wordml/cex" xmlns:w16cid="http://schemas.microsoft.com/office/word/2016/wordml/cid" xmlns:w16="http://schemas.microsoft.com/office/word/2018/wordml" xmlns:w16du="http://schemas.microsoft.com/office/word/2023/wordml/word16du" xmlns:w16sdtdh="http://schemas.microsoft.com/office/word/2020/wordml/sdtdatahash" xmlns:w16sdtfl="http://schemas.microsoft.com/office/word/2024/wordml/sdtformatlock" xmlns:w16se="http://schemas.microsoft.com/office/word/2015/wordml/symex" xmlns:wpg="http://schemas.microsoft.com/office/word/2010/wordprocessingGroup" xmlns:wpi="http://schemas.microsoft.com/office/word/2010/wordprocessingInk" xmlns:wne="http://schemas.microsoft.com/office/word/2006/wordml" xmlns:wps="http://schemas.microsoft.com/office/word/2010/wordprocessingShape" mc:Ignorable="w14 w15 w16se w16cid w16 w16cex w16sdtdh w16sdtfl w16du wp14">
   <w:numPicBullet w:numPicBulletId="0">
     <w:pict>
-      <v:rect id="_x0000_i1041" style="width:0;height:1.5pt" o:hralign="center" o:bullet="t" o:hrstd="t" o:hr="t" fillcolor="#a0a0a0" stroked="f"/>
+      <v:rect id="_x0000_i1043" style="width:0;height:1.5pt" o:hralign="center" o:bullet="t" o:hrstd="t" o:hr="t" fillcolor="#a0a0a0" stroked="f"/>
     </w:pict>
   </w:numPicBullet>
   <w:abstractNum w:abstractNumId="0" w15:restartNumberingAfterBreak="0">

</xml_diff>

<commit_message>
studied operations on values
</commit_message>
<xml_diff>
--- a/JAVASCRIPT NOTES.docx
+++ b/JAVASCRIPT NOTES.docx
@@ -7905,6 +7905,45 @@
       </w:r>
     </w:p>
     <w:p>
+      <w:r>
+        <w:drawing>
+          <wp:inline distT="0" distB="0" distL="0" distR="0" wp14:anchorId="7FD3F770" wp14:editId="62C134D0">
+            <wp:extent cx="5731510" cy="4586605"/>
+            <wp:effectExtent l="0" t="0" r="2540" b="4445"/>
+            <wp:docPr id="1113841990" name="Picture 1"/>
+            <wp:cNvGraphicFramePr>
+              <a:graphicFrameLocks xmlns:a="http://schemas.openxmlformats.org/drawingml/2006/main" noChangeAspect="1"/>
+            </wp:cNvGraphicFramePr>
+            <a:graphic xmlns:a="http://schemas.openxmlformats.org/drawingml/2006/main">
+              <a:graphicData uri="http://schemas.openxmlformats.org/drawingml/2006/picture">
+                <pic:pic xmlns:pic="http://schemas.openxmlformats.org/drawingml/2006/picture">
+                  <pic:nvPicPr>
+                    <pic:cNvPr id="1113841990" name=""/>
+                    <pic:cNvPicPr/>
+                  </pic:nvPicPr>
+                  <pic:blipFill>
+                    <a:blip r:embed="rId22"/>
+                    <a:stretch>
+                      <a:fillRect/>
+                    </a:stretch>
+                  </pic:blipFill>
+                  <pic:spPr>
+                    <a:xfrm>
+                      <a:off x="0" y="0"/>
+                      <a:ext cx="5731510" cy="4586605"/>
+                    </a:xfrm>
+                    <a:prstGeom prst="rect">
+                      <a:avLst/>
+                    </a:prstGeom>
+                  </pic:spPr>
+                </pic:pic>
+              </a:graphicData>
+            </a:graphic>
+          </wp:inline>
+        </w:drawing>
+      </w:r>
+    </w:p>
+    <w:p>
       <w:pPr>
         <w:numPr>
           <w:ilvl w:val="0"/>
@@ -8219,6 +8258,46 @@
       </w:r>
     </w:p>
     <w:p>
+      <w:r>
+        <w:lastRenderedPageBreak/>
+        <w:drawing>
+          <wp:inline distT="0" distB="0" distL="0" distR="0" wp14:anchorId="131D0163" wp14:editId="1185317C">
+            <wp:extent cx="5731510" cy="4477385"/>
+            <wp:effectExtent l="0" t="0" r="2540" b="0"/>
+            <wp:docPr id="1099789443" name="Picture 1"/>
+            <wp:cNvGraphicFramePr>
+              <a:graphicFrameLocks xmlns:a="http://schemas.openxmlformats.org/drawingml/2006/main" noChangeAspect="1"/>
+            </wp:cNvGraphicFramePr>
+            <a:graphic xmlns:a="http://schemas.openxmlformats.org/drawingml/2006/main">
+              <a:graphicData uri="http://schemas.openxmlformats.org/drawingml/2006/picture">
+                <pic:pic xmlns:pic="http://schemas.openxmlformats.org/drawingml/2006/picture">
+                  <pic:nvPicPr>
+                    <pic:cNvPr id="1099789443" name=""/>
+                    <pic:cNvPicPr/>
+                  </pic:nvPicPr>
+                  <pic:blipFill>
+                    <a:blip r:embed="rId23"/>
+                    <a:stretch>
+                      <a:fillRect/>
+                    </a:stretch>
+                  </pic:blipFill>
+                  <pic:spPr>
+                    <a:xfrm>
+                      <a:off x="0" y="0"/>
+                      <a:ext cx="5731510" cy="4477385"/>
+                    </a:xfrm>
+                    <a:prstGeom prst="rect">
+                      <a:avLst/>
+                    </a:prstGeom>
+                  </pic:spPr>
+                </pic:pic>
+              </a:graphicData>
+            </a:graphic>
+          </wp:inline>
+        </w:drawing>
+      </w:r>
+    </w:p>
+    <w:p>
       <w:pPr>
         <w:numPr>
           <w:ilvl w:val="0"/>
@@ -8416,9 +8495,52 @@
     </w:p>
     <w:p>
       <w:r>
+        <w:t xml:space="preserve">        </w:t>
+      </w:r>
+      <w:r>
+        <w:drawing>
+          <wp:inline distT="0" distB="0" distL="0" distR="0" wp14:anchorId="71E73B40" wp14:editId="1DA60F5F">
+            <wp:extent cx="5075822" cy="2859578"/>
+            <wp:effectExtent l="0" t="0" r="0" b="0"/>
+            <wp:docPr id="1502116909" name="Picture 1"/>
+            <wp:cNvGraphicFramePr>
+              <a:graphicFrameLocks xmlns:a="http://schemas.openxmlformats.org/drawingml/2006/main" noChangeAspect="1"/>
+            </wp:cNvGraphicFramePr>
+            <a:graphic xmlns:a="http://schemas.openxmlformats.org/drawingml/2006/main">
+              <a:graphicData uri="http://schemas.openxmlformats.org/drawingml/2006/picture">
+                <pic:pic xmlns:pic="http://schemas.openxmlformats.org/drawingml/2006/picture">
+                  <pic:nvPicPr>
+                    <pic:cNvPr id="1502116909" name=""/>
+                    <pic:cNvPicPr/>
+                  </pic:nvPicPr>
+                  <pic:blipFill>
+                    <a:blip r:embed="rId24"/>
+                    <a:stretch>
+                      <a:fillRect/>
+                    </a:stretch>
+                  </pic:blipFill>
+                  <pic:spPr>
+                    <a:xfrm>
+                      <a:off x="0" y="0"/>
+                      <a:ext cx="5115441" cy="2881898"/>
+                    </a:xfrm>
+                    <a:prstGeom prst="rect">
+                      <a:avLst/>
+                    </a:prstGeom>
+                  </pic:spPr>
+                </pic:pic>
+              </a:graphicData>
+            </a:graphic>
+          </wp:inline>
+        </w:drawing>
+      </w:r>
+    </w:p>
+    <w:p>
+      <w:r>
         <w:rPr>
           <w:noProof/>
         </w:rPr>
+        <w:lastRenderedPageBreak/>
         <w:drawing>
           <wp:inline distT="0" distB="0" distL="0" distR="0" wp14:anchorId="1C7AEF3B" wp14:editId="7DBE3B87">
             <wp:extent cx="5731510" cy="5184775"/>
@@ -8435,7 +8557,7 @@
                     <pic:cNvPicPr/>
                   </pic:nvPicPr>
                   <pic:blipFill>
-                    <a:blip r:embed="rId22"/>
+                    <a:blip r:embed="rId25"/>
                     <a:stretch>
                       <a:fillRect/>
                     </a:stretch>
@@ -8473,7 +8595,6 @@
           <w:b/>
           <w:bCs/>
         </w:rPr>
-        <w:lastRenderedPageBreak/>
         <w:t xml:space="preserve">5. </w:t>
       </w:r>
       <w:proofErr w:type="spellStart"/>
@@ -9000,6 +9121,7 @@
       </w:r>
       <w:proofErr w:type="spellStart"/>
       <w:r>
+        <w:lastRenderedPageBreak/>
         <w:t>ke</w:t>
       </w:r>
       <w:proofErr w:type="spellEnd"/>
@@ -9121,7 +9243,7 @@
                     <pic:cNvPicPr/>
                   </pic:nvPicPr>
                   <pic:blipFill>
-                    <a:blip r:embed="rId23"/>
+                    <a:blip r:embed="rId26"/>
                     <a:stretch>
                       <a:fillRect/>
                     </a:stretch>
@@ -9163,7 +9285,7 @@
                     <pic:cNvPicPr/>
                   </pic:nvPicPr>
                   <pic:blipFill>
-                    <a:blip r:embed="rId24"/>
+                    <a:blip r:embed="rId27"/>
                     <a:stretch>
                       <a:fillRect/>
                     </a:stretch>
@@ -9206,7 +9328,7 @@
                     <pic:cNvPicPr/>
                   </pic:nvPicPr>
                   <pic:blipFill>
-                    <a:blip r:embed="rId25"/>
+                    <a:blip r:embed="rId28"/>
                     <a:stretch>
                       <a:fillRect/>
                     </a:stretch>
@@ -9666,7 +9788,7 @@
                     <pic:cNvPicPr/>
                   </pic:nvPicPr>
                   <pic:blipFill>
-                    <a:blip r:embed="rId26"/>
+                    <a:blip r:embed="rId29"/>
                     <a:stretch>
                       <a:fillRect/>
                     </a:stretch>
@@ -9817,7 +9939,7 @@
                     <pic:cNvPicPr/>
                   </pic:nvPicPr>
                   <pic:blipFill>
-                    <a:blip r:embed="rId27"/>
+                    <a:blip r:embed="rId30"/>
                     <a:stretch>
                       <a:fillRect/>
                     </a:stretch>
@@ -9933,7 +10055,7 @@
                     <pic:cNvPicPr/>
                   </pic:nvPicPr>
                   <pic:blipFill>
-                    <a:blip r:embed="rId28"/>
+                    <a:blip r:embed="rId31"/>
                     <a:stretch>
                       <a:fillRect/>
                     </a:stretch>
@@ -9977,7 +10099,7 @@
                     <pic:cNvPicPr/>
                   </pic:nvPicPr>
                   <pic:blipFill>
-                    <a:blip r:embed="rId29"/>
+                    <a:blip r:embed="rId32"/>
                     <a:stretch>
                       <a:fillRect/>
                     </a:stretch>
@@ -10150,7 +10272,7 @@
                     <pic:cNvPicPr/>
                   </pic:nvPicPr>
                   <pic:blipFill>
-                    <a:blip r:embed="rId30"/>
+                    <a:blip r:embed="rId33"/>
                     <a:stretch>
                       <a:fillRect/>
                     </a:stretch>
@@ -10537,7 +10659,7 @@
                     <pic:cNvPicPr/>
                   </pic:nvPicPr>
                   <pic:blipFill>
-                    <a:blip r:embed="rId31"/>
+                    <a:blip r:embed="rId34"/>
                     <a:stretch>
                       <a:fillRect/>
                     </a:stretch>
@@ -10660,7 +10782,7 @@
                     <pic:cNvPicPr/>
                   </pic:nvPicPr>
                   <pic:blipFill>
-                    <a:blip r:embed="rId32"/>
+                    <a:blip r:embed="rId35"/>
                     <a:stretch>
                       <a:fillRect/>
                     </a:stretch>
@@ -10700,7 +10822,7 @@
                     <pic:cNvPicPr/>
                   </pic:nvPicPr>
                   <pic:blipFill>
-                    <a:blip r:embed="rId33"/>
+                    <a:blip r:embed="rId36"/>
                     <a:stretch>
                       <a:fillRect/>
                     </a:stretch>
@@ -10744,7 +10866,7 @@
                     <pic:cNvPicPr/>
                   </pic:nvPicPr>
                   <pic:blipFill>
-                    <a:blip r:embed="rId34"/>
+                    <a:blip r:embed="rId37"/>
                     <a:stretch>
                       <a:fillRect/>
                     </a:stretch>
@@ -10789,7 +10911,7 @@
                     <pic:cNvPicPr/>
                   </pic:nvPicPr>
                   <pic:blipFill>
-                    <a:blip r:embed="rId35"/>
+                    <a:blip r:embed="rId38"/>
                     <a:stretch>
                       <a:fillRect/>
                     </a:stretch>
@@ -10829,7 +10951,7 @@
                     <pic:cNvPicPr/>
                   </pic:nvPicPr>
                   <pic:blipFill>
-                    <a:blip r:embed="rId36"/>
+                    <a:blip r:embed="rId39"/>
                     <a:stretch>
                       <a:fillRect/>
                     </a:stretch>
@@ -10908,7 +11030,7 @@
                     <pic:cNvPicPr/>
                   </pic:nvPicPr>
                   <pic:blipFill>
-                    <a:blip r:embed="rId37"/>
+                    <a:blip r:embed="rId40"/>
                     <a:stretch>
                       <a:fillRect/>
                     </a:stretch>
@@ -10934,6 +11056,1584 @@
         </w:pict>
       </w:r>
     </w:p>
+    <w:p>
+      <w:pPr>
+        <w:rPr>
+          <w:b/>
+          <w:bCs/>
+          <w:sz w:val="36"/>
+          <w:szCs w:val="36"/>
+          <w:u w:val="single"/>
+        </w:rPr>
+      </w:pPr>
+      <w:r>
+        <w:rPr>
+          <w:b/>
+          <w:bCs/>
+          <w:sz w:val="36"/>
+          <w:szCs w:val="36"/>
+          <w:u w:val="single"/>
+        </w:rPr>
+        <w:t>JAVASCRIPT NOTES (</w:t>
+      </w:r>
+      <w:r>
+        <w:rPr>
+          <w:b/>
+          <w:bCs/>
+          <w:sz w:val="36"/>
+          <w:szCs w:val="36"/>
+          <w:u w:val="single"/>
+        </w:rPr>
+        <w:t>7</w:t>
+      </w:r>
+      <w:r>
+        <w:rPr>
+          <w:b/>
+          <w:bCs/>
+          <w:sz w:val="36"/>
+          <w:szCs w:val="36"/>
+          <w:u w:val="single"/>
+        </w:rPr>
+        <w:t>)</w:t>
+      </w:r>
+    </w:p>
+    <w:p>
+      <w:pPr>
+        <w:rPr>
+          <w:b/>
+          <w:bCs/>
+        </w:rPr>
+      </w:pPr>
+      <w:r>
+        <w:rPr>
+          <w:b/>
+          <w:bCs/>
+        </w:rPr>
+        <w:t>1. Basic Operations</w:t>
+      </w:r>
+    </w:p>
+    <w:p>
+      <w:r>
+        <w:t xml:space="preserve">JS </w:t>
+      </w:r>
+      <w:proofErr w:type="spellStart"/>
+      <w:r>
+        <w:t>mein</w:t>
+      </w:r>
+      <w:proofErr w:type="spellEnd"/>
+      <w:r>
+        <w:t xml:space="preserve"> basic math simple </w:t>
+      </w:r>
+      <w:proofErr w:type="spellStart"/>
+      <w:r>
+        <w:t>hai</w:t>
+      </w:r>
+      <w:proofErr w:type="spellEnd"/>
+      <w:r>
+        <w:t xml:space="preserve">: 2+2=4, 2-2=0, 2*2=4, 2**3=8 (power), 2/3 (division), aur 2%3 (remainder/modulo). Lekin real </w:t>
+      </w:r>
+      <w:proofErr w:type="spellStart"/>
+      <w:r>
+        <w:t>khel</w:t>
+      </w:r>
+      <w:proofErr w:type="spellEnd"/>
+      <w:r>
+        <w:t xml:space="preserve"> tab </w:t>
+      </w:r>
+      <w:proofErr w:type="spellStart"/>
+      <w:r>
+        <w:t>shuru</w:t>
+      </w:r>
+      <w:proofErr w:type="spellEnd"/>
+      <w:r>
+        <w:t xml:space="preserve"> </w:t>
+      </w:r>
+      <w:proofErr w:type="spellStart"/>
+      <w:r>
+        <w:t>hota</w:t>
+      </w:r>
+      <w:proofErr w:type="spellEnd"/>
+      <w:r>
+        <w:t xml:space="preserve"> </w:t>
+      </w:r>
+      <w:proofErr w:type="spellStart"/>
+      <w:r>
+        <w:t>hai</w:t>
+      </w:r>
+      <w:proofErr w:type="spellEnd"/>
+      <w:r>
+        <w:t xml:space="preserve"> jab hum </w:t>
+      </w:r>
+      <w:r>
+        <w:rPr>
+          <w:b/>
+          <w:bCs/>
+        </w:rPr>
+        <w:t>Strings</w:t>
+      </w:r>
+      <w:r>
+        <w:t xml:space="preserve"> ko </w:t>
+      </w:r>
+      <w:proofErr w:type="spellStart"/>
+      <w:r>
+        <w:t>jodte</w:t>
+      </w:r>
+      <w:proofErr w:type="spellEnd"/>
+      <w:r>
+        <w:t xml:space="preserve"> hain.</w:t>
+      </w:r>
+    </w:p>
+    <w:p>
+      <w:pPr>
+        <w:rPr>
+          <w:b/>
+          <w:bCs/>
+        </w:rPr>
+      </w:pPr>
+      <w:r>
+        <w:rPr>
+          <w:b/>
+          <w:bCs/>
+        </w:rPr>
+        <w:lastRenderedPageBreak/>
+        <w:drawing>
+          <wp:inline distT="0" distB="0" distL="0" distR="0" wp14:anchorId="4ADDF0B8" wp14:editId="3F68A899">
+            <wp:extent cx="3962953" cy="4182059"/>
+            <wp:effectExtent l="0" t="0" r="0" b="9525"/>
+            <wp:docPr id="50371877" name="Picture 1"/>
+            <wp:cNvGraphicFramePr>
+              <a:graphicFrameLocks xmlns:a="http://schemas.openxmlformats.org/drawingml/2006/main" noChangeAspect="1"/>
+            </wp:cNvGraphicFramePr>
+            <a:graphic xmlns:a="http://schemas.openxmlformats.org/drawingml/2006/main">
+              <a:graphicData uri="http://schemas.openxmlformats.org/drawingml/2006/picture">
+                <pic:pic xmlns:pic="http://schemas.openxmlformats.org/drawingml/2006/picture">
+                  <pic:nvPicPr>
+                    <pic:cNvPr id="50371877" name=""/>
+                    <pic:cNvPicPr/>
+                  </pic:nvPicPr>
+                  <pic:blipFill>
+                    <a:blip r:embed="rId41"/>
+                    <a:stretch>
+                      <a:fillRect/>
+                    </a:stretch>
+                  </pic:blipFill>
+                  <pic:spPr>
+                    <a:xfrm>
+                      <a:off x="0" y="0"/>
+                      <a:ext cx="3962953" cy="4182059"/>
+                    </a:xfrm>
+                    <a:prstGeom prst="rect">
+                      <a:avLst/>
+                    </a:prstGeom>
+                  </pic:spPr>
+                </pic:pic>
+              </a:graphicData>
+            </a:graphic>
+          </wp:inline>
+        </w:drawing>
+      </w:r>
+      <w:r>
+        <w:pict w14:anchorId="4CD91A3A">
+          <v:rect id="_x0000_i1086" style="width:0;height:1.5pt" o:hralign="center" o:hrstd="t" o:hr="t" fillcolor="#a0a0a0" stroked="f"/>
+        </w:pict>
+      </w:r>
+      <w:r>
+        <w:rPr>
+          <w:b/>
+          <w:bCs/>
+        </w:rPr>
+        <w:t>2. String Concatenation (</w:t>
+      </w:r>
+      <w:proofErr w:type="spellStart"/>
+      <w:r>
+        <w:rPr>
+          <w:b/>
+          <w:bCs/>
+        </w:rPr>
+        <w:t>Jodna</w:t>
+      </w:r>
+      <w:proofErr w:type="spellEnd"/>
+      <w:r>
+        <w:rPr>
+          <w:b/>
+          <w:bCs/>
+        </w:rPr>
+        <w:t>)</w:t>
+      </w:r>
+    </w:p>
+    <w:p>
+      <w:r>
+        <w:t xml:space="preserve">Do strings ko + se </w:t>
+      </w:r>
+      <w:proofErr w:type="spellStart"/>
+      <w:r>
+        <w:t>joda</w:t>
+      </w:r>
+      <w:proofErr w:type="spellEnd"/>
+      <w:r>
+        <w:t xml:space="preserve"> </w:t>
+      </w:r>
+      <w:proofErr w:type="spellStart"/>
+      <w:r>
+        <w:t>ja</w:t>
+      </w:r>
+      <w:proofErr w:type="spellEnd"/>
+      <w:r>
+        <w:t xml:space="preserve"> </w:t>
+      </w:r>
+      <w:proofErr w:type="spellStart"/>
+      <w:r>
+        <w:t>sakta</w:t>
+      </w:r>
+      <w:proofErr w:type="spellEnd"/>
+      <w:r>
+        <w:t xml:space="preserve"> </w:t>
+      </w:r>
+      <w:proofErr w:type="spellStart"/>
+      <w:r>
+        <w:t>hai</w:t>
+      </w:r>
+      <w:proofErr w:type="spellEnd"/>
+      <w:r>
+        <w:t>:</w:t>
+      </w:r>
+    </w:p>
+    <w:p>
+      <w:r>
+        <w:t xml:space="preserve">"hello" + " </w:t>
+      </w:r>
+      <w:r>
+        <w:t>Surjo</w:t>
+      </w:r>
+      <w:r>
+        <w:t xml:space="preserve">" </w:t>
+      </w:r>
+      <w:r>
+        <w:t xml:space="preserve">=&gt; </w:t>
+      </w:r>
+      <w:r>
+        <w:t xml:space="preserve">"hello </w:t>
+      </w:r>
+      <w:r>
+        <w:t>Surjo</w:t>
+      </w:r>
+      <w:r>
+        <w:t>".</w:t>
+      </w:r>
+      <w:r>
+        <w:pict w14:anchorId="26E45C68">
+          <v:rect id="_x0000_i1089" style="width:0;height:1.5pt" o:hralign="center" o:hrstd="t" o:hr="t" fillcolor="#a0a0a0" stroked="f"/>
+        </w:pict>
+      </w:r>
+      <w:r>
+        <w:rPr>
+          <w:b/>
+          <w:bCs/>
+        </w:rPr>
+        <w:t>3. The "Confusing" Part (Mixing Numbers &amp; Strings)</w:t>
+      </w:r>
+    </w:p>
+    <w:p>
+      <w:r>
+        <w:t xml:space="preserve">Yahan JS </w:t>
+      </w:r>
+      <w:proofErr w:type="spellStart"/>
+      <w:r>
+        <w:t>ke</w:t>
+      </w:r>
+      <w:proofErr w:type="spellEnd"/>
+      <w:r>
+        <w:t xml:space="preserve"> </w:t>
+      </w:r>
+      <w:proofErr w:type="spellStart"/>
+      <w:r>
+        <w:t>kuch</w:t>
+      </w:r>
+      <w:proofErr w:type="spellEnd"/>
+      <w:r>
+        <w:t xml:space="preserve"> </w:t>
+      </w:r>
+      <w:proofErr w:type="spellStart"/>
+      <w:r>
+        <w:t>ajeeb</w:t>
+      </w:r>
+      <w:proofErr w:type="spellEnd"/>
+      <w:r>
+        <w:t xml:space="preserve"> rules hain jo interview </w:t>
+      </w:r>
+      <w:proofErr w:type="spellStart"/>
+      <w:r>
+        <w:t>mein</w:t>
+      </w:r>
+      <w:proofErr w:type="spellEnd"/>
+      <w:r>
+        <w:t xml:space="preserve"> </w:t>
+      </w:r>
+      <w:proofErr w:type="spellStart"/>
+      <w:r>
+        <w:t>puche</w:t>
+      </w:r>
+      <w:proofErr w:type="spellEnd"/>
+      <w:r>
+        <w:t xml:space="preserve"> </w:t>
+      </w:r>
+      <w:proofErr w:type="spellStart"/>
+      <w:r>
+        <w:t>jate</w:t>
+      </w:r>
+      <w:proofErr w:type="spellEnd"/>
+      <w:r>
+        <w:t xml:space="preserve"> hain:</w:t>
+      </w:r>
+    </w:p>
+    <w:p>
+      <w:pPr>
+        <w:numPr>
+          <w:ilvl w:val="0"/>
+          <w:numId w:val="27"/>
+        </w:numPr>
+      </w:pPr>
+      <w:proofErr w:type="gramStart"/>
+      <w:r>
+        <w:rPr>
+          <w:b/>
+          <w:bCs/>
+        </w:rPr>
+        <w:t>console.log(</w:t>
+      </w:r>
+      <w:proofErr w:type="gramEnd"/>
+      <w:r>
+        <w:rPr>
+          <w:b/>
+          <w:bCs/>
+        </w:rPr>
+        <w:t>"1" + 2);</w:t>
+      </w:r>
+      <w:r>
+        <w:t xml:space="preserve"> Output: </w:t>
+      </w:r>
+      <w:r>
+        <w:rPr>
+          <w:b/>
+          <w:bCs/>
+        </w:rPr>
+        <w:t>"12"</w:t>
+      </w:r>
+    </w:p>
+    <w:p>
+      <w:pPr>
+        <w:numPr>
+          <w:ilvl w:val="0"/>
+          <w:numId w:val="27"/>
+        </w:numPr>
+      </w:pPr>
+      <w:proofErr w:type="gramStart"/>
+      <w:r>
+        <w:rPr>
+          <w:b/>
+          <w:bCs/>
+        </w:rPr>
+        <w:t>console.log(</w:t>
+      </w:r>
+      <w:proofErr w:type="gramEnd"/>
+      <w:r>
+        <w:rPr>
+          <w:b/>
+          <w:bCs/>
+        </w:rPr>
+        <w:t>1 + "2");</w:t>
+      </w:r>
+      <w:r>
+        <w:t xml:space="preserve"> Output: </w:t>
+      </w:r>
+      <w:r>
+        <w:rPr>
+          <w:b/>
+          <w:bCs/>
+        </w:rPr>
+        <w:t>"12"</w:t>
+      </w:r>
+    </w:p>
+    <w:p>
+      <w:pPr>
+        <w:numPr>
+          <w:ilvl w:val="0"/>
+          <w:numId w:val="27"/>
+        </w:numPr>
+      </w:pPr>
+      <w:proofErr w:type="gramStart"/>
+      <w:r>
+        <w:rPr>
+          <w:b/>
+          <w:bCs/>
+        </w:rPr>
+        <w:t>console.log(</w:t>
+      </w:r>
+      <w:proofErr w:type="gramEnd"/>
+      <w:r>
+        <w:rPr>
+          <w:b/>
+          <w:bCs/>
+        </w:rPr>
+        <w:t>"1" + 2 + 2);</w:t>
+      </w:r>
+      <w:r>
+        <w:t xml:space="preserve"> Output: </w:t>
+      </w:r>
+      <w:r>
+        <w:rPr>
+          <w:b/>
+          <w:bCs/>
+        </w:rPr>
+        <w:t>"122"</w:t>
+      </w:r>
+      <w:r>
+        <w:t xml:space="preserve"> (Agar string </w:t>
+      </w:r>
+      <w:proofErr w:type="spellStart"/>
+      <w:r>
+        <w:t>pehle</w:t>
+      </w:r>
+      <w:proofErr w:type="spellEnd"/>
+      <w:r>
+        <w:t xml:space="preserve"> </w:t>
+      </w:r>
+      <w:proofErr w:type="spellStart"/>
+      <w:r>
+        <w:t>hai</w:t>
+      </w:r>
+      <w:proofErr w:type="spellEnd"/>
+      <w:r>
+        <w:t xml:space="preserve">, </w:t>
+      </w:r>
+      <w:proofErr w:type="spellStart"/>
+      <w:r>
+        <w:t>toh</w:t>
+      </w:r>
+      <w:proofErr w:type="spellEnd"/>
+      <w:r>
+        <w:t xml:space="preserve"> </w:t>
+      </w:r>
+      <w:proofErr w:type="spellStart"/>
+      <w:r>
+        <w:t>sabko</w:t>
+      </w:r>
+      <w:proofErr w:type="spellEnd"/>
+      <w:r>
+        <w:t xml:space="preserve"> string hi mana </w:t>
+      </w:r>
+      <w:proofErr w:type="spellStart"/>
+      <w:r>
+        <w:t>jayega</w:t>
+      </w:r>
+      <w:proofErr w:type="spellEnd"/>
+      <w:r>
+        <w:t>).</w:t>
+      </w:r>
+    </w:p>
+    <w:p>
+      <w:pPr>
+        <w:numPr>
+          <w:ilvl w:val="0"/>
+          <w:numId w:val="27"/>
+        </w:numPr>
+      </w:pPr>
+      <w:proofErr w:type="gramStart"/>
+      <w:r>
+        <w:rPr>
+          <w:b/>
+          <w:bCs/>
+        </w:rPr>
+        <w:t>console.log(</w:t>
+      </w:r>
+      <w:proofErr w:type="gramEnd"/>
+      <w:r>
+        <w:rPr>
+          <w:b/>
+          <w:bCs/>
+        </w:rPr>
+        <w:t>1 + 2 + "2");</w:t>
+      </w:r>
+      <w:r>
+        <w:t xml:space="preserve"> Output: </w:t>
+      </w:r>
+      <w:r>
+        <w:rPr>
+          <w:b/>
+          <w:bCs/>
+        </w:rPr>
+        <w:t>"32"</w:t>
+      </w:r>
+      <w:r>
+        <w:t xml:space="preserve"> (Pehle 1+2 add </w:t>
+      </w:r>
+      <w:proofErr w:type="spellStart"/>
+      <w:r>
+        <w:t>hokar</w:t>
+      </w:r>
+      <w:proofErr w:type="spellEnd"/>
+      <w:r>
+        <w:t xml:space="preserve"> 3 </w:t>
+      </w:r>
+      <w:proofErr w:type="spellStart"/>
+      <w:r>
+        <w:t>bana</w:t>
+      </w:r>
+      <w:proofErr w:type="spellEnd"/>
+      <w:r>
+        <w:t xml:space="preserve">, </w:t>
+      </w:r>
+      <w:proofErr w:type="spellStart"/>
+      <w:r>
+        <w:t>phir</w:t>
+      </w:r>
+      <w:proofErr w:type="spellEnd"/>
+      <w:r>
+        <w:t xml:space="preserve"> "2" </w:t>
+      </w:r>
+      <w:proofErr w:type="spellStart"/>
+      <w:r>
+        <w:t>ke</w:t>
+      </w:r>
+      <w:proofErr w:type="spellEnd"/>
+      <w:r>
+        <w:t xml:space="preserve"> </w:t>
+      </w:r>
+      <w:proofErr w:type="spellStart"/>
+      <w:r>
+        <w:t>saath</w:t>
+      </w:r>
+      <w:proofErr w:type="spellEnd"/>
+      <w:r>
+        <w:t xml:space="preserve"> </w:t>
+      </w:r>
+      <w:proofErr w:type="spellStart"/>
+      <w:r>
+        <w:t>jud</w:t>
+      </w:r>
+      <w:proofErr w:type="spellEnd"/>
+      <w:r>
+        <w:t xml:space="preserve"> </w:t>
+      </w:r>
+      <w:proofErr w:type="spellStart"/>
+      <w:r>
+        <w:t>kar</w:t>
+      </w:r>
+      <w:proofErr w:type="spellEnd"/>
+      <w:r>
+        <w:t xml:space="preserve"> "32" ban </w:t>
+      </w:r>
+      <w:proofErr w:type="spellStart"/>
+      <w:r>
+        <w:t>gaya</w:t>
+      </w:r>
+      <w:proofErr w:type="spellEnd"/>
+      <w:r>
+        <w:t>).</w:t>
+      </w:r>
+    </w:p>
+    <w:p>
+      <w:r>
+        <w:t>S</w:t>
+      </w:r>
+      <w:r>
+        <w:t xml:space="preserve">ir ne ye </w:t>
+      </w:r>
+      <w:proofErr w:type="spellStart"/>
+      <w:r>
+        <w:t>behavior</w:t>
+      </w:r>
+      <w:proofErr w:type="spellEnd"/>
+      <w:r>
+        <w:t xml:space="preserve"> </w:t>
+      </w:r>
+      <w:proofErr w:type="spellStart"/>
+      <w:r>
+        <w:t>dikhaya</w:t>
+      </w:r>
+      <w:proofErr w:type="spellEnd"/>
+      <w:r>
+        <w:t xml:space="preserve"> </w:t>
+      </w:r>
+      <w:proofErr w:type="spellStart"/>
+      <w:r>
+        <w:t>hai</w:t>
+      </w:r>
+      <w:proofErr w:type="spellEnd"/>
+      <w:r>
+        <w:t xml:space="preserve">. Iska reason </w:t>
+      </w:r>
+      <w:r>
+        <w:rPr>
+          <w:b/>
+          <w:bCs/>
+        </w:rPr>
+        <w:t>ECMAScript</w:t>
+      </w:r>
+      <w:r>
+        <w:t xml:space="preserve"> ki guidelines (Abstract Operations) </w:t>
+      </w:r>
+      <w:proofErr w:type="spellStart"/>
+      <w:r>
+        <w:t>mein</w:t>
+      </w:r>
+      <w:proofErr w:type="spellEnd"/>
+      <w:r>
+        <w:t xml:space="preserve"> </w:t>
+      </w:r>
+      <w:proofErr w:type="spellStart"/>
+      <w:r>
+        <w:t>hai</w:t>
+      </w:r>
+      <w:proofErr w:type="spellEnd"/>
+      <w:r>
+        <w:t>.</w:t>
+      </w:r>
+    </w:p>
+    <w:p>
+      <w:r>
+        <w:lastRenderedPageBreak/>
+        <w:drawing>
+          <wp:inline distT="0" distB="0" distL="0" distR="0" wp14:anchorId="0EE9DB97" wp14:editId="3C99D7B8">
+            <wp:extent cx="4077269" cy="3867690"/>
+            <wp:effectExtent l="0" t="0" r="0" b="0"/>
+            <wp:docPr id="173824492" name="Picture 1"/>
+            <wp:cNvGraphicFramePr>
+              <a:graphicFrameLocks xmlns:a="http://schemas.openxmlformats.org/drawingml/2006/main" noChangeAspect="1"/>
+            </wp:cNvGraphicFramePr>
+            <a:graphic xmlns:a="http://schemas.openxmlformats.org/drawingml/2006/main">
+              <a:graphicData uri="http://schemas.openxmlformats.org/drawingml/2006/picture">
+                <pic:pic xmlns:pic="http://schemas.openxmlformats.org/drawingml/2006/picture">
+                  <pic:nvPicPr>
+                    <pic:cNvPr id="173824492" name=""/>
+                    <pic:cNvPicPr/>
+                  </pic:nvPicPr>
+                  <pic:blipFill>
+                    <a:blip r:embed="rId42"/>
+                    <a:stretch>
+                      <a:fillRect/>
+                    </a:stretch>
+                  </pic:blipFill>
+                  <pic:spPr>
+                    <a:xfrm>
+                      <a:off x="0" y="0"/>
+                      <a:ext cx="4077269" cy="3867690"/>
+                    </a:xfrm>
+                    <a:prstGeom prst="rect">
+                      <a:avLst/>
+                    </a:prstGeom>
+                  </pic:spPr>
+                </pic:pic>
+              </a:graphicData>
+            </a:graphic>
+          </wp:inline>
+        </w:drawing>
+      </w:r>
+    </w:p>
+    <w:p>
+      <w:r>
+        <w:drawing>
+          <wp:inline distT="0" distB="0" distL="0" distR="0" wp14:anchorId="4D267B58" wp14:editId="0EEC7CC3">
+            <wp:extent cx="5731510" cy="3177540"/>
+            <wp:effectExtent l="0" t="0" r="2540" b="3810"/>
+            <wp:docPr id="268248463" name="Picture 1"/>
+            <wp:cNvGraphicFramePr>
+              <a:graphicFrameLocks xmlns:a="http://schemas.openxmlformats.org/drawingml/2006/main" noChangeAspect="1"/>
+            </wp:cNvGraphicFramePr>
+            <a:graphic xmlns:a="http://schemas.openxmlformats.org/drawingml/2006/main">
+              <a:graphicData uri="http://schemas.openxmlformats.org/drawingml/2006/picture">
+                <pic:pic xmlns:pic="http://schemas.openxmlformats.org/drawingml/2006/picture">
+                  <pic:nvPicPr>
+                    <pic:cNvPr id="268248463" name=""/>
+                    <pic:cNvPicPr/>
+                  </pic:nvPicPr>
+                  <pic:blipFill>
+                    <a:blip r:embed="rId43"/>
+                    <a:stretch>
+                      <a:fillRect/>
+                    </a:stretch>
+                  </pic:blipFill>
+                  <pic:spPr>
+                    <a:xfrm>
+                      <a:off x="0" y="0"/>
+                      <a:ext cx="5731510" cy="3177540"/>
+                    </a:xfrm>
+                    <a:prstGeom prst="rect">
+                      <a:avLst/>
+                    </a:prstGeom>
+                  </pic:spPr>
+                </pic:pic>
+              </a:graphicData>
+            </a:graphic>
+          </wp:inline>
+        </w:drawing>
+      </w:r>
+      <w:r>
+        <w:pict w14:anchorId="5B5828A8">
+          <v:rect id="_x0000_i1072" style="width:0;height:1.5pt" o:hralign="center" o:hrstd="t" o:hr="t" fillcolor="#a0a0a0" stroked="f"/>
+        </w:pict>
+      </w:r>
+    </w:p>
+    <w:p>
+      <w:pPr>
+        <w:rPr>
+          <w:b/>
+          <w:bCs/>
+        </w:rPr>
+      </w:pPr>
+      <w:r>
+        <w:rPr>
+          <w:b/>
+          <w:bCs/>
+        </w:rPr>
+        <w:t>4. Tricky Conversions (Don't do this in real code!)</w:t>
+      </w:r>
+    </w:p>
+    <w:p>
+      <w:r>
+        <w:t xml:space="preserve">Hitesh sir ne warn </w:t>
+      </w:r>
+      <w:proofErr w:type="spellStart"/>
+      <w:r>
+        <w:t>kiya</w:t>
+      </w:r>
+      <w:proofErr w:type="spellEnd"/>
+      <w:r>
+        <w:t xml:space="preserve"> </w:t>
+      </w:r>
+      <w:proofErr w:type="spellStart"/>
+      <w:r>
+        <w:t>hai</w:t>
+      </w:r>
+      <w:proofErr w:type="spellEnd"/>
+      <w:r>
+        <w:t xml:space="preserve"> ki </w:t>
+      </w:r>
+      <w:proofErr w:type="spellStart"/>
+      <w:r>
+        <w:t>aisa</w:t>
+      </w:r>
+      <w:proofErr w:type="spellEnd"/>
+      <w:r>
+        <w:t xml:space="preserve"> code real projects </w:t>
+      </w:r>
+      <w:proofErr w:type="spellStart"/>
+      <w:r>
+        <w:t>mein</w:t>
+      </w:r>
+      <w:proofErr w:type="spellEnd"/>
+      <w:r>
+        <w:t xml:space="preserve"> </w:t>
+      </w:r>
+      <w:proofErr w:type="spellStart"/>
+      <w:r>
+        <w:t>kabhi</w:t>
+      </w:r>
+      <w:proofErr w:type="spellEnd"/>
+      <w:r>
+        <w:t xml:space="preserve"> </w:t>
+      </w:r>
+      <w:proofErr w:type="spellStart"/>
+      <w:r>
+        <w:t>nahi</w:t>
+      </w:r>
+      <w:proofErr w:type="spellEnd"/>
+      <w:r>
+        <w:t xml:space="preserve"> </w:t>
+      </w:r>
+      <w:proofErr w:type="spellStart"/>
+      <w:r>
+        <w:t>likhna</w:t>
+      </w:r>
+      <w:proofErr w:type="spellEnd"/>
+      <w:r>
+        <w:t xml:space="preserve"> </w:t>
+      </w:r>
+      <w:proofErr w:type="spellStart"/>
+      <w:r>
+        <w:t>chahiye</w:t>
+      </w:r>
+      <w:proofErr w:type="spellEnd"/>
+      <w:r>
+        <w:t xml:space="preserve"> </w:t>
+      </w:r>
+      <w:proofErr w:type="spellStart"/>
+      <w:r>
+        <w:t>kyunki</w:t>
+      </w:r>
+      <w:proofErr w:type="spellEnd"/>
+      <w:r>
+        <w:t xml:space="preserve"> ye </w:t>
+      </w:r>
+      <w:r>
+        <w:rPr>
+          <w:b/>
+          <w:bCs/>
+        </w:rPr>
+        <w:t>Readability</w:t>
+      </w:r>
+      <w:r>
+        <w:t xml:space="preserve"> khatam </w:t>
+      </w:r>
+      <w:proofErr w:type="spellStart"/>
+      <w:r>
+        <w:t>kar</w:t>
+      </w:r>
+      <w:proofErr w:type="spellEnd"/>
+      <w:r>
+        <w:t xml:space="preserve"> </w:t>
+      </w:r>
+      <w:proofErr w:type="spellStart"/>
+      <w:r>
+        <w:t>deta</w:t>
+      </w:r>
+      <w:proofErr w:type="spellEnd"/>
+      <w:r>
+        <w:t xml:space="preserve"> </w:t>
+      </w:r>
+      <w:proofErr w:type="spellStart"/>
+      <w:r>
+        <w:t>hai</w:t>
+      </w:r>
+      <w:proofErr w:type="spellEnd"/>
+      <w:r>
+        <w:t>:</w:t>
+      </w:r>
+    </w:p>
+    <w:p>
+      <w:pPr>
+        <w:numPr>
+          <w:ilvl w:val="0"/>
+          <w:numId w:val="28"/>
+        </w:numPr>
+      </w:pPr>
+      <w:r>
+        <w:rPr>
+          <w:b/>
+          <w:bCs/>
+        </w:rPr>
+        <w:t>console.log(+true);</w:t>
+      </w:r>
+      <w:r>
+        <w:t xml:space="preserve"> Output: 1 (Unary plus ne true ko number </w:t>
+      </w:r>
+      <w:proofErr w:type="spellStart"/>
+      <w:r>
+        <w:t>bana</w:t>
+      </w:r>
+      <w:proofErr w:type="spellEnd"/>
+      <w:r>
+        <w:t xml:space="preserve"> diya).</w:t>
+      </w:r>
+    </w:p>
+    <w:p>
+      <w:pPr>
+        <w:numPr>
+          <w:ilvl w:val="0"/>
+          <w:numId w:val="28"/>
+        </w:numPr>
+      </w:pPr>
+      <w:proofErr w:type="gramStart"/>
+      <w:r>
+        <w:rPr>
+          <w:b/>
+          <w:bCs/>
+        </w:rPr>
+        <w:lastRenderedPageBreak/>
+        <w:t>console.log(</w:t>
+      </w:r>
+      <w:proofErr w:type="gramEnd"/>
+      <w:r>
+        <w:rPr>
+          <w:b/>
+          <w:bCs/>
+        </w:rPr>
+        <w:t>+"");</w:t>
+      </w:r>
+      <w:r>
+        <w:rPr>
+          <w:b/>
+          <w:bCs/>
+        </w:rPr>
+        <w:t xml:space="preserve"> </w:t>
+      </w:r>
+      <w:r>
+        <w:t xml:space="preserve">Output: 0 (Empty string number </w:t>
+      </w:r>
+      <w:proofErr w:type="spellStart"/>
+      <w:r>
+        <w:t>mein</w:t>
+      </w:r>
+      <w:proofErr w:type="spellEnd"/>
+      <w:r>
+        <w:t xml:space="preserve"> 0 </w:t>
+      </w:r>
+      <w:proofErr w:type="spellStart"/>
+      <w:r>
+        <w:t>hoti</w:t>
+      </w:r>
+      <w:proofErr w:type="spellEnd"/>
+      <w:r>
+        <w:t xml:space="preserve"> </w:t>
+      </w:r>
+      <w:proofErr w:type="spellStart"/>
+      <w:r>
+        <w:t>hai</w:t>
+      </w:r>
+      <w:proofErr w:type="spellEnd"/>
+      <w:r>
+        <w:t>).</w:t>
+      </w:r>
+    </w:p>
+    <w:p>
+      <w:pPr>
+        <w:rPr>
+          <w:noProof/>
+        </w:rPr>
+      </w:pPr>
+      <w:r>
+        <w:t xml:space="preserve">Sir </w:t>
+      </w:r>
+      <w:r>
+        <w:t xml:space="preserve">ne </w:t>
+      </w:r>
+      <w:r>
+        <w:rPr>
+          <w:b/>
+          <w:bCs/>
+        </w:rPr>
+        <w:t>Multiple Assignments</w:t>
+      </w:r>
+      <w:r>
+        <w:t xml:space="preserve"> (num1 = num2 = num3 = 2 + 2) ko </w:t>
+      </w:r>
+      <w:proofErr w:type="spellStart"/>
+      <w:r>
+        <w:t>bhi</w:t>
+      </w:r>
+      <w:proofErr w:type="spellEnd"/>
+      <w:r>
+        <w:t xml:space="preserve"> avoid </w:t>
+      </w:r>
+      <w:proofErr w:type="spellStart"/>
+      <w:r>
+        <w:t>karne</w:t>
+      </w:r>
+      <w:proofErr w:type="spellEnd"/>
+      <w:r>
+        <w:t xml:space="preserve"> ko kaha </w:t>
+      </w:r>
+      <w:proofErr w:type="spellStart"/>
+      <w:r>
+        <w:t>hai</w:t>
+      </w:r>
+      <w:proofErr w:type="spellEnd"/>
+      <w:r>
+        <w:t xml:space="preserve"> </w:t>
+      </w:r>
+      <w:proofErr w:type="spellStart"/>
+      <w:r>
+        <w:t>kyunki</w:t>
+      </w:r>
+      <w:proofErr w:type="spellEnd"/>
+      <w:r>
+        <w:t xml:space="preserve"> ye smart </w:t>
+      </w:r>
+      <w:proofErr w:type="spellStart"/>
+      <w:r>
+        <w:t>dikhne</w:t>
+      </w:r>
+      <w:proofErr w:type="spellEnd"/>
+      <w:r>
+        <w:t xml:space="preserve"> </w:t>
+      </w:r>
+      <w:proofErr w:type="spellStart"/>
+      <w:r>
+        <w:t>ke</w:t>
+      </w:r>
+      <w:proofErr w:type="spellEnd"/>
+      <w:r>
+        <w:t xml:space="preserve"> </w:t>
+      </w:r>
+      <w:proofErr w:type="spellStart"/>
+      <w:r>
+        <w:t>liye</w:t>
+      </w:r>
+      <w:proofErr w:type="spellEnd"/>
+      <w:r>
+        <w:t xml:space="preserve"> </w:t>
+      </w:r>
+      <w:proofErr w:type="spellStart"/>
+      <w:r>
+        <w:t>achha</w:t>
+      </w:r>
+      <w:proofErr w:type="spellEnd"/>
+      <w:r>
+        <w:t xml:space="preserve"> </w:t>
+      </w:r>
+      <w:proofErr w:type="spellStart"/>
+      <w:r>
+        <w:t>hai</w:t>
+      </w:r>
+      <w:proofErr w:type="spellEnd"/>
+      <w:r>
+        <w:t xml:space="preserve"> par code ko </w:t>
+      </w:r>
+      <w:proofErr w:type="spellStart"/>
+      <w:r>
+        <w:t>ganda</w:t>
+      </w:r>
+      <w:proofErr w:type="spellEnd"/>
+      <w:r>
+        <w:t xml:space="preserve"> </w:t>
+      </w:r>
+      <w:proofErr w:type="spellStart"/>
+      <w:r>
+        <w:t>karta</w:t>
+      </w:r>
+      <w:proofErr w:type="spellEnd"/>
+      <w:r>
+        <w:t xml:space="preserve"> </w:t>
+      </w:r>
+      <w:proofErr w:type="spellStart"/>
+      <w:r>
+        <w:t>hai</w:t>
+      </w:r>
+      <w:proofErr w:type="spellEnd"/>
+      <w:r>
+        <w:t>.</w:t>
+      </w:r>
+      <w:r>
+        <w:rPr>
+          <w:noProof/>
+        </w:rPr>
+        <w:t xml:space="preserve"> </w:t>
+      </w:r>
+      <w:r>
+        <w:rPr>
+          <w:noProof/>
+        </w:rPr>
+        <w:t xml:space="preserve">      </w:t>
+      </w:r>
+    </w:p>
+    <w:p>
+      <w:r>
+        <w:rPr>
+          <w:noProof/>
+        </w:rPr>
+        <w:t xml:space="preserve">                </w:t>
+      </w:r>
+      <w:r>
+        <w:drawing>
+          <wp:inline distT="0" distB="0" distL="0" distR="0" wp14:anchorId="06BCD81C" wp14:editId="15BB5FAC">
+            <wp:extent cx="4001058" cy="3524742"/>
+            <wp:effectExtent l="0" t="0" r="0" b="0"/>
+            <wp:docPr id="24753404" name="Picture 1"/>
+            <wp:cNvGraphicFramePr>
+              <a:graphicFrameLocks xmlns:a="http://schemas.openxmlformats.org/drawingml/2006/main" noChangeAspect="1"/>
+            </wp:cNvGraphicFramePr>
+            <a:graphic xmlns:a="http://schemas.openxmlformats.org/drawingml/2006/main">
+              <a:graphicData uri="http://schemas.openxmlformats.org/drawingml/2006/picture">
+                <pic:pic xmlns:pic="http://schemas.openxmlformats.org/drawingml/2006/picture">
+                  <pic:nvPicPr>
+                    <pic:cNvPr id="24753404" name=""/>
+                    <pic:cNvPicPr/>
+                  </pic:nvPicPr>
+                  <pic:blipFill>
+                    <a:blip r:embed="rId44"/>
+                    <a:stretch>
+                      <a:fillRect/>
+                    </a:stretch>
+                  </pic:blipFill>
+                  <pic:spPr>
+                    <a:xfrm>
+                      <a:off x="0" y="0"/>
+                      <a:ext cx="4001058" cy="3524742"/>
+                    </a:xfrm>
+                    <a:prstGeom prst="rect">
+                      <a:avLst/>
+                    </a:prstGeom>
+                  </pic:spPr>
+                </pic:pic>
+              </a:graphicData>
+            </a:graphic>
+          </wp:inline>
+        </w:drawing>
+      </w:r>
+      <w:r>
+        <w:pict w14:anchorId="601CA3C6">
+          <v:rect id="_x0000_i1073" style="width:0;height:1.5pt" o:hralign="center" o:hrstd="t" o:hr="t" fillcolor="#a0a0a0" stroked="f"/>
+        </w:pict>
+      </w:r>
+    </w:p>
+    <w:p>
+      <w:pPr>
+        <w:rPr>
+          <w:b/>
+          <w:bCs/>
+        </w:rPr>
+      </w:pPr>
+      <w:r>
+        <w:rPr>
+          <w:b/>
+          <w:bCs/>
+        </w:rPr>
+        <w:t>5. Increment Operator (Prefix &amp; Postfix)</w:t>
+      </w:r>
+    </w:p>
+    <w:p>
+      <w:r>
+        <w:t xml:space="preserve">Ye </w:t>
+      </w:r>
+      <w:proofErr w:type="spellStart"/>
+      <w:r>
+        <w:t>sabse</w:t>
+      </w:r>
+      <w:proofErr w:type="spellEnd"/>
+      <w:r>
+        <w:t xml:space="preserve"> important part </w:t>
+      </w:r>
+      <w:proofErr w:type="spellStart"/>
+      <w:r>
+        <w:t>hai</w:t>
+      </w:r>
+      <w:proofErr w:type="spellEnd"/>
+      <w:r>
+        <w:t xml:space="preserve"> jo sir ne </w:t>
+      </w:r>
+      <w:proofErr w:type="spellStart"/>
+      <w:r>
+        <w:t>aapko</w:t>
+      </w:r>
+      <w:proofErr w:type="spellEnd"/>
+      <w:r>
+        <w:t xml:space="preserve"> khud </w:t>
+      </w:r>
+      <w:proofErr w:type="spellStart"/>
+      <w:r>
+        <w:t>padhne</w:t>
+      </w:r>
+      <w:proofErr w:type="spellEnd"/>
+      <w:r>
+        <w:t xml:space="preserve"> ka assignment diya </w:t>
+      </w:r>
+      <w:proofErr w:type="spellStart"/>
+      <w:r>
+        <w:t>hai</w:t>
+      </w:r>
+      <w:proofErr w:type="spellEnd"/>
+      <w:r>
+        <w:t>:</w:t>
+      </w:r>
+    </w:p>
+    <w:p>
+      <w:pPr>
+        <w:numPr>
+          <w:ilvl w:val="0"/>
+          <w:numId w:val="29"/>
+        </w:numPr>
+      </w:pPr>
+      <w:r>
+        <w:rPr>
+          <w:b/>
+          <w:bCs/>
+        </w:rPr>
+        <w:t>Postfix (x++):</w:t>
+      </w:r>
+      <w:r>
+        <w:t xml:space="preserve"> Pehle value use </w:t>
+      </w:r>
+      <w:proofErr w:type="spellStart"/>
+      <w:r>
+        <w:t>hoti</w:t>
+      </w:r>
+      <w:proofErr w:type="spellEnd"/>
+      <w:r>
+        <w:t xml:space="preserve"> </w:t>
+      </w:r>
+      <w:proofErr w:type="spellStart"/>
+      <w:r>
+        <w:t>hai</w:t>
+      </w:r>
+      <w:proofErr w:type="spellEnd"/>
+      <w:r>
+        <w:t xml:space="preserve">, </w:t>
+      </w:r>
+      <w:proofErr w:type="spellStart"/>
+      <w:r>
+        <w:t>phir</w:t>
+      </w:r>
+      <w:proofErr w:type="spellEnd"/>
+      <w:r>
+        <w:t xml:space="preserve"> </w:t>
+      </w:r>
+      <w:proofErr w:type="spellStart"/>
+      <w:r>
+        <w:t>badhti</w:t>
+      </w:r>
+      <w:proofErr w:type="spellEnd"/>
+      <w:r>
+        <w:t xml:space="preserve"> </w:t>
+      </w:r>
+      <w:proofErr w:type="spellStart"/>
+      <w:r>
+        <w:t>hai</w:t>
+      </w:r>
+      <w:proofErr w:type="spellEnd"/>
+      <w:r>
+        <w:t>.</w:t>
+      </w:r>
+    </w:p>
+    <w:p>
+      <w:pPr>
+        <w:numPr>
+          <w:ilvl w:val="0"/>
+          <w:numId w:val="29"/>
+        </w:numPr>
+      </w:pPr>
+      <w:r>
+        <w:rPr>
+          <w:b/>
+          <w:bCs/>
+        </w:rPr>
+        <w:t>Prefix (++x):</w:t>
+      </w:r>
+      <w:r>
+        <w:t xml:space="preserve"> Pehle value </w:t>
+      </w:r>
+      <w:proofErr w:type="spellStart"/>
+      <w:r>
+        <w:t>badhti</w:t>
+      </w:r>
+      <w:proofErr w:type="spellEnd"/>
+      <w:r>
+        <w:t xml:space="preserve"> </w:t>
+      </w:r>
+      <w:proofErr w:type="spellStart"/>
+      <w:r>
+        <w:t>hai</w:t>
+      </w:r>
+      <w:proofErr w:type="spellEnd"/>
+      <w:r>
+        <w:t xml:space="preserve">, </w:t>
+      </w:r>
+      <w:proofErr w:type="spellStart"/>
+      <w:r>
+        <w:t>phir</w:t>
+      </w:r>
+      <w:proofErr w:type="spellEnd"/>
+      <w:r>
+        <w:t xml:space="preserve"> use </w:t>
+      </w:r>
+      <w:proofErr w:type="spellStart"/>
+      <w:r>
+        <w:t>hoti</w:t>
+      </w:r>
+      <w:proofErr w:type="spellEnd"/>
+      <w:r>
+        <w:t xml:space="preserve"> </w:t>
+      </w:r>
+      <w:proofErr w:type="spellStart"/>
+      <w:r>
+        <w:t>hai</w:t>
+      </w:r>
+      <w:proofErr w:type="spellEnd"/>
+      <w:r>
+        <w:t>.</w:t>
+      </w:r>
+    </w:p>
+    <w:p>
+      <w:r>
+        <w:t xml:space="preserve">                  </w:t>
+      </w:r>
+      <w:r>
+        <w:drawing>
+          <wp:inline distT="0" distB="0" distL="0" distR="0" wp14:anchorId="4DC23C62" wp14:editId="2F9363D4">
+            <wp:extent cx="4029637" cy="2543530"/>
+            <wp:effectExtent l="0" t="0" r="9525" b="9525"/>
+            <wp:docPr id="408074108" name="Picture 1"/>
+            <wp:cNvGraphicFramePr>
+              <a:graphicFrameLocks xmlns:a="http://schemas.openxmlformats.org/drawingml/2006/main" noChangeAspect="1"/>
+            </wp:cNvGraphicFramePr>
+            <a:graphic xmlns:a="http://schemas.openxmlformats.org/drawingml/2006/main">
+              <a:graphicData uri="http://schemas.openxmlformats.org/drawingml/2006/picture">
+                <pic:pic xmlns:pic="http://schemas.openxmlformats.org/drawingml/2006/picture">
+                  <pic:nvPicPr>
+                    <pic:cNvPr id="408074108" name=""/>
+                    <pic:cNvPicPr/>
+                  </pic:nvPicPr>
+                  <pic:blipFill>
+                    <a:blip r:embed="rId45"/>
+                    <a:stretch>
+                      <a:fillRect/>
+                    </a:stretch>
+                  </pic:blipFill>
+                  <pic:spPr>
+                    <a:xfrm>
+                      <a:off x="0" y="0"/>
+                      <a:ext cx="4029637" cy="2543530"/>
+                    </a:xfrm>
+                    <a:prstGeom prst="rect">
+                      <a:avLst/>
+                    </a:prstGeom>
+                  </pic:spPr>
+                </pic:pic>
+              </a:graphicData>
+            </a:graphic>
+          </wp:inline>
+        </w:drawing>
+      </w:r>
+    </w:p>
+    <w:p>
+      <w:pPr>
+        <w:rPr>
+          <w:b/>
+          <w:bCs/>
+        </w:rPr>
+      </w:pPr>
+      <w:r>
+        <w:lastRenderedPageBreak/>
+        <w:t xml:space="preserve">               </w:t>
+      </w:r>
+      <w:r>
+        <w:drawing>
+          <wp:inline distT="0" distB="0" distL="0" distR="0" wp14:anchorId="5E345EEA" wp14:editId="1A2A1D5D">
+            <wp:extent cx="4601217" cy="3753374"/>
+            <wp:effectExtent l="0" t="0" r="8890" b="0"/>
+            <wp:docPr id="152790124" name="Picture 1"/>
+            <wp:cNvGraphicFramePr>
+              <a:graphicFrameLocks xmlns:a="http://schemas.openxmlformats.org/drawingml/2006/main" noChangeAspect="1"/>
+            </wp:cNvGraphicFramePr>
+            <a:graphic xmlns:a="http://schemas.openxmlformats.org/drawingml/2006/main">
+              <a:graphicData uri="http://schemas.openxmlformats.org/drawingml/2006/picture">
+                <pic:pic xmlns:pic="http://schemas.openxmlformats.org/drawingml/2006/picture">
+                  <pic:nvPicPr>
+                    <pic:cNvPr id="152790124" name=""/>
+                    <pic:cNvPicPr/>
+                  </pic:nvPicPr>
+                  <pic:blipFill>
+                    <a:blip r:embed="rId46"/>
+                    <a:stretch>
+                      <a:fillRect/>
+                    </a:stretch>
+                  </pic:blipFill>
+                  <pic:spPr>
+                    <a:xfrm>
+                      <a:off x="0" y="0"/>
+                      <a:ext cx="4601217" cy="3753374"/>
+                    </a:xfrm>
+                    <a:prstGeom prst="rect">
+                      <a:avLst/>
+                    </a:prstGeom>
+                  </pic:spPr>
+                </pic:pic>
+              </a:graphicData>
+            </a:graphic>
+          </wp:inline>
+        </w:drawing>
+      </w:r>
+      <w:r>
+        <w:pict w14:anchorId="693703E7">
+          <v:rect id="_x0000_i1080" style="width:0;height:1.5pt" o:hralign="center" o:hrstd="t" o:hr="t" fillcolor="#a0a0a0" stroked="f"/>
+        </w:pict>
+      </w:r>
+    </w:p>
+    <w:p>
+      <w:pPr>
+        <w:rPr>
+          <w:b/>
+          <w:bCs/>
+        </w:rPr>
+      </w:pPr>
+      <w:r>
+        <w:rPr>
+          <w:b/>
+          <w:bCs/>
+        </w:rPr>
+        <w:t>Key Takeaways from Video:</w:t>
+      </w:r>
+    </w:p>
+    <w:p>
+      <w:pPr>
+        <w:numPr>
+          <w:ilvl w:val="0"/>
+          <w:numId w:val="30"/>
+        </w:numPr>
+      </w:pPr>
+      <w:r>
+        <w:rPr>
+          <w:b/>
+          <w:bCs/>
+        </w:rPr>
+        <w:t>Code Readability is Priority:</w:t>
+      </w:r>
+      <w:r>
+        <w:t xml:space="preserve"> Aisa code mat </w:t>
+      </w:r>
+      <w:proofErr w:type="spellStart"/>
+      <w:r>
+        <w:t>likho</w:t>
+      </w:r>
+      <w:proofErr w:type="spellEnd"/>
+      <w:r>
+        <w:t xml:space="preserve"> jo </w:t>
+      </w:r>
+      <w:proofErr w:type="spellStart"/>
+      <w:r>
+        <w:t>dimaag</w:t>
+      </w:r>
+      <w:proofErr w:type="spellEnd"/>
+      <w:r>
+        <w:t xml:space="preserve"> </w:t>
+      </w:r>
+      <w:proofErr w:type="spellStart"/>
+      <w:r>
+        <w:t>ghumaye</w:t>
+      </w:r>
+      <w:proofErr w:type="spellEnd"/>
+      <w:r>
+        <w:t xml:space="preserve">. Parentheses () ka </w:t>
+      </w:r>
+      <w:proofErr w:type="gramStart"/>
+      <w:r>
+        <w:t>use</w:t>
+      </w:r>
+      <w:proofErr w:type="gramEnd"/>
+      <w:r>
+        <w:t xml:space="preserve"> karo </w:t>
+      </w:r>
+      <w:proofErr w:type="spellStart"/>
+      <w:r>
+        <w:t>taaki</w:t>
+      </w:r>
+      <w:proofErr w:type="spellEnd"/>
+      <w:r>
+        <w:t xml:space="preserve"> order of operations clear </w:t>
+      </w:r>
+      <w:proofErr w:type="spellStart"/>
+      <w:r>
+        <w:t>rahe</w:t>
+      </w:r>
+      <w:proofErr w:type="spellEnd"/>
+      <w:r>
+        <w:t>.</w:t>
+      </w:r>
+    </w:p>
+    <w:p>
+      <w:pPr>
+        <w:numPr>
+          <w:ilvl w:val="0"/>
+          <w:numId w:val="30"/>
+        </w:numPr>
+      </w:pPr>
+      <w:r>
+        <w:rPr>
+          <w:b/>
+          <w:bCs/>
+        </w:rPr>
+        <w:t>ECMA Standards:</w:t>
+      </w:r>
+      <w:r>
+        <w:t xml:space="preserve"> Saara conversion ECMA ki rules book se </w:t>
+      </w:r>
+      <w:proofErr w:type="spellStart"/>
+      <w:r>
+        <w:t>chalta</w:t>
+      </w:r>
+      <w:proofErr w:type="spellEnd"/>
+      <w:r>
+        <w:t xml:space="preserve"> </w:t>
+      </w:r>
+      <w:proofErr w:type="spellStart"/>
+      <w:r>
+        <w:t>hai</w:t>
+      </w:r>
+      <w:proofErr w:type="spellEnd"/>
+      <w:r>
+        <w:t xml:space="preserve"> (</w:t>
+      </w:r>
+      <w:proofErr w:type="spellStart"/>
+      <w:r>
+        <w:t>ToPrimitive</w:t>
+      </w:r>
+      <w:proofErr w:type="spellEnd"/>
+      <w:r>
+        <w:t xml:space="preserve"> algorithms).</w:t>
+      </w:r>
+    </w:p>
+    <w:p>
+      <w:pPr>
+        <w:numPr>
+          <w:ilvl w:val="0"/>
+          <w:numId w:val="30"/>
+        </w:numPr>
+      </w:pPr>
+      <w:r>
+        <w:rPr>
+          <w:b/>
+          <w:bCs/>
+        </w:rPr>
+        <w:t>MDN Documentation:</w:t>
+      </w:r>
+      <w:r>
+        <w:t xml:space="preserve"> Sir ne suggest </w:t>
+      </w:r>
+      <w:proofErr w:type="spellStart"/>
+      <w:r>
+        <w:t>kiya</w:t>
+      </w:r>
+      <w:proofErr w:type="spellEnd"/>
+      <w:r>
+        <w:t xml:space="preserve"> </w:t>
+      </w:r>
+      <w:proofErr w:type="spellStart"/>
+      <w:r>
+        <w:t>hai</w:t>
+      </w:r>
+      <w:proofErr w:type="spellEnd"/>
+      <w:r>
+        <w:t xml:space="preserve"> ki Prefix aur Postfix ko MDN par </w:t>
+      </w:r>
+      <w:proofErr w:type="spellStart"/>
+      <w:r>
+        <w:t>ja</w:t>
+      </w:r>
+      <w:proofErr w:type="spellEnd"/>
+      <w:r>
+        <w:t xml:space="preserve"> </w:t>
+      </w:r>
+      <w:proofErr w:type="spellStart"/>
+      <w:r>
+        <w:t>kar</w:t>
+      </w:r>
+      <w:proofErr w:type="spellEnd"/>
+      <w:r>
+        <w:t xml:space="preserve"> detail </w:t>
+      </w:r>
+      <w:proofErr w:type="spellStart"/>
+      <w:r>
+        <w:t>mein</w:t>
+      </w:r>
+      <w:proofErr w:type="spellEnd"/>
+      <w:r>
+        <w:t xml:space="preserve"> </w:t>
+      </w:r>
+      <w:proofErr w:type="spellStart"/>
+      <w:r>
+        <w:t>padho</w:t>
+      </w:r>
+      <w:proofErr w:type="spellEnd"/>
+      <w:r>
+        <w:t>.</w:t>
+      </w:r>
+    </w:p>
+    <w:p>
+      <w:r>
+        <w:pict w14:anchorId="51BEE1D9">
+          <v:rect id="_x0000_i1094" style="width:0;height:1.5pt" o:hralign="center" o:hrstd="t" o:hr="t" fillcolor="#a0a0a0" stroked="f"/>
+        </w:pict>
+      </w:r>
+    </w:p>
     <w:p/>
     <w:sectPr>
       <w:pgSz w:w="11906" w:h="16838"/>
@@ -10949,7 +12649,7 @@
 <w:numbering xmlns:wpc="http://schemas.microsoft.com/office/word/2010/wordprocessingCanvas" xmlns:cx="http://schemas.microsoft.com/office/drawing/2014/chartex" xmlns:cx1="http://schemas.microsoft.com/office/drawing/2015/9/8/chartex" xmlns:cx2="http://schemas.microsoft.com/office/drawing/2015/10/21/chartex" xmlns:cx3="http://schemas.microsoft.com/office/drawing/2016/5/9/chartex" xmlns:cx4="http://schemas.microsoft.com/office/drawing/2016/5/10/chartex" xmlns:cx5="http://schemas.microsoft.com/office/drawing/2016/5/11/chartex" xmlns:cx6="http://schemas.microsoft.com/office/drawing/2016/5/12/chartex" xmlns:cx7="http://schemas.microsoft.com/office/drawing/2016/5/13/chartex" xmlns:cx8="http://schemas.microsoft.com/office/drawing/2016/5/14/chartex" xmlns:mc="http://schemas.openxmlformats.org/markup-compatibility/2006" xmlns:aink="http://schemas.microsoft.com/office/drawing/2016/ink" xmlns:am3d="http://schemas.microsoft.com/office/drawing/2017/model3d" xmlns:o="urn:schemas-microsoft-com:office:office" xmlns:oel="http://schemas.microsoft.com/office/2019/extlst" xmlns:r="http://schemas.openxmlformats.org/officeDocument/2006/relationships" xmlns:m="http://schemas.openxmlformats.org/officeDocument/2006/math" xmlns:v="urn:schemas-microsoft-com:vml" xmlns:wp14="http://schemas.microsoft.com/office/word/2010/wordprocessingDrawing" xmlns:wp="http://schemas.openxmlformats.org/drawingml/2006/wordprocessingDrawing" xmlns:w10="urn:schemas-microsoft-com:office:word" xmlns:w="http://schemas.openxmlformats.org/wordprocessingml/2006/main" xmlns:w14="http://schemas.microsoft.com/office/word/2010/wordml" xmlns:w15="http://schemas.microsoft.com/office/word/2012/wordml" xmlns:w16cex="http://schemas.microsoft.com/office/word/2018/wordml/cex" xmlns:w16cid="http://schemas.microsoft.com/office/word/2016/wordml/cid" xmlns:w16="http://schemas.microsoft.com/office/word/2018/wordml" xmlns:w16du="http://schemas.microsoft.com/office/word/2023/wordml/word16du" xmlns:w16sdtdh="http://schemas.microsoft.com/office/word/2020/wordml/sdtdatahash" xmlns:w16sdtfl="http://schemas.microsoft.com/office/word/2024/wordml/sdtformatlock" xmlns:w16se="http://schemas.microsoft.com/office/word/2015/wordml/symex" xmlns:wpg="http://schemas.microsoft.com/office/word/2010/wordprocessingGroup" xmlns:wpi="http://schemas.microsoft.com/office/word/2010/wordprocessingInk" xmlns:wne="http://schemas.microsoft.com/office/word/2006/wordml" xmlns:wps="http://schemas.microsoft.com/office/word/2010/wordprocessingShape" mc:Ignorable="w14 w15 w16se w16cid w16 w16cex w16sdtdh w16sdtfl w16du wp14">
   <w:numPicBullet w:numPicBulletId="0">
     <w:pict>
-      <v:rect id="_x0000_i1043" style="width:0;height:1.5pt" o:hralign="center" o:bullet="t" o:hrstd="t" o:hr="t" fillcolor="#a0a0a0" stroked="f"/>
+      <v:rect id="_x0000_i1056" style="width:0;height:1.5pt" o:hralign="center" o:bullet="t" o:hrstd="t" o:hr="t" fillcolor="#a0a0a0" stroked="f"/>
     </w:pict>
   </w:numPicBullet>
   <w:abstractNum w:abstractNumId="0" w15:restartNumberingAfterBreak="0">
@@ -11102,6 +12802,155 @@
     </w:lvl>
   </w:abstractNum>
   <w:abstractNum w:abstractNumId="1" w15:restartNumberingAfterBreak="0">
+    <w:nsid w:val="0360189C"/>
+    <w:multiLevelType w:val="multilevel"/>
+    <w:tmpl w:val="C060CBF2"/>
+    <w:lvl w:ilvl="0">
+      <w:start w:val="1"/>
+      <w:numFmt w:val="bullet"/>
+      <w:lvlText w:val=""/>
+      <w:lvlJc w:val="left"/>
+      <w:pPr>
+        <w:tabs>
+          <w:tab w:val="num" w:pos="720"/>
+        </w:tabs>
+        <w:ind w:left="720" w:hanging="360"/>
+      </w:pPr>
+      <w:rPr>
+        <w:rFonts w:ascii="Symbol" w:hAnsi="Symbol" w:hint="default"/>
+        <w:sz w:val="20"/>
+      </w:rPr>
+    </w:lvl>
+    <w:lvl w:ilvl="1" w:tentative="1">
+      <w:start w:val="1"/>
+      <w:numFmt w:val="bullet"/>
+      <w:lvlText w:val="o"/>
+      <w:lvlJc w:val="left"/>
+      <w:pPr>
+        <w:tabs>
+          <w:tab w:val="num" w:pos="1440"/>
+        </w:tabs>
+        <w:ind w:left="1440" w:hanging="360"/>
+      </w:pPr>
+      <w:rPr>
+        <w:rFonts w:ascii="Courier New" w:hAnsi="Courier New" w:hint="default"/>
+        <w:sz w:val="20"/>
+      </w:rPr>
+    </w:lvl>
+    <w:lvl w:ilvl="2" w:tentative="1">
+      <w:start w:val="1"/>
+      <w:numFmt w:val="bullet"/>
+      <w:lvlText w:val=""/>
+      <w:lvlJc w:val="left"/>
+      <w:pPr>
+        <w:tabs>
+          <w:tab w:val="num" w:pos="2160"/>
+        </w:tabs>
+        <w:ind w:left="2160" w:hanging="360"/>
+      </w:pPr>
+      <w:rPr>
+        <w:rFonts w:ascii="Wingdings" w:hAnsi="Wingdings" w:hint="default"/>
+        <w:sz w:val="20"/>
+      </w:rPr>
+    </w:lvl>
+    <w:lvl w:ilvl="3" w:tentative="1">
+      <w:start w:val="1"/>
+      <w:numFmt w:val="bullet"/>
+      <w:lvlText w:val=""/>
+      <w:lvlJc w:val="left"/>
+      <w:pPr>
+        <w:tabs>
+          <w:tab w:val="num" w:pos="2880"/>
+        </w:tabs>
+        <w:ind w:left="2880" w:hanging="360"/>
+      </w:pPr>
+      <w:rPr>
+        <w:rFonts w:ascii="Wingdings" w:hAnsi="Wingdings" w:hint="default"/>
+        <w:sz w:val="20"/>
+      </w:rPr>
+    </w:lvl>
+    <w:lvl w:ilvl="4" w:tentative="1">
+      <w:start w:val="1"/>
+      <w:numFmt w:val="bullet"/>
+      <w:lvlText w:val=""/>
+      <w:lvlJc w:val="left"/>
+      <w:pPr>
+        <w:tabs>
+          <w:tab w:val="num" w:pos="3600"/>
+        </w:tabs>
+        <w:ind w:left="3600" w:hanging="360"/>
+      </w:pPr>
+      <w:rPr>
+        <w:rFonts w:ascii="Wingdings" w:hAnsi="Wingdings" w:hint="default"/>
+        <w:sz w:val="20"/>
+      </w:rPr>
+    </w:lvl>
+    <w:lvl w:ilvl="5" w:tentative="1">
+      <w:start w:val="1"/>
+      <w:numFmt w:val="bullet"/>
+      <w:lvlText w:val=""/>
+      <w:lvlJc w:val="left"/>
+      <w:pPr>
+        <w:tabs>
+          <w:tab w:val="num" w:pos="4320"/>
+        </w:tabs>
+        <w:ind w:left="4320" w:hanging="360"/>
+      </w:pPr>
+      <w:rPr>
+        <w:rFonts w:ascii="Wingdings" w:hAnsi="Wingdings" w:hint="default"/>
+        <w:sz w:val="20"/>
+      </w:rPr>
+    </w:lvl>
+    <w:lvl w:ilvl="6" w:tentative="1">
+      <w:start w:val="1"/>
+      <w:numFmt w:val="bullet"/>
+      <w:lvlText w:val=""/>
+      <w:lvlJc w:val="left"/>
+      <w:pPr>
+        <w:tabs>
+          <w:tab w:val="num" w:pos="5040"/>
+        </w:tabs>
+        <w:ind w:left="5040" w:hanging="360"/>
+      </w:pPr>
+      <w:rPr>
+        <w:rFonts w:ascii="Wingdings" w:hAnsi="Wingdings" w:hint="default"/>
+        <w:sz w:val="20"/>
+      </w:rPr>
+    </w:lvl>
+    <w:lvl w:ilvl="7" w:tentative="1">
+      <w:start w:val="1"/>
+      <w:numFmt w:val="bullet"/>
+      <w:lvlText w:val=""/>
+      <w:lvlJc w:val="left"/>
+      <w:pPr>
+        <w:tabs>
+          <w:tab w:val="num" w:pos="5760"/>
+        </w:tabs>
+        <w:ind w:left="5760" w:hanging="360"/>
+      </w:pPr>
+      <w:rPr>
+        <w:rFonts w:ascii="Wingdings" w:hAnsi="Wingdings" w:hint="default"/>
+        <w:sz w:val="20"/>
+      </w:rPr>
+    </w:lvl>
+    <w:lvl w:ilvl="8" w:tentative="1">
+      <w:start w:val="1"/>
+      <w:numFmt w:val="bullet"/>
+      <w:lvlText w:val=""/>
+      <w:lvlJc w:val="left"/>
+      <w:pPr>
+        <w:tabs>
+          <w:tab w:val="num" w:pos="6480"/>
+        </w:tabs>
+        <w:ind w:left="6480" w:hanging="360"/>
+      </w:pPr>
+      <w:rPr>
+        <w:rFonts w:ascii="Wingdings" w:hAnsi="Wingdings" w:hint="default"/>
+        <w:sz w:val="20"/>
+      </w:rPr>
+    </w:lvl>
+  </w:abstractNum>
+  <w:abstractNum w:abstractNumId="2" w15:restartNumberingAfterBreak="0">
     <w:nsid w:val="096C22F2"/>
     <w:multiLevelType w:val="multilevel"/>
     <w:tmpl w:val="B3625C66"/>
@@ -11250,7 +13099,7 @@
       </w:rPr>
     </w:lvl>
   </w:abstractNum>
-  <w:abstractNum w:abstractNumId="2" w15:restartNumberingAfterBreak="0">
+  <w:abstractNum w:abstractNumId="3" w15:restartNumberingAfterBreak="0">
     <w:nsid w:val="0A7E2759"/>
     <w:multiLevelType w:val="multilevel"/>
     <w:tmpl w:val="5762C7D6"/>
@@ -11363,7 +13212,7 @@
       </w:pPr>
     </w:lvl>
   </w:abstractNum>
-  <w:abstractNum w:abstractNumId="3" w15:restartNumberingAfterBreak="0">
+  <w:abstractNum w:abstractNumId="4" w15:restartNumberingAfterBreak="0">
     <w:nsid w:val="0F4A44EE"/>
     <w:multiLevelType w:val="multilevel"/>
     <w:tmpl w:val="54D281CE"/>
@@ -11512,7 +13361,7 @@
       </w:rPr>
     </w:lvl>
   </w:abstractNum>
-  <w:abstractNum w:abstractNumId="4" w15:restartNumberingAfterBreak="0">
+  <w:abstractNum w:abstractNumId="5" w15:restartNumberingAfterBreak="0">
     <w:nsid w:val="146754DF"/>
     <w:multiLevelType w:val="multilevel"/>
     <w:tmpl w:val="82881C24"/>
@@ -11661,7 +13510,7 @@
       </w:rPr>
     </w:lvl>
   </w:abstractNum>
-  <w:abstractNum w:abstractNumId="5" w15:restartNumberingAfterBreak="0">
+  <w:abstractNum w:abstractNumId="6" w15:restartNumberingAfterBreak="0">
     <w:nsid w:val="14831423"/>
     <w:multiLevelType w:val="multilevel"/>
     <w:tmpl w:val="6142A946"/>
@@ -11806,7 +13655,7 @@
       </w:rPr>
     </w:lvl>
   </w:abstractNum>
-  <w:abstractNum w:abstractNumId="6" w15:restartNumberingAfterBreak="0">
+  <w:abstractNum w:abstractNumId="7" w15:restartNumberingAfterBreak="0">
     <w:nsid w:val="17387F48"/>
     <w:multiLevelType w:val="multilevel"/>
     <w:tmpl w:val="827A1642"/>
@@ -11955,7 +13804,7 @@
       </w:rPr>
     </w:lvl>
   </w:abstractNum>
-  <w:abstractNum w:abstractNumId="7" w15:restartNumberingAfterBreak="0">
+  <w:abstractNum w:abstractNumId="8" w15:restartNumberingAfterBreak="0">
     <w:nsid w:val="1B9E2DC0"/>
     <w:multiLevelType w:val="multilevel"/>
     <w:tmpl w:val="9E1C2A48"/>
@@ -12068,7 +13917,7 @@
       </w:pPr>
     </w:lvl>
   </w:abstractNum>
-  <w:abstractNum w:abstractNumId="8" w15:restartNumberingAfterBreak="0">
+  <w:abstractNum w:abstractNumId="9" w15:restartNumberingAfterBreak="0">
     <w:nsid w:val="22344C3B"/>
     <w:multiLevelType w:val="multilevel"/>
     <w:tmpl w:val="8DBE15BE"/>
@@ -12217,7 +14066,7 @@
       </w:rPr>
     </w:lvl>
   </w:abstractNum>
-  <w:abstractNum w:abstractNumId="9" w15:restartNumberingAfterBreak="0">
+  <w:abstractNum w:abstractNumId="10" w15:restartNumberingAfterBreak="0">
     <w:nsid w:val="257838BF"/>
     <w:multiLevelType w:val="multilevel"/>
     <w:tmpl w:val="931E5548"/>
@@ -12366,7 +14215,120 @@
       </w:rPr>
     </w:lvl>
   </w:abstractNum>
-  <w:abstractNum w:abstractNumId="10" w15:restartNumberingAfterBreak="0">
+  <w:abstractNum w:abstractNumId="11" w15:restartNumberingAfterBreak="0">
+    <w:nsid w:val="284349D0"/>
+    <w:multiLevelType w:val="multilevel"/>
+    <w:tmpl w:val="D36A1922"/>
+    <w:lvl w:ilvl="0">
+      <w:start w:val="1"/>
+      <w:numFmt w:val="decimal"/>
+      <w:lvlText w:val="%1."/>
+      <w:lvlJc w:val="left"/>
+      <w:pPr>
+        <w:tabs>
+          <w:tab w:val="num" w:pos="720"/>
+        </w:tabs>
+        <w:ind w:left="720" w:hanging="360"/>
+      </w:pPr>
+    </w:lvl>
+    <w:lvl w:ilvl="1" w:tentative="1">
+      <w:start w:val="1"/>
+      <w:numFmt w:val="decimal"/>
+      <w:lvlText w:val="%2."/>
+      <w:lvlJc w:val="left"/>
+      <w:pPr>
+        <w:tabs>
+          <w:tab w:val="num" w:pos="1440"/>
+        </w:tabs>
+        <w:ind w:left="1440" w:hanging="360"/>
+      </w:pPr>
+    </w:lvl>
+    <w:lvl w:ilvl="2" w:tentative="1">
+      <w:start w:val="1"/>
+      <w:numFmt w:val="decimal"/>
+      <w:lvlText w:val="%3."/>
+      <w:lvlJc w:val="left"/>
+      <w:pPr>
+        <w:tabs>
+          <w:tab w:val="num" w:pos="2160"/>
+        </w:tabs>
+        <w:ind w:left="2160" w:hanging="360"/>
+      </w:pPr>
+    </w:lvl>
+    <w:lvl w:ilvl="3" w:tentative="1">
+      <w:start w:val="1"/>
+      <w:numFmt w:val="decimal"/>
+      <w:lvlText w:val="%4."/>
+      <w:lvlJc w:val="left"/>
+      <w:pPr>
+        <w:tabs>
+          <w:tab w:val="num" w:pos="2880"/>
+        </w:tabs>
+        <w:ind w:left="2880" w:hanging="360"/>
+      </w:pPr>
+    </w:lvl>
+    <w:lvl w:ilvl="4" w:tentative="1">
+      <w:start w:val="1"/>
+      <w:numFmt w:val="decimal"/>
+      <w:lvlText w:val="%5."/>
+      <w:lvlJc w:val="left"/>
+      <w:pPr>
+        <w:tabs>
+          <w:tab w:val="num" w:pos="3600"/>
+        </w:tabs>
+        <w:ind w:left="3600" w:hanging="360"/>
+      </w:pPr>
+    </w:lvl>
+    <w:lvl w:ilvl="5" w:tentative="1">
+      <w:start w:val="1"/>
+      <w:numFmt w:val="decimal"/>
+      <w:lvlText w:val="%6."/>
+      <w:lvlJc w:val="left"/>
+      <w:pPr>
+        <w:tabs>
+          <w:tab w:val="num" w:pos="4320"/>
+        </w:tabs>
+        <w:ind w:left="4320" w:hanging="360"/>
+      </w:pPr>
+    </w:lvl>
+    <w:lvl w:ilvl="6" w:tentative="1">
+      <w:start w:val="1"/>
+      <w:numFmt w:val="decimal"/>
+      <w:lvlText w:val="%7."/>
+      <w:lvlJc w:val="left"/>
+      <w:pPr>
+        <w:tabs>
+          <w:tab w:val="num" w:pos="5040"/>
+        </w:tabs>
+        <w:ind w:left="5040" w:hanging="360"/>
+      </w:pPr>
+    </w:lvl>
+    <w:lvl w:ilvl="7" w:tentative="1">
+      <w:start w:val="1"/>
+      <w:numFmt w:val="decimal"/>
+      <w:lvlText w:val="%8."/>
+      <w:lvlJc w:val="left"/>
+      <w:pPr>
+        <w:tabs>
+          <w:tab w:val="num" w:pos="5760"/>
+        </w:tabs>
+        <w:ind w:left="5760" w:hanging="360"/>
+      </w:pPr>
+    </w:lvl>
+    <w:lvl w:ilvl="8" w:tentative="1">
+      <w:start w:val="1"/>
+      <w:numFmt w:val="decimal"/>
+      <w:lvlText w:val="%9."/>
+      <w:lvlJc w:val="left"/>
+      <w:pPr>
+        <w:tabs>
+          <w:tab w:val="num" w:pos="6480"/>
+        </w:tabs>
+        <w:ind w:left="6480" w:hanging="360"/>
+      </w:pPr>
+    </w:lvl>
+  </w:abstractNum>
+  <w:abstractNum w:abstractNumId="12" w15:restartNumberingAfterBreak="0">
     <w:nsid w:val="29F31054"/>
     <w:multiLevelType w:val="multilevel"/>
     <w:tmpl w:val="357C58B0"/>
@@ -12515,7 +14477,7 @@
       </w:rPr>
     </w:lvl>
   </w:abstractNum>
-  <w:abstractNum w:abstractNumId="11" w15:restartNumberingAfterBreak="0">
+  <w:abstractNum w:abstractNumId="13" w15:restartNumberingAfterBreak="0">
     <w:nsid w:val="328F4473"/>
     <w:multiLevelType w:val="multilevel"/>
     <w:tmpl w:val="3F7616B4"/>
@@ -12664,7 +14626,7 @@
       </w:rPr>
     </w:lvl>
   </w:abstractNum>
-  <w:abstractNum w:abstractNumId="12" w15:restartNumberingAfterBreak="0">
+  <w:abstractNum w:abstractNumId="14" w15:restartNumberingAfterBreak="0">
     <w:nsid w:val="33923578"/>
     <w:multiLevelType w:val="multilevel"/>
     <w:tmpl w:val="EB42FD92"/>
@@ -12813,7 +14775,7 @@
       </w:rPr>
     </w:lvl>
   </w:abstractNum>
-  <w:abstractNum w:abstractNumId="13" w15:restartNumberingAfterBreak="0">
+  <w:abstractNum w:abstractNumId="15" w15:restartNumberingAfterBreak="0">
     <w:nsid w:val="35EE1AD9"/>
     <w:multiLevelType w:val="multilevel"/>
     <w:tmpl w:val="52063FB2"/>
@@ -12962,7 +14924,7 @@
       </w:rPr>
     </w:lvl>
   </w:abstractNum>
-  <w:abstractNum w:abstractNumId="14" w15:restartNumberingAfterBreak="0">
+  <w:abstractNum w:abstractNumId="16" w15:restartNumberingAfterBreak="0">
     <w:nsid w:val="3C763A2D"/>
     <w:multiLevelType w:val="multilevel"/>
     <w:tmpl w:val="373A1C18"/>
@@ -13111,7 +15073,7 @@
       </w:rPr>
     </w:lvl>
   </w:abstractNum>
-  <w:abstractNum w:abstractNumId="15" w15:restartNumberingAfterBreak="0">
+  <w:abstractNum w:abstractNumId="17" w15:restartNumberingAfterBreak="0">
     <w:nsid w:val="3F991AB3"/>
     <w:multiLevelType w:val="multilevel"/>
     <w:tmpl w:val="D7C07BB0"/>
@@ -13260,7 +15222,156 @@
       </w:rPr>
     </w:lvl>
   </w:abstractNum>
-  <w:abstractNum w:abstractNumId="16" w15:restartNumberingAfterBreak="0">
+  <w:abstractNum w:abstractNumId="18" w15:restartNumberingAfterBreak="0">
+    <w:nsid w:val="41FF10EF"/>
+    <w:multiLevelType w:val="multilevel"/>
+    <w:tmpl w:val="A5008A5C"/>
+    <w:lvl w:ilvl="0">
+      <w:start w:val="1"/>
+      <w:numFmt w:val="bullet"/>
+      <w:lvlText w:val=""/>
+      <w:lvlJc w:val="left"/>
+      <w:pPr>
+        <w:tabs>
+          <w:tab w:val="num" w:pos="720"/>
+        </w:tabs>
+        <w:ind w:left="720" w:hanging="360"/>
+      </w:pPr>
+      <w:rPr>
+        <w:rFonts w:ascii="Symbol" w:hAnsi="Symbol" w:hint="default"/>
+        <w:sz w:val="20"/>
+      </w:rPr>
+    </w:lvl>
+    <w:lvl w:ilvl="1" w:tentative="1">
+      <w:start w:val="1"/>
+      <w:numFmt w:val="bullet"/>
+      <w:lvlText w:val="o"/>
+      <w:lvlJc w:val="left"/>
+      <w:pPr>
+        <w:tabs>
+          <w:tab w:val="num" w:pos="1440"/>
+        </w:tabs>
+        <w:ind w:left="1440" w:hanging="360"/>
+      </w:pPr>
+      <w:rPr>
+        <w:rFonts w:ascii="Courier New" w:hAnsi="Courier New" w:hint="default"/>
+        <w:sz w:val="20"/>
+      </w:rPr>
+    </w:lvl>
+    <w:lvl w:ilvl="2" w:tentative="1">
+      <w:start w:val="1"/>
+      <w:numFmt w:val="bullet"/>
+      <w:lvlText w:val=""/>
+      <w:lvlJc w:val="left"/>
+      <w:pPr>
+        <w:tabs>
+          <w:tab w:val="num" w:pos="2160"/>
+        </w:tabs>
+        <w:ind w:left="2160" w:hanging="360"/>
+      </w:pPr>
+      <w:rPr>
+        <w:rFonts w:ascii="Wingdings" w:hAnsi="Wingdings" w:hint="default"/>
+        <w:sz w:val="20"/>
+      </w:rPr>
+    </w:lvl>
+    <w:lvl w:ilvl="3" w:tentative="1">
+      <w:start w:val="1"/>
+      <w:numFmt w:val="bullet"/>
+      <w:lvlText w:val=""/>
+      <w:lvlJc w:val="left"/>
+      <w:pPr>
+        <w:tabs>
+          <w:tab w:val="num" w:pos="2880"/>
+        </w:tabs>
+        <w:ind w:left="2880" w:hanging="360"/>
+      </w:pPr>
+      <w:rPr>
+        <w:rFonts w:ascii="Wingdings" w:hAnsi="Wingdings" w:hint="default"/>
+        <w:sz w:val="20"/>
+      </w:rPr>
+    </w:lvl>
+    <w:lvl w:ilvl="4" w:tentative="1">
+      <w:start w:val="1"/>
+      <w:numFmt w:val="bullet"/>
+      <w:lvlText w:val=""/>
+      <w:lvlJc w:val="left"/>
+      <w:pPr>
+        <w:tabs>
+          <w:tab w:val="num" w:pos="3600"/>
+        </w:tabs>
+        <w:ind w:left="3600" w:hanging="360"/>
+      </w:pPr>
+      <w:rPr>
+        <w:rFonts w:ascii="Wingdings" w:hAnsi="Wingdings" w:hint="default"/>
+        <w:sz w:val="20"/>
+      </w:rPr>
+    </w:lvl>
+    <w:lvl w:ilvl="5" w:tentative="1">
+      <w:start w:val="1"/>
+      <w:numFmt w:val="bullet"/>
+      <w:lvlText w:val=""/>
+      <w:lvlJc w:val="left"/>
+      <w:pPr>
+        <w:tabs>
+          <w:tab w:val="num" w:pos="4320"/>
+        </w:tabs>
+        <w:ind w:left="4320" w:hanging="360"/>
+      </w:pPr>
+      <w:rPr>
+        <w:rFonts w:ascii="Wingdings" w:hAnsi="Wingdings" w:hint="default"/>
+        <w:sz w:val="20"/>
+      </w:rPr>
+    </w:lvl>
+    <w:lvl w:ilvl="6" w:tentative="1">
+      <w:start w:val="1"/>
+      <w:numFmt w:val="bullet"/>
+      <w:lvlText w:val=""/>
+      <w:lvlJc w:val="left"/>
+      <w:pPr>
+        <w:tabs>
+          <w:tab w:val="num" w:pos="5040"/>
+        </w:tabs>
+        <w:ind w:left="5040" w:hanging="360"/>
+      </w:pPr>
+      <w:rPr>
+        <w:rFonts w:ascii="Wingdings" w:hAnsi="Wingdings" w:hint="default"/>
+        <w:sz w:val="20"/>
+      </w:rPr>
+    </w:lvl>
+    <w:lvl w:ilvl="7" w:tentative="1">
+      <w:start w:val="1"/>
+      <w:numFmt w:val="bullet"/>
+      <w:lvlText w:val=""/>
+      <w:lvlJc w:val="left"/>
+      <w:pPr>
+        <w:tabs>
+          <w:tab w:val="num" w:pos="5760"/>
+        </w:tabs>
+        <w:ind w:left="5760" w:hanging="360"/>
+      </w:pPr>
+      <w:rPr>
+        <w:rFonts w:ascii="Wingdings" w:hAnsi="Wingdings" w:hint="default"/>
+        <w:sz w:val="20"/>
+      </w:rPr>
+    </w:lvl>
+    <w:lvl w:ilvl="8" w:tentative="1">
+      <w:start w:val="1"/>
+      <w:numFmt w:val="bullet"/>
+      <w:lvlText w:val=""/>
+      <w:lvlJc w:val="left"/>
+      <w:pPr>
+        <w:tabs>
+          <w:tab w:val="num" w:pos="6480"/>
+        </w:tabs>
+        <w:ind w:left="6480" w:hanging="360"/>
+      </w:pPr>
+      <w:rPr>
+        <w:rFonts w:ascii="Wingdings" w:hAnsi="Wingdings" w:hint="default"/>
+        <w:sz w:val="20"/>
+      </w:rPr>
+    </w:lvl>
+  </w:abstractNum>
+  <w:abstractNum w:abstractNumId="19" w15:restartNumberingAfterBreak="0">
     <w:nsid w:val="53B754AC"/>
     <w:multiLevelType w:val="multilevel"/>
     <w:tmpl w:val="0854C724"/>
@@ -13409,7 +15520,7 @@
       </w:rPr>
     </w:lvl>
   </w:abstractNum>
-  <w:abstractNum w:abstractNumId="17" w15:restartNumberingAfterBreak="0">
+  <w:abstractNum w:abstractNumId="20" w15:restartNumberingAfterBreak="0">
     <w:nsid w:val="55FC7277"/>
     <w:multiLevelType w:val="multilevel"/>
     <w:tmpl w:val="FCEED21E"/>
@@ -13522,7 +15633,7 @@
       </w:pPr>
     </w:lvl>
   </w:abstractNum>
-  <w:abstractNum w:abstractNumId="18" w15:restartNumberingAfterBreak="0">
+  <w:abstractNum w:abstractNumId="21" w15:restartNumberingAfterBreak="0">
     <w:nsid w:val="5A3741C6"/>
     <w:multiLevelType w:val="multilevel"/>
     <w:tmpl w:val="F5BA7EFE"/>
@@ -13671,7 +15782,7 @@
       </w:rPr>
     </w:lvl>
   </w:abstractNum>
-  <w:abstractNum w:abstractNumId="19" w15:restartNumberingAfterBreak="0">
+  <w:abstractNum w:abstractNumId="22" w15:restartNumberingAfterBreak="0">
     <w:nsid w:val="5C5023A8"/>
     <w:multiLevelType w:val="multilevel"/>
     <w:tmpl w:val="3E7EEADA"/>
@@ -13820,7 +15931,7 @@
       </w:rPr>
     </w:lvl>
   </w:abstractNum>
-  <w:abstractNum w:abstractNumId="20" w15:restartNumberingAfterBreak="0">
+  <w:abstractNum w:abstractNumId="23" w15:restartNumberingAfterBreak="0">
     <w:nsid w:val="5CC41962"/>
     <w:multiLevelType w:val="multilevel"/>
     <w:tmpl w:val="F98AD5E6"/>
@@ -13969,7 +16080,7 @@
       </w:rPr>
     </w:lvl>
   </w:abstractNum>
-  <w:abstractNum w:abstractNumId="21" w15:restartNumberingAfterBreak="0">
+  <w:abstractNum w:abstractNumId="24" w15:restartNumberingAfterBreak="0">
     <w:nsid w:val="64264E9A"/>
     <w:multiLevelType w:val="multilevel"/>
     <w:tmpl w:val="4196AC08"/>
@@ -14082,7 +16193,156 @@
       </w:pPr>
     </w:lvl>
   </w:abstractNum>
-  <w:abstractNum w:abstractNumId="22" w15:restartNumberingAfterBreak="0">
+  <w:abstractNum w:abstractNumId="25" w15:restartNumberingAfterBreak="0">
+    <w:nsid w:val="69825E29"/>
+    <w:multiLevelType w:val="multilevel"/>
+    <w:tmpl w:val="09740A7C"/>
+    <w:lvl w:ilvl="0">
+      <w:start w:val="1"/>
+      <w:numFmt w:val="bullet"/>
+      <w:lvlText w:val=""/>
+      <w:lvlJc w:val="left"/>
+      <w:pPr>
+        <w:tabs>
+          <w:tab w:val="num" w:pos="720"/>
+        </w:tabs>
+        <w:ind w:left="720" w:hanging="360"/>
+      </w:pPr>
+      <w:rPr>
+        <w:rFonts w:ascii="Symbol" w:hAnsi="Symbol" w:hint="default"/>
+        <w:sz w:val="20"/>
+      </w:rPr>
+    </w:lvl>
+    <w:lvl w:ilvl="1" w:tentative="1">
+      <w:start w:val="1"/>
+      <w:numFmt w:val="bullet"/>
+      <w:lvlText w:val="o"/>
+      <w:lvlJc w:val="left"/>
+      <w:pPr>
+        <w:tabs>
+          <w:tab w:val="num" w:pos="1440"/>
+        </w:tabs>
+        <w:ind w:left="1440" w:hanging="360"/>
+      </w:pPr>
+      <w:rPr>
+        <w:rFonts w:ascii="Courier New" w:hAnsi="Courier New" w:hint="default"/>
+        <w:sz w:val="20"/>
+      </w:rPr>
+    </w:lvl>
+    <w:lvl w:ilvl="2" w:tentative="1">
+      <w:start w:val="1"/>
+      <w:numFmt w:val="bullet"/>
+      <w:lvlText w:val=""/>
+      <w:lvlJc w:val="left"/>
+      <w:pPr>
+        <w:tabs>
+          <w:tab w:val="num" w:pos="2160"/>
+        </w:tabs>
+        <w:ind w:left="2160" w:hanging="360"/>
+      </w:pPr>
+      <w:rPr>
+        <w:rFonts w:ascii="Wingdings" w:hAnsi="Wingdings" w:hint="default"/>
+        <w:sz w:val="20"/>
+      </w:rPr>
+    </w:lvl>
+    <w:lvl w:ilvl="3" w:tentative="1">
+      <w:start w:val="1"/>
+      <w:numFmt w:val="bullet"/>
+      <w:lvlText w:val=""/>
+      <w:lvlJc w:val="left"/>
+      <w:pPr>
+        <w:tabs>
+          <w:tab w:val="num" w:pos="2880"/>
+        </w:tabs>
+        <w:ind w:left="2880" w:hanging="360"/>
+      </w:pPr>
+      <w:rPr>
+        <w:rFonts w:ascii="Wingdings" w:hAnsi="Wingdings" w:hint="default"/>
+        <w:sz w:val="20"/>
+      </w:rPr>
+    </w:lvl>
+    <w:lvl w:ilvl="4" w:tentative="1">
+      <w:start w:val="1"/>
+      <w:numFmt w:val="bullet"/>
+      <w:lvlText w:val=""/>
+      <w:lvlJc w:val="left"/>
+      <w:pPr>
+        <w:tabs>
+          <w:tab w:val="num" w:pos="3600"/>
+        </w:tabs>
+        <w:ind w:left="3600" w:hanging="360"/>
+      </w:pPr>
+      <w:rPr>
+        <w:rFonts w:ascii="Wingdings" w:hAnsi="Wingdings" w:hint="default"/>
+        <w:sz w:val="20"/>
+      </w:rPr>
+    </w:lvl>
+    <w:lvl w:ilvl="5" w:tentative="1">
+      <w:start w:val="1"/>
+      <w:numFmt w:val="bullet"/>
+      <w:lvlText w:val=""/>
+      <w:lvlJc w:val="left"/>
+      <w:pPr>
+        <w:tabs>
+          <w:tab w:val="num" w:pos="4320"/>
+        </w:tabs>
+        <w:ind w:left="4320" w:hanging="360"/>
+      </w:pPr>
+      <w:rPr>
+        <w:rFonts w:ascii="Wingdings" w:hAnsi="Wingdings" w:hint="default"/>
+        <w:sz w:val="20"/>
+      </w:rPr>
+    </w:lvl>
+    <w:lvl w:ilvl="6" w:tentative="1">
+      <w:start w:val="1"/>
+      <w:numFmt w:val="bullet"/>
+      <w:lvlText w:val=""/>
+      <w:lvlJc w:val="left"/>
+      <w:pPr>
+        <w:tabs>
+          <w:tab w:val="num" w:pos="5040"/>
+        </w:tabs>
+        <w:ind w:left="5040" w:hanging="360"/>
+      </w:pPr>
+      <w:rPr>
+        <w:rFonts w:ascii="Wingdings" w:hAnsi="Wingdings" w:hint="default"/>
+        <w:sz w:val="20"/>
+      </w:rPr>
+    </w:lvl>
+    <w:lvl w:ilvl="7" w:tentative="1">
+      <w:start w:val="1"/>
+      <w:numFmt w:val="bullet"/>
+      <w:lvlText w:val=""/>
+      <w:lvlJc w:val="left"/>
+      <w:pPr>
+        <w:tabs>
+          <w:tab w:val="num" w:pos="5760"/>
+        </w:tabs>
+        <w:ind w:left="5760" w:hanging="360"/>
+      </w:pPr>
+      <w:rPr>
+        <w:rFonts w:ascii="Wingdings" w:hAnsi="Wingdings" w:hint="default"/>
+        <w:sz w:val="20"/>
+      </w:rPr>
+    </w:lvl>
+    <w:lvl w:ilvl="8" w:tentative="1">
+      <w:start w:val="1"/>
+      <w:numFmt w:val="bullet"/>
+      <w:lvlText w:val=""/>
+      <w:lvlJc w:val="left"/>
+      <w:pPr>
+        <w:tabs>
+          <w:tab w:val="num" w:pos="6480"/>
+        </w:tabs>
+        <w:ind w:left="6480" w:hanging="360"/>
+      </w:pPr>
+      <w:rPr>
+        <w:rFonts w:ascii="Wingdings" w:hAnsi="Wingdings" w:hint="default"/>
+        <w:sz w:val="20"/>
+      </w:rPr>
+    </w:lvl>
+  </w:abstractNum>
+  <w:abstractNum w:abstractNumId="26" w15:restartNumberingAfterBreak="0">
     <w:nsid w:val="70732DB6"/>
     <w:multiLevelType w:val="multilevel"/>
     <w:tmpl w:val="A9C67EE8"/>
@@ -14195,7 +16455,7 @@
       </w:pPr>
     </w:lvl>
   </w:abstractNum>
-  <w:abstractNum w:abstractNumId="23" w15:restartNumberingAfterBreak="0">
+  <w:abstractNum w:abstractNumId="27" w15:restartNumberingAfterBreak="0">
     <w:nsid w:val="76DE0254"/>
     <w:multiLevelType w:val="multilevel"/>
     <w:tmpl w:val="24FE7538"/>
@@ -14344,7 +16604,7 @@
       </w:rPr>
     </w:lvl>
   </w:abstractNum>
-  <w:abstractNum w:abstractNumId="24" w15:restartNumberingAfterBreak="0">
+  <w:abstractNum w:abstractNumId="28" w15:restartNumberingAfterBreak="0">
     <w:nsid w:val="7C40730E"/>
     <w:multiLevelType w:val="multilevel"/>
     <w:tmpl w:val="4EC44F78"/>
@@ -14457,7 +16717,7 @@
       </w:pPr>
     </w:lvl>
   </w:abstractNum>
-  <w:abstractNum w:abstractNumId="25" w15:restartNumberingAfterBreak="0">
+  <w:abstractNum w:abstractNumId="29" w15:restartNumberingAfterBreak="0">
     <w:nsid w:val="7CCC01C9"/>
     <w:multiLevelType w:val="multilevel"/>
     <w:tmpl w:val="656C6610"/>
@@ -14571,82 +16831,94 @@
     </w:lvl>
   </w:abstractNum>
   <w:num w:numId="1" w16cid:durableId="305085771">
-    <w:abstractNumId w:val="13"/>
+    <w:abstractNumId w:val="15"/>
   </w:num>
   <w:num w:numId="2" w16cid:durableId="581524277">
+    <w:abstractNumId w:val="10"/>
+  </w:num>
+  <w:num w:numId="3" w16cid:durableId="695161013">
+    <w:abstractNumId w:val="19"/>
+  </w:num>
+  <w:num w:numId="4" w16cid:durableId="1966420648">
+    <w:abstractNumId w:val="26"/>
+  </w:num>
+  <w:num w:numId="5" w16cid:durableId="372508527">
+    <w:abstractNumId w:val="24"/>
+  </w:num>
+  <w:num w:numId="6" w16cid:durableId="988827085">
+    <w:abstractNumId w:val="22"/>
+  </w:num>
+  <w:num w:numId="7" w16cid:durableId="260647793">
+    <w:abstractNumId w:val="28"/>
+  </w:num>
+  <w:num w:numId="8" w16cid:durableId="202527156">
+    <w:abstractNumId w:val="2"/>
+  </w:num>
+  <w:num w:numId="9" w16cid:durableId="706218535">
+    <w:abstractNumId w:val="27"/>
+  </w:num>
+  <w:num w:numId="10" w16cid:durableId="734400429">
+    <w:abstractNumId w:val="8"/>
+  </w:num>
+  <w:num w:numId="11" w16cid:durableId="1295868554">
     <w:abstractNumId w:val="9"/>
   </w:num>
-  <w:num w:numId="3" w16cid:durableId="695161013">
+  <w:num w:numId="12" w16cid:durableId="1047141599">
+    <w:abstractNumId w:val="6"/>
+  </w:num>
+  <w:num w:numId="13" w16cid:durableId="583732473">
     <w:abstractNumId w:val="16"/>
   </w:num>
-  <w:num w:numId="4" w16cid:durableId="1966420648">
-    <w:abstractNumId w:val="22"/>
+  <w:num w:numId="14" w16cid:durableId="1058015792">
+    <w:abstractNumId w:val="14"/>
   </w:num>
-  <w:num w:numId="5" w16cid:durableId="372508527">
-    <w:abstractNumId w:val="21"/>
-  </w:num>
-  <w:num w:numId="6" w16cid:durableId="988827085">
-    <w:abstractNumId w:val="19"/>
-  </w:num>
-  <w:num w:numId="7" w16cid:durableId="260647793">
-    <w:abstractNumId w:val="24"/>
-  </w:num>
-  <w:num w:numId="8" w16cid:durableId="202527156">
-    <w:abstractNumId w:val="1"/>
-  </w:num>
-  <w:num w:numId="9" w16cid:durableId="706218535">
-    <w:abstractNumId w:val="23"/>
-  </w:num>
-  <w:num w:numId="10" w16cid:durableId="734400429">
-    <w:abstractNumId w:val="7"/>
-  </w:num>
-  <w:num w:numId="11" w16cid:durableId="1295868554">
-    <w:abstractNumId w:val="8"/>
-  </w:num>
-  <w:num w:numId="12" w16cid:durableId="1047141599">
+  <w:num w:numId="15" w16cid:durableId="2020310721">
     <w:abstractNumId w:val="5"/>
   </w:num>
-  <w:num w:numId="13" w16cid:durableId="583732473">
-    <w:abstractNumId w:val="14"/>
-  </w:num>
-  <w:num w:numId="14" w16cid:durableId="1058015792">
-    <w:abstractNumId w:val="12"/>
-  </w:num>
-  <w:num w:numId="15" w16cid:durableId="2020310721">
+  <w:num w:numId="16" w16cid:durableId="327368084">
     <w:abstractNumId w:val="4"/>
   </w:num>
-  <w:num w:numId="16" w16cid:durableId="327368084">
-    <w:abstractNumId w:val="3"/>
-  </w:num>
   <w:num w:numId="17" w16cid:durableId="34939295">
-    <w:abstractNumId w:val="25"/>
+    <w:abstractNumId w:val="29"/>
   </w:num>
   <w:num w:numId="18" w16cid:durableId="877009161">
     <w:abstractNumId w:val="0"/>
   </w:num>
   <w:num w:numId="19" w16cid:durableId="424228631">
-    <w:abstractNumId w:val="6"/>
+    <w:abstractNumId w:val="7"/>
   </w:num>
   <w:num w:numId="20" w16cid:durableId="1497957781">
-    <w:abstractNumId w:val="10"/>
+    <w:abstractNumId w:val="12"/>
   </w:num>
   <w:num w:numId="21" w16cid:durableId="833765505">
+    <w:abstractNumId w:val="20"/>
+  </w:num>
+  <w:num w:numId="22" w16cid:durableId="995450667">
+    <w:abstractNumId w:val="21"/>
+  </w:num>
+  <w:num w:numId="23" w16cid:durableId="920456383">
+    <w:abstractNumId w:val="23"/>
+  </w:num>
+  <w:num w:numId="24" w16cid:durableId="1360089471">
     <w:abstractNumId w:val="17"/>
   </w:num>
-  <w:num w:numId="22" w16cid:durableId="995450667">
+  <w:num w:numId="25" w16cid:durableId="729579019">
+    <w:abstractNumId w:val="13"/>
+  </w:num>
+  <w:num w:numId="26" w16cid:durableId="1931309371">
+    <w:abstractNumId w:val="3"/>
+  </w:num>
+  <w:num w:numId="27" w16cid:durableId="1216313033">
+    <w:abstractNumId w:val="1"/>
+  </w:num>
+  <w:num w:numId="28" w16cid:durableId="1272282229">
     <w:abstractNumId w:val="18"/>
   </w:num>
-  <w:num w:numId="23" w16cid:durableId="920456383">
-    <w:abstractNumId w:val="20"/>
+  <w:num w:numId="29" w16cid:durableId="1479955780">
+    <w:abstractNumId w:val="25"/>
   </w:num>
-  <w:num w:numId="24" w16cid:durableId="1360089471">
-    <w:abstractNumId w:val="15"/>
-  </w:num>
-  <w:num w:numId="25" w16cid:durableId="729579019">
+  <w:num w:numId="30" w16cid:durableId="1095589399">
     <w:abstractNumId w:val="11"/>
-  </w:num>
-  <w:num w:numId="26" w16cid:durableId="1931309371">
-    <w:abstractNumId w:val="2"/>
   </w:num>
 </w:numbering>
 </file>

</xml_diff>

<commit_message>
studied comparison operations with Datatypes
</commit_message>
<xml_diff>
--- a/JAVASCRIPT NOTES.docx
+++ b/JAVASCRIPT NOTES.docx
@@ -12634,6 +12634,1769 @@
         </w:pict>
       </w:r>
     </w:p>
+    <w:p>
+      <w:pPr>
+        <w:rPr>
+          <w:b/>
+          <w:bCs/>
+          <w:sz w:val="36"/>
+          <w:szCs w:val="36"/>
+          <w:u w:val="single"/>
+        </w:rPr>
+      </w:pPr>
+      <w:r>
+        <w:rPr>
+          <w:b/>
+          <w:bCs/>
+          <w:sz w:val="36"/>
+          <w:szCs w:val="36"/>
+          <w:u w:val="single"/>
+        </w:rPr>
+        <w:t>JAVASCRIPT NOTES (</w:t>
+      </w:r>
+      <w:r>
+        <w:rPr>
+          <w:b/>
+          <w:bCs/>
+          <w:sz w:val="36"/>
+          <w:szCs w:val="36"/>
+          <w:u w:val="single"/>
+        </w:rPr>
+        <w:t>8</w:t>
+      </w:r>
+      <w:r>
+        <w:rPr>
+          <w:b/>
+          <w:bCs/>
+          <w:sz w:val="36"/>
+          <w:szCs w:val="36"/>
+          <w:u w:val="single"/>
+        </w:rPr>
+        <w:t>)</w:t>
+      </w:r>
+    </w:p>
+    <w:p>
+      <w:pPr>
+        <w:rPr>
+          <w:b/>
+          <w:bCs/>
+        </w:rPr>
+      </w:pPr>
+      <w:r>
+        <w:rPr>
+          <w:b/>
+          <w:bCs/>
+        </w:rPr>
+        <w:t>1. Basic Comparisons (Sabse Simple)</w:t>
+      </w:r>
+    </w:p>
+    <w:p>
+      <w:r>
+        <w:t xml:space="preserve">Ye </w:t>
+      </w:r>
+      <w:proofErr w:type="spellStart"/>
+      <w:r>
+        <w:t>toh</w:t>
+      </w:r>
+      <w:proofErr w:type="spellEnd"/>
+      <w:r>
+        <w:t xml:space="preserve"> math </w:t>
+      </w:r>
+      <w:proofErr w:type="spellStart"/>
+      <w:r>
+        <w:t>jaisa</w:t>
+      </w:r>
+      <w:proofErr w:type="spellEnd"/>
+      <w:r>
+        <w:t xml:space="preserve"> hi </w:t>
+      </w:r>
+      <w:proofErr w:type="spellStart"/>
+      <w:r>
+        <w:t>hai</w:t>
+      </w:r>
+      <w:proofErr w:type="spellEnd"/>
+      <w:r>
+        <w:t>: &gt;, &lt;, &gt;=, &lt;=, ==</w:t>
+      </w:r>
+      <w:proofErr w:type="gramStart"/>
+      <w:r>
+        <w:t>, !</w:t>
+      </w:r>
+      <w:proofErr w:type="gramEnd"/>
+      <w:r>
+        <w:t>=.</w:t>
+      </w:r>
+    </w:p>
+    <w:p>
+      <w:r>
+        <w:t xml:space="preserve">Agar </w:t>
+      </w:r>
+      <w:proofErr w:type="spellStart"/>
+      <w:r>
+        <w:t>dono</w:t>
+      </w:r>
+      <w:proofErr w:type="spellEnd"/>
+      <w:r>
+        <w:t xml:space="preserve"> side numbers hain (e.g., 2 &gt; 1), </w:t>
+      </w:r>
+      <w:proofErr w:type="spellStart"/>
+      <w:r>
+        <w:t>toh</w:t>
+      </w:r>
+      <w:proofErr w:type="spellEnd"/>
+      <w:r>
+        <w:t xml:space="preserve"> result </w:t>
+      </w:r>
+      <w:proofErr w:type="spellStart"/>
+      <w:r>
+        <w:t>humesha</w:t>
+      </w:r>
+      <w:proofErr w:type="spellEnd"/>
+      <w:r>
+        <w:t xml:space="preserve"> predictable (true/false) </w:t>
+      </w:r>
+      <w:proofErr w:type="spellStart"/>
+      <w:r>
+        <w:t>aayega</w:t>
+      </w:r>
+      <w:proofErr w:type="spellEnd"/>
+      <w:r>
+        <w:t xml:space="preserve">. Isme koi tension </w:t>
+      </w:r>
+      <w:proofErr w:type="spellStart"/>
+      <w:r>
+        <w:t>nahi</w:t>
+      </w:r>
+      <w:proofErr w:type="spellEnd"/>
+      <w:r>
+        <w:t xml:space="preserve"> </w:t>
+      </w:r>
+      <w:proofErr w:type="spellStart"/>
+      <w:r>
+        <w:t>hai</w:t>
+      </w:r>
+      <w:proofErr w:type="spellEnd"/>
+      <w:r>
+        <w:t xml:space="preserve">.                        </w:t>
+      </w:r>
+    </w:p>
+    <w:p>
+      <w:r>
+        <w:lastRenderedPageBreak/>
+        <w:t xml:space="preserve">                    </w:t>
+      </w:r>
+      <w:r>
+        <w:drawing>
+          <wp:inline distT="0" distB="0" distL="0" distR="0" wp14:anchorId="7579555C" wp14:editId="4ACC9498">
+            <wp:extent cx="3924848" cy="4086795"/>
+            <wp:effectExtent l="0" t="0" r="0" b="0"/>
+            <wp:docPr id="1615088320" name="Picture 1"/>
+            <wp:cNvGraphicFramePr>
+              <a:graphicFrameLocks xmlns:a="http://schemas.openxmlformats.org/drawingml/2006/main" noChangeAspect="1"/>
+            </wp:cNvGraphicFramePr>
+            <a:graphic xmlns:a="http://schemas.openxmlformats.org/drawingml/2006/main">
+              <a:graphicData uri="http://schemas.openxmlformats.org/drawingml/2006/picture">
+                <pic:pic xmlns:pic="http://schemas.openxmlformats.org/drawingml/2006/picture">
+                  <pic:nvPicPr>
+                    <pic:cNvPr id="1615088320" name=""/>
+                    <pic:cNvPicPr/>
+                  </pic:nvPicPr>
+                  <pic:blipFill>
+                    <a:blip r:embed="rId47"/>
+                    <a:stretch>
+                      <a:fillRect/>
+                    </a:stretch>
+                  </pic:blipFill>
+                  <pic:spPr>
+                    <a:xfrm>
+                      <a:off x="0" y="0"/>
+                      <a:ext cx="3924848" cy="4086795"/>
+                    </a:xfrm>
+                    <a:prstGeom prst="rect">
+                      <a:avLst/>
+                    </a:prstGeom>
+                  </pic:spPr>
+                </pic:pic>
+              </a:graphicData>
+            </a:graphic>
+          </wp:inline>
+        </w:drawing>
+      </w:r>
+      <w:r>
+        <w:pict w14:anchorId="2F82AC74">
+          <v:rect id="_x0000_i1124" style="width:0;height:1.5pt" o:hralign="center" o:hrstd="t" o:hr="t" fillcolor="#a0a0a0" stroked="f"/>
+        </w:pict>
+      </w:r>
+      <w:r>
+        <w:rPr>
+          <w:b/>
+          <w:bCs/>
+        </w:rPr>
+        <w:t>2. Different Datatypes ka Comparison</w:t>
+      </w:r>
+    </w:p>
+    <w:p>
+      <w:r>
+        <w:t xml:space="preserve">Asli panga tab </w:t>
+      </w:r>
+      <w:proofErr w:type="spellStart"/>
+      <w:r>
+        <w:t>shuru</w:t>
+      </w:r>
+      <w:proofErr w:type="spellEnd"/>
+      <w:r>
+        <w:t xml:space="preserve"> </w:t>
+      </w:r>
+      <w:proofErr w:type="spellStart"/>
+      <w:r>
+        <w:t>hota</w:t>
+      </w:r>
+      <w:proofErr w:type="spellEnd"/>
+      <w:r>
+        <w:t xml:space="preserve"> </w:t>
+      </w:r>
+      <w:proofErr w:type="spellStart"/>
+      <w:r>
+        <w:t>hai</w:t>
+      </w:r>
+      <w:proofErr w:type="spellEnd"/>
+      <w:r>
+        <w:t xml:space="preserve"> jab types </w:t>
+      </w:r>
+      <w:proofErr w:type="spellStart"/>
+      <w:r>
+        <w:t>alag</w:t>
+      </w:r>
+      <w:proofErr w:type="spellEnd"/>
+      <w:r>
+        <w:t xml:space="preserve"> hon:</w:t>
+      </w:r>
+    </w:p>
+    <w:p>
+      <w:pPr>
+        <w:numPr>
+          <w:ilvl w:val="0"/>
+          <w:numId w:val="31"/>
+        </w:numPr>
+      </w:pPr>
+      <w:proofErr w:type="gramStart"/>
+      <w:r>
+        <w:rPr>
+          <w:b/>
+          <w:bCs/>
+        </w:rPr>
+        <w:t>console.log(</w:t>
+      </w:r>
+      <w:proofErr w:type="gramEnd"/>
+      <w:r>
+        <w:rPr>
+          <w:b/>
+          <w:bCs/>
+        </w:rPr>
+        <w:t>"2" &gt; 1);</w:t>
+      </w:r>
+      <w:r>
+        <w:t xml:space="preserve"> $\</w:t>
+      </w:r>
+      <w:proofErr w:type="spellStart"/>
+      <w:r>
+        <w:t>rightarrow</w:t>
+      </w:r>
+      <w:proofErr w:type="spellEnd"/>
+      <w:r>
+        <w:t>$ Output: true</w:t>
+      </w:r>
+    </w:p>
+    <w:p>
+      <w:pPr>
+        <w:numPr>
+          <w:ilvl w:val="0"/>
+          <w:numId w:val="31"/>
+        </w:numPr>
+      </w:pPr>
+      <w:proofErr w:type="gramStart"/>
+      <w:r>
+        <w:rPr>
+          <w:b/>
+          <w:bCs/>
+        </w:rPr>
+        <w:t>console.log(</w:t>
+      </w:r>
+      <w:proofErr w:type="gramEnd"/>
+      <w:r>
+        <w:rPr>
+          <w:b/>
+          <w:bCs/>
+        </w:rPr>
+        <w:t>"02" &gt; 1);</w:t>
+      </w:r>
+      <w:r>
+        <w:t xml:space="preserve"> $\</w:t>
+      </w:r>
+      <w:proofErr w:type="spellStart"/>
+      <w:r>
+        <w:t>rightarrow</w:t>
+      </w:r>
+      <w:proofErr w:type="spellEnd"/>
+      <w:r>
+        <w:t>$ Output: true</w:t>
+      </w:r>
+    </w:p>
+    <w:p>
+      <w:r>
+        <w:t xml:space="preserve">JavaScript </w:t>
+      </w:r>
+      <w:proofErr w:type="spellStart"/>
+      <w:r>
+        <w:t>yahan</w:t>
+      </w:r>
+      <w:proofErr w:type="spellEnd"/>
+      <w:r>
+        <w:t xml:space="preserve"> string ko automatic number </w:t>
+      </w:r>
+      <w:proofErr w:type="spellStart"/>
+      <w:r>
+        <w:t>mein</w:t>
+      </w:r>
+      <w:proofErr w:type="spellEnd"/>
+      <w:r>
+        <w:t xml:space="preserve"> </w:t>
+      </w:r>
+      <w:proofErr w:type="spellStart"/>
+      <w:r>
+        <w:t>badal</w:t>
+      </w:r>
+      <w:proofErr w:type="spellEnd"/>
+      <w:r>
+        <w:t xml:space="preserve"> </w:t>
+      </w:r>
+      <w:proofErr w:type="spellStart"/>
+      <w:r>
+        <w:t>deti</w:t>
+      </w:r>
+      <w:proofErr w:type="spellEnd"/>
+      <w:r>
+        <w:t xml:space="preserve"> </w:t>
+      </w:r>
+      <w:proofErr w:type="spellStart"/>
+      <w:r>
+        <w:t>hai</w:t>
+      </w:r>
+      <w:proofErr w:type="spellEnd"/>
+      <w:r>
+        <w:t xml:space="preserve">. Lekin Hitesh sir ne kaha </w:t>
+      </w:r>
+      <w:proofErr w:type="spellStart"/>
+      <w:r>
+        <w:t>hai</w:t>
+      </w:r>
+      <w:proofErr w:type="spellEnd"/>
+      <w:r>
+        <w:t xml:space="preserve"> ki </w:t>
+      </w:r>
+      <w:proofErr w:type="spellStart"/>
+      <w:r>
+        <w:rPr>
+          <w:b/>
+          <w:bCs/>
+        </w:rPr>
+        <w:t>aise</w:t>
+      </w:r>
+      <w:proofErr w:type="spellEnd"/>
+      <w:r>
+        <w:rPr>
+          <w:b/>
+          <w:bCs/>
+        </w:rPr>
+        <w:t xml:space="preserve"> comparisons ko avoid karo</w:t>
+      </w:r>
+      <w:r>
+        <w:t xml:space="preserve"> </w:t>
+      </w:r>
+      <w:proofErr w:type="spellStart"/>
+      <w:r>
+        <w:t>kyunki</w:t>
+      </w:r>
+      <w:proofErr w:type="spellEnd"/>
+      <w:r>
+        <w:t xml:space="preserve"> ye </w:t>
+      </w:r>
+      <w:proofErr w:type="spellStart"/>
+      <w:r>
+        <w:t>hamesha</w:t>
+      </w:r>
+      <w:proofErr w:type="spellEnd"/>
+      <w:r>
+        <w:t xml:space="preserve"> predictable </w:t>
+      </w:r>
+      <w:proofErr w:type="spellStart"/>
+      <w:r>
+        <w:t>nahi</w:t>
+      </w:r>
+      <w:proofErr w:type="spellEnd"/>
+      <w:r>
+        <w:t xml:space="preserve"> </w:t>
+      </w:r>
+      <w:proofErr w:type="spellStart"/>
+      <w:r>
+        <w:t>hote</w:t>
+      </w:r>
+      <w:proofErr w:type="spellEnd"/>
+      <w:r>
+        <w:t xml:space="preserve">. </w:t>
+      </w:r>
+      <w:proofErr w:type="spellStart"/>
+      <w:r>
+        <w:t>Koshish</w:t>
+      </w:r>
+      <w:proofErr w:type="spellEnd"/>
+      <w:r>
+        <w:t xml:space="preserve"> karo ki </w:t>
+      </w:r>
+      <w:proofErr w:type="spellStart"/>
+      <w:r>
+        <w:t>dono</w:t>
+      </w:r>
+      <w:proofErr w:type="spellEnd"/>
+      <w:r>
+        <w:t xml:space="preserve"> side </w:t>
+      </w:r>
+      <w:proofErr w:type="spellStart"/>
+      <w:r>
+        <w:t>ke</w:t>
+      </w:r>
+      <w:proofErr w:type="spellEnd"/>
+      <w:r>
+        <w:t xml:space="preserve"> data types </w:t>
+      </w:r>
+      <w:r>
+        <w:rPr>
+          <w:b/>
+          <w:bCs/>
+        </w:rPr>
+        <w:t>same</w:t>
+      </w:r>
+      <w:r>
+        <w:t xml:space="preserve"> hon.</w:t>
+      </w:r>
+      <w:r>
+        <w:rPr>
+          <w:noProof/>
+        </w:rPr>
+        <w:t xml:space="preserve"> </w:t>
+      </w:r>
+      <w:r>
+        <w:drawing>
+          <wp:inline distT="0" distB="0" distL="0" distR="0" wp14:anchorId="54DFAE1A" wp14:editId="3170C314">
+            <wp:extent cx="5731510" cy="1499235"/>
+            <wp:effectExtent l="0" t="0" r="2540" b="5715"/>
+            <wp:docPr id="511751435" name="Picture 1"/>
+            <wp:cNvGraphicFramePr>
+              <a:graphicFrameLocks xmlns:a="http://schemas.openxmlformats.org/drawingml/2006/main" noChangeAspect="1"/>
+            </wp:cNvGraphicFramePr>
+            <a:graphic xmlns:a="http://schemas.openxmlformats.org/drawingml/2006/main">
+              <a:graphicData uri="http://schemas.openxmlformats.org/drawingml/2006/picture">
+                <pic:pic xmlns:pic="http://schemas.openxmlformats.org/drawingml/2006/picture">
+                  <pic:nvPicPr>
+                    <pic:cNvPr id="511751435" name=""/>
+                    <pic:cNvPicPr/>
+                  </pic:nvPicPr>
+                  <pic:blipFill>
+                    <a:blip r:embed="rId48"/>
+                    <a:stretch>
+                      <a:fillRect/>
+                    </a:stretch>
+                  </pic:blipFill>
+                  <pic:spPr>
+                    <a:xfrm>
+                      <a:off x="0" y="0"/>
+                      <a:ext cx="5731510" cy="1499235"/>
+                    </a:xfrm>
+                    <a:prstGeom prst="rect">
+                      <a:avLst/>
+                    </a:prstGeom>
+                  </pic:spPr>
+                </pic:pic>
+              </a:graphicData>
+            </a:graphic>
+          </wp:inline>
+        </w:drawing>
+      </w:r>
+      <w:r>
+        <w:pict w14:anchorId="6F0BAAE8">
+          <v:rect id="_x0000_i1113" style="width:0;height:1.5pt" o:hralign="center" o:hrstd="t" o:hr="t" fillcolor="#a0a0a0" stroked="f"/>
+        </w:pict>
+      </w:r>
+    </w:p>
+    <w:p>
+      <w:pPr>
+        <w:rPr>
+          <w:b/>
+          <w:bCs/>
+        </w:rPr>
+      </w:pPr>
+      <w:r>
+        <w:rPr>
+          <w:b/>
+          <w:bCs/>
+        </w:rPr>
+        <w:t>3. Null vs Zero (The "Mind-Blowing" Part)</w:t>
+      </w:r>
+    </w:p>
+    <w:p>
+      <w:r>
+        <w:t xml:space="preserve">Ye interview ka </w:t>
+      </w:r>
+      <w:proofErr w:type="spellStart"/>
+      <w:r>
+        <w:t>sabse</w:t>
+      </w:r>
+      <w:proofErr w:type="spellEnd"/>
+      <w:r>
+        <w:t xml:space="preserve"> </w:t>
+      </w:r>
+      <w:proofErr w:type="spellStart"/>
+      <w:r>
+        <w:t>favorite</w:t>
+      </w:r>
+      <w:proofErr w:type="spellEnd"/>
+      <w:r>
+        <w:t xml:space="preserve"> topic </w:t>
+      </w:r>
+      <w:proofErr w:type="spellStart"/>
+      <w:r>
+        <w:t>hai</w:t>
+      </w:r>
+      <w:proofErr w:type="spellEnd"/>
+      <w:r>
+        <w:t xml:space="preserve">. Dhyan se </w:t>
+      </w:r>
+      <w:proofErr w:type="spellStart"/>
+      <w:r>
+        <w:t>dekhna</w:t>
+      </w:r>
+      <w:proofErr w:type="spellEnd"/>
+      <w:r>
+        <w:t>:</w:t>
+      </w:r>
+    </w:p>
+    <w:p>
+      <w:pPr>
+        <w:rPr>
+          <w:b/>
+          <w:bCs/>
+        </w:rPr>
+      </w:pPr>
+      <w:r>
+        <w:rPr>
+          <w:b/>
+          <w:bCs/>
+        </w:rPr>
+        <w:lastRenderedPageBreak/>
+        <w:t xml:space="preserve">          </w:t>
+      </w:r>
+      <w:r>
+        <w:rPr>
+          <w:b/>
+          <w:bCs/>
+        </w:rPr>
+        <w:drawing>
+          <wp:inline distT="0" distB="0" distL="0" distR="0" wp14:anchorId="0D153689" wp14:editId="7622A3A6">
+            <wp:extent cx="2743200" cy="1085850"/>
+            <wp:effectExtent l="0" t="0" r="0" b="0"/>
+            <wp:docPr id="536451597" name="Picture 1"/>
+            <wp:cNvGraphicFramePr>
+              <a:graphicFrameLocks xmlns:a="http://schemas.openxmlformats.org/drawingml/2006/main" noChangeAspect="1"/>
+            </wp:cNvGraphicFramePr>
+            <a:graphic xmlns:a="http://schemas.openxmlformats.org/drawingml/2006/main">
+              <a:graphicData uri="http://schemas.openxmlformats.org/drawingml/2006/picture">
+                <pic:pic xmlns:pic="http://schemas.openxmlformats.org/drawingml/2006/picture">
+                  <pic:nvPicPr>
+                    <pic:cNvPr id="536451597" name=""/>
+                    <pic:cNvPicPr/>
+                  </pic:nvPicPr>
+                  <pic:blipFill>
+                    <a:blip r:embed="rId49"/>
+                    <a:stretch>
+                      <a:fillRect/>
+                    </a:stretch>
+                  </pic:blipFill>
+                  <pic:spPr>
+                    <a:xfrm>
+                      <a:off x="0" y="0"/>
+                      <a:ext cx="2748940" cy="1088122"/>
+                    </a:xfrm>
+                    <a:prstGeom prst="rect">
+                      <a:avLst/>
+                    </a:prstGeom>
+                  </pic:spPr>
+                </pic:pic>
+              </a:graphicData>
+            </a:graphic>
+          </wp:inline>
+        </w:drawing>
+      </w:r>
+    </w:p>
+    <w:p>
+      <w:proofErr w:type="gramStart"/>
+      <w:r>
+        <w:rPr>
+          <w:b/>
+          <w:bCs/>
+          <w:sz w:val="32"/>
+          <w:szCs w:val="32"/>
+          <w:u w:val="single"/>
+        </w:rPr>
+        <w:t>NOTE</w:t>
+      </w:r>
+      <w:r>
+        <w:rPr>
+          <w:b/>
+          <w:bCs/>
+          <w:sz w:val="32"/>
+          <w:szCs w:val="32"/>
+        </w:rPr>
+        <w:t>:-</w:t>
+      </w:r>
+      <w:proofErr w:type="gramEnd"/>
+      <w:r>
+        <w:rPr>
+          <w:b/>
+          <w:bCs/>
+          <w:sz w:val="32"/>
+          <w:szCs w:val="32"/>
+        </w:rPr>
+        <w:t xml:space="preserve"> </w:t>
+      </w:r>
+      <w:r>
+        <w:rPr>
+          <w:b/>
+          <w:bCs/>
+        </w:rPr>
+        <w:t>Reason:</w:t>
+      </w:r>
+      <w:r>
+        <w:t xml:space="preserve"> JavaScript </w:t>
+      </w:r>
+      <w:proofErr w:type="spellStart"/>
+      <w:r>
+        <w:t>mein</w:t>
+      </w:r>
+      <w:proofErr w:type="spellEnd"/>
+      <w:r>
+        <w:t xml:space="preserve"> </w:t>
+      </w:r>
+      <w:r>
+        <w:rPr>
+          <w:b/>
+          <w:bCs/>
+        </w:rPr>
+        <w:t>Equality check (==)</w:t>
+      </w:r>
+      <w:r>
+        <w:t xml:space="preserve"> aur </w:t>
+      </w:r>
+      <w:r>
+        <w:rPr>
+          <w:b/>
+          <w:bCs/>
+        </w:rPr>
+        <w:t>Comparisons (&gt; &lt; &gt;= &lt;=)</w:t>
+      </w:r>
+      <w:r>
+        <w:t xml:space="preserve"> </w:t>
+      </w:r>
+      <w:proofErr w:type="spellStart"/>
+      <w:r>
+        <w:t>alag</w:t>
+      </w:r>
+      <w:proofErr w:type="spellEnd"/>
+      <w:r>
+        <w:t xml:space="preserve"> </w:t>
+      </w:r>
+      <w:proofErr w:type="spellStart"/>
+      <w:r>
+        <w:t>tarah</w:t>
+      </w:r>
+      <w:proofErr w:type="spellEnd"/>
+      <w:r>
+        <w:t xml:space="preserve"> se </w:t>
+      </w:r>
+      <w:proofErr w:type="spellStart"/>
+      <w:r>
+        <w:t>kaam</w:t>
+      </w:r>
+      <w:proofErr w:type="spellEnd"/>
+      <w:r>
+        <w:t xml:space="preserve"> </w:t>
+      </w:r>
+      <w:proofErr w:type="spellStart"/>
+      <w:r>
+        <w:t>karte</w:t>
+      </w:r>
+      <w:proofErr w:type="spellEnd"/>
+      <w:r>
+        <w:t xml:space="preserve"> hain.</w:t>
+      </w:r>
+    </w:p>
+    <w:p>
+      <w:pPr>
+        <w:numPr>
+          <w:ilvl w:val="0"/>
+          <w:numId w:val="33"/>
+        </w:numPr>
+      </w:pPr>
+      <w:r>
+        <w:t xml:space="preserve">Comparisons null ko ek number ki </w:t>
+      </w:r>
+      <w:proofErr w:type="spellStart"/>
+      <w:r>
+        <w:t>tarah</w:t>
+      </w:r>
+      <w:proofErr w:type="spellEnd"/>
+      <w:r>
+        <w:t xml:space="preserve"> treat </w:t>
+      </w:r>
+      <w:proofErr w:type="spellStart"/>
+      <w:r>
+        <w:t>karte</w:t>
+      </w:r>
+      <w:proofErr w:type="spellEnd"/>
+      <w:r>
+        <w:t xml:space="preserve"> hain aur </w:t>
+      </w:r>
+      <w:proofErr w:type="spellStart"/>
+      <w:r>
+        <w:t>usey</w:t>
+      </w:r>
+      <w:proofErr w:type="spellEnd"/>
+      <w:r>
+        <w:t xml:space="preserve"> </w:t>
+      </w:r>
+      <w:r>
+        <w:rPr>
+          <w:b/>
+          <w:bCs/>
+        </w:rPr>
+        <w:t>0</w:t>
+      </w:r>
+      <w:r>
+        <w:t xml:space="preserve"> </w:t>
+      </w:r>
+      <w:proofErr w:type="spellStart"/>
+      <w:r>
+        <w:t>bana</w:t>
+      </w:r>
+      <w:proofErr w:type="spellEnd"/>
+      <w:r>
+        <w:t xml:space="preserve"> </w:t>
+      </w:r>
+      <w:proofErr w:type="spellStart"/>
+      <w:r>
+        <w:t>dete</w:t>
+      </w:r>
+      <w:proofErr w:type="spellEnd"/>
+      <w:r>
+        <w:t xml:space="preserve"> hain. </w:t>
+      </w:r>
+      <w:proofErr w:type="spellStart"/>
+      <w:r>
+        <w:t>Isliye</w:t>
+      </w:r>
+      <w:proofErr w:type="spellEnd"/>
+      <w:r>
+        <w:t xml:space="preserve"> null &gt;= 0 true </w:t>
+      </w:r>
+      <w:proofErr w:type="spellStart"/>
+      <w:r>
+        <w:t>ho</w:t>
+      </w:r>
+      <w:proofErr w:type="spellEnd"/>
+      <w:r>
+        <w:t xml:space="preserve"> </w:t>
+      </w:r>
+      <w:proofErr w:type="spellStart"/>
+      <w:r>
+        <w:t>jata</w:t>
+      </w:r>
+      <w:proofErr w:type="spellEnd"/>
+      <w:r>
+        <w:t xml:space="preserve"> </w:t>
+      </w:r>
+      <w:proofErr w:type="spellStart"/>
+      <w:r>
+        <w:t>hai</w:t>
+      </w:r>
+      <w:proofErr w:type="spellEnd"/>
+      <w:r>
+        <w:t xml:space="preserve"> (</w:t>
+      </w:r>
+      <w:proofErr w:type="spellStart"/>
+      <w:r>
+        <w:t>kyunki</w:t>
+      </w:r>
+      <w:proofErr w:type="spellEnd"/>
+      <w:r>
+        <w:t xml:space="preserve"> 0 &gt;= 0 true </w:t>
+      </w:r>
+      <w:proofErr w:type="spellStart"/>
+      <w:r>
+        <w:t>hai</w:t>
+      </w:r>
+      <w:proofErr w:type="spellEnd"/>
+      <w:r>
+        <w:t>).</w:t>
+      </w:r>
+    </w:p>
+    <w:p>
+      <w:pPr>
+        <w:numPr>
+          <w:ilvl w:val="0"/>
+          <w:numId w:val="33"/>
+        </w:numPr>
+      </w:pPr>
+      <w:r>
+        <w:t xml:space="preserve">Lekin Equality check null ko 0 </w:t>
+      </w:r>
+      <w:proofErr w:type="spellStart"/>
+      <w:r>
+        <w:t>mein</w:t>
+      </w:r>
+      <w:proofErr w:type="spellEnd"/>
+      <w:r>
+        <w:t xml:space="preserve"> convert </w:t>
+      </w:r>
+      <w:proofErr w:type="spellStart"/>
+      <w:r>
+        <w:t>nahi</w:t>
+      </w:r>
+      <w:proofErr w:type="spellEnd"/>
+      <w:r>
+        <w:t xml:space="preserve"> </w:t>
+      </w:r>
+      <w:proofErr w:type="spellStart"/>
+      <w:r>
+        <w:t>karta</w:t>
+      </w:r>
+      <w:proofErr w:type="spellEnd"/>
+      <w:r>
+        <w:t xml:space="preserve">, wo </w:t>
+      </w:r>
+      <w:proofErr w:type="spellStart"/>
+      <w:r>
+        <w:t>usey</w:t>
+      </w:r>
+      <w:proofErr w:type="spellEnd"/>
+      <w:r>
+        <w:t xml:space="preserve"> </w:t>
+      </w:r>
+      <w:proofErr w:type="spellStart"/>
+      <w:r>
+        <w:t>sirf</w:t>
+      </w:r>
+      <w:proofErr w:type="spellEnd"/>
+      <w:r>
+        <w:t xml:space="preserve"> undefined </w:t>
+      </w:r>
+      <w:proofErr w:type="spellStart"/>
+      <w:r>
+        <w:t>ke</w:t>
+      </w:r>
+      <w:proofErr w:type="spellEnd"/>
+      <w:r>
+        <w:t xml:space="preserve"> </w:t>
+      </w:r>
+      <w:proofErr w:type="spellStart"/>
+      <w:r>
+        <w:t>barabar</w:t>
+      </w:r>
+      <w:proofErr w:type="spellEnd"/>
+      <w:r>
+        <w:t xml:space="preserve"> </w:t>
+      </w:r>
+      <w:proofErr w:type="spellStart"/>
+      <w:r>
+        <w:t>maanta</w:t>
+      </w:r>
+      <w:proofErr w:type="spellEnd"/>
+      <w:r>
+        <w:t xml:space="preserve"> </w:t>
+      </w:r>
+      <w:proofErr w:type="spellStart"/>
+      <w:r>
+        <w:t>hai</w:t>
+      </w:r>
+      <w:proofErr w:type="spellEnd"/>
+      <w:r>
+        <w:t>.</w:t>
+      </w:r>
+    </w:p>
+    <w:p>
+      <w:r>
+        <w:drawing>
+          <wp:inline distT="0" distB="0" distL="0" distR="0" wp14:anchorId="59E558AB" wp14:editId="6F42F20E">
+            <wp:extent cx="5731510" cy="3352165"/>
+            <wp:effectExtent l="0" t="0" r="2540" b="635"/>
+            <wp:docPr id="1146353986" name="Picture 1"/>
+            <wp:cNvGraphicFramePr>
+              <a:graphicFrameLocks xmlns:a="http://schemas.openxmlformats.org/drawingml/2006/main" noChangeAspect="1"/>
+            </wp:cNvGraphicFramePr>
+            <a:graphic xmlns:a="http://schemas.openxmlformats.org/drawingml/2006/main">
+              <a:graphicData uri="http://schemas.openxmlformats.org/drawingml/2006/picture">
+                <pic:pic xmlns:pic="http://schemas.openxmlformats.org/drawingml/2006/picture">
+                  <pic:nvPicPr>
+                    <pic:cNvPr id="1146353986" name=""/>
+                    <pic:cNvPicPr/>
+                  </pic:nvPicPr>
+                  <pic:blipFill>
+                    <a:blip r:embed="rId50"/>
+                    <a:stretch>
+                      <a:fillRect/>
+                    </a:stretch>
+                  </pic:blipFill>
+                  <pic:spPr>
+                    <a:xfrm>
+                      <a:off x="0" y="0"/>
+                      <a:ext cx="5731510" cy="3352165"/>
+                    </a:xfrm>
+                    <a:prstGeom prst="rect">
+                      <a:avLst/>
+                    </a:prstGeom>
+                  </pic:spPr>
+                </pic:pic>
+              </a:graphicData>
+            </a:graphic>
+          </wp:inline>
+        </w:drawing>
+      </w:r>
+    </w:p>
+    <w:p>
+      <w:r>
+        <w:drawing>
+          <wp:inline distT="0" distB="0" distL="0" distR="0" wp14:anchorId="5EC7B1FD" wp14:editId="2D78BF6E">
+            <wp:extent cx="5731510" cy="1828800"/>
+            <wp:effectExtent l="0" t="0" r="2540" b="0"/>
+            <wp:docPr id="2048565588" name="Picture 1"/>
+            <wp:cNvGraphicFramePr>
+              <a:graphicFrameLocks xmlns:a="http://schemas.openxmlformats.org/drawingml/2006/main" noChangeAspect="1"/>
+            </wp:cNvGraphicFramePr>
+            <a:graphic xmlns:a="http://schemas.openxmlformats.org/drawingml/2006/main">
+              <a:graphicData uri="http://schemas.openxmlformats.org/drawingml/2006/picture">
+                <pic:pic xmlns:pic="http://schemas.openxmlformats.org/drawingml/2006/picture">
+                  <pic:nvPicPr>
+                    <pic:cNvPr id="2048565588" name=""/>
+                    <pic:cNvPicPr/>
+                  </pic:nvPicPr>
+                  <pic:blipFill>
+                    <a:blip r:embed="rId51"/>
+                    <a:stretch>
+                      <a:fillRect/>
+                    </a:stretch>
+                  </pic:blipFill>
+                  <pic:spPr>
+                    <a:xfrm>
+                      <a:off x="0" y="0"/>
+                      <a:ext cx="5731510" cy="1828800"/>
+                    </a:xfrm>
+                    <a:prstGeom prst="rect">
+                      <a:avLst/>
+                    </a:prstGeom>
+                  </pic:spPr>
+                </pic:pic>
+              </a:graphicData>
+            </a:graphic>
+          </wp:inline>
+        </w:drawing>
+      </w:r>
+      <w:r>
+        <w:pict w14:anchorId="2DA88330">
+          <v:rect id="_x0000_i1114" style="width:0;height:1.5pt" o:hralign="center" o:hrstd="t" o:hr="t" fillcolor="#a0a0a0" stroked="f"/>
+        </w:pict>
+      </w:r>
+    </w:p>
+    <w:p>
+      <w:pPr>
+        <w:rPr>
+          <w:b/>
+          <w:bCs/>
+        </w:rPr>
+      </w:pPr>
+    </w:p>
+    <w:p>
+      <w:pPr>
+        <w:rPr>
+          <w:b/>
+          <w:bCs/>
+        </w:rPr>
+      </w:pPr>
+      <w:r>
+        <w:rPr>
+          <w:b/>
+          <w:bCs/>
+        </w:rPr>
+        <w:lastRenderedPageBreak/>
+        <w:t xml:space="preserve">4. Undefined </w:t>
+      </w:r>
+      <w:proofErr w:type="spellStart"/>
+      <w:r>
+        <w:rPr>
+          <w:b/>
+          <w:bCs/>
+        </w:rPr>
+        <w:t>ke</w:t>
+      </w:r>
+      <w:proofErr w:type="spellEnd"/>
+      <w:r>
+        <w:rPr>
+          <w:b/>
+          <w:bCs/>
+        </w:rPr>
+        <w:t xml:space="preserve"> Saath Comparison</w:t>
+      </w:r>
+    </w:p>
+    <w:p>
+      <w:r>
+        <w:t xml:space="preserve">undefined bahut </w:t>
+      </w:r>
+      <w:proofErr w:type="spellStart"/>
+      <w:r>
+        <w:t>seedha</w:t>
+      </w:r>
+      <w:proofErr w:type="spellEnd"/>
+      <w:r>
+        <w:t xml:space="preserve"> </w:t>
+      </w:r>
+      <w:proofErr w:type="spellStart"/>
+      <w:r>
+        <w:t>hai</w:t>
+      </w:r>
+      <w:proofErr w:type="spellEnd"/>
+      <w:r>
+        <w:t xml:space="preserve">. Wo </w:t>
+      </w:r>
+      <w:proofErr w:type="spellStart"/>
+      <w:r>
+        <w:t>kisi</w:t>
+      </w:r>
+      <w:proofErr w:type="spellEnd"/>
+      <w:r>
+        <w:t xml:space="preserve"> </w:t>
+      </w:r>
+      <w:proofErr w:type="spellStart"/>
+      <w:r>
+        <w:t>bhi</w:t>
+      </w:r>
+      <w:proofErr w:type="spellEnd"/>
+      <w:r>
+        <w:t xml:space="preserve"> comparison (&gt;, &lt;, ==) </w:t>
+      </w:r>
+      <w:proofErr w:type="spellStart"/>
+      <w:r>
+        <w:t>mein</w:t>
+      </w:r>
+      <w:proofErr w:type="spellEnd"/>
+      <w:r>
+        <w:t xml:space="preserve"> </w:t>
+      </w:r>
+      <w:proofErr w:type="spellStart"/>
+      <w:r>
+        <w:t>hamesha</w:t>
+      </w:r>
+      <w:proofErr w:type="spellEnd"/>
+      <w:r>
+        <w:t xml:space="preserve"> </w:t>
+      </w:r>
+      <w:r>
+        <w:rPr>
+          <w:b/>
+          <w:bCs/>
+        </w:rPr>
+        <w:t>false</w:t>
+      </w:r>
+      <w:r>
+        <w:t xml:space="preserve"> hi </w:t>
+      </w:r>
+      <w:proofErr w:type="spellStart"/>
+      <w:r>
+        <w:t>dega</w:t>
+      </w:r>
+      <w:proofErr w:type="spellEnd"/>
+      <w:r>
+        <w:t xml:space="preserve"> agar tum </w:t>
+      </w:r>
+      <w:proofErr w:type="spellStart"/>
+      <w:r>
+        <w:t>usey</w:t>
+      </w:r>
+      <w:proofErr w:type="spellEnd"/>
+      <w:r>
+        <w:t xml:space="preserve"> 0 </w:t>
+      </w:r>
+      <w:proofErr w:type="spellStart"/>
+      <w:r>
+        <w:t>ya</w:t>
+      </w:r>
+      <w:proofErr w:type="spellEnd"/>
+      <w:r>
+        <w:t xml:space="preserve"> </w:t>
+      </w:r>
+      <w:proofErr w:type="spellStart"/>
+      <w:r>
+        <w:t>kisi</w:t>
+      </w:r>
+      <w:proofErr w:type="spellEnd"/>
+      <w:r>
+        <w:t xml:space="preserve"> number se compare </w:t>
+      </w:r>
+      <w:proofErr w:type="spellStart"/>
+      <w:r>
+        <w:t>karoge</w:t>
+      </w:r>
+      <w:proofErr w:type="spellEnd"/>
+      <w:r>
+        <w:t>.</w:t>
+      </w:r>
+    </w:p>
+    <w:p>
+      <w:r>
+        <w:t xml:space="preserve">              </w:t>
+      </w:r>
+      <w:r>
+        <w:drawing>
+          <wp:inline distT="0" distB="0" distL="0" distR="0" wp14:anchorId="3D6B0F01" wp14:editId="4F2B7C91">
+            <wp:extent cx="4753638" cy="3772426"/>
+            <wp:effectExtent l="0" t="0" r="8890" b="0"/>
+            <wp:docPr id="21612469" name="Picture 1"/>
+            <wp:cNvGraphicFramePr>
+              <a:graphicFrameLocks xmlns:a="http://schemas.openxmlformats.org/drawingml/2006/main" noChangeAspect="1"/>
+            </wp:cNvGraphicFramePr>
+            <a:graphic xmlns:a="http://schemas.openxmlformats.org/drawingml/2006/main">
+              <a:graphicData uri="http://schemas.openxmlformats.org/drawingml/2006/picture">
+                <pic:pic xmlns:pic="http://schemas.openxmlformats.org/drawingml/2006/picture">
+                  <pic:nvPicPr>
+                    <pic:cNvPr id="21612469" name=""/>
+                    <pic:cNvPicPr/>
+                  </pic:nvPicPr>
+                  <pic:blipFill>
+                    <a:blip r:embed="rId52"/>
+                    <a:stretch>
+                      <a:fillRect/>
+                    </a:stretch>
+                  </pic:blipFill>
+                  <pic:spPr>
+                    <a:xfrm>
+                      <a:off x="0" y="0"/>
+                      <a:ext cx="4753638" cy="3772426"/>
+                    </a:xfrm>
+                    <a:prstGeom prst="rect">
+                      <a:avLst/>
+                    </a:prstGeom>
+                  </pic:spPr>
+                </pic:pic>
+              </a:graphicData>
+            </a:graphic>
+          </wp:inline>
+        </w:drawing>
+      </w:r>
+      <w:r>
+        <w:pict w14:anchorId="765247DE">
+          <v:rect id="_x0000_i1126" style="width:0;height:1.5pt" o:hralign="center" o:hrstd="t" o:hr="t" fillcolor="#a0a0a0" stroked="f"/>
+        </w:pict>
+      </w:r>
+      <w:r>
+        <w:rPr>
+          <w:b/>
+          <w:bCs/>
+        </w:rPr>
+        <w:t>5. Strict Check (===)</w:t>
+      </w:r>
+    </w:p>
+    <w:p>
+      <w:r>
+        <w:t xml:space="preserve">Ye </w:t>
+      </w:r>
+      <w:proofErr w:type="spellStart"/>
+      <w:r>
+        <w:t>sabse</w:t>
+      </w:r>
+      <w:proofErr w:type="spellEnd"/>
+      <w:r>
+        <w:t xml:space="preserve"> </w:t>
+      </w:r>
+      <w:proofErr w:type="spellStart"/>
+      <w:r>
+        <w:t>kaam</w:t>
+      </w:r>
+      <w:proofErr w:type="spellEnd"/>
+      <w:r>
+        <w:t xml:space="preserve"> ki </w:t>
+      </w:r>
+      <w:proofErr w:type="spellStart"/>
+      <w:r>
+        <w:t>cheez</w:t>
+      </w:r>
+      <w:proofErr w:type="spellEnd"/>
+      <w:r>
+        <w:t xml:space="preserve"> </w:t>
+      </w:r>
+      <w:proofErr w:type="spellStart"/>
+      <w:r>
+        <w:t>hai</w:t>
+      </w:r>
+      <w:proofErr w:type="spellEnd"/>
+      <w:r>
+        <w:t>.</w:t>
+      </w:r>
+    </w:p>
+    <w:p>
+      <w:pPr>
+        <w:numPr>
+          <w:ilvl w:val="0"/>
+          <w:numId w:val="34"/>
+        </w:numPr>
+      </w:pPr>
+      <w:r>
+        <w:rPr>
+          <w:b/>
+          <w:bCs/>
+        </w:rPr>
+        <w:t>== (Double Equals):</w:t>
+      </w:r>
+      <w:r>
+        <w:t xml:space="preserve"> Ye </w:t>
+      </w:r>
+      <w:proofErr w:type="spellStart"/>
+      <w:r>
+        <w:t>sirf</w:t>
+      </w:r>
+      <w:proofErr w:type="spellEnd"/>
+      <w:r>
+        <w:t xml:space="preserve"> value </w:t>
+      </w:r>
+      <w:proofErr w:type="spellStart"/>
+      <w:r>
+        <w:t>dekhta</w:t>
+      </w:r>
+      <w:proofErr w:type="spellEnd"/>
+      <w:r>
+        <w:t xml:space="preserve"> </w:t>
+      </w:r>
+      <w:proofErr w:type="spellStart"/>
+      <w:r>
+        <w:t>hai</w:t>
+      </w:r>
+      <w:proofErr w:type="spellEnd"/>
+      <w:r>
+        <w:t xml:space="preserve"> aur agar </w:t>
+      </w:r>
+      <w:proofErr w:type="spellStart"/>
+      <w:r>
+        <w:t>zaroorat</w:t>
+      </w:r>
+      <w:proofErr w:type="spellEnd"/>
+      <w:r>
+        <w:t xml:space="preserve"> </w:t>
+      </w:r>
+      <w:proofErr w:type="spellStart"/>
+      <w:r>
+        <w:t>pade</w:t>
+      </w:r>
+      <w:proofErr w:type="spellEnd"/>
+      <w:r>
+        <w:t xml:space="preserve"> </w:t>
+      </w:r>
+      <w:proofErr w:type="spellStart"/>
+      <w:r>
+        <w:t>toh</w:t>
+      </w:r>
+      <w:proofErr w:type="spellEnd"/>
+      <w:r>
+        <w:t xml:space="preserve"> type convert (coercion) </w:t>
+      </w:r>
+      <w:proofErr w:type="spellStart"/>
+      <w:r>
+        <w:t>kar</w:t>
+      </w:r>
+      <w:proofErr w:type="spellEnd"/>
+      <w:r>
+        <w:t xml:space="preserve"> </w:t>
+      </w:r>
+      <w:proofErr w:type="spellStart"/>
+      <w:r>
+        <w:t>deta</w:t>
+      </w:r>
+      <w:proofErr w:type="spellEnd"/>
+      <w:r>
+        <w:t xml:space="preserve"> </w:t>
+      </w:r>
+      <w:proofErr w:type="spellStart"/>
+      <w:r>
+        <w:t>hai</w:t>
+      </w:r>
+      <w:proofErr w:type="spellEnd"/>
+      <w:r>
+        <w:t>. ("2" == 2 is true).</w:t>
+      </w:r>
+    </w:p>
+    <w:p>
+      <w:pPr>
+        <w:numPr>
+          <w:ilvl w:val="0"/>
+          <w:numId w:val="34"/>
+        </w:numPr>
+      </w:pPr>
+      <w:r>
+        <w:rPr>
+          <w:b/>
+          <w:bCs/>
+        </w:rPr>
+        <w:t>=== (Triple Equals):</w:t>
+      </w:r>
+      <w:r>
+        <w:t xml:space="preserve"> Ye </w:t>
+      </w:r>
+      <w:r>
+        <w:rPr>
+          <w:b/>
+          <w:bCs/>
+        </w:rPr>
+        <w:t>strictly</w:t>
+      </w:r>
+      <w:r>
+        <w:t xml:space="preserve"> check </w:t>
+      </w:r>
+      <w:proofErr w:type="spellStart"/>
+      <w:r>
+        <w:t>karta</w:t>
+      </w:r>
+      <w:proofErr w:type="spellEnd"/>
+      <w:r>
+        <w:t xml:space="preserve"> </w:t>
+      </w:r>
+      <w:proofErr w:type="spellStart"/>
+      <w:r>
+        <w:t>hai</w:t>
+      </w:r>
+      <w:proofErr w:type="spellEnd"/>
+      <w:r>
+        <w:t xml:space="preserve">. Ye check </w:t>
+      </w:r>
+      <w:proofErr w:type="spellStart"/>
+      <w:r>
+        <w:t>karta</w:t>
+      </w:r>
+      <w:proofErr w:type="spellEnd"/>
+      <w:r>
+        <w:t xml:space="preserve"> </w:t>
+      </w:r>
+      <w:proofErr w:type="spellStart"/>
+      <w:r>
+        <w:t>hai</w:t>
+      </w:r>
+      <w:proofErr w:type="spellEnd"/>
+      <w:r>
+        <w:t xml:space="preserve"> ki </w:t>
+      </w:r>
+      <w:r>
+        <w:rPr>
+          <w:b/>
+          <w:bCs/>
+        </w:rPr>
+        <w:t>Value</w:t>
+      </w:r>
+      <w:r>
+        <w:t xml:space="preserve"> aur </w:t>
+      </w:r>
+      <w:proofErr w:type="spellStart"/>
+      <w:r>
+        <w:rPr>
+          <w:b/>
+          <w:bCs/>
+        </w:rPr>
+        <w:t>DataType</w:t>
+      </w:r>
+      <w:proofErr w:type="spellEnd"/>
+      <w:r>
+        <w:t xml:space="preserve"> </w:t>
+      </w:r>
+      <w:proofErr w:type="spellStart"/>
+      <w:r>
+        <w:t>dono</w:t>
+      </w:r>
+      <w:proofErr w:type="spellEnd"/>
+      <w:r>
+        <w:t xml:space="preserve"> same hain </w:t>
+      </w:r>
+      <w:proofErr w:type="spellStart"/>
+      <w:r>
+        <w:t>ya</w:t>
+      </w:r>
+      <w:proofErr w:type="spellEnd"/>
+      <w:r>
+        <w:t xml:space="preserve"> </w:t>
+      </w:r>
+      <w:proofErr w:type="spellStart"/>
+      <w:r>
+        <w:t>nahi</w:t>
+      </w:r>
+      <w:proofErr w:type="spellEnd"/>
+      <w:r>
+        <w:t xml:space="preserve">. ("2" === 2 is false </w:t>
+      </w:r>
+      <w:proofErr w:type="spellStart"/>
+      <w:r>
+        <w:t>kyunki</w:t>
+      </w:r>
+      <w:proofErr w:type="spellEnd"/>
+      <w:r>
+        <w:t xml:space="preserve"> ek string </w:t>
+      </w:r>
+      <w:proofErr w:type="spellStart"/>
+      <w:r>
+        <w:t>hai</w:t>
+      </w:r>
+      <w:proofErr w:type="spellEnd"/>
+      <w:r>
+        <w:t xml:space="preserve"> aur ek number).</w:t>
+      </w:r>
+    </w:p>
+    <w:p>
+      <w:r>
+        <w:t>S</w:t>
+      </w:r>
+      <w:r>
+        <w:t xml:space="preserve">ir ne </w:t>
+      </w:r>
+      <w:proofErr w:type="spellStart"/>
+      <w:r>
+        <w:t>samjhaya</w:t>
+      </w:r>
+      <w:proofErr w:type="spellEnd"/>
+      <w:r>
+        <w:t xml:space="preserve"> </w:t>
+      </w:r>
+      <w:proofErr w:type="spellStart"/>
+      <w:r>
+        <w:t>hai</w:t>
+      </w:r>
+      <w:proofErr w:type="spellEnd"/>
+      <w:r>
+        <w:t xml:space="preserve"> ki </w:t>
+      </w:r>
+      <w:proofErr w:type="spellStart"/>
+      <w:r>
+        <w:t>hamesha</w:t>
+      </w:r>
+      <w:proofErr w:type="spellEnd"/>
+      <w:r>
+        <w:t xml:space="preserve"> === use </w:t>
+      </w:r>
+      <w:proofErr w:type="spellStart"/>
+      <w:r>
+        <w:t>karna</w:t>
+      </w:r>
+      <w:proofErr w:type="spellEnd"/>
+      <w:r>
+        <w:t xml:space="preserve"> better </w:t>
+      </w:r>
+      <w:proofErr w:type="spellStart"/>
+      <w:r>
+        <w:t>hai</w:t>
+      </w:r>
+      <w:proofErr w:type="spellEnd"/>
+      <w:r>
+        <w:t xml:space="preserve"> </w:t>
+      </w:r>
+      <w:proofErr w:type="spellStart"/>
+      <w:r>
+        <w:t>taaki</w:t>
+      </w:r>
+      <w:proofErr w:type="spellEnd"/>
+      <w:r>
+        <w:t xml:space="preserve"> koi </w:t>
+      </w:r>
+      <w:proofErr w:type="spellStart"/>
+      <w:r>
+        <w:t>galti</w:t>
+      </w:r>
+      <w:proofErr w:type="spellEnd"/>
+      <w:r>
+        <w:t xml:space="preserve"> </w:t>
+      </w:r>
+      <w:proofErr w:type="spellStart"/>
+      <w:r>
+        <w:t>na</w:t>
+      </w:r>
+      <w:proofErr w:type="spellEnd"/>
+      <w:r>
+        <w:t xml:space="preserve"> ho.</w:t>
+      </w:r>
+    </w:p>
+    <w:p>
+      <w:r>
+        <w:lastRenderedPageBreak/>
+        <w:drawing>
+          <wp:inline distT="0" distB="0" distL="0" distR="0" wp14:anchorId="739E6F74" wp14:editId="3D362FEA">
+            <wp:extent cx="5731510" cy="1776095"/>
+            <wp:effectExtent l="0" t="0" r="2540" b="0"/>
+            <wp:docPr id="1443433094" name="Picture 1"/>
+            <wp:cNvGraphicFramePr>
+              <a:graphicFrameLocks xmlns:a="http://schemas.openxmlformats.org/drawingml/2006/main" noChangeAspect="1"/>
+            </wp:cNvGraphicFramePr>
+            <a:graphic xmlns:a="http://schemas.openxmlformats.org/drawingml/2006/main">
+              <a:graphicData uri="http://schemas.openxmlformats.org/drawingml/2006/picture">
+                <pic:pic xmlns:pic="http://schemas.openxmlformats.org/drawingml/2006/picture">
+                  <pic:nvPicPr>
+                    <pic:cNvPr id="1443433094" name=""/>
+                    <pic:cNvPicPr/>
+                  </pic:nvPicPr>
+                  <pic:blipFill>
+                    <a:blip r:embed="rId53"/>
+                    <a:stretch>
+                      <a:fillRect/>
+                    </a:stretch>
+                  </pic:blipFill>
+                  <pic:spPr>
+                    <a:xfrm>
+                      <a:off x="0" y="0"/>
+                      <a:ext cx="5731510" cy="1776095"/>
+                    </a:xfrm>
+                    <a:prstGeom prst="rect">
+                      <a:avLst/>
+                    </a:prstGeom>
+                  </pic:spPr>
+                </pic:pic>
+              </a:graphicData>
+            </a:graphic>
+          </wp:inline>
+        </w:drawing>
+      </w:r>
+      <w:r>
+        <w:pict w14:anchorId="34BD9A7C">
+          <v:rect id="_x0000_i1115" style="width:0;height:1.5pt" o:hralign="center" o:hrstd="t" o:hr="t" fillcolor="#a0a0a0" stroked="f"/>
+        </w:pict>
+      </w:r>
+    </w:p>
+    <w:p>
+      <w:pPr>
+        <w:rPr>
+          <w:b/>
+          <w:bCs/>
+        </w:rPr>
+      </w:pPr>
+      <w:r>
+        <w:rPr>
+          <w:b/>
+          <w:bCs/>
+        </w:rPr>
+        <w:t>Key Summary &amp; Notes:</w:t>
+      </w:r>
+    </w:p>
+    <w:p>
+      <w:pPr>
+        <w:numPr>
+          <w:ilvl w:val="0"/>
+          <w:numId w:val="35"/>
+        </w:numPr>
+      </w:pPr>
+      <w:r>
+        <w:rPr>
+          <w:b/>
+          <w:bCs/>
+        </w:rPr>
+        <w:t>Avoid Inconsistent Comparisons:</w:t>
+      </w:r>
+      <w:r>
+        <w:t xml:space="preserve"> Jab </w:t>
+      </w:r>
+      <w:proofErr w:type="spellStart"/>
+      <w:r>
+        <w:t>tak</w:t>
+      </w:r>
+      <w:proofErr w:type="spellEnd"/>
+      <w:r>
+        <w:t xml:space="preserve"> </w:t>
+      </w:r>
+      <w:proofErr w:type="spellStart"/>
+      <w:r>
+        <w:t>zaroori</w:t>
+      </w:r>
+      <w:proofErr w:type="spellEnd"/>
+      <w:r>
+        <w:t xml:space="preserve"> </w:t>
+      </w:r>
+      <w:proofErr w:type="spellStart"/>
+      <w:r>
+        <w:t>na</w:t>
+      </w:r>
+      <w:proofErr w:type="spellEnd"/>
+      <w:r>
+        <w:t xml:space="preserve"> </w:t>
+      </w:r>
+      <w:proofErr w:type="spellStart"/>
+      <w:r>
+        <w:t>ho</w:t>
+      </w:r>
+      <w:proofErr w:type="spellEnd"/>
+      <w:r>
+        <w:t xml:space="preserve">, </w:t>
+      </w:r>
+      <w:proofErr w:type="spellStart"/>
+      <w:r>
+        <w:t>alag-alag</w:t>
+      </w:r>
+      <w:proofErr w:type="spellEnd"/>
+      <w:r>
+        <w:t xml:space="preserve"> datatypes ko compare mat karo. Code "Clean" aur "Predictable" </w:t>
+      </w:r>
+      <w:proofErr w:type="spellStart"/>
+      <w:r>
+        <w:t>hona</w:t>
+      </w:r>
+      <w:proofErr w:type="spellEnd"/>
+      <w:r>
+        <w:t xml:space="preserve"> </w:t>
+      </w:r>
+      <w:proofErr w:type="spellStart"/>
+      <w:r>
+        <w:t>chahiye</w:t>
+      </w:r>
+      <w:proofErr w:type="spellEnd"/>
+      <w:r>
+        <w:t>.</w:t>
+      </w:r>
+    </w:p>
+    <w:p>
+      <w:pPr>
+        <w:numPr>
+          <w:ilvl w:val="0"/>
+          <w:numId w:val="35"/>
+        </w:numPr>
+      </w:pPr>
+      <w:r>
+        <w:rPr>
+          <w:b/>
+          <w:bCs/>
+        </w:rPr>
+        <w:t>Equality vs Comparison:</w:t>
+      </w:r>
+      <w:r>
+        <w:t xml:space="preserve"> </w:t>
+      </w:r>
+      <w:proofErr w:type="spellStart"/>
+      <w:r>
+        <w:t>Yaad</w:t>
+      </w:r>
+      <w:proofErr w:type="spellEnd"/>
+      <w:r>
+        <w:t xml:space="preserve"> </w:t>
+      </w:r>
+      <w:proofErr w:type="spellStart"/>
+      <w:r>
+        <w:t>rakhna</w:t>
+      </w:r>
+      <w:proofErr w:type="spellEnd"/>
+      <w:r>
+        <w:t xml:space="preserve"> ki == aur &gt; </w:t>
+      </w:r>
+      <w:proofErr w:type="spellStart"/>
+      <w:r>
+        <w:t>alag</w:t>
+      </w:r>
+      <w:proofErr w:type="spellEnd"/>
+      <w:r>
+        <w:t xml:space="preserve"> </w:t>
+      </w:r>
+      <w:proofErr w:type="spellStart"/>
+      <w:r>
+        <w:t>tareeke</w:t>
+      </w:r>
+      <w:proofErr w:type="spellEnd"/>
+      <w:r>
+        <w:t xml:space="preserve"> se handle </w:t>
+      </w:r>
+      <w:proofErr w:type="spellStart"/>
+      <w:r>
+        <w:t>hote</w:t>
+      </w:r>
+      <w:proofErr w:type="spellEnd"/>
+      <w:r>
+        <w:t xml:space="preserve"> hain (null </w:t>
+      </w:r>
+      <w:proofErr w:type="spellStart"/>
+      <w:r>
+        <w:t>wala</w:t>
+      </w:r>
+      <w:proofErr w:type="spellEnd"/>
+      <w:r>
+        <w:t xml:space="preserve"> example).</w:t>
+      </w:r>
+    </w:p>
+    <w:p>
+      <w:pPr>
+        <w:numPr>
+          <w:ilvl w:val="0"/>
+          <w:numId w:val="35"/>
+        </w:numPr>
+      </w:pPr>
+      <w:r>
+        <w:rPr>
+          <w:b/>
+          <w:bCs/>
+        </w:rPr>
+        <w:t>Strict Check is Best:</w:t>
+      </w:r>
+      <w:r>
+        <w:t xml:space="preserve"> Hamesha === use karo </w:t>
+      </w:r>
+      <w:proofErr w:type="spellStart"/>
+      <w:r>
+        <w:t>taaki</w:t>
+      </w:r>
+      <w:proofErr w:type="spellEnd"/>
+      <w:r>
+        <w:t xml:space="preserve"> JS </w:t>
+      </w:r>
+      <w:proofErr w:type="spellStart"/>
+      <w:r>
+        <w:t>piche</w:t>
+      </w:r>
+      <w:proofErr w:type="spellEnd"/>
+      <w:r>
+        <w:t xml:space="preserve"> se koi </w:t>
+      </w:r>
+      <w:proofErr w:type="spellStart"/>
+      <w:r>
+        <w:t>ajeeb</w:t>
+      </w:r>
+      <w:proofErr w:type="spellEnd"/>
+      <w:r>
+        <w:t xml:space="preserve"> conversion </w:t>
+      </w:r>
+      <w:proofErr w:type="spellStart"/>
+      <w:r>
+        <w:t>na</w:t>
+      </w:r>
+      <w:proofErr w:type="spellEnd"/>
+      <w:r>
+        <w:t xml:space="preserve"> </w:t>
+      </w:r>
+      <w:proofErr w:type="spellStart"/>
+      <w:r>
+        <w:t>kare</w:t>
+      </w:r>
+      <w:proofErr w:type="spellEnd"/>
+      <w:r>
+        <w:t>.</w:t>
+      </w:r>
+    </w:p>
+    <w:p>
+      <w:r>
+        <w:pict w14:anchorId="4534D3DC">
+          <v:rect id="_x0000_i1123" style="width:0;height:1.5pt" o:hralign="center" o:hrstd="t" o:hr="t" fillcolor="#a0a0a0" stroked="f"/>
+        </w:pict>
+      </w:r>
+    </w:p>
     <w:p/>
     <w:sectPr>
       <w:pgSz w:w="11906" w:h="16838"/>
@@ -12649,7 +14412,7 @@
 <w:numbering xmlns:wpc="http://schemas.microsoft.com/office/word/2010/wordprocessingCanvas" xmlns:cx="http://schemas.microsoft.com/office/drawing/2014/chartex" xmlns:cx1="http://schemas.microsoft.com/office/drawing/2015/9/8/chartex" xmlns:cx2="http://schemas.microsoft.com/office/drawing/2015/10/21/chartex" xmlns:cx3="http://schemas.microsoft.com/office/drawing/2016/5/9/chartex" xmlns:cx4="http://schemas.microsoft.com/office/drawing/2016/5/10/chartex" xmlns:cx5="http://schemas.microsoft.com/office/drawing/2016/5/11/chartex" xmlns:cx6="http://schemas.microsoft.com/office/drawing/2016/5/12/chartex" xmlns:cx7="http://schemas.microsoft.com/office/drawing/2016/5/13/chartex" xmlns:cx8="http://schemas.microsoft.com/office/drawing/2016/5/14/chartex" xmlns:mc="http://schemas.openxmlformats.org/markup-compatibility/2006" xmlns:aink="http://schemas.microsoft.com/office/drawing/2016/ink" xmlns:am3d="http://schemas.microsoft.com/office/drawing/2017/model3d" xmlns:o="urn:schemas-microsoft-com:office:office" xmlns:oel="http://schemas.microsoft.com/office/2019/extlst" xmlns:r="http://schemas.openxmlformats.org/officeDocument/2006/relationships" xmlns:m="http://schemas.openxmlformats.org/officeDocument/2006/math" xmlns:v="urn:schemas-microsoft-com:vml" xmlns:wp14="http://schemas.microsoft.com/office/word/2010/wordprocessingDrawing" xmlns:wp="http://schemas.openxmlformats.org/drawingml/2006/wordprocessingDrawing" xmlns:w10="urn:schemas-microsoft-com:office:word" xmlns:w="http://schemas.openxmlformats.org/wordprocessingml/2006/main" xmlns:w14="http://schemas.microsoft.com/office/word/2010/wordml" xmlns:w15="http://schemas.microsoft.com/office/word/2012/wordml" xmlns:w16cex="http://schemas.microsoft.com/office/word/2018/wordml/cex" xmlns:w16cid="http://schemas.microsoft.com/office/word/2016/wordml/cid" xmlns:w16="http://schemas.microsoft.com/office/word/2018/wordml" xmlns:w16du="http://schemas.microsoft.com/office/word/2023/wordml/word16du" xmlns:w16sdtdh="http://schemas.microsoft.com/office/word/2020/wordml/sdtdatahash" xmlns:w16sdtfl="http://schemas.microsoft.com/office/word/2024/wordml/sdtformatlock" xmlns:w16se="http://schemas.microsoft.com/office/word/2015/wordml/symex" xmlns:wpg="http://schemas.microsoft.com/office/word/2010/wordprocessingGroup" xmlns:wpi="http://schemas.microsoft.com/office/word/2010/wordprocessingInk" xmlns:wne="http://schemas.microsoft.com/office/word/2006/wordml" xmlns:wps="http://schemas.microsoft.com/office/word/2010/wordprocessingShape" mc:Ignorable="w14 w15 w16se w16cid w16 w16cex w16sdtdh w16sdtfl w16du wp14">
   <w:numPicBullet w:numPicBulletId="0">
     <w:pict>
-      <v:rect id="_x0000_i1056" style="width:0;height:1.5pt" o:hralign="center" o:bullet="t" o:hrstd="t" o:hr="t" fillcolor="#a0a0a0" stroked="f"/>
+      <v:rect id="_x0000_i1064" style="width:0;height:1.5pt" o:hralign="center" o:bullet="t" o:hrstd="t" o:hr="t" fillcolor="#a0a0a0" stroked="f"/>
     </w:pict>
   </w:numPicBullet>
   <w:abstractNum w:abstractNumId="0" w15:restartNumberingAfterBreak="0">
@@ -13213,6 +14976,155 @@
     </w:lvl>
   </w:abstractNum>
   <w:abstractNum w:abstractNumId="4" w15:restartNumberingAfterBreak="0">
+    <w:nsid w:val="0EF45C76"/>
+    <w:multiLevelType w:val="multilevel"/>
+    <w:tmpl w:val="BCCC5AD6"/>
+    <w:lvl w:ilvl="0">
+      <w:start w:val="1"/>
+      <w:numFmt w:val="bullet"/>
+      <w:lvlText w:val=""/>
+      <w:lvlJc w:val="left"/>
+      <w:pPr>
+        <w:tabs>
+          <w:tab w:val="num" w:pos="720"/>
+        </w:tabs>
+        <w:ind w:left="720" w:hanging="360"/>
+      </w:pPr>
+      <w:rPr>
+        <w:rFonts w:ascii="Symbol" w:hAnsi="Symbol" w:hint="default"/>
+        <w:sz w:val="20"/>
+      </w:rPr>
+    </w:lvl>
+    <w:lvl w:ilvl="1" w:tentative="1">
+      <w:start w:val="1"/>
+      <w:numFmt w:val="bullet"/>
+      <w:lvlText w:val="o"/>
+      <w:lvlJc w:val="left"/>
+      <w:pPr>
+        <w:tabs>
+          <w:tab w:val="num" w:pos="1440"/>
+        </w:tabs>
+        <w:ind w:left="1440" w:hanging="360"/>
+      </w:pPr>
+      <w:rPr>
+        <w:rFonts w:ascii="Courier New" w:hAnsi="Courier New" w:hint="default"/>
+        <w:sz w:val="20"/>
+      </w:rPr>
+    </w:lvl>
+    <w:lvl w:ilvl="2" w:tentative="1">
+      <w:start w:val="1"/>
+      <w:numFmt w:val="bullet"/>
+      <w:lvlText w:val=""/>
+      <w:lvlJc w:val="left"/>
+      <w:pPr>
+        <w:tabs>
+          <w:tab w:val="num" w:pos="2160"/>
+        </w:tabs>
+        <w:ind w:left="2160" w:hanging="360"/>
+      </w:pPr>
+      <w:rPr>
+        <w:rFonts w:ascii="Wingdings" w:hAnsi="Wingdings" w:hint="default"/>
+        <w:sz w:val="20"/>
+      </w:rPr>
+    </w:lvl>
+    <w:lvl w:ilvl="3" w:tentative="1">
+      <w:start w:val="1"/>
+      <w:numFmt w:val="bullet"/>
+      <w:lvlText w:val=""/>
+      <w:lvlJc w:val="left"/>
+      <w:pPr>
+        <w:tabs>
+          <w:tab w:val="num" w:pos="2880"/>
+        </w:tabs>
+        <w:ind w:left="2880" w:hanging="360"/>
+      </w:pPr>
+      <w:rPr>
+        <w:rFonts w:ascii="Wingdings" w:hAnsi="Wingdings" w:hint="default"/>
+        <w:sz w:val="20"/>
+      </w:rPr>
+    </w:lvl>
+    <w:lvl w:ilvl="4" w:tentative="1">
+      <w:start w:val="1"/>
+      <w:numFmt w:val="bullet"/>
+      <w:lvlText w:val=""/>
+      <w:lvlJc w:val="left"/>
+      <w:pPr>
+        <w:tabs>
+          <w:tab w:val="num" w:pos="3600"/>
+        </w:tabs>
+        <w:ind w:left="3600" w:hanging="360"/>
+      </w:pPr>
+      <w:rPr>
+        <w:rFonts w:ascii="Wingdings" w:hAnsi="Wingdings" w:hint="default"/>
+        <w:sz w:val="20"/>
+      </w:rPr>
+    </w:lvl>
+    <w:lvl w:ilvl="5" w:tentative="1">
+      <w:start w:val="1"/>
+      <w:numFmt w:val="bullet"/>
+      <w:lvlText w:val=""/>
+      <w:lvlJc w:val="left"/>
+      <w:pPr>
+        <w:tabs>
+          <w:tab w:val="num" w:pos="4320"/>
+        </w:tabs>
+        <w:ind w:left="4320" w:hanging="360"/>
+      </w:pPr>
+      <w:rPr>
+        <w:rFonts w:ascii="Wingdings" w:hAnsi="Wingdings" w:hint="default"/>
+        <w:sz w:val="20"/>
+      </w:rPr>
+    </w:lvl>
+    <w:lvl w:ilvl="6" w:tentative="1">
+      <w:start w:val="1"/>
+      <w:numFmt w:val="bullet"/>
+      <w:lvlText w:val=""/>
+      <w:lvlJc w:val="left"/>
+      <w:pPr>
+        <w:tabs>
+          <w:tab w:val="num" w:pos="5040"/>
+        </w:tabs>
+        <w:ind w:left="5040" w:hanging="360"/>
+      </w:pPr>
+      <w:rPr>
+        <w:rFonts w:ascii="Wingdings" w:hAnsi="Wingdings" w:hint="default"/>
+        <w:sz w:val="20"/>
+      </w:rPr>
+    </w:lvl>
+    <w:lvl w:ilvl="7" w:tentative="1">
+      <w:start w:val="1"/>
+      <w:numFmt w:val="bullet"/>
+      <w:lvlText w:val=""/>
+      <w:lvlJc w:val="left"/>
+      <w:pPr>
+        <w:tabs>
+          <w:tab w:val="num" w:pos="5760"/>
+        </w:tabs>
+        <w:ind w:left="5760" w:hanging="360"/>
+      </w:pPr>
+      <w:rPr>
+        <w:rFonts w:ascii="Wingdings" w:hAnsi="Wingdings" w:hint="default"/>
+        <w:sz w:val="20"/>
+      </w:rPr>
+    </w:lvl>
+    <w:lvl w:ilvl="8" w:tentative="1">
+      <w:start w:val="1"/>
+      <w:numFmt w:val="bullet"/>
+      <w:lvlText w:val=""/>
+      <w:lvlJc w:val="left"/>
+      <w:pPr>
+        <w:tabs>
+          <w:tab w:val="num" w:pos="6480"/>
+        </w:tabs>
+        <w:ind w:left="6480" w:hanging="360"/>
+      </w:pPr>
+      <w:rPr>
+        <w:rFonts w:ascii="Wingdings" w:hAnsi="Wingdings" w:hint="default"/>
+        <w:sz w:val="20"/>
+      </w:rPr>
+    </w:lvl>
+  </w:abstractNum>
+  <w:abstractNum w:abstractNumId="5" w15:restartNumberingAfterBreak="0">
     <w:nsid w:val="0F4A44EE"/>
     <w:multiLevelType w:val="multilevel"/>
     <w:tmpl w:val="54D281CE"/>
@@ -13361,7 +15273,120 @@
       </w:rPr>
     </w:lvl>
   </w:abstractNum>
-  <w:abstractNum w:abstractNumId="5" w15:restartNumberingAfterBreak="0">
+  <w:abstractNum w:abstractNumId="6" w15:restartNumberingAfterBreak="0">
+    <w:nsid w:val="11064EE4"/>
+    <w:multiLevelType w:val="multilevel"/>
+    <w:tmpl w:val="83F86878"/>
+    <w:lvl w:ilvl="0">
+      <w:start w:val="1"/>
+      <w:numFmt w:val="decimal"/>
+      <w:lvlText w:val="%1."/>
+      <w:lvlJc w:val="left"/>
+      <w:pPr>
+        <w:tabs>
+          <w:tab w:val="num" w:pos="720"/>
+        </w:tabs>
+        <w:ind w:left="720" w:hanging="360"/>
+      </w:pPr>
+    </w:lvl>
+    <w:lvl w:ilvl="1" w:tentative="1">
+      <w:start w:val="1"/>
+      <w:numFmt w:val="decimal"/>
+      <w:lvlText w:val="%2."/>
+      <w:lvlJc w:val="left"/>
+      <w:pPr>
+        <w:tabs>
+          <w:tab w:val="num" w:pos="1440"/>
+        </w:tabs>
+        <w:ind w:left="1440" w:hanging="360"/>
+      </w:pPr>
+    </w:lvl>
+    <w:lvl w:ilvl="2" w:tentative="1">
+      <w:start w:val="1"/>
+      <w:numFmt w:val="decimal"/>
+      <w:lvlText w:val="%3."/>
+      <w:lvlJc w:val="left"/>
+      <w:pPr>
+        <w:tabs>
+          <w:tab w:val="num" w:pos="2160"/>
+        </w:tabs>
+        <w:ind w:left="2160" w:hanging="360"/>
+      </w:pPr>
+    </w:lvl>
+    <w:lvl w:ilvl="3" w:tentative="1">
+      <w:start w:val="1"/>
+      <w:numFmt w:val="decimal"/>
+      <w:lvlText w:val="%4."/>
+      <w:lvlJc w:val="left"/>
+      <w:pPr>
+        <w:tabs>
+          <w:tab w:val="num" w:pos="2880"/>
+        </w:tabs>
+        <w:ind w:left="2880" w:hanging="360"/>
+      </w:pPr>
+    </w:lvl>
+    <w:lvl w:ilvl="4" w:tentative="1">
+      <w:start w:val="1"/>
+      <w:numFmt w:val="decimal"/>
+      <w:lvlText w:val="%5."/>
+      <w:lvlJc w:val="left"/>
+      <w:pPr>
+        <w:tabs>
+          <w:tab w:val="num" w:pos="3600"/>
+        </w:tabs>
+        <w:ind w:left="3600" w:hanging="360"/>
+      </w:pPr>
+    </w:lvl>
+    <w:lvl w:ilvl="5" w:tentative="1">
+      <w:start w:val="1"/>
+      <w:numFmt w:val="decimal"/>
+      <w:lvlText w:val="%6."/>
+      <w:lvlJc w:val="left"/>
+      <w:pPr>
+        <w:tabs>
+          <w:tab w:val="num" w:pos="4320"/>
+        </w:tabs>
+        <w:ind w:left="4320" w:hanging="360"/>
+      </w:pPr>
+    </w:lvl>
+    <w:lvl w:ilvl="6" w:tentative="1">
+      <w:start w:val="1"/>
+      <w:numFmt w:val="decimal"/>
+      <w:lvlText w:val="%7."/>
+      <w:lvlJc w:val="left"/>
+      <w:pPr>
+        <w:tabs>
+          <w:tab w:val="num" w:pos="5040"/>
+        </w:tabs>
+        <w:ind w:left="5040" w:hanging="360"/>
+      </w:pPr>
+    </w:lvl>
+    <w:lvl w:ilvl="7" w:tentative="1">
+      <w:start w:val="1"/>
+      <w:numFmt w:val="decimal"/>
+      <w:lvlText w:val="%8."/>
+      <w:lvlJc w:val="left"/>
+      <w:pPr>
+        <w:tabs>
+          <w:tab w:val="num" w:pos="5760"/>
+        </w:tabs>
+        <w:ind w:left="5760" w:hanging="360"/>
+      </w:pPr>
+    </w:lvl>
+    <w:lvl w:ilvl="8" w:tentative="1">
+      <w:start w:val="1"/>
+      <w:numFmt w:val="decimal"/>
+      <w:lvlText w:val="%9."/>
+      <w:lvlJc w:val="left"/>
+      <w:pPr>
+        <w:tabs>
+          <w:tab w:val="num" w:pos="6480"/>
+        </w:tabs>
+        <w:ind w:left="6480" w:hanging="360"/>
+      </w:pPr>
+    </w:lvl>
+  </w:abstractNum>
+  <w:abstractNum w:abstractNumId="7" w15:restartNumberingAfterBreak="0">
     <w:nsid w:val="146754DF"/>
     <w:multiLevelType w:val="multilevel"/>
     <w:tmpl w:val="82881C24"/>
@@ -13510,7 +15535,7 @@
       </w:rPr>
     </w:lvl>
   </w:abstractNum>
-  <w:abstractNum w:abstractNumId="6" w15:restartNumberingAfterBreak="0">
+  <w:abstractNum w:abstractNumId="8" w15:restartNumberingAfterBreak="0">
     <w:nsid w:val="14831423"/>
     <w:multiLevelType w:val="multilevel"/>
     <w:tmpl w:val="6142A946"/>
@@ -13655,7 +15680,7 @@
       </w:rPr>
     </w:lvl>
   </w:abstractNum>
-  <w:abstractNum w:abstractNumId="7" w15:restartNumberingAfterBreak="0">
+  <w:abstractNum w:abstractNumId="9" w15:restartNumberingAfterBreak="0">
     <w:nsid w:val="17387F48"/>
     <w:multiLevelType w:val="multilevel"/>
     <w:tmpl w:val="827A1642"/>
@@ -13804,7 +15829,7 @@
       </w:rPr>
     </w:lvl>
   </w:abstractNum>
-  <w:abstractNum w:abstractNumId="8" w15:restartNumberingAfterBreak="0">
+  <w:abstractNum w:abstractNumId="10" w15:restartNumberingAfterBreak="0">
     <w:nsid w:val="1B9E2DC0"/>
     <w:multiLevelType w:val="multilevel"/>
     <w:tmpl w:val="9E1C2A48"/>
@@ -13917,7 +15942,7 @@
       </w:pPr>
     </w:lvl>
   </w:abstractNum>
-  <w:abstractNum w:abstractNumId="9" w15:restartNumberingAfterBreak="0">
+  <w:abstractNum w:abstractNumId="11" w15:restartNumberingAfterBreak="0">
     <w:nsid w:val="22344C3B"/>
     <w:multiLevelType w:val="multilevel"/>
     <w:tmpl w:val="8DBE15BE"/>
@@ -14066,7 +16091,7 @@
       </w:rPr>
     </w:lvl>
   </w:abstractNum>
-  <w:abstractNum w:abstractNumId="10" w15:restartNumberingAfterBreak="0">
+  <w:abstractNum w:abstractNumId="12" w15:restartNumberingAfterBreak="0">
     <w:nsid w:val="257838BF"/>
     <w:multiLevelType w:val="multilevel"/>
     <w:tmpl w:val="931E5548"/>
@@ -14215,7 +16240,7 @@
       </w:rPr>
     </w:lvl>
   </w:abstractNum>
-  <w:abstractNum w:abstractNumId="11" w15:restartNumberingAfterBreak="0">
+  <w:abstractNum w:abstractNumId="13" w15:restartNumberingAfterBreak="0">
     <w:nsid w:val="284349D0"/>
     <w:multiLevelType w:val="multilevel"/>
     <w:tmpl w:val="D36A1922"/>
@@ -14328,7 +16353,7 @@
       </w:pPr>
     </w:lvl>
   </w:abstractNum>
-  <w:abstractNum w:abstractNumId="12" w15:restartNumberingAfterBreak="0">
+  <w:abstractNum w:abstractNumId="14" w15:restartNumberingAfterBreak="0">
     <w:nsid w:val="29F31054"/>
     <w:multiLevelType w:val="multilevel"/>
     <w:tmpl w:val="357C58B0"/>
@@ -14477,7 +16502,7 @@
       </w:rPr>
     </w:lvl>
   </w:abstractNum>
-  <w:abstractNum w:abstractNumId="13" w15:restartNumberingAfterBreak="0">
+  <w:abstractNum w:abstractNumId="15" w15:restartNumberingAfterBreak="0">
     <w:nsid w:val="328F4473"/>
     <w:multiLevelType w:val="multilevel"/>
     <w:tmpl w:val="3F7616B4"/>
@@ -14626,7 +16651,7 @@
       </w:rPr>
     </w:lvl>
   </w:abstractNum>
-  <w:abstractNum w:abstractNumId="14" w15:restartNumberingAfterBreak="0">
+  <w:abstractNum w:abstractNumId="16" w15:restartNumberingAfterBreak="0">
     <w:nsid w:val="33923578"/>
     <w:multiLevelType w:val="multilevel"/>
     <w:tmpl w:val="EB42FD92"/>
@@ -14775,7 +16800,7 @@
       </w:rPr>
     </w:lvl>
   </w:abstractNum>
-  <w:abstractNum w:abstractNumId="15" w15:restartNumberingAfterBreak="0">
+  <w:abstractNum w:abstractNumId="17" w15:restartNumberingAfterBreak="0">
     <w:nsid w:val="35EE1AD9"/>
     <w:multiLevelType w:val="multilevel"/>
     <w:tmpl w:val="52063FB2"/>
@@ -14924,7 +16949,156 @@
       </w:rPr>
     </w:lvl>
   </w:abstractNum>
-  <w:abstractNum w:abstractNumId="16" w15:restartNumberingAfterBreak="0">
+  <w:abstractNum w:abstractNumId="18" w15:restartNumberingAfterBreak="0">
+    <w:nsid w:val="36644E19"/>
+    <w:multiLevelType w:val="multilevel"/>
+    <w:tmpl w:val="9C0E3822"/>
+    <w:lvl w:ilvl="0">
+      <w:start w:val="1"/>
+      <w:numFmt w:val="bullet"/>
+      <w:lvlText w:val=""/>
+      <w:lvlJc w:val="left"/>
+      <w:pPr>
+        <w:tabs>
+          <w:tab w:val="num" w:pos="720"/>
+        </w:tabs>
+        <w:ind w:left="720" w:hanging="360"/>
+      </w:pPr>
+      <w:rPr>
+        <w:rFonts w:ascii="Symbol" w:hAnsi="Symbol" w:hint="default"/>
+        <w:sz w:val="20"/>
+      </w:rPr>
+    </w:lvl>
+    <w:lvl w:ilvl="1" w:tentative="1">
+      <w:start w:val="1"/>
+      <w:numFmt w:val="bullet"/>
+      <w:lvlText w:val="o"/>
+      <w:lvlJc w:val="left"/>
+      <w:pPr>
+        <w:tabs>
+          <w:tab w:val="num" w:pos="1440"/>
+        </w:tabs>
+        <w:ind w:left="1440" w:hanging="360"/>
+      </w:pPr>
+      <w:rPr>
+        <w:rFonts w:ascii="Courier New" w:hAnsi="Courier New" w:hint="default"/>
+        <w:sz w:val="20"/>
+      </w:rPr>
+    </w:lvl>
+    <w:lvl w:ilvl="2" w:tentative="1">
+      <w:start w:val="1"/>
+      <w:numFmt w:val="bullet"/>
+      <w:lvlText w:val=""/>
+      <w:lvlJc w:val="left"/>
+      <w:pPr>
+        <w:tabs>
+          <w:tab w:val="num" w:pos="2160"/>
+        </w:tabs>
+        <w:ind w:left="2160" w:hanging="360"/>
+      </w:pPr>
+      <w:rPr>
+        <w:rFonts w:ascii="Wingdings" w:hAnsi="Wingdings" w:hint="default"/>
+        <w:sz w:val="20"/>
+      </w:rPr>
+    </w:lvl>
+    <w:lvl w:ilvl="3" w:tentative="1">
+      <w:start w:val="1"/>
+      <w:numFmt w:val="bullet"/>
+      <w:lvlText w:val=""/>
+      <w:lvlJc w:val="left"/>
+      <w:pPr>
+        <w:tabs>
+          <w:tab w:val="num" w:pos="2880"/>
+        </w:tabs>
+        <w:ind w:left="2880" w:hanging="360"/>
+      </w:pPr>
+      <w:rPr>
+        <w:rFonts w:ascii="Wingdings" w:hAnsi="Wingdings" w:hint="default"/>
+        <w:sz w:val="20"/>
+      </w:rPr>
+    </w:lvl>
+    <w:lvl w:ilvl="4" w:tentative="1">
+      <w:start w:val="1"/>
+      <w:numFmt w:val="bullet"/>
+      <w:lvlText w:val=""/>
+      <w:lvlJc w:val="left"/>
+      <w:pPr>
+        <w:tabs>
+          <w:tab w:val="num" w:pos="3600"/>
+        </w:tabs>
+        <w:ind w:left="3600" w:hanging="360"/>
+      </w:pPr>
+      <w:rPr>
+        <w:rFonts w:ascii="Wingdings" w:hAnsi="Wingdings" w:hint="default"/>
+        <w:sz w:val="20"/>
+      </w:rPr>
+    </w:lvl>
+    <w:lvl w:ilvl="5" w:tentative="1">
+      <w:start w:val="1"/>
+      <w:numFmt w:val="bullet"/>
+      <w:lvlText w:val=""/>
+      <w:lvlJc w:val="left"/>
+      <w:pPr>
+        <w:tabs>
+          <w:tab w:val="num" w:pos="4320"/>
+        </w:tabs>
+        <w:ind w:left="4320" w:hanging="360"/>
+      </w:pPr>
+      <w:rPr>
+        <w:rFonts w:ascii="Wingdings" w:hAnsi="Wingdings" w:hint="default"/>
+        <w:sz w:val="20"/>
+      </w:rPr>
+    </w:lvl>
+    <w:lvl w:ilvl="6" w:tentative="1">
+      <w:start w:val="1"/>
+      <w:numFmt w:val="bullet"/>
+      <w:lvlText w:val=""/>
+      <w:lvlJc w:val="left"/>
+      <w:pPr>
+        <w:tabs>
+          <w:tab w:val="num" w:pos="5040"/>
+        </w:tabs>
+        <w:ind w:left="5040" w:hanging="360"/>
+      </w:pPr>
+      <w:rPr>
+        <w:rFonts w:ascii="Wingdings" w:hAnsi="Wingdings" w:hint="default"/>
+        <w:sz w:val="20"/>
+      </w:rPr>
+    </w:lvl>
+    <w:lvl w:ilvl="7" w:tentative="1">
+      <w:start w:val="1"/>
+      <w:numFmt w:val="bullet"/>
+      <w:lvlText w:val=""/>
+      <w:lvlJc w:val="left"/>
+      <w:pPr>
+        <w:tabs>
+          <w:tab w:val="num" w:pos="5760"/>
+        </w:tabs>
+        <w:ind w:left="5760" w:hanging="360"/>
+      </w:pPr>
+      <w:rPr>
+        <w:rFonts w:ascii="Wingdings" w:hAnsi="Wingdings" w:hint="default"/>
+        <w:sz w:val="20"/>
+      </w:rPr>
+    </w:lvl>
+    <w:lvl w:ilvl="8" w:tentative="1">
+      <w:start w:val="1"/>
+      <w:numFmt w:val="bullet"/>
+      <w:lvlText w:val=""/>
+      <w:lvlJc w:val="left"/>
+      <w:pPr>
+        <w:tabs>
+          <w:tab w:val="num" w:pos="6480"/>
+        </w:tabs>
+        <w:ind w:left="6480" w:hanging="360"/>
+      </w:pPr>
+      <w:rPr>
+        <w:rFonts w:ascii="Wingdings" w:hAnsi="Wingdings" w:hint="default"/>
+        <w:sz w:val="20"/>
+      </w:rPr>
+    </w:lvl>
+  </w:abstractNum>
+  <w:abstractNum w:abstractNumId="19" w15:restartNumberingAfterBreak="0">
     <w:nsid w:val="3C763A2D"/>
     <w:multiLevelType w:val="multilevel"/>
     <w:tmpl w:val="373A1C18"/>
@@ -15073,7 +17247,7 @@
       </w:rPr>
     </w:lvl>
   </w:abstractNum>
-  <w:abstractNum w:abstractNumId="17" w15:restartNumberingAfterBreak="0">
+  <w:abstractNum w:abstractNumId="20" w15:restartNumberingAfterBreak="0">
     <w:nsid w:val="3F991AB3"/>
     <w:multiLevelType w:val="multilevel"/>
     <w:tmpl w:val="D7C07BB0"/>
@@ -15222,7 +17396,7 @@
       </w:rPr>
     </w:lvl>
   </w:abstractNum>
-  <w:abstractNum w:abstractNumId="18" w15:restartNumberingAfterBreak="0">
+  <w:abstractNum w:abstractNumId="21" w15:restartNumberingAfterBreak="0">
     <w:nsid w:val="41FF10EF"/>
     <w:multiLevelType w:val="multilevel"/>
     <w:tmpl w:val="A5008A5C"/>
@@ -15371,7 +17545,7 @@
       </w:rPr>
     </w:lvl>
   </w:abstractNum>
-  <w:abstractNum w:abstractNumId="19" w15:restartNumberingAfterBreak="0">
+  <w:abstractNum w:abstractNumId="22" w15:restartNumberingAfterBreak="0">
     <w:nsid w:val="53B754AC"/>
     <w:multiLevelType w:val="multilevel"/>
     <w:tmpl w:val="0854C724"/>
@@ -15520,7 +17694,7 @@
       </w:rPr>
     </w:lvl>
   </w:abstractNum>
-  <w:abstractNum w:abstractNumId="20" w15:restartNumberingAfterBreak="0">
+  <w:abstractNum w:abstractNumId="23" w15:restartNumberingAfterBreak="0">
     <w:nsid w:val="55FC7277"/>
     <w:multiLevelType w:val="multilevel"/>
     <w:tmpl w:val="FCEED21E"/>
@@ -15633,7 +17807,7 @@
       </w:pPr>
     </w:lvl>
   </w:abstractNum>
-  <w:abstractNum w:abstractNumId="21" w15:restartNumberingAfterBreak="0">
+  <w:abstractNum w:abstractNumId="24" w15:restartNumberingAfterBreak="0">
     <w:nsid w:val="5A3741C6"/>
     <w:multiLevelType w:val="multilevel"/>
     <w:tmpl w:val="F5BA7EFE"/>
@@ -15782,7 +17956,7 @@
       </w:rPr>
     </w:lvl>
   </w:abstractNum>
-  <w:abstractNum w:abstractNumId="22" w15:restartNumberingAfterBreak="0">
+  <w:abstractNum w:abstractNumId="25" w15:restartNumberingAfterBreak="0">
     <w:nsid w:val="5C5023A8"/>
     <w:multiLevelType w:val="multilevel"/>
     <w:tmpl w:val="3E7EEADA"/>
@@ -15931,7 +18105,7 @@
       </w:rPr>
     </w:lvl>
   </w:abstractNum>
-  <w:abstractNum w:abstractNumId="23" w15:restartNumberingAfterBreak="0">
+  <w:abstractNum w:abstractNumId="26" w15:restartNumberingAfterBreak="0">
     <w:nsid w:val="5CC41962"/>
     <w:multiLevelType w:val="multilevel"/>
     <w:tmpl w:val="F98AD5E6"/>
@@ -16080,7 +18254,7 @@
       </w:rPr>
     </w:lvl>
   </w:abstractNum>
-  <w:abstractNum w:abstractNumId="24" w15:restartNumberingAfterBreak="0">
+  <w:abstractNum w:abstractNumId="27" w15:restartNumberingAfterBreak="0">
     <w:nsid w:val="64264E9A"/>
     <w:multiLevelType w:val="multilevel"/>
     <w:tmpl w:val="4196AC08"/>
@@ -16193,7 +18367,7 @@
       </w:pPr>
     </w:lvl>
   </w:abstractNum>
-  <w:abstractNum w:abstractNumId="25" w15:restartNumberingAfterBreak="0">
+  <w:abstractNum w:abstractNumId="28" w15:restartNumberingAfterBreak="0">
     <w:nsid w:val="69825E29"/>
     <w:multiLevelType w:val="multilevel"/>
     <w:tmpl w:val="09740A7C"/>
@@ -16342,7 +18516,156 @@
       </w:rPr>
     </w:lvl>
   </w:abstractNum>
-  <w:abstractNum w:abstractNumId="26" w15:restartNumberingAfterBreak="0">
+  <w:abstractNum w:abstractNumId="29" w15:restartNumberingAfterBreak="0">
+    <w:nsid w:val="6F777BBB"/>
+    <w:multiLevelType w:val="multilevel"/>
+    <w:tmpl w:val="FFB6B6C8"/>
+    <w:lvl w:ilvl="0">
+      <w:start w:val="1"/>
+      <w:numFmt w:val="bullet"/>
+      <w:lvlText w:val=""/>
+      <w:lvlJc w:val="left"/>
+      <w:pPr>
+        <w:tabs>
+          <w:tab w:val="num" w:pos="720"/>
+        </w:tabs>
+        <w:ind w:left="720" w:hanging="360"/>
+      </w:pPr>
+      <w:rPr>
+        <w:rFonts w:ascii="Symbol" w:hAnsi="Symbol" w:hint="default"/>
+        <w:sz w:val="20"/>
+      </w:rPr>
+    </w:lvl>
+    <w:lvl w:ilvl="1" w:tentative="1">
+      <w:start w:val="1"/>
+      <w:numFmt w:val="bullet"/>
+      <w:lvlText w:val="o"/>
+      <w:lvlJc w:val="left"/>
+      <w:pPr>
+        <w:tabs>
+          <w:tab w:val="num" w:pos="1440"/>
+        </w:tabs>
+        <w:ind w:left="1440" w:hanging="360"/>
+      </w:pPr>
+      <w:rPr>
+        <w:rFonts w:ascii="Courier New" w:hAnsi="Courier New" w:hint="default"/>
+        <w:sz w:val="20"/>
+      </w:rPr>
+    </w:lvl>
+    <w:lvl w:ilvl="2" w:tentative="1">
+      <w:start w:val="1"/>
+      <w:numFmt w:val="bullet"/>
+      <w:lvlText w:val=""/>
+      <w:lvlJc w:val="left"/>
+      <w:pPr>
+        <w:tabs>
+          <w:tab w:val="num" w:pos="2160"/>
+        </w:tabs>
+        <w:ind w:left="2160" w:hanging="360"/>
+      </w:pPr>
+      <w:rPr>
+        <w:rFonts w:ascii="Wingdings" w:hAnsi="Wingdings" w:hint="default"/>
+        <w:sz w:val="20"/>
+      </w:rPr>
+    </w:lvl>
+    <w:lvl w:ilvl="3" w:tentative="1">
+      <w:start w:val="1"/>
+      <w:numFmt w:val="bullet"/>
+      <w:lvlText w:val=""/>
+      <w:lvlJc w:val="left"/>
+      <w:pPr>
+        <w:tabs>
+          <w:tab w:val="num" w:pos="2880"/>
+        </w:tabs>
+        <w:ind w:left="2880" w:hanging="360"/>
+      </w:pPr>
+      <w:rPr>
+        <w:rFonts w:ascii="Wingdings" w:hAnsi="Wingdings" w:hint="default"/>
+        <w:sz w:val="20"/>
+      </w:rPr>
+    </w:lvl>
+    <w:lvl w:ilvl="4" w:tentative="1">
+      <w:start w:val="1"/>
+      <w:numFmt w:val="bullet"/>
+      <w:lvlText w:val=""/>
+      <w:lvlJc w:val="left"/>
+      <w:pPr>
+        <w:tabs>
+          <w:tab w:val="num" w:pos="3600"/>
+        </w:tabs>
+        <w:ind w:left="3600" w:hanging="360"/>
+      </w:pPr>
+      <w:rPr>
+        <w:rFonts w:ascii="Wingdings" w:hAnsi="Wingdings" w:hint="default"/>
+        <w:sz w:val="20"/>
+      </w:rPr>
+    </w:lvl>
+    <w:lvl w:ilvl="5" w:tentative="1">
+      <w:start w:val="1"/>
+      <w:numFmt w:val="bullet"/>
+      <w:lvlText w:val=""/>
+      <w:lvlJc w:val="left"/>
+      <w:pPr>
+        <w:tabs>
+          <w:tab w:val="num" w:pos="4320"/>
+        </w:tabs>
+        <w:ind w:left="4320" w:hanging="360"/>
+      </w:pPr>
+      <w:rPr>
+        <w:rFonts w:ascii="Wingdings" w:hAnsi="Wingdings" w:hint="default"/>
+        <w:sz w:val="20"/>
+      </w:rPr>
+    </w:lvl>
+    <w:lvl w:ilvl="6" w:tentative="1">
+      <w:start w:val="1"/>
+      <w:numFmt w:val="bullet"/>
+      <w:lvlText w:val=""/>
+      <w:lvlJc w:val="left"/>
+      <w:pPr>
+        <w:tabs>
+          <w:tab w:val="num" w:pos="5040"/>
+        </w:tabs>
+        <w:ind w:left="5040" w:hanging="360"/>
+      </w:pPr>
+      <w:rPr>
+        <w:rFonts w:ascii="Wingdings" w:hAnsi="Wingdings" w:hint="default"/>
+        <w:sz w:val="20"/>
+      </w:rPr>
+    </w:lvl>
+    <w:lvl w:ilvl="7" w:tentative="1">
+      <w:start w:val="1"/>
+      <w:numFmt w:val="bullet"/>
+      <w:lvlText w:val=""/>
+      <w:lvlJc w:val="left"/>
+      <w:pPr>
+        <w:tabs>
+          <w:tab w:val="num" w:pos="5760"/>
+        </w:tabs>
+        <w:ind w:left="5760" w:hanging="360"/>
+      </w:pPr>
+      <w:rPr>
+        <w:rFonts w:ascii="Wingdings" w:hAnsi="Wingdings" w:hint="default"/>
+        <w:sz w:val="20"/>
+      </w:rPr>
+    </w:lvl>
+    <w:lvl w:ilvl="8" w:tentative="1">
+      <w:start w:val="1"/>
+      <w:numFmt w:val="bullet"/>
+      <w:lvlText w:val=""/>
+      <w:lvlJc w:val="left"/>
+      <w:pPr>
+        <w:tabs>
+          <w:tab w:val="num" w:pos="6480"/>
+        </w:tabs>
+        <w:ind w:left="6480" w:hanging="360"/>
+      </w:pPr>
+      <w:rPr>
+        <w:rFonts w:ascii="Wingdings" w:hAnsi="Wingdings" w:hint="default"/>
+        <w:sz w:val="20"/>
+      </w:rPr>
+    </w:lvl>
+  </w:abstractNum>
+  <w:abstractNum w:abstractNumId="30" w15:restartNumberingAfterBreak="0">
     <w:nsid w:val="70732DB6"/>
     <w:multiLevelType w:val="multilevel"/>
     <w:tmpl w:val="A9C67EE8"/>
@@ -16455,7 +18778,7 @@
       </w:pPr>
     </w:lvl>
   </w:abstractNum>
-  <w:abstractNum w:abstractNumId="27" w15:restartNumberingAfterBreak="0">
+  <w:abstractNum w:abstractNumId="31" w15:restartNumberingAfterBreak="0">
     <w:nsid w:val="76DE0254"/>
     <w:multiLevelType w:val="multilevel"/>
     <w:tmpl w:val="24FE7538"/>
@@ -16604,7 +18927,7 @@
       </w:rPr>
     </w:lvl>
   </w:abstractNum>
-  <w:abstractNum w:abstractNumId="28" w15:restartNumberingAfterBreak="0">
+  <w:abstractNum w:abstractNumId="32" w15:restartNumberingAfterBreak="0">
     <w:nsid w:val="7C40730E"/>
     <w:multiLevelType w:val="multilevel"/>
     <w:tmpl w:val="4EC44F78"/>
@@ -16717,7 +19040,7 @@
       </w:pPr>
     </w:lvl>
   </w:abstractNum>
-  <w:abstractNum w:abstractNumId="29" w15:restartNumberingAfterBreak="0">
+  <w:abstractNum w:abstractNumId="33" w15:restartNumberingAfterBreak="0">
     <w:nsid w:val="7CCC01C9"/>
     <w:multiLevelType w:val="multilevel"/>
     <w:tmpl w:val="656C6610"/>
@@ -16830,80 +19153,229 @@
       </w:pPr>
     </w:lvl>
   </w:abstractNum>
+  <w:abstractNum w:abstractNumId="34" w15:restartNumberingAfterBreak="0">
+    <w:nsid w:val="7FBA476D"/>
+    <w:multiLevelType w:val="multilevel"/>
+    <w:tmpl w:val="E5BA9576"/>
+    <w:lvl w:ilvl="0">
+      <w:start w:val="1"/>
+      <w:numFmt w:val="bullet"/>
+      <w:lvlText w:val=""/>
+      <w:lvlJc w:val="left"/>
+      <w:pPr>
+        <w:tabs>
+          <w:tab w:val="num" w:pos="720"/>
+        </w:tabs>
+        <w:ind w:left="720" w:hanging="360"/>
+      </w:pPr>
+      <w:rPr>
+        <w:rFonts w:ascii="Symbol" w:hAnsi="Symbol" w:hint="default"/>
+        <w:sz w:val="20"/>
+      </w:rPr>
+    </w:lvl>
+    <w:lvl w:ilvl="1" w:tentative="1">
+      <w:start w:val="1"/>
+      <w:numFmt w:val="bullet"/>
+      <w:lvlText w:val="o"/>
+      <w:lvlJc w:val="left"/>
+      <w:pPr>
+        <w:tabs>
+          <w:tab w:val="num" w:pos="1440"/>
+        </w:tabs>
+        <w:ind w:left="1440" w:hanging="360"/>
+      </w:pPr>
+      <w:rPr>
+        <w:rFonts w:ascii="Courier New" w:hAnsi="Courier New" w:hint="default"/>
+        <w:sz w:val="20"/>
+      </w:rPr>
+    </w:lvl>
+    <w:lvl w:ilvl="2" w:tentative="1">
+      <w:start w:val="1"/>
+      <w:numFmt w:val="bullet"/>
+      <w:lvlText w:val=""/>
+      <w:lvlJc w:val="left"/>
+      <w:pPr>
+        <w:tabs>
+          <w:tab w:val="num" w:pos="2160"/>
+        </w:tabs>
+        <w:ind w:left="2160" w:hanging="360"/>
+      </w:pPr>
+      <w:rPr>
+        <w:rFonts w:ascii="Wingdings" w:hAnsi="Wingdings" w:hint="default"/>
+        <w:sz w:val="20"/>
+      </w:rPr>
+    </w:lvl>
+    <w:lvl w:ilvl="3" w:tentative="1">
+      <w:start w:val="1"/>
+      <w:numFmt w:val="bullet"/>
+      <w:lvlText w:val=""/>
+      <w:lvlJc w:val="left"/>
+      <w:pPr>
+        <w:tabs>
+          <w:tab w:val="num" w:pos="2880"/>
+        </w:tabs>
+        <w:ind w:left="2880" w:hanging="360"/>
+      </w:pPr>
+      <w:rPr>
+        <w:rFonts w:ascii="Wingdings" w:hAnsi="Wingdings" w:hint="default"/>
+        <w:sz w:val="20"/>
+      </w:rPr>
+    </w:lvl>
+    <w:lvl w:ilvl="4" w:tentative="1">
+      <w:start w:val="1"/>
+      <w:numFmt w:val="bullet"/>
+      <w:lvlText w:val=""/>
+      <w:lvlJc w:val="left"/>
+      <w:pPr>
+        <w:tabs>
+          <w:tab w:val="num" w:pos="3600"/>
+        </w:tabs>
+        <w:ind w:left="3600" w:hanging="360"/>
+      </w:pPr>
+      <w:rPr>
+        <w:rFonts w:ascii="Wingdings" w:hAnsi="Wingdings" w:hint="default"/>
+        <w:sz w:val="20"/>
+      </w:rPr>
+    </w:lvl>
+    <w:lvl w:ilvl="5" w:tentative="1">
+      <w:start w:val="1"/>
+      <w:numFmt w:val="bullet"/>
+      <w:lvlText w:val=""/>
+      <w:lvlJc w:val="left"/>
+      <w:pPr>
+        <w:tabs>
+          <w:tab w:val="num" w:pos="4320"/>
+        </w:tabs>
+        <w:ind w:left="4320" w:hanging="360"/>
+      </w:pPr>
+      <w:rPr>
+        <w:rFonts w:ascii="Wingdings" w:hAnsi="Wingdings" w:hint="default"/>
+        <w:sz w:val="20"/>
+      </w:rPr>
+    </w:lvl>
+    <w:lvl w:ilvl="6" w:tentative="1">
+      <w:start w:val="1"/>
+      <w:numFmt w:val="bullet"/>
+      <w:lvlText w:val=""/>
+      <w:lvlJc w:val="left"/>
+      <w:pPr>
+        <w:tabs>
+          <w:tab w:val="num" w:pos="5040"/>
+        </w:tabs>
+        <w:ind w:left="5040" w:hanging="360"/>
+      </w:pPr>
+      <w:rPr>
+        <w:rFonts w:ascii="Wingdings" w:hAnsi="Wingdings" w:hint="default"/>
+        <w:sz w:val="20"/>
+      </w:rPr>
+    </w:lvl>
+    <w:lvl w:ilvl="7" w:tentative="1">
+      <w:start w:val="1"/>
+      <w:numFmt w:val="bullet"/>
+      <w:lvlText w:val=""/>
+      <w:lvlJc w:val="left"/>
+      <w:pPr>
+        <w:tabs>
+          <w:tab w:val="num" w:pos="5760"/>
+        </w:tabs>
+        <w:ind w:left="5760" w:hanging="360"/>
+      </w:pPr>
+      <w:rPr>
+        <w:rFonts w:ascii="Wingdings" w:hAnsi="Wingdings" w:hint="default"/>
+        <w:sz w:val="20"/>
+      </w:rPr>
+    </w:lvl>
+    <w:lvl w:ilvl="8" w:tentative="1">
+      <w:start w:val="1"/>
+      <w:numFmt w:val="bullet"/>
+      <w:lvlText w:val=""/>
+      <w:lvlJc w:val="left"/>
+      <w:pPr>
+        <w:tabs>
+          <w:tab w:val="num" w:pos="6480"/>
+        </w:tabs>
+        <w:ind w:left="6480" w:hanging="360"/>
+      </w:pPr>
+      <w:rPr>
+        <w:rFonts w:ascii="Wingdings" w:hAnsi="Wingdings" w:hint="default"/>
+        <w:sz w:val="20"/>
+      </w:rPr>
+    </w:lvl>
+  </w:abstractNum>
   <w:num w:numId="1" w16cid:durableId="305085771">
-    <w:abstractNumId w:val="15"/>
+    <w:abstractNumId w:val="17"/>
   </w:num>
   <w:num w:numId="2" w16cid:durableId="581524277">
-    <w:abstractNumId w:val="10"/>
+    <w:abstractNumId w:val="12"/>
   </w:num>
   <w:num w:numId="3" w16cid:durableId="695161013">
-    <w:abstractNumId w:val="19"/>
+    <w:abstractNumId w:val="22"/>
   </w:num>
   <w:num w:numId="4" w16cid:durableId="1966420648">
-    <w:abstractNumId w:val="26"/>
+    <w:abstractNumId w:val="30"/>
   </w:num>
   <w:num w:numId="5" w16cid:durableId="372508527">
-    <w:abstractNumId w:val="24"/>
+    <w:abstractNumId w:val="27"/>
   </w:num>
   <w:num w:numId="6" w16cid:durableId="988827085">
-    <w:abstractNumId w:val="22"/>
+    <w:abstractNumId w:val="25"/>
   </w:num>
   <w:num w:numId="7" w16cid:durableId="260647793">
-    <w:abstractNumId w:val="28"/>
+    <w:abstractNumId w:val="32"/>
   </w:num>
   <w:num w:numId="8" w16cid:durableId="202527156">
     <w:abstractNumId w:val="2"/>
   </w:num>
   <w:num w:numId="9" w16cid:durableId="706218535">
-    <w:abstractNumId w:val="27"/>
+    <w:abstractNumId w:val="31"/>
   </w:num>
   <w:num w:numId="10" w16cid:durableId="734400429">
+    <w:abstractNumId w:val="10"/>
+  </w:num>
+  <w:num w:numId="11" w16cid:durableId="1295868554">
+    <w:abstractNumId w:val="11"/>
+  </w:num>
+  <w:num w:numId="12" w16cid:durableId="1047141599">
     <w:abstractNumId w:val="8"/>
   </w:num>
-  <w:num w:numId="11" w16cid:durableId="1295868554">
-    <w:abstractNumId w:val="9"/>
+  <w:num w:numId="13" w16cid:durableId="583732473">
+    <w:abstractNumId w:val="19"/>
   </w:num>
-  <w:num w:numId="12" w16cid:durableId="1047141599">
-    <w:abstractNumId w:val="6"/>
-  </w:num>
-  <w:num w:numId="13" w16cid:durableId="583732473">
+  <w:num w:numId="14" w16cid:durableId="1058015792">
     <w:abstractNumId w:val="16"/>
   </w:num>
-  <w:num w:numId="14" w16cid:durableId="1058015792">
-    <w:abstractNumId w:val="14"/>
+  <w:num w:numId="15" w16cid:durableId="2020310721">
+    <w:abstractNumId w:val="7"/>
   </w:num>
-  <w:num w:numId="15" w16cid:durableId="2020310721">
+  <w:num w:numId="16" w16cid:durableId="327368084">
     <w:abstractNumId w:val="5"/>
   </w:num>
-  <w:num w:numId="16" w16cid:durableId="327368084">
-    <w:abstractNumId w:val="4"/>
-  </w:num>
   <w:num w:numId="17" w16cid:durableId="34939295">
-    <w:abstractNumId w:val="29"/>
+    <w:abstractNumId w:val="33"/>
   </w:num>
   <w:num w:numId="18" w16cid:durableId="877009161">
     <w:abstractNumId w:val="0"/>
   </w:num>
   <w:num w:numId="19" w16cid:durableId="424228631">
-    <w:abstractNumId w:val="7"/>
+    <w:abstractNumId w:val="9"/>
   </w:num>
   <w:num w:numId="20" w16cid:durableId="1497957781">
-    <w:abstractNumId w:val="12"/>
+    <w:abstractNumId w:val="14"/>
   </w:num>
   <w:num w:numId="21" w16cid:durableId="833765505">
+    <w:abstractNumId w:val="23"/>
+  </w:num>
+  <w:num w:numId="22" w16cid:durableId="995450667">
+    <w:abstractNumId w:val="24"/>
+  </w:num>
+  <w:num w:numId="23" w16cid:durableId="920456383">
+    <w:abstractNumId w:val="26"/>
+  </w:num>
+  <w:num w:numId="24" w16cid:durableId="1360089471">
     <w:abstractNumId w:val="20"/>
   </w:num>
-  <w:num w:numId="22" w16cid:durableId="995450667">
-    <w:abstractNumId w:val="21"/>
-  </w:num>
-  <w:num w:numId="23" w16cid:durableId="920456383">
-    <w:abstractNumId w:val="23"/>
-  </w:num>
-  <w:num w:numId="24" w16cid:durableId="1360089471">
-    <w:abstractNumId w:val="17"/>
-  </w:num>
   <w:num w:numId="25" w16cid:durableId="729579019">
-    <w:abstractNumId w:val="13"/>
+    <w:abstractNumId w:val="15"/>
   </w:num>
   <w:num w:numId="26" w16cid:durableId="1931309371">
     <w:abstractNumId w:val="3"/>
@@ -16912,13 +19384,28 @@
     <w:abstractNumId w:val="1"/>
   </w:num>
   <w:num w:numId="28" w16cid:durableId="1272282229">
+    <w:abstractNumId w:val="21"/>
+  </w:num>
+  <w:num w:numId="29" w16cid:durableId="1479955780">
+    <w:abstractNumId w:val="28"/>
+  </w:num>
+  <w:num w:numId="30" w16cid:durableId="1095589399">
+    <w:abstractNumId w:val="13"/>
+  </w:num>
+  <w:num w:numId="31" w16cid:durableId="2007399855">
     <w:abstractNumId w:val="18"/>
   </w:num>
-  <w:num w:numId="29" w16cid:durableId="1479955780">
-    <w:abstractNumId w:val="25"/>
+  <w:num w:numId="32" w16cid:durableId="627054175">
+    <w:abstractNumId w:val="34"/>
   </w:num>
-  <w:num w:numId="30" w16cid:durableId="1095589399">
-    <w:abstractNumId w:val="11"/>
+  <w:num w:numId="33" w16cid:durableId="1371758995">
+    <w:abstractNumId w:val="29"/>
+  </w:num>
+  <w:num w:numId="34" w16cid:durableId="614141435">
+    <w:abstractNumId w:val="4"/>
+  </w:num>
+  <w:num w:numId="35" w16cid:durableId="417138005">
+    <w:abstractNumId w:val="6"/>
   </w:num>
 </w:numbering>
 </file>

</xml_diff>

<commit_message>
started datatypes summary and notes updated
</commit_message>
<xml_diff>
--- a/JAVASCRIPT NOTES.docx
+++ b/JAVASCRIPT NOTES.docx
@@ -14397,6 +14397,1798 @@
         </w:pict>
       </w:r>
     </w:p>
+    <w:p>
+      <w:pPr>
+        <w:rPr>
+          <w:b/>
+          <w:bCs/>
+          <w:sz w:val="36"/>
+          <w:szCs w:val="36"/>
+          <w:u w:val="single"/>
+        </w:rPr>
+      </w:pPr>
+      <w:r>
+        <w:rPr>
+          <w:b/>
+          <w:bCs/>
+          <w:sz w:val="36"/>
+          <w:szCs w:val="36"/>
+          <w:u w:val="single"/>
+        </w:rPr>
+        <w:t>JAVASCRIPT NOTES (</w:t>
+      </w:r>
+      <w:r>
+        <w:rPr>
+          <w:b/>
+          <w:bCs/>
+          <w:sz w:val="36"/>
+          <w:szCs w:val="36"/>
+          <w:u w:val="single"/>
+        </w:rPr>
+        <w:t>9</w:t>
+      </w:r>
+      <w:r>
+        <w:rPr>
+          <w:b/>
+          <w:bCs/>
+          <w:sz w:val="36"/>
+          <w:szCs w:val="36"/>
+          <w:u w:val="single"/>
+        </w:rPr>
+        <w:t>)</w:t>
+      </w:r>
+    </w:p>
+    <w:p>
+      <w:pPr>
+        <w:rPr>
+          <w:b/>
+          <w:bCs/>
+        </w:rPr>
+      </w:pPr>
+      <w:r>
+        <w:rPr>
+          <w:b/>
+          <w:bCs/>
+        </w:rPr>
+        <w:t>1. Datatypes ki Do Main Categories</w:t>
+      </w:r>
+    </w:p>
+    <w:p>
+      <w:r>
+        <w:t xml:space="preserve">JavaScript </w:t>
+      </w:r>
+      <w:proofErr w:type="spellStart"/>
+      <w:r>
+        <w:t>mein</w:t>
+      </w:r>
+      <w:proofErr w:type="spellEnd"/>
+      <w:r>
+        <w:t xml:space="preserve"> data </w:t>
+      </w:r>
+      <w:proofErr w:type="spellStart"/>
+      <w:r>
+        <w:t>kaise</w:t>
+      </w:r>
+      <w:proofErr w:type="spellEnd"/>
+      <w:r>
+        <w:t xml:space="preserve"> store </w:t>
+      </w:r>
+      <w:proofErr w:type="spellStart"/>
+      <w:r>
+        <w:t>hota</w:t>
+      </w:r>
+      <w:proofErr w:type="spellEnd"/>
+      <w:r>
+        <w:t xml:space="preserve"> </w:t>
+      </w:r>
+      <w:proofErr w:type="spellStart"/>
+      <w:r>
+        <w:t>hai</w:t>
+      </w:r>
+      <w:proofErr w:type="spellEnd"/>
+      <w:r>
+        <w:t xml:space="preserve"> aur </w:t>
+      </w:r>
+      <w:proofErr w:type="spellStart"/>
+      <w:r>
+        <w:t>kaise</w:t>
+      </w:r>
+      <w:proofErr w:type="spellEnd"/>
+      <w:r>
+        <w:t xml:space="preserve"> access </w:t>
+      </w:r>
+      <w:proofErr w:type="spellStart"/>
+      <w:r>
+        <w:t>hota</w:t>
+      </w:r>
+      <w:proofErr w:type="spellEnd"/>
+      <w:r>
+        <w:t xml:space="preserve"> </w:t>
+      </w:r>
+      <w:proofErr w:type="spellStart"/>
+      <w:r>
+        <w:t>hai</w:t>
+      </w:r>
+      <w:proofErr w:type="spellEnd"/>
+      <w:r>
+        <w:t xml:space="preserve">, us basis par do main types </w:t>
+      </w:r>
+      <w:proofErr w:type="spellStart"/>
+      <w:r>
+        <w:t>hote</w:t>
+      </w:r>
+      <w:proofErr w:type="spellEnd"/>
+      <w:r>
+        <w:t xml:space="preserve"> hain:</w:t>
+      </w:r>
+    </w:p>
+    <w:p>
+      <w:pPr>
+        <w:numPr>
+          <w:ilvl w:val="0"/>
+          <w:numId w:val="36"/>
+        </w:numPr>
+      </w:pPr>
+      <w:proofErr w:type="spellStart"/>
+      <w:r>
+        <w:rPr>
+          <w:b/>
+          <w:bCs/>
+        </w:rPr>
+        <w:t>Primitve</w:t>
+      </w:r>
+      <w:proofErr w:type="spellEnd"/>
+      <w:r>
+        <w:rPr>
+          <w:b/>
+          <w:bCs/>
+        </w:rPr>
+        <w:t xml:space="preserve"> (Call by Value):</w:t>
+      </w:r>
+      <w:r>
+        <w:t xml:space="preserve"> Jab </w:t>
+      </w:r>
+      <w:proofErr w:type="spellStart"/>
+      <w:r>
+        <w:t>aap</w:t>
+      </w:r>
+      <w:proofErr w:type="spellEnd"/>
+      <w:r>
+        <w:t xml:space="preserve"> </w:t>
+      </w:r>
+      <w:proofErr w:type="spellStart"/>
+      <w:r>
+        <w:t>inka</w:t>
+      </w:r>
+      <w:proofErr w:type="spellEnd"/>
+      <w:r>
+        <w:t xml:space="preserve"> use </w:t>
+      </w:r>
+      <w:proofErr w:type="spellStart"/>
+      <w:r>
+        <w:t>karte</w:t>
+      </w:r>
+      <w:proofErr w:type="spellEnd"/>
+      <w:r>
+        <w:t xml:space="preserve"> </w:t>
+      </w:r>
+      <w:proofErr w:type="spellStart"/>
+      <w:r>
+        <w:t>ho</w:t>
+      </w:r>
+      <w:proofErr w:type="spellEnd"/>
+      <w:r>
+        <w:t xml:space="preserve">, </w:t>
+      </w:r>
+      <w:proofErr w:type="spellStart"/>
+      <w:r>
+        <w:t>toh</w:t>
+      </w:r>
+      <w:proofErr w:type="spellEnd"/>
+      <w:r>
+        <w:t xml:space="preserve"> </w:t>
+      </w:r>
+      <w:proofErr w:type="spellStart"/>
+      <w:r>
+        <w:t>aapko</w:t>
+      </w:r>
+      <w:proofErr w:type="spellEnd"/>
+      <w:r>
+        <w:t xml:space="preserve"> original data </w:t>
+      </w:r>
+      <w:proofErr w:type="spellStart"/>
+      <w:r>
+        <w:t>nahi</w:t>
+      </w:r>
+      <w:proofErr w:type="spellEnd"/>
+      <w:r>
+        <w:t xml:space="preserve"> </w:t>
+      </w:r>
+      <w:proofErr w:type="spellStart"/>
+      <w:r>
+        <w:t>balki</w:t>
+      </w:r>
+      <w:proofErr w:type="spellEnd"/>
+      <w:r>
+        <w:t xml:space="preserve"> </w:t>
+      </w:r>
+      <w:proofErr w:type="spellStart"/>
+      <w:r>
+        <w:t>uski</w:t>
+      </w:r>
+      <w:proofErr w:type="spellEnd"/>
+      <w:r>
+        <w:t xml:space="preserve"> ek </w:t>
+      </w:r>
+      <w:r>
+        <w:rPr>
+          <w:b/>
+          <w:bCs/>
+        </w:rPr>
+        <w:t>copy</w:t>
+      </w:r>
+      <w:r>
+        <w:t xml:space="preserve"> </w:t>
+      </w:r>
+      <w:proofErr w:type="spellStart"/>
+      <w:r>
+        <w:t>milti</w:t>
+      </w:r>
+      <w:proofErr w:type="spellEnd"/>
+      <w:r>
+        <w:t xml:space="preserve"> </w:t>
+      </w:r>
+      <w:proofErr w:type="spellStart"/>
+      <w:r>
+        <w:t>hai</w:t>
+      </w:r>
+      <w:proofErr w:type="spellEnd"/>
+      <w:r>
+        <w:t xml:space="preserve">. Agar </w:t>
+      </w:r>
+      <w:proofErr w:type="spellStart"/>
+      <w:r>
+        <w:t>aap</w:t>
+      </w:r>
+      <w:proofErr w:type="spellEnd"/>
+      <w:r>
+        <w:t xml:space="preserve"> copy </w:t>
+      </w:r>
+      <w:proofErr w:type="spellStart"/>
+      <w:r>
+        <w:t>mein</w:t>
+      </w:r>
+      <w:proofErr w:type="spellEnd"/>
+      <w:r>
+        <w:t xml:space="preserve"> change </w:t>
+      </w:r>
+      <w:proofErr w:type="spellStart"/>
+      <w:r>
+        <w:t>karoge</w:t>
+      </w:r>
+      <w:proofErr w:type="spellEnd"/>
+      <w:r>
+        <w:t xml:space="preserve">, </w:t>
+      </w:r>
+      <w:proofErr w:type="spellStart"/>
+      <w:r>
+        <w:t>toh</w:t>
+      </w:r>
+      <w:proofErr w:type="spellEnd"/>
+      <w:r>
+        <w:t xml:space="preserve"> original change </w:t>
+      </w:r>
+      <w:proofErr w:type="spellStart"/>
+      <w:r>
+        <w:t>nahi</w:t>
+      </w:r>
+      <w:proofErr w:type="spellEnd"/>
+      <w:r>
+        <w:t xml:space="preserve"> </w:t>
+      </w:r>
+      <w:proofErr w:type="spellStart"/>
+      <w:r>
+        <w:t>hoga</w:t>
+      </w:r>
+      <w:proofErr w:type="spellEnd"/>
+      <w:r>
+        <w:t>.</w:t>
+      </w:r>
+    </w:p>
+    <w:p>
+      <w:pPr>
+        <w:numPr>
+          <w:ilvl w:val="1"/>
+          <w:numId w:val="36"/>
+        </w:numPr>
+      </w:pPr>
+      <w:r>
+        <w:rPr>
+          <w:b/>
+          <w:bCs/>
+        </w:rPr>
+        <w:t xml:space="preserve">7 Types </w:t>
+      </w:r>
+      <w:proofErr w:type="spellStart"/>
+      <w:r>
+        <w:rPr>
+          <w:b/>
+          <w:bCs/>
+        </w:rPr>
+        <w:t>hote</w:t>
+      </w:r>
+      <w:proofErr w:type="spellEnd"/>
+      <w:r>
+        <w:rPr>
+          <w:b/>
+          <w:bCs/>
+        </w:rPr>
+        <w:t xml:space="preserve"> hain:</w:t>
+      </w:r>
+      <w:r>
+        <w:t xml:space="preserve"> String, Number, Boolean, null (empty), undefined (variable declared par value </w:t>
+      </w:r>
+      <w:proofErr w:type="spellStart"/>
+      <w:r>
+        <w:t>nahi</w:t>
+      </w:r>
+      <w:proofErr w:type="spellEnd"/>
+      <w:r>
+        <w:t xml:space="preserve">), Symbol (unique </w:t>
+      </w:r>
+      <w:proofErr w:type="spellStart"/>
+      <w:r>
+        <w:t>banane</w:t>
+      </w:r>
+      <w:proofErr w:type="spellEnd"/>
+      <w:r>
+        <w:t xml:space="preserve"> </w:t>
+      </w:r>
+      <w:proofErr w:type="spellStart"/>
+      <w:r>
+        <w:t>ke</w:t>
+      </w:r>
+      <w:proofErr w:type="spellEnd"/>
+      <w:r>
+        <w:t xml:space="preserve"> </w:t>
+      </w:r>
+      <w:proofErr w:type="spellStart"/>
+      <w:r>
+        <w:t>liye</w:t>
+      </w:r>
+      <w:proofErr w:type="spellEnd"/>
+      <w:r>
+        <w:t xml:space="preserve">), aur </w:t>
+      </w:r>
+      <w:proofErr w:type="spellStart"/>
+      <w:r>
+        <w:t>BigInt</w:t>
+      </w:r>
+      <w:proofErr w:type="spellEnd"/>
+      <w:r>
+        <w:t xml:space="preserve"> (bahut bade numbers </w:t>
+      </w:r>
+      <w:proofErr w:type="spellStart"/>
+      <w:r>
+        <w:t>ke</w:t>
+      </w:r>
+      <w:proofErr w:type="spellEnd"/>
+      <w:r>
+        <w:t xml:space="preserve"> </w:t>
+      </w:r>
+      <w:proofErr w:type="spellStart"/>
+      <w:r>
+        <w:t>liye</w:t>
+      </w:r>
+      <w:proofErr w:type="spellEnd"/>
+      <w:r>
+        <w:t>).</w:t>
+      </w:r>
+    </w:p>
+    <w:p>
+      <w:pPr>
+        <w:numPr>
+          <w:ilvl w:val="0"/>
+          <w:numId w:val="36"/>
+        </w:numPr>
+      </w:pPr>
+      <w:r>
+        <w:rPr>
+          <w:b/>
+          <w:bCs/>
+        </w:rPr>
+        <w:t>Non-Primitive / Reference (Call by Reference):</w:t>
+      </w:r>
+      <w:r>
+        <w:t xml:space="preserve"> Inka memory address (reference) </w:t>
+      </w:r>
+      <w:proofErr w:type="spellStart"/>
+      <w:r>
+        <w:t>aapko</w:t>
+      </w:r>
+      <w:proofErr w:type="spellEnd"/>
+      <w:r>
+        <w:t xml:space="preserve"> directly </w:t>
+      </w:r>
+      <w:proofErr w:type="spellStart"/>
+      <w:r>
+        <w:t>milta</w:t>
+      </w:r>
+      <w:proofErr w:type="spellEnd"/>
+      <w:r>
+        <w:t xml:space="preserve"> </w:t>
+      </w:r>
+      <w:proofErr w:type="spellStart"/>
+      <w:r>
+        <w:t>hai</w:t>
+      </w:r>
+      <w:proofErr w:type="spellEnd"/>
+      <w:r>
+        <w:t>.</w:t>
+      </w:r>
+    </w:p>
+    <w:p>
+      <w:pPr>
+        <w:numPr>
+          <w:ilvl w:val="1"/>
+          <w:numId w:val="36"/>
+        </w:numPr>
+      </w:pPr>
+      <w:r>
+        <w:rPr>
+          <w:b/>
+          <w:bCs/>
+        </w:rPr>
+        <w:t>Main Types:</w:t>
+      </w:r>
+      <w:r>
+        <w:t xml:space="preserve"> Array, Objects, aur Functions.</w:t>
+      </w:r>
+    </w:p>
+    <w:p>
+      <w:r>
+        <w:pict w14:anchorId="07E4BAE5">
+          <v:rect id="_x0000_i1146" style="width:0;height:1.5pt" o:hralign="center" o:hrstd="t" o:hr="t" fillcolor="#a0a0a0" stroked="f"/>
+        </w:pict>
+      </w:r>
+    </w:p>
+    <w:p>
+      <w:pPr>
+        <w:rPr>
+          <w:b/>
+          <w:bCs/>
+        </w:rPr>
+      </w:pPr>
+    </w:p>
+    <w:p>
+      <w:pPr>
+        <w:rPr>
+          <w:b/>
+          <w:bCs/>
+        </w:rPr>
+      </w:pPr>
+    </w:p>
+    <w:p>
+      <w:pPr>
+        <w:rPr>
+          <w:b/>
+          <w:bCs/>
+        </w:rPr>
+      </w:pPr>
+      <w:r>
+        <w:rPr>
+          <w:b/>
+          <w:bCs/>
+        </w:rPr>
+        <w:lastRenderedPageBreak/>
+        <w:t>2. JavaScript: Dynamic vs Static?</w:t>
+      </w:r>
+    </w:p>
+    <w:p>
+      <w:r>
+        <w:t xml:space="preserve">Hitesh sir ne ek bahut </w:t>
+      </w:r>
+      <w:proofErr w:type="spellStart"/>
+      <w:r>
+        <w:t>badhiya</w:t>
+      </w:r>
+      <w:proofErr w:type="spellEnd"/>
+      <w:r>
+        <w:t xml:space="preserve"> point </w:t>
+      </w:r>
+      <w:proofErr w:type="spellStart"/>
+      <w:r>
+        <w:t>uthaya</w:t>
+      </w:r>
+      <w:proofErr w:type="spellEnd"/>
+      <w:r>
+        <w:t xml:space="preserve"> ki JS ek </w:t>
+      </w:r>
+      <w:r>
+        <w:rPr>
+          <w:b/>
+          <w:bCs/>
+        </w:rPr>
+        <w:t>Dynamically Typed</w:t>
+      </w:r>
+      <w:r>
+        <w:t xml:space="preserve"> language </w:t>
+      </w:r>
+      <w:proofErr w:type="spellStart"/>
+      <w:r>
+        <w:t>hai</w:t>
+      </w:r>
+      <w:proofErr w:type="spellEnd"/>
+      <w:r>
+        <w:t xml:space="preserve">. Kyun? </w:t>
+      </w:r>
+      <w:proofErr w:type="spellStart"/>
+      <w:r>
+        <w:t>Kyunki</w:t>
+      </w:r>
+      <w:proofErr w:type="spellEnd"/>
+      <w:r>
+        <w:t xml:space="preserve"> </w:t>
+      </w:r>
+      <w:proofErr w:type="spellStart"/>
+      <w:r>
+        <w:t>humein</w:t>
+      </w:r>
+      <w:proofErr w:type="spellEnd"/>
+      <w:r>
+        <w:t xml:space="preserve"> variable ka type </w:t>
+      </w:r>
+      <w:proofErr w:type="spellStart"/>
+      <w:r>
+        <w:t>pehle</w:t>
+      </w:r>
+      <w:proofErr w:type="spellEnd"/>
+      <w:r>
+        <w:t xml:space="preserve"> se </w:t>
+      </w:r>
+      <w:proofErr w:type="spellStart"/>
+      <w:r>
+        <w:t>batane</w:t>
+      </w:r>
+      <w:proofErr w:type="spellEnd"/>
+      <w:r>
+        <w:t xml:space="preserve"> ki </w:t>
+      </w:r>
+      <w:proofErr w:type="spellStart"/>
+      <w:r>
+        <w:t>zaroorat</w:t>
+      </w:r>
+      <w:proofErr w:type="spellEnd"/>
+      <w:r>
+        <w:t xml:space="preserve"> </w:t>
+      </w:r>
+      <w:proofErr w:type="spellStart"/>
+      <w:r>
+        <w:t>nahi</w:t>
+      </w:r>
+      <w:proofErr w:type="spellEnd"/>
+      <w:r>
+        <w:t xml:space="preserve"> </w:t>
+      </w:r>
+      <w:proofErr w:type="spellStart"/>
+      <w:r>
+        <w:t>hoti</w:t>
+      </w:r>
+      <w:proofErr w:type="spellEnd"/>
+      <w:r>
+        <w:t xml:space="preserve"> (</w:t>
+      </w:r>
+      <w:proofErr w:type="spellStart"/>
+      <w:r>
+        <w:t>jaise</w:t>
+      </w:r>
+      <w:proofErr w:type="spellEnd"/>
+      <w:r>
+        <w:t xml:space="preserve"> let score = 100). JS runtime par </w:t>
+      </w:r>
+      <w:proofErr w:type="gramStart"/>
+      <w:r>
+        <w:t>decide</w:t>
+      </w:r>
+      <w:proofErr w:type="gramEnd"/>
+      <w:r>
+        <w:t xml:space="preserve"> </w:t>
+      </w:r>
+      <w:proofErr w:type="spellStart"/>
+      <w:r>
+        <w:t>karta</w:t>
+      </w:r>
+      <w:proofErr w:type="spellEnd"/>
+      <w:r>
+        <w:t xml:space="preserve"> </w:t>
+      </w:r>
+      <w:proofErr w:type="spellStart"/>
+      <w:r>
+        <w:t>hai</w:t>
+      </w:r>
+      <w:proofErr w:type="spellEnd"/>
+      <w:r>
+        <w:t xml:space="preserve"> ki wo </w:t>
+      </w:r>
+      <w:proofErr w:type="spellStart"/>
+      <w:r>
+        <w:t>kya</w:t>
+      </w:r>
+      <w:proofErr w:type="spellEnd"/>
+      <w:r>
+        <w:t xml:space="preserve"> </w:t>
+      </w:r>
+      <w:proofErr w:type="spellStart"/>
+      <w:r>
+        <w:t>hai</w:t>
+      </w:r>
+      <w:proofErr w:type="spellEnd"/>
+      <w:r>
+        <w:t xml:space="preserve">. TypeScript </w:t>
+      </w:r>
+      <w:proofErr w:type="spellStart"/>
+      <w:r>
+        <w:t>iska</w:t>
+      </w:r>
+      <w:proofErr w:type="spellEnd"/>
+      <w:r>
+        <w:t xml:space="preserve"> </w:t>
+      </w:r>
+      <w:proofErr w:type="spellStart"/>
+      <w:r>
+        <w:t>ulta</w:t>
+      </w:r>
+      <w:proofErr w:type="spellEnd"/>
+      <w:r>
+        <w:t xml:space="preserve"> </w:t>
+      </w:r>
+      <w:proofErr w:type="spellStart"/>
+      <w:r>
+        <w:t>hai</w:t>
+      </w:r>
+      <w:proofErr w:type="spellEnd"/>
+      <w:r>
+        <w:t xml:space="preserve"> (Statically typed).</w:t>
+      </w:r>
+    </w:p>
+    <w:p>
+      <w:pPr>
+        <w:rPr>
+          <w:b/>
+          <w:bCs/>
+        </w:rPr>
+      </w:pPr>
+      <w:r>
+        <w:rPr>
+          <w:b/>
+          <w:bCs/>
+        </w:rPr>
+        <w:t xml:space="preserve">3. Special Types: Symbol aur </w:t>
+      </w:r>
+      <w:proofErr w:type="spellStart"/>
+      <w:r>
+        <w:rPr>
+          <w:b/>
+          <w:bCs/>
+        </w:rPr>
+        <w:t>BigInt</w:t>
+      </w:r>
+      <w:proofErr w:type="spellEnd"/>
+    </w:p>
+    <w:p>
+      <w:pPr>
+        <w:numPr>
+          <w:ilvl w:val="0"/>
+          <w:numId w:val="37"/>
+        </w:numPr>
+      </w:pPr>
+      <w:r>
+        <w:rPr>
+          <w:b/>
+          <w:bCs/>
+        </w:rPr>
+        <w:t>Symbol:</w:t>
+      </w:r>
+      <w:r>
+        <w:t xml:space="preserve"> Iska use </w:t>
+      </w:r>
+      <w:proofErr w:type="spellStart"/>
+      <w:r>
+        <w:t>kisi</w:t>
+      </w:r>
+      <w:proofErr w:type="spellEnd"/>
+      <w:r>
+        <w:t xml:space="preserve"> value ko "Unique" </w:t>
+      </w:r>
+      <w:proofErr w:type="spellStart"/>
+      <w:r>
+        <w:t>banane</w:t>
+      </w:r>
+      <w:proofErr w:type="spellEnd"/>
+      <w:r>
+        <w:t xml:space="preserve"> </w:t>
+      </w:r>
+      <w:proofErr w:type="spellStart"/>
+      <w:r>
+        <w:t>ke</w:t>
+      </w:r>
+      <w:proofErr w:type="spellEnd"/>
+      <w:r>
+        <w:t xml:space="preserve"> </w:t>
+      </w:r>
+      <w:proofErr w:type="spellStart"/>
+      <w:r>
+        <w:t>liye</w:t>
+      </w:r>
+      <w:proofErr w:type="spellEnd"/>
+      <w:r>
+        <w:t xml:space="preserve"> </w:t>
+      </w:r>
+      <w:proofErr w:type="spellStart"/>
+      <w:r>
+        <w:t>hota</w:t>
+      </w:r>
+      <w:proofErr w:type="spellEnd"/>
+      <w:r>
+        <w:t xml:space="preserve"> </w:t>
+      </w:r>
+      <w:proofErr w:type="spellStart"/>
+      <w:r>
+        <w:t>hai</w:t>
+      </w:r>
+      <w:proofErr w:type="spellEnd"/>
+      <w:r>
+        <w:t xml:space="preserve">. Agar </w:t>
+      </w:r>
+      <w:proofErr w:type="spellStart"/>
+      <w:r>
+        <w:t>aap</w:t>
+      </w:r>
+      <w:proofErr w:type="spellEnd"/>
+      <w:r>
+        <w:t xml:space="preserve"> do symbols </w:t>
+      </w:r>
+      <w:proofErr w:type="spellStart"/>
+      <w:r>
+        <w:t>mein</w:t>
+      </w:r>
+      <w:proofErr w:type="spellEnd"/>
+      <w:r>
+        <w:t xml:space="preserve"> same value </w:t>
+      </w:r>
+      <w:proofErr w:type="spellStart"/>
+      <w:r>
+        <w:t>bhi</w:t>
+      </w:r>
+      <w:proofErr w:type="spellEnd"/>
+      <w:r>
+        <w:t xml:space="preserve"> </w:t>
+      </w:r>
+      <w:proofErr w:type="spellStart"/>
+      <w:r>
+        <w:t>daaloge</w:t>
+      </w:r>
+      <w:proofErr w:type="spellEnd"/>
+      <w:r>
+        <w:t xml:space="preserve">, </w:t>
+      </w:r>
+      <w:proofErr w:type="spellStart"/>
+      <w:r>
+        <w:t>toh</w:t>
+      </w:r>
+      <w:proofErr w:type="spellEnd"/>
+      <w:r>
+        <w:t xml:space="preserve"> </w:t>
+      </w:r>
+      <w:proofErr w:type="spellStart"/>
+      <w:r>
+        <w:t>bhi</w:t>
+      </w:r>
+      <w:proofErr w:type="spellEnd"/>
+      <w:r>
+        <w:t xml:space="preserve"> wo </w:t>
+      </w:r>
+      <w:proofErr w:type="spellStart"/>
+      <w:r>
+        <w:t>barabar</w:t>
+      </w:r>
+      <w:proofErr w:type="spellEnd"/>
+      <w:r>
+        <w:t xml:space="preserve"> </w:t>
+      </w:r>
+      <w:proofErr w:type="spellStart"/>
+      <w:r>
+        <w:t>nahi</w:t>
+      </w:r>
+      <w:proofErr w:type="spellEnd"/>
+      <w:r>
+        <w:t xml:space="preserve"> </w:t>
+      </w:r>
+      <w:proofErr w:type="spellStart"/>
+      <w:r>
+        <w:t>honge</w:t>
+      </w:r>
+      <w:proofErr w:type="spellEnd"/>
+      <w:r>
+        <w:t>.</w:t>
+      </w:r>
+    </w:p>
+    <w:p>
+      <w:pPr>
+        <w:numPr>
+          <w:ilvl w:val="0"/>
+          <w:numId w:val="37"/>
+        </w:numPr>
+      </w:pPr>
+      <w:proofErr w:type="spellStart"/>
+      <w:r>
+        <w:rPr>
+          <w:b/>
+          <w:bCs/>
+        </w:rPr>
+        <w:t>BigInt</w:t>
+      </w:r>
+      <w:proofErr w:type="spellEnd"/>
+      <w:r>
+        <w:rPr>
+          <w:b/>
+          <w:bCs/>
+        </w:rPr>
+        <w:t>:</w:t>
+      </w:r>
+      <w:r>
+        <w:t xml:space="preserve"> Jab number bahut </w:t>
+      </w:r>
+      <w:proofErr w:type="spellStart"/>
+      <w:r>
+        <w:t>bada</w:t>
+      </w:r>
+      <w:proofErr w:type="spellEnd"/>
+      <w:r>
+        <w:t xml:space="preserve"> </w:t>
+      </w:r>
+      <w:proofErr w:type="spellStart"/>
+      <w:r>
+        <w:t>ho</w:t>
+      </w:r>
+      <w:proofErr w:type="spellEnd"/>
+      <w:r>
+        <w:t xml:space="preserve"> </w:t>
+      </w:r>
+      <w:proofErr w:type="spellStart"/>
+      <w:r>
+        <w:t>jaye</w:t>
+      </w:r>
+      <w:proofErr w:type="spellEnd"/>
+      <w:r>
+        <w:t xml:space="preserve"> (scientific values), </w:t>
+      </w:r>
+      <w:proofErr w:type="spellStart"/>
+      <w:r>
+        <w:t>toh</w:t>
+      </w:r>
+      <w:proofErr w:type="spellEnd"/>
+      <w:r>
+        <w:t xml:space="preserve"> number </w:t>
+      </w:r>
+      <w:proofErr w:type="spellStart"/>
+      <w:r>
+        <w:t>ke</w:t>
+      </w:r>
+      <w:proofErr w:type="spellEnd"/>
+      <w:r>
+        <w:t xml:space="preserve"> </w:t>
+      </w:r>
+      <w:proofErr w:type="spellStart"/>
+      <w:r>
+        <w:t>piche</w:t>
+      </w:r>
+      <w:proofErr w:type="spellEnd"/>
+      <w:r>
+        <w:t xml:space="preserve"> n </w:t>
+      </w:r>
+      <w:proofErr w:type="spellStart"/>
+      <w:r>
+        <w:t>laga</w:t>
+      </w:r>
+      <w:proofErr w:type="spellEnd"/>
+      <w:r>
+        <w:t xml:space="preserve"> </w:t>
+      </w:r>
+      <w:proofErr w:type="spellStart"/>
+      <w:r>
+        <w:t>kar</w:t>
+      </w:r>
+      <w:proofErr w:type="spellEnd"/>
+      <w:r>
+        <w:t xml:space="preserve"> </w:t>
+      </w:r>
+      <w:proofErr w:type="spellStart"/>
+      <w:r>
+        <w:t>usey</w:t>
+      </w:r>
+      <w:proofErr w:type="spellEnd"/>
+      <w:r>
+        <w:t xml:space="preserve"> </w:t>
+      </w:r>
+      <w:proofErr w:type="spellStart"/>
+      <w:r>
+        <w:t>BigInt</w:t>
+      </w:r>
+      <w:proofErr w:type="spellEnd"/>
+      <w:r>
+        <w:t xml:space="preserve"> </w:t>
+      </w:r>
+      <w:proofErr w:type="spellStart"/>
+      <w:r>
+        <w:t>banate</w:t>
+      </w:r>
+      <w:proofErr w:type="spellEnd"/>
+      <w:r>
+        <w:t xml:space="preserve"> hain (e.g., 12345n).</w:t>
+      </w:r>
+    </w:p>
+    <w:p>
+      <w:r>
+        <w:pict w14:anchorId="6CE2A799">
+          <v:rect id="_x0000_i1159" style="width:0;height:1.5pt" o:hralign="center" o:hrstd="t" o:hr="t" fillcolor="#a0a0a0" stroked="f"/>
+        </w:pict>
+      </w:r>
+    </w:p>
+    <w:p>
+      <w:pPr>
+        <w:rPr>
+          <w:b/>
+          <w:bCs/>
+        </w:rPr>
+      </w:pPr>
+      <w:r>
+        <w:rPr>
+          <w:b/>
+          <w:bCs/>
+        </w:rPr>
+        <w:t>4. Non-Primitive Examples</w:t>
+      </w:r>
+    </w:p>
+    <w:p>
+      <w:pPr>
+        <w:numPr>
+          <w:ilvl w:val="0"/>
+          <w:numId w:val="38"/>
+        </w:numPr>
+      </w:pPr>
+      <w:r>
+        <w:rPr>
+          <w:b/>
+          <w:bCs/>
+        </w:rPr>
+        <w:t>Arrays:</w:t>
+      </w:r>
+      <w:r>
+        <w:t xml:space="preserve"> ["</w:t>
+      </w:r>
+      <w:proofErr w:type="spellStart"/>
+      <w:r>
+        <w:t>shaktiman</w:t>
+      </w:r>
+      <w:proofErr w:type="spellEnd"/>
+      <w:r>
+        <w:t>", "</w:t>
+      </w:r>
+      <w:proofErr w:type="spellStart"/>
+      <w:r>
+        <w:t>naagraj</w:t>
+      </w:r>
+      <w:proofErr w:type="spellEnd"/>
+      <w:r>
+        <w:t>", "</w:t>
+      </w:r>
+      <w:proofErr w:type="spellStart"/>
+      <w:r>
+        <w:t>doga</w:t>
+      </w:r>
+      <w:proofErr w:type="spellEnd"/>
+      <w:r>
+        <w:t xml:space="preserve">"] (Square brackets </w:t>
+      </w:r>
+      <w:proofErr w:type="spellStart"/>
+      <w:r>
+        <w:t>mein</w:t>
+      </w:r>
+      <w:proofErr w:type="spellEnd"/>
+      <w:r>
+        <w:t>).</w:t>
+      </w:r>
+    </w:p>
+    <w:p>
+      <w:pPr>
+        <w:numPr>
+          <w:ilvl w:val="0"/>
+          <w:numId w:val="38"/>
+        </w:numPr>
+      </w:pPr>
+      <w:r>
+        <w:rPr>
+          <w:b/>
+          <w:bCs/>
+        </w:rPr>
+        <w:t>Objects:</w:t>
+      </w:r>
+      <w:r>
+        <w:t xml:space="preserve"> </w:t>
+      </w:r>
+      <w:proofErr w:type="gramStart"/>
+      <w:r>
+        <w:t>{ name</w:t>
+      </w:r>
+      <w:proofErr w:type="gramEnd"/>
+      <w:r>
+        <w:t>: "</w:t>
+      </w:r>
+      <w:proofErr w:type="spellStart"/>
+      <w:r>
+        <w:t>hitesh</w:t>
+      </w:r>
+      <w:proofErr w:type="spellEnd"/>
+      <w:r>
+        <w:t xml:space="preserve">", age: </w:t>
+      </w:r>
+      <w:proofErr w:type="gramStart"/>
+      <w:r>
+        <w:t>22 }</w:t>
+      </w:r>
+      <w:proofErr w:type="gramEnd"/>
+      <w:r>
+        <w:t xml:space="preserve"> (Curly braces </w:t>
+      </w:r>
+      <w:proofErr w:type="spellStart"/>
+      <w:r>
+        <w:t>mein</w:t>
+      </w:r>
+      <w:proofErr w:type="spellEnd"/>
+      <w:r>
+        <w:t xml:space="preserve"> key-value pairs).</w:t>
+      </w:r>
+    </w:p>
+    <w:p>
+      <w:pPr>
+        <w:numPr>
+          <w:ilvl w:val="0"/>
+          <w:numId w:val="38"/>
+        </w:numPr>
+      </w:pPr>
+      <w:r>
+        <w:rPr>
+          <w:b/>
+          <w:bCs/>
+        </w:rPr>
+        <w:t>Functions:</w:t>
+      </w:r>
+      <w:r>
+        <w:t xml:space="preserve"> </w:t>
+      </w:r>
+      <w:proofErr w:type="spellStart"/>
+      <w:r>
+        <w:t>Inhe</w:t>
+      </w:r>
+      <w:proofErr w:type="spellEnd"/>
+      <w:r>
+        <w:t xml:space="preserve"> variable </w:t>
+      </w:r>
+      <w:proofErr w:type="spellStart"/>
+      <w:r>
+        <w:t>mein</w:t>
+      </w:r>
+      <w:proofErr w:type="spellEnd"/>
+      <w:r>
+        <w:t xml:space="preserve"> </w:t>
+      </w:r>
+      <w:proofErr w:type="spellStart"/>
+      <w:r>
+        <w:t>bhi</w:t>
+      </w:r>
+      <w:proofErr w:type="spellEnd"/>
+      <w:r>
+        <w:t xml:space="preserve"> store </w:t>
+      </w:r>
+      <w:proofErr w:type="spellStart"/>
+      <w:r>
+        <w:t>kiya</w:t>
+      </w:r>
+      <w:proofErr w:type="spellEnd"/>
+      <w:r>
+        <w:t xml:space="preserve"> </w:t>
+      </w:r>
+      <w:proofErr w:type="spellStart"/>
+      <w:r>
+        <w:t>ja</w:t>
+      </w:r>
+      <w:proofErr w:type="spellEnd"/>
+      <w:r>
+        <w:t xml:space="preserve"> </w:t>
+      </w:r>
+      <w:proofErr w:type="spellStart"/>
+      <w:r>
+        <w:t>sakta</w:t>
+      </w:r>
+      <w:proofErr w:type="spellEnd"/>
+      <w:r>
+        <w:t xml:space="preserve"> </w:t>
+      </w:r>
+      <w:proofErr w:type="spellStart"/>
+      <w:r>
+        <w:t>hai</w:t>
+      </w:r>
+      <w:proofErr w:type="spellEnd"/>
+      <w:r>
+        <w:t xml:space="preserve"> (Function as a variable).</w:t>
+      </w:r>
+    </w:p>
+    <w:p>
+      <w:pPr>
+        <w:rPr>
+          <w:b/>
+          <w:bCs/>
+        </w:rPr>
+      </w:pPr>
+      <w:r>
+        <w:pict w14:anchorId="132C5164">
+          <v:rect id="_x0000_i1164" style="width:0;height:1.5pt" o:hralign="center" o:hrstd="t" o:hr="t" fillcolor="#a0a0a0" stroked="f"/>
+        </w:pict>
+      </w:r>
+      <w:r>
+        <w:rPr>
+          <w:b/>
+          <w:bCs/>
+        </w:rPr>
+        <w:t xml:space="preserve">5. </w:t>
+      </w:r>
+      <w:proofErr w:type="spellStart"/>
+      <w:r>
+        <w:rPr>
+          <w:b/>
+          <w:bCs/>
+        </w:rPr>
+        <w:t>typeof</w:t>
+      </w:r>
+      <w:proofErr w:type="spellEnd"/>
+      <w:r>
+        <w:rPr>
+          <w:b/>
+          <w:bCs/>
+        </w:rPr>
+        <w:t xml:space="preserve"> Operator (Interview Gold!)</w:t>
+      </w:r>
+    </w:p>
+    <w:p>
+      <w:r>
+        <w:t xml:space="preserve">Interview </w:t>
+      </w:r>
+      <w:proofErr w:type="spellStart"/>
+      <w:r>
+        <w:t>mein</w:t>
+      </w:r>
+      <w:proofErr w:type="spellEnd"/>
+      <w:r>
+        <w:t xml:space="preserve"> ye results </w:t>
+      </w:r>
+      <w:proofErr w:type="spellStart"/>
+      <w:r>
+        <w:t>aksar</w:t>
+      </w:r>
+      <w:proofErr w:type="spellEnd"/>
+      <w:r>
+        <w:t xml:space="preserve"> </w:t>
+      </w:r>
+      <w:proofErr w:type="spellStart"/>
+      <w:r>
+        <w:t>puche</w:t>
+      </w:r>
+      <w:proofErr w:type="spellEnd"/>
+      <w:r>
+        <w:t xml:space="preserve"> </w:t>
+      </w:r>
+      <w:proofErr w:type="spellStart"/>
+      <w:r>
+        <w:t>jate</w:t>
+      </w:r>
+      <w:proofErr w:type="spellEnd"/>
+      <w:r>
+        <w:t xml:space="preserve"> hain:</w:t>
+      </w:r>
+    </w:p>
+    <w:p>
+      <w:pPr>
+        <w:numPr>
+          <w:ilvl w:val="0"/>
+          <w:numId w:val="39"/>
+        </w:numPr>
+      </w:pPr>
+      <w:proofErr w:type="spellStart"/>
+      <w:r>
+        <w:t>typeof</w:t>
+      </w:r>
+      <w:proofErr w:type="spellEnd"/>
+      <w:r>
+        <w:t xml:space="preserve"> null </w:t>
+      </w:r>
+      <w:r>
+        <w:t>=&gt;</w:t>
+      </w:r>
+      <w:r>
+        <w:rPr>
+          <w:b/>
+          <w:bCs/>
+        </w:rPr>
+        <w:t>"object"</w:t>
+      </w:r>
+      <w:r>
+        <w:t xml:space="preserve"> (Ye JS ki ek </w:t>
+      </w:r>
+      <w:proofErr w:type="spellStart"/>
+      <w:r>
+        <w:t>purani</w:t>
+      </w:r>
+      <w:proofErr w:type="spellEnd"/>
+      <w:r>
+        <w:t xml:space="preserve"> "bug" </w:t>
+      </w:r>
+      <w:proofErr w:type="spellStart"/>
+      <w:r>
+        <w:t>ya</w:t>
+      </w:r>
+      <w:proofErr w:type="spellEnd"/>
+      <w:r>
+        <w:t xml:space="preserve"> feature </w:t>
+      </w:r>
+      <w:proofErr w:type="spellStart"/>
+      <w:r>
+        <w:t>hai</w:t>
+      </w:r>
+      <w:proofErr w:type="spellEnd"/>
+      <w:r>
+        <w:t>).</w:t>
+      </w:r>
+    </w:p>
+    <w:p>
+      <w:pPr>
+        <w:numPr>
+          <w:ilvl w:val="0"/>
+          <w:numId w:val="39"/>
+        </w:numPr>
+      </w:pPr>
+      <w:proofErr w:type="spellStart"/>
+      <w:r>
+        <w:t>typeof</w:t>
+      </w:r>
+      <w:proofErr w:type="spellEnd"/>
+      <w:r>
+        <w:t xml:space="preserve"> undefined </w:t>
+      </w:r>
+      <w:r>
+        <w:t>=&gt;</w:t>
+      </w:r>
+      <w:r>
+        <w:rPr>
+          <w:b/>
+          <w:bCs/>
+        </w:rPr>
+        <w:t>"undefined"</w:t>
+      </w:r>
+      <w:r>
+        <w:t>.</w:t>
+      </w:r>
+    </w:p>
+    <w:p>
+      <w:pPr>
+        <w:numPr>
+          <w:ilvl w:val="0"/>
+          <w:numId w:val="39"/>
+        </w:numPr>
+      </w:pPr>
+      <w:proofErr w:type="spellStart"/>
+      <w:r>
+        <w:t>typeof</w:t>
+      </w:r>
+      <w:proofErr w:type="spellEnd"/>
+      <w:r>
+        <w:t xml:space="preserve"> function </w:t>
+      </w:r>
+      <w:r>
+        <w:t>=&gt;</w:t>
+      </w:r>
+      <w:r>
+        <w:rPr>
+          <w:b/>
+          <w:bCs/>
+        </w:rPr>
+        <w:t>"function"</w:t>
+      </w:r>
+      <w:r>
+        <w:t xml:space="preserve"> (Par </w:t>
+      </w:r>
+      <w:proofErr w:type="spellStart"/>
+      <w:r>
+        <w:t>isey</w:t>
+      </w:r>
+      <w:proofErr w:type="spellEnd"/>
+      <w:r>
+        <w:t xml:space="preserve"> "Object Function" </w:t>
+      </w:r>
+      <w:proofErr w:type="spellStart"/>
+      <w:r>
+        <w:t>bhi</w:t>
+      </w:r>
+      <w:proofErr w:type="spellEnd"/>
+      <w:r>
+        <w:t xml:space="preserve"> </w:t>
+      </w:r>
+      <w:proofErr w:type="spellStart"/>
+      <w:r>
+        <w:t>kehte</w:t>
+      </w:r>
+      <w:proofErr w:type="spellEnd"/>
+      <w:r>
+        <w:t xml:space="preserve"> hain).</w:t>
+      </w:r>
+    </w:p>
+    <w:p>
+      <w:pPr>
+        <w:numPr>
+          <w:ilvl w:val="0"/>
+          <w:numId w:val="39"/>
+        </w:numPr>
+      </w:pPr>
+      <w:r>
+        <w:t xml:space="preserve">Saare non-primitive types ka return type </w:t>
+      </w:r>
+      <w:proofErr w:type="gramStart"/>
+      <w:r>
+        <w:t xml:space="preserve">actually </w:t>
+      </w:r>
+      <w:r>
+        <w:rPr>
+          <w:b/>
+          <w:bCs/>
+        </w:rPr>
+        <w:t>"object"</w:t>
+      </w:r>
+      <w:proofErr w:type="gramEnd"/>
+      <w:r>
+        <w:t xml:space="preserve"> hi </w:t>
+      </w:r>
+      <w:proofErr w:type="spellStart"/>
+      <w:r>
+        <w:t>aata</w:t>
+      </w:r>
+      <w:proofErr w:type="spellEnd"/>
+      <w:r>
+        <w:t xml:space="preserve"> </w:t>
+      </w:r>
+      <w:proofErr w:type="spellStart"/>
+      <w:r>
+        <w:t>hai</w:t>
+      </w:r>
+      <w:proofErr w:type="spellEnd"/>
+      <w:r>
+        <w:t>.</w:t>
+      </w:r>
+    </w:p>
+    <w:p>
+      <w:r>
+        <w:pict w14:anchorId="4E449291">
+          <v:rect id="_x0000_i1155" style="width:0;height:1.5pt" o:hralign="center" o:hrstd="t" o:hr="t" fillcolor="#a0a0a0" stroked="f"/>
+        </w:pict>
+      </w:r>
+    </w:p>
+    <w:p>
+      <w:pPr>
+        <w:rPr>
+          <w:b/>
+          <w:bCs/>
+        </w:rPr>
+      </w:pPr>
+      <w:r>
+        <w:rPr>
+          <w:b/>
+          <w:bCs/>
+        </w:rPr>
+        <w:t>Key Summary Table:</w:t>
+      </w:r>
+    </w:p>
+    <w:tbl>
+      <w:tblPr>
+        <w:tblW w:w="0" w:type="auto"/>
+        <w:tblCellSpacing w:w="15" w:type="dxa"/>
+        <w:tblCellMar>
+          <w:top w:w="15" w:type="dxa"/>
+          <w:left w:w="15" w:type="dxa"/>
+          <w:bottom w:w="15" w:type="dxa"/>
+          <w:right w:w="15" w:type="dxa"/>
+        </w:tblCellMar>
+        <w:tblLook w:val="04A0" w:firstRow="1" w:lastRow="0" w:firstColumn="1" w:lastColumn="0" w:noHBand="0" w:noVBand="1"/>
+      </w:tblPr>
+      <w:tblGrid>
+        <w:gridCol w:w="1128"/>
+        <w:gridCol w:w="2203"/>
+      </w:tblGrid>
+      <w:tr>
+        <w:trPr>
+          <w:tblHeader/>
+          <w:tblCellSpacing w:w="15" w:type="dxa"/>
+        </w:trPr>
+        <w:tc>
+          <w:tcPr>
+            <w:tcW w:w="0" w:type="auto"/>
+            <w:tcBorders>
+              <w:top w:val="single" w:sz="6" w:space="0" w:color="auto"/>
+              <w:left w:val="single" w:sz="6" w:space="0" w:color="auto"/>
+              <w:bottom w:val="single" w:sz="6" w:space="0" w:color="auto"/>
+              <w:right w:val="single" w:sz="6" w:space="0" w:color="auto"/>
+            </w:tcBorders>
+            <w:vAlign w:val="center"/>
+            <w:hideMark/>
+          </w:tcPr>
+          <w:p>
+            <w:r>
+              <w:rPr>
+                <w:b/>
+                <w:bCs/>
+              </w:rPr>
+              <w:t>Type</w:t>
+            </w:r>
+          </w:p>
+        </w:tc>
+        <w:tc>
+          <w:tcPr>
+            <w:tcW w:w="0" w:type="auto"/>
+            <w:tcBorders>
+              <w:top w:val="single" w:sz="6" w:space="0" w:color="auto"/>
+              <w:left w:val="single" w:sz="6" w:space="0" w:color="auto"/>
+              <w:bottom w:val="single" w:sz="6" w:space="0" w:color="auto"/>
+              <w:right w:val="single" w:sz="6" w:space="0" w:color="auto"/>
+            </w:tcBorders>
+            <w:vAlign w:val="center"/>
+            <w:hideMark/>
+          </w:tcPr>
+          <w:p>
+            <w:r>
+              <w:rPr>
+                <w:b/>
+                <w:bCs/>
+              </w:rPr>
+              <w:t>Return Type (</w:t>
+            </w:r>
+            <w:proofErr w:type="spellStart"/>
+            <w:r>
+              <w:rPr>
+                <w:b/>
+                <w:bCs/>
+              </w:rPr>
+              <w:t>typeof</w:t>
+            </w:r>
+            <w:proofErr w:type="spellEnd"/>
+            <w:r>
+              <w:rPr>
+                <w:b/>
+                <w:bCs/>
+              </w:rPr>
+              <w:t>)</w:t>
+            </w:r>
+          </w:p>
+        </w:tc>
+      </w:tr>
+      <w:tr>
+        <w:trPr>
+          <w:tblCellSpacing w:w="15" w:type="dxa"/>
+        </w:trPr>
+        <w:tc>
+          <w:tcPr>
+            <w:tcW w:w="0" w:type="auto"/>
+            <w:tcBorders>
+              <w:top w:val="single" w:sz="6" w:space="0" w:color="auto"/>
+              <w:left w:val="single" w:sz="6" w:space="0" w:color="auto"/>
+              <w:bottom w:val="single" w:sz="6" w:space="0" w:color="auto"/>
+              <w:right w:val="single" w:sz="6" w:space="0" w:color="auto"/>
+            </w:tcBorders>
+            <w:vAlign w:val="center"/>
+            <w:hideMark/>
+          </w:tcPr>
+          <w:p>
+            <w:r>
+              <w:t>Undefined</w:t>
+            </w:r>
+          </w:p>
+        </w:tc>
+        <w:tc>
+          <w:tcPr>
+            <w:tcW w:w="0" w:type="auto"/>
+            <w:tcBorders>
+              <w:top w:val="single" w:sz="6" w:space="0" w:color="auto"/>
+              <w:left w:val="single" w:sz="6" w:space="0" w:color="auto"/>
+              <w:bottom w:val="single" w:sz="6" w:space="0" w:color="auto"/>
+              <w:right w:val="single" w:sz="6" w:space="0" w:color="auto"/>
+            </w:tcBorders>
+            <w:vAlign w:val="center"/>
+            <w:hideMark/>
+          </w:tcPr>
+          <w:p>
+            <w:r>
+              <w:t>"undefined"</w:t>
+            </w:r>
+          </w:p>
+        </w:tc>
+      </w:tr>
+      <w:tr>
+        <w:trPr>
+          <w:tblCellSpacing w:w="15" w:type="dxa"/>
+        </w:trPr>
+        <w:tc>
+          <w:tcPr>
+            <w:tcW w:w="0" w:type="auto"/>
+            <w:tcBorders>
+              <w:top w:val="single" w:sz="6" w:space="0" w:color="auto"/>
+              <w:left w:val="single" w:sz="6" w:space="0" w:color="auto"/>
+              <w:bottom w:val="single" w:sz="6" w:space="0" w:color="auto"/>
+              <w:right w:val="single" w:sz="6" w:space="0" w:color="auto"/>
+            </w:tcBorders>
+            <w:vAlign w:val="center"/>
+            <w:hideMark/>
+          </w:tcPr>
+          <w:p>
+            <w:r>
+              <w:t>Null</w:t>
+            </w:r>
+          </w:p>
+        </w:tc>
+        <w:tc>
+          <w:tcPr>
+            <w:tcW w:w="0" w:type="auto"/>
+            <w:tcBorders>
+              <w:top w:val="single" w:sz="6" w:space="0" w:color="auto"/>
+              <w:left w:val="single" w:sz="6" w:space="0" w:color="auto"/>
+              <w:bottom w:val="single" w:sz="6" w:space="0" w:color="auto"/>
+              <w:right w:val="single" w:sz="6" w:space="0" w:color="auto"/>
+            </w:tcBorders>
+            <w:vAlign w:val="center"/>
+            <w:hideMark/>
+          </w:tcPr>
+          <w:p>
+            <w:r>
+              <w:rPr>
+                <w:b/>
+                <w:bCs/>
+              </w:rPr>
+              <w:t>"object"</w:t>
+            </w:r>
+            <w:r>
+              <w:t xml:space="preserve"> (Important!)</w:t>
+            </w:r>
+          </w:p>
+        </w:tc>
+      </w:tr>
+      <w:tr>
+        <w:trPr>
+          <w:tblCellSpacing w:w="15" w:type="dxa"/>
+        </w:trPr>
+        <w:tc>
+          <w:tcPr>
+            <w:tcW w:w="0" w:type="auto"/>
+            <w:tcBorders>
+              <w:top w:val="single" w:sz="6" w:space="0" w:color="auto"/>
+              <w:left w:val="single" w:sz="6" w:space="0" w:color="auto"/>
+              <w:bottom w:val="single" w:sz="6" w:space="0" w:color="auto"/>
+              <w:right w:val="single" w:sz="6" w:space="0" w:color="auto"/>
+            </w:tcBorders>
+            <w:vAlign w:val="center"/>
+            <w:hideMark/>
+          </w:tcPr>
+          <w:p>
+            <w:r>
+              <w:t>Boolean</w:t>
+            </w:r>
+          </w:p>
+        </w:tc>
+        <w:tc>
+          <w:tcPr>
+            <w:tcW w:w="0" w:type="auto"/>
+            <w:tcBorders>
+              <w:top w:val="single" w:sz="6" w:space="0" w:color="auto"/>
+              <w:left w:val="single" w:sz="6" w:space="0" w:color="auto"/>
+              <w:bottom w:val="single" w:sz="6" w:space="0" w:color="auto"/>
+              <w:right w:val="single" w:sz="6" w:space="0" w:color="auto"/>
+            </w:tcBorders>
+            <w:vAlign w:val="center"/>
+            <w:hideMark/>
+          </w:tcPr>
+          <w:p>
+            <w:r>
+              <w:t>"</w:t>
+            </w:r>
+            <w:proofErr w:type="spellStart"/>
+            <w:r>
+              <w:t>boolean</w:t>
+            </w:r>
+            <w:proofErr w:type="spellEnd"/>
+            <w:r>
+              <w:t>"</w:t>
+            </w:r>
+          </w:p>
+        </w:tc>
+      </w:tr>
+      <w:tr>
+        <w:trPr>
+          <w:tblCellSpacing w:w="15" w:type="dxa"/>
+        </w:trPr>
+        <w:tc>
+          <w:tcPr>
+            <w:tcW w:w="0" w:type="auto"/>
+            <w:tcBorders>
+              <w:top w:val="single" w:sz="6" w:space="0" w:color="auto"/>
+              <w:left w:val="single" w:sz="6" w:space="0" w:color="auto"/>
+              <w:bottom w:val="single" w:sz="6" w:space="0" w:color="auto"/>
+              <w:right w:val="single" w:sz="6" w:space="0" w:color="auto"/>
+            </w:tcBorders>
+            <w:vAlign w:val="center"/>
+            <w:hideMark/>
+          </w:tcPr>
+          <w:p>
+            <w:r>
+              <w:t>Number</w:t>
+            </w:r>
+          </w:p>
+        </w:tc>
+        <w:tc>
+          <w:tcPr>
+            <w:tcW w:w="0" w:type="auto"/>
+            <w:tcBorders>
+              <w:top w:val="single" w:sz="6" w:space="0" w:color="auto"/>
+              <w:left w:val="single" w:sz="6" w:space="0" w:color="auto"/>
+              <w:bottom w:val="single" w:sz="6" w:space="0" w:color="auto"/>
+              <w:right w:val="single" w:sz="6" w:space="0" w:color="auto"/>
+            </w:tcBorders>
+            <w:vAlign w:val="center"/>
+            <w:hideMark/>
+          </w:tcPr>
+          <w:p>
+            <w:r>
+              <w:t>"number"</w:t>
+            </w:r>
+          </w:p>
+        </w:tc>
+      </w:tr>
+      <w:tr>
+        <w:trPr>
+          <w:tblCellSpacing w:w="15" w:type="dxa"/>
+        </w:trPr>
+        <w:tc>
+          <w:tcPr>
+            <w:tcW w:w="0" w:type="auto"/>
+            <w:tcBorders>
+              <w:top w:val="single" w:sz="6" w:space="0" w:color="auto"/>
+              <w:left w:val="single" w:sz="6" w:space="0" w:color="auto"/>
+              <w:bottom w:val="single" w:sz="6" w:space="0" w:color="auto"/>
+              <w:right w:val="single" w:sz="6" w:space="0" w:color="auto"/>
+            </w:tcBorders>
+            <w:vAlign w:val="center"/>
+            <w:hideMark/>
+          </w:tcPr>
+          <w:p>
+            <w:r>
+              <w:lastRenderedPageBreak/>
+              <w:t>String</w:t>
+            </w:r>
+          </w:p>
+        </w:tc>
+        <w:tc>
+          <w:tcPr>
+            <w:tcW w:w="0" w:type="auto"/>
+            <w:tcBorders>
+              <w:top w:val="single" w:sz="6" w:space="0" w:color="auto"/>
+              <w:left w:val="single" w:sz="6" w:space="0" w:color="auto"/>
+              <w:bottom w:val="single" w:sz="6" w:space="0" w:color="auto"/>
+              <w:right w:val="single" w:sz="6" w:space="0" w:color="auto"/>
+            </w:tcBorders>
+            <w:vAlign w:val="center"/>
+            <w:hideMark/>
+          </w:tcPr>
+          <w:p>
+            <w:r>
+              <w:t>"string"</w:t>
+            </w:r>
+          </w:p>
+        </w:tc>
+      </w:tr>
+      <w:tr>
+        <w:trPr>
+          <w:tblCellSpacing w:w="15" w:type="dxa"/>
+        </w:trPr>
+        <w:tc>
+          <w:tcPr>
+            <w:tcW w:w="0" w:type="auto"/>
+            <w:tcBorders>
+              <w:top w:val="single" w:sz="6" w:space="0" w:color="auto"/>
+              <w:left w:val="single" w:sz="6" w:space="0" w:color="auto"/>
+              <w:bottom w:val="single" w:sz="6" w:space="0" w:color="auto"/>
+              <w:right w:val="single" w:sz="6" w:space="0" w:color="auto"/>
+            </w:tcBorders>
+            <w:vAlign w:val="center"/>
+            <w:hideMark/>
+          </w:tcPr>
+          <w:p>
+            <w:r>
+              <w:t>Object</w:t>
+            </w:r>
+          </w:p>
+        </w:tc>
+        <w:tc>
+          <w:tcPr>
+            <w:tcW w:w="0" w:type="auto"/>
+            <w:tcBorders>
+              <w:top w:val="single" w:sz="6" w:space="0" w:color="auto"/>
+              <w:left w:val="single" w:sz="6" w:space="0" w:color="auto"/>
+              <w:bottom w:val="single" w:sz="6" w:space="0" w:color="auto"/>
+              <w:right w:val="single" w:sz="6" w:space="0" w:color="auto"/>
+            </w:tcBorders>
+            <w:vAlign w:val="center"/>
+            <w:hideMark/>
+          </w:tcPr>
+          <w:p>
+            <w:r>
+              <w:t>"object"</w:t>
+            </w:r>
+          </w:p>
+        </w:tc>
+      </w:tr>
+      <w:tr>
+        <w:trPr>
+          <w:tblCellSpacing w:w="15" w:type="dxa"/>
+        </w:trPr>
+        <w:tc>
+          <w:tcPr>
+            <w:tcW w:w="0" w:type="auto"/>
+            <w:tcBorders>
+              <w:top w:val="single" w:sz="6" w:space="0" w:color="auto"/>
+              <w:left w:val="single" w:sz="6" w:space="0" w:color="auto"/>
+              <w:bottom w:val="single" w:sz="6" w:space="0" w:color="auto"/>
+              <w:right w:val="single" w:sz="6" w:space="0" w:color="auto"/>
+            </w:tcBorders>
+            <w:vAlign w:val="center"/>
+            <w:hideMark/>
+          </w:tcPr>
+          <w:p>
+            <w:r>
+              <w:t>Function</w:t>
+            </w:r>
+          </w:p>
+        </w:tc>
+        <w:tc>
+          <w:tcPr>
+            <w:tcW w:w="0" w:type="auto"/>
+            <w:tcBorders>
+              <w:top w:val="single" w:sz="6" w:space="0" w:color="auto"/>
+              <w:left w:val="single" w:sz="6" w:space="0" w:color="auto"/>
+              <w:bottom w:val="single" w:sz="6" w:space="0" w:color="auto"/>
+              <w:right w:val="single" w:sz="6" w:space="0" w:color="auto"/>
+            </w:tcBorders>
+            <w:vAlign w:val="center"/>
+            <w:hideMark/>
+          </w:tcPr>
+          <w:p>
+            <w:r>
+              <w:t>"function"</w:t>
+            </w:r>
+          </w:p>
+        </w:tc>
+      </w:tr>
+    </w:tbl>
+    <w:p>
+      <w:r>
+        <w:pict w14:anchorId="32110DDF">
+          <v:rect id="_x0000_i1165" style="width:0;height:1.5pt" o:hralign="center" o:hrstd="t" o:hr="t" fillcolor="#a0a0a0" stroked="f"/>
+        </w:pict>
+      </w:r>
+    </w:p>
     <w:p/>
     <w:sectPr>
       <w:pgSz w:w="11906" w:h="16838"/>
@@ -14412,7 +16204,7 @@
 <w:numbering xmlns:wpc="http://schemas.microsoft.com/office/word/2010/wordprocessingCanvas" xmlns:cx="http://schemas.microsoft.com/office/drawing/2014/chartex" xmlns:cx1="http://schemas.microsoft.com/office/drawing/2015/9/8/chartex" xmlns:cx2="http://schemas.microsoft.com/office/drawing/2015/10/21/chartex" xmlns:cx3="http://schemas.microsoft.com/office/drawing/2016/5/9/chartex" xmlns:cx4="http://schemas.microsoft.com/office/drawing/2016/5/10/chartex" xmlns:cx5="http://schemas.microsoft.com/office/drawing/2016/5/11/chartex" xmlns:cx6="http://schemas.microsoft.com/office/drawing/2016/5/12/chartex" xmlns:cx7="http://schemas.microsoft.com/office/drawing/2016/5/13/chartex" xmlns:cx8="http://schemas.microsoft.com/office/drawing/2016/5/14/chartex" xmlns:mc="http://schemas.openxmlformats.org/markup-compatibility/2006" xmlns:aink="http://schemas.microsoft.com/office/drawing/2016/ink" xmlns:am3d="http://schemas.microsoft.com/office/drawing/2017/model3d" xmlns:o="urn:schemas-microsoft-com:office:office" xmlns:oel="http://schemas.microsoft.com/office/2019/extlst" xmlns:r="http://schemas.openxmlformats.org/officeDocument/2006/relationships" xmlns:m="http://schemas.openxmlformats.org/officeDocument/2006/math" xmlns:v="urn:schemas-microsoft-com:vml" xmlns:wp14="http://schemas.microsoft.com/office/word/2010/wordprocessingDrawing" xmlns:wp="http://schemas.openxmlformats.org/drawingml/2006/wordprocessingDrawing" xmlns:w10="urn:schemas-microsoft-com:office:word" xmlns:w="http://schemas.openxmlformats.org/wordprocessingml/2006/main" xmlns:w14="http://schemas.microsoft.com/office/word/2010/wordml" xmlns:w15="http://schemas.microsoft.com/office/word/2012/wordml" xmlns:w16cex="http://schemas.microsoft.com/office/word/2018/wordml/cex" xmlns:w16cid="http://schemas.microsoft.com/office/word/2016/wordml/cid" xmlns:w16="http://schemas.microsoft.com/office/word/2018/wordml" xmlns:w16du="http://schemas.microsoft.com/office/word/2023/wordml/word16du" xmlns:w16sdtdh="http://schemas.microsoft.com/office/word/2020/wordml/sdtdatahash" xmlns:w16sdtfl="http://schemas.microsoft.com/office/word/2024/wordml/sdtformatlock" xmlns:w16se="http://schemas.microsoft.com/office/word/2015/wordml/symex" xmlns:wpg="http://schemas.microsoft.com/office/word/2010/wordprocessingGroup" xmlns:wpi="http://schemas.microsoft.com/office/word/2010/wordprocessingInk" xmlns:wne="http://schemas.microsoft.com/office/word/2006/wordml" xmlns:wps="http://schemas.microsoft.com/office/word/2010/wordprocessingShape" mc:Ignorable="w14 w15 w16se w16cid w16 w16cex w16sdtdh w16sdtfl w16du wp14">
   <w:numPicBullet w:numPicBulletId="0">
     <w:pict>
-      <v:rect id="_x0000_i1064" style="width:0;height:1.5pt" o:hralign="center" o:bullet="t" o:hrstd="t" o:hr="t" fillcolor="#a0a0a0" stroked="f"/>
+      <v:rect id="_x0000_i1070" style="width:0;height:1.5pt" o:hralign="center" o:bullet="t" o:hrstd="t" o:hr="t" fillcolor="#a0a0a0" stroked="f"/>
     </w:pict>
   </w:numPicBullet>
   <w:abstractNum w:abstractNumId="0" w15:restartNumberingAfterBreak="0">
@@ -14976,6 +16768,155 @@
     </w:lvl>
   </w:abstractNum>
   <w:abstractNum w:abstractNumId="4" w15:restartNumberingAfterBreak="0">
+    <w:nsid w:val="0CB8336F"/>
+    <w:multiLevelType w:val="multilevel"/>
+    <w:tmpl w:val="D2BABCD6"/>
+    <w:lvl w:ilvl="0">
+      <w:start w:val="1"/>
+      <w:numFmt w:val="bullet"/>
+      <w:lvlText w:val=""/>
+      <w:lvlJc w:val="left"/>
+      <w:pPr>
+        <w:tabs>
+          <w:tab w:val="num" w:pos="720"/>
+        </w:tabs>
+        <w:ind w:left="720" w:hanging="360"/>
+      </w:pPr>
+      <w:rPr>
+        <w:rFonts w:ascii="Symbol" w:hAnsi="Symbol" w:hint="default"/>
+        <w:sz w:val="20"/>
+      </w:rPr>
+    </w:lvl>
+    <w:lvl w:ilvl="1" w:tentative="1">
+      <w:start w:val="1"/>
+      <w:numFmt w:val="bullet"/>
+      <w:lvlText w:val="o"/>
+      <w:lvlJc w:val="left"/>
+      <w:pPr>
+        <w:tabs>
+          <w:tab w:val="num" w:pos="1440"/>
+        </w:tabs>
+        <w:ind w:left="1440" w:hanging="360"/>
+      </w:pPr>
+      <w:rPr>
+        <w:rFonts w:ascii="Courier New" w:hAnsi="Courier New" w:hint="default"/>
+        <w:sz w:val="20"/>
+      </w:rPr>
+    </w:lvl>
+    <w:lvl w:ilvl="2" w:tentative="1">
+      <w:start w:val="1"/>
+      <w:numFmt w:val="bullet"/>
+      <w:lvlText w:val=""/>
+      <w:lvlJc w:val="left"/>
+      <w:pPr>
+        <w:tabs>
+          <w:tab w:val="num" w:pos="2160"/>
+        </w:tabs>
+        <w:ind w:left="2160" w:hanging="360"/>
+      </w:pPr>
+      <w:rPr>
+        <w:rFonts w:ascii="Wingdings" w:hAnsi="Wingdings" w:hint="default"/>
+        <w:sz w:val="20"/>
+      </w:rPr>
+    </w:lvl>
+    <w:lvl w:ilvl="3" w:tentative="1">
+      <w:start w:val="1"/>
+      <w:numFmt w:val="bullet"/>
+      <w:lvlText w:val=""/>
+      <w:lvlJc w:val="left"/>
+      <w:pPr>
+        <w:tabs>
+          <w:tab w:val="num" w:pos="2880"/>
+        </w:tabs>
+        <w:ind w:left="2880" w:hanging="360"/>
+      </w:pPr>
+      <w:rPr>
+        <w:rFonts w:ascii="Wingdings" w:hAnsi="Wingdings" w:hint="default"/>
+        <w:sz w:val="20"/>
+      </w:rPr>
+    </w:lvl>
+    <w:lvl w:ilvl="4" w:tentative="1">
+      <w:start w:val="1"/>
+      <w:numFmt w:val="bullet"/>
+      <w:lvlText w:val=""/>
+      <w:lvlJc w:val="left"/>
+      <w:pPr>
+        <w:tabs>
+          <w:tab w:val="num" w:pos="3600"/>
+        </w:tabs>
+        <w:ind w:left="3600" w:hanging="360"/>
+      </w:pPr>
+      <w:rPr>
+        <w:rFonts w:ascii="Wingdings" w:hAnsi="Wingdings" w:hint="default"/>
+        <w:sz w:val="20"/>
+      </w:rPr>
+    </w:lvl>
+    <w:lvl w:ilvl="5" w:tentative="1">
+      <w:start w:val="1"/>
+      <w:numFmt w:val="bullet"/>
+      <w:lvlText w:val=""/>
+      <w:lvlJc w:val="left"/>
+      <w:pPr>
+        <w:tabs>
+          <w:tab w:val="num" w:pos="4320"/>
+        </w:tabs>
+        <w:ind w:left="4320" w:hanging="360"/>
+      </w:pPr>
+      <w:rPr>
+        <w:rFonts w:ascii="Wingdings" w:hAnsi="Wingdings" w:hint="default"/>
+        <w:sz w:val="20"/>
+      </w:rPr>
+    </w:lvl>
+    <w:lvl w:ilvl="6" w:tentative="1">
+      <w:start w:val="1"/>
+      <w:numFmt w:val="bullet"/>
+      <w:lvlText w:val=""/>
+      <w:lvlJc w:val="left"/>
+      <w:pPr>
+        <w:tabs>
+          <w:tab w:val="num" w:pos="5040"/>
+        </w:tabs>
+        <w:ind w:left="5040" w:hanging="360"/>
+      </w:pPr>
+      <w:rPr>
+        <w:rFonts w:ascii="Wingdings" w:hAnsi="Wingdings" w:hint="default"/>
+        <w:sz w:val="20"/>
+      </w:rPr>
+    </w:lvl>
+    <w:lvl w:ilvl="7" w:tentative="1">
+      <w:start w:val="1"/>
+      <w:numFmt w:val="bullet"/>
+      <w:lvlText w:val=""/>
+      <w:lvlJc w:val="left"/>
+      <w:pPr>
+        <w:tabs>
+          <w:tab w:val="num" w:pos="5760"/>
+        </w:tabs>
+        <w:ind w:left="5760" w:hanging="360"/>
+      </w:pPr>
+      <w:rPr>
+        <w:rFonts w:ascii="Wingdings" w:hAnsi="Wingdings" w:hint="default"/>
+        <w:sz w:val="20"/>
+      </w:rPr>
+    </w:lvl>
+    <w:lvl w:ilvl="8" w:tentative="1">
+      <w:start w:val="1"/>
+      <w:numFmt w:val="bullet"/>
+      <w:lvlText w:val=""/>
+      <w:lvlJc w:val="left"/>
+      <w:pPr>
+        <w:tabs>
+          <w:tab w:val="num" w:pos="6480"/>
+        </w:tabs>
+        <w:ind w:left="6480" w:hanging="360"/>
+      </w:pPr>
+      <w:rPr>
+        <w:rFonts w:ascii="Wingdings" w:hAnsi="Wingdings" w:hint="default"/>
+        <w:sz w:val="20"/>
+      </w:rPr>
+    </w:lvl>
+  </w:abstractNum>
+  <w:abstractNum w:abstractNumId="5" w15:restartNumberingAfterBreak="0">
     <w:nsid w:val="0EF45C76"/>
     <w:multiLevelType w:val="multilevel"/>
     <w:tmpl w:val="BCCC5AD6"/>
@@ -15124,7 +17065,7 @@
       </w:rPr>
     </w:lvl>
   </w:abstractNum>
-  <w:abstractNum w:abstractNumId="5" w15:restartNumberingAfterBreak="0">
+  <w:abstractNum w:abstractNumId="6" w15:restartNumberingAfterBreak="0">
     <w:nsid w:val="0F4A44EE"/>
     <w:multiLevelType w:val="multilevel"/>
     <w:tmpl w:val="54D281CE"/>
@@ -15273,7 +17214,7 @@
       </w:rPr>
     </w:lvl>
   </w:abstractNum>
-  <w:abstractNum w:abstractNumId="6" w15:restartNumberingAfterBreak="0">
+  <w:abstractNum w:abstractNumId="7" w15:restartNumberingAfterBreak="0">
     <w:nsid w:val="11064EE4"/>
     <w:multiLevelType w:val="multilevel"/>
     <w:tmpl w:val="83F86878"/>
@@ -15386,7 +17327,7 @@
       </w:pPr>
     </w:lvl>
   </w:abstractNum>
-  <w:abstractNum w:abstractNumId="7" w15:restartNumberingAfterBreak="0">
+  <w:abstractNum w:abstractNumId="8" w15:restartNumberingAfterBreak="0">
     <w:nsid w:val="146754DF"/>
     <w:multiLevelType w:val="multilevel"/>
     <w:tmpl w:val="82881C24"/>
@@ -15535,7 +17476,7 @@
       </w:rPr>
     </w:lvl>
   </w:abstractNum>
-  <w:abstractNum w:abstractNumId="8" w15:restartNumberingAfterBreak="0">
+  <w:abstractNum w:abstractNumId="9" w15:restartNumberingAfterBreak="0">
     <w:nsid w:val="14831423"/>
     <w:multiLevelType w:val="multilevel"/>
     <w:tmpl w:val="6142A946"/>
@@ -15680,7 +17621,7 @@
       </w:rPr>
     </w:lvl>
   </w:abstractNum>
-  <w:abstractNum w:abstractNumId="9" w15:restartNumberingAfterBreak="0">
+  <w:abstractNum w:abstractNumId="10" w15:restartNumberingAfterBreak="0">
     <w:nsid w:val="17387F48"/>
     <w:multiLevelType w:val="multilevel"/>
     <w:tmpl w:val="827A1642"/>
@@ -15829,7 +17770,7 @@
       </w:rPr>
     </w:lvl>
   </w:abstractNum>
-  <w:abstractNum w:abstractNumId="10" w15:restartNumberingAfterBreak="0">
+  <w:abstractNum w:abstractNumId="11" w15:restartNumberingAfterBreak="0">
     <w:nsid w:val="1B9E2DC0"/>
     <w:multiLevelType w:val="multilevel"/>
     <w:tmpl w:val="9E1C2A48"/>
@@ -15942,7 +17883,7 @@
       </w:pPr>
     </w:lvl>
   </w:abstractNum>
-  <w:abstractNum w:abstractNumId="11" w15:restartNumberingAfterBreak="0">
+  <w:abstractNum w:abstractNumId="12" w15:restartNumberingAfterBreak="0">
     <w:nsid w:val="22344C3B"/>
     <w:multiLevelType w:val="multilevel"/>
     <w:tmpl w:val="8DBE15BE"/>
@@ -16091,7 +18032,156 @@
       </w:rPr>
     </w:lvl>
   </w:abstractNum>
-  <w:abstractNum w:abstractNumId="12" w15:restartNumberingAfterBreak="0">
+  <w:abstractNum w:abstractNumId="13" w15:restartNumberingAfterBreak="0">
+    <w:nsid w:val="23006C20"/>
+    <w:multiLevelType w:val="multilevel"/>
+    <w:tmpl w:val="98381408"/>
+    <w:lvl w:ilvl="0">
+      <w:start w:val="1"/>
+      <w:numFmt w:val="bullet"/>
+      <w:lvlText w:val=""/>
+      <w:lvlJc w:val="left"/>
+      <w:pPr>
+        <w:tabs>
+          <w:tab w:val="num" w:pos="720"/>
+        </w:tabs>
+        <w:ind w:left="720" w:hanging="360"/>
+      </w:pPr>
+      <w:rPr>
+        <w:rFonts w:ascii="Symbol" w:hAnsi="Symbol" w:hint="default"/>
+        <w:sz w:val="20"/>
+      </w:rPr>
+    </w:lvl>
+    <w:lvl w:ilvl="1" w:tentative="1">
+      <w:start w:val="1"/>
+      <w:numFmt w:val="bullet"/>
+      <w:lvlText w:val="o"/>
+      <w:lvlJc w:val="left"/>
+      <w:pPr>
+        <w:tabs>
+          <w:tab w:val="num" w:pos="1440"/>
+        </w:tabs>
+        <w:ind w:left="1440" w:hanging="360"/>
+      </w:pPr>
+      <w:rPr>
+        <w:rFonts w:ascii="Courier New" w:hAnsi="Courier New" w:hint="default"/>
+        <w:sz w:val="20"/>
+      </w:rPr>
+    </w:lvl>
+    <w:lvl w:ilvl="2" w:tentative="1">
+      <w:start w:val="1"/>
+      <w:numFmt w:val="bullet"/>
+      <w:lvlText w:val=""/>
+      <w:lvlJc w:val="left"/>
+      <w:pPr>
+        <w:tabs>
+          <w:tab w:val="num" w:pos="2160"/>
+        </w:tabs>
+        <w:ind w:left="2160" w:hanging="360"/>
+      </w:pPr>
+      <w:rPr>
+        <w:rFonts w:ascii="Wingdings" w:hAnsi="Wingdings" w:hint="default"/>
+        <w:sz w:val="20"/>
+      </w:rPr>
+    </w:lvl>
+    <w:lvl w:ilvl="3" w:tentative="1">
+      <w:start w:val="1"/>
+      <w:numFmt w:val="bullet"/>
+      <w:lvlText w:val=""/>
+      <w:lvlJc w:val="left"/>
+      <w:pPr>
+        <w:tabs>
+          <w:tab w:val="num" w:pos="2880"/>
+        </w:tabs>
+        <w:ind w:left="2880" w:hanging="360"/>
+      </w:pPr>
+      <w:rPr>
+        <w:rFonts w:ascii="Wingdings" w:hAnsi="Wingdings" w:hint="default"/>
+        <w:sz w:val="20"/>
+      </w:rPr>
+    </w:lvl>
+    <w:lvl w:ilvl="4" w:tentative="1">
+      <w:start w:val="1"/>
+      <w:numFmt w:val="bullet"/>
+      <w:lvlText w:val=""/>
+      <w:lvlJc w:val="left"/>
+      <w:pPr>
+        <w:tabs>
+          <w:tab w:val="num" w:pos="3600"/>
+        </w:tabs>
+        <w:ind w:left="3600" w:hanging="360"/>
+      </w:pPr>
+      <w:rPr>
+        <w:rFonts w:ascii="Wingdings" w:hAnsi="Wingdings" w:hint="default"/>
+        <w:sz w:val="20"/>
+      </w:rPr>
+    </w:lvl>
+    <w:lvl w:ilvl="5" w:tentative="1">
+      <w:start w:val="1"/>
+      <w:numFmt w:val="bullet"/>
+      <w:lvlText w:val=""/>
+      <w:lvlJc w:val="left"/>
+      <w:pPr>
+        <w:tabs>
+          <w:tab w:val="num" w:pos="4320"/>
+        </w:tabs>
+        <w:ind w:left="4320" w:hanging="360"/>
+      </w:pPr>
+      <w:rPr>
+        <w:rFonts w:ascii="Wingdings" w:hAnsi="Wingdings" w:hint="default"/>
+        <w:sz w:val="20"/>
+      </w:rPr>
+    </w:lvl>
+    <w:lvl w:ilvl="6" w:tentative="1">
+      <w:start w:val="1"/>
+      <w:numFmt w:val="bullet"/>
+      <w:lvlText w:val=""/>
+      <w:lvlJc w:val="left"/>
+      <w:pPr>
+        <w:tabs>
+          <w:tab w:val="num" w:pos="5040"/>
+        </w:tabs>
+        <w:ind w:left="5040" w:hanging="360"/>
+      </w:pPr>
+      <w:rPr>
+        <w:rFonts w:ascii="Wingdings" w:hAnsi="Wingdings" w:hint="default"/>
+        <w:sz w:val="20"/>
+      </w:rPr>
+    </w:lvl>
+    <w:lvl w:ilvl="7" w:tentative="1">
+      <w:start w:val="1"/>
+      <w:numFmt w:val="bullet"/>
+      <w:lvlText w:val=""/>
+      <w:lvlJc w:val="left"/>
+      <w:pPr>
+        <w:tabs>
+          <w:tab w:val="num" w:pos="5760"/>
+        </w:tabs>
+        <w:ind w:left="5760" w:hanging="360"/>
+      </w:pPr>
+      <w:rPr>
+        <w:rFonts w:ascii="Wingdings" w:hAnsi="Wingdings" w:hint="default"/>
+        <w:sz w:val="20"/>
+      </w:rPr>
+    </w:lvl>
+    <w:lvl w:ilvl="8" w:tentative="1">
+      <w:start w:val="1"/>
+      <w:numFmt w:val="bullet"/>
+      <w:lvlText w:val=""/>
+      <w:lvlJc w:val="left"/>
+      <w:pPr>
+        <w:tabs>
+          <w:tab w:val="num" w:pos="6480"/>
+        </w:tabs>
+        <w:ind w:left="6480" w:hanging="360"/>
+      </w:pPr>
+      <w:rPr>
+        <w:rFonts w:ascii="Wingdings" w:hAnsi="Wingdings" w:hint="default"/>
+        <w:sz w:val="20"/>
+      </w:rPr>
+    </w:lvl>
+  </w:abstractNum>
+  <w:abstractNum w:abstractNumId="14" w15:restartNumberingAfterBreak="0">
     <w:nsid w:val="257838BF"/>
     <w:multiLevelType w:val="multilevel"/>
     <w:tmpl w:val="931E5548"/>
@@ -16240,7 +18330,7 @@
       </w:rPr>
     </w:lvl>
   </w:abstractNum>
-  <w:abstractNum w:abstractNumId="13" w15:restartNumberingAfterBreak="0">
+  <w:abstractNum w:abstractNumId="15" w15:restartNumberingAfterBreak="0">
     <w:nsid w:val="284349D0"/>
     <w:multiLevelType w:val="multilevel"/>
     <w:tmpl w:val="D36A1922"/>
@@ -16353,7 +18443,7 @@
       </w:pPr>
     </w:lvl>
   </w:abstractNum>
-  <w:abstractNum w:abstractNumId="14" w15:restartNumberingAfterBreak="0">
+  <w:abstractNum w:abstractNumId="16" w15:restartNumberingAfterBreak="0">
     <w:nsid w:val="29F31054"/>
     <w:multiLevelType w:val="multilevel"/>
     <w:tmpl w:val="357C58B0"/>
@@ -16502,7 +18592,7 @@
       </w:rPr>
     </w:lvl>
   </w:abstractNum>
-  <w:abstractNum w:abstractNumId="15" w15:restartNumberingAfterBreak="0">
+  <w:abstractNum w:abstractNumId="17" w15:restartNumberingAfterBreak="0">
     <w:nsid w:val="328F4473"/>
     <w:multiLevelType w:val="multilevel"/>
     <w:tmpl w:val="3F7616B4"/>
@@ -16651,7 +18741,7 @@
       </w:rPr>
     </w:lvl>
   </w:abstractNum>
-  <w:abstractNum w:abstractNumId="16" w15:restartNumberingAfterBreak="0">
+  <w:abstractNum w:abstractNumId="18" w15:restartNumberingAfterBreak="0">
     <w:nsid w:val="33923578"/>
     <w:multiLevelType w:val="multilevel"/>
     <w:tmpl w:val="EB42FD92"/>
@@ -16800,7 +18890,7 @@
       </w:rPr>
     </w:lvl>
   </w:abstractNum>
-  <w:abstractNum w:abstractNumId="17" w15:restartNumberingAfterBreak="0">
+  <w:abstractNum w:abstractNumId="19" w15:restartNumberingAfterBreak="0">
     <w:nsid w:val="35EE1AD9"/>
     <w:multiLevelType w:val="multilevel"/>
     <w:tmpl w:val="52063FB2"/>
@@ -16949,7 +19039,7 @@
       </w:rPr>
     </w:lvl>
   </w:abstractNum>
-  <w:abstractNum w:abstractNumId="18" w15:restartNumberingAfterBreak="0">
+  <w:abstractNum w:abstractNumId="20" w15:restartNumberingAfterBreak="0">
     <w:nsid w:val="36644E19"/>
     <w:multiLevelType w:val="multilevel"/>
     <w:tmpl w:val="9C0E3822"/>
@@ -17098,7 +19188,7 @@
       </w:rPr>
     </w:lvl>
   </w:abstractNum>
-  <w:abstractNum w:abstractNumId="19" w15:restartNumberingAfterBreak="0">
+  <w:abstractNum w:abstractNumId="21" w15:restartNumberingAfterBreak="0">
     <w:nsid w:val="3C763A2D"/>
     <w:multiLevelType w:val="multilevel"/>
     <w:tmpl w:val="373A1C18"/>
@@ -17247,7 +19337,7 @@
       </w:rPr>
     </w:lvl>
   </w:abstractNum>
-  <w:abstractNum w:abstractNumId="20" w15:restartNumberingAfterBreak="0">
+  <w:abstractNum w:abstractNumId="22" w15:restartNumberingAfterBreak="0">
     <w:nsid w:val="3F991AB3"/>
     <w:multiLevelType w:val="multilevel"/>
     <w:tmpl w:val="D7C07BB0"/>
@@ -17396,7 +19486,7 @@
       </w:rPr>
     </w:lvl>
   </w:abstractNum>
-  <w:abstractNum w:abstractNumId="21" w15:restartNumberingAfterBreak="0">
+  <w:abstractNum w:abstractNumId="23" w15:restartNumberingAfterBreak="0">
     <w:nsid w:val="41FF10EF"/>
     <w:multiLevelType w:val="multilevel"/>
     <w:tmpl w:val="A5008A5C"/>
@@ -17545,7 +19635,156 @@
       </w:rPr>
     </w:lvl>
   </w:abstractNum>
-  <w:abstractNum w:abstractNumId="22" w15:restartNumberingAfterBreak="0">
+  <w:abstractNum w:abstractNumId="24" w15:restartNumberingAfterBreak="0">
+    <w:nsid w:val="4A9D2491"/>
+    <w:multiLevelType w:val="multilevel"/>
+    <w:tmpl w:val="17F68EBC"/>
+    <w:lvl w:ilvl="0">
+      <w:start w:val="1"/>
+      <w:numFmt w:val="bullet"/>
+      <w:lvlText w:val=""/>
+      <w:lvlJc w:val="left"/>
+      <w:pPr>
+        <w:tabs>
+          <w:tab w:val="num" w:pos="720"/>
+        </w:tabs>
+        <w:ind w:left="720" w:hanging="360"/>
+      </w:pPr>
+      <w:rPr>
+        <w:rFonts w:ascii="Symbol" w:hAnsi="Symbol" w:hint="default"/>
+        <w:sz w:val="20"/>
+      </w:rPr>
+    </w:lvl>
+    <w:lvl w:ilvl="1">
+      <w:start w:val="1"/>
+      <w:numFmt w:val="bullet"/>
+      <w:lvlText w:val="o"/>
+      <w:lvlJc w:val="left"/>
+      <w:pPr>
+        <w:tabs>
+          <w:tab w:val="num" w:pos="1440"/>
+        </w:tabs>
+        <w:ind w:left="1440" w:hanging="360"/>
+      </w:pPr>
+      <w:rPr>
+        <w:rFonts w:ascii="Courier New" w:hAnsi="Courier New" w:hint="default"/>
+        <w:sz w:val="20"/>
+      </w:rPr>
+    </w:lvl>
+    <w:lvl w:ilvl="2" w:tentative="1">
+      <w:start w:val="1"/>
+      <w:numFmt w:val="bullet"/>
+      <w:lvlText w:val=""/>
+      <w:lvlJc w:val="left"/>
+      <w:pPr>
+        <w:tabs>
+          <w:tab w:val="num" w:pos="2160"/>
+        </w:tabs>
+        <w:ind w:left="2160" w:hanging="360"/>
+      </w:pPr>
+      <w:rPr>
+        <w:rFonts w:ascii="Wingdings" w:hAnsi="Wingdings" w:hint="default"/>
+        <w:sz w:val="20"/>
+      </w:rPr>
+    </w:lvl>
+    <w:lvl w:ilvl="3" w:tentative="1">
+      <w:start w:val="1"/>
+      <w:numFmt w:val="bullet"/>
+      <w:lvlText w:val=""/>
+      <w:lvlJc w:val="left"/>
+      <w:pPr>
+        <w:tabs>
+          <w:tab w:val="num" w:pos="2880"/>
+        </w:tabs>
+        <w:ind w:left="2880" w:hanging="360"/>
+      </w:pPr>
+      <w:rPr>
+        <w:rFonts w:ascii="Wingdings" w:hAnsi="Wingdings" w:hint="default"/>
+        <w:sz w:val="20"/>
+      </w:rPr>
+    </w:lvl>
+    <w:lvl w:ilvl="4" w:tentative="1">
+      <w:start w:val="1"/>
+      <w:numFmt w:val="bullet"/>
+      <w:lvlText w:val=""/>
+      <w:lvlJc w:val="left"/>
+      <w:pPr>
+        <w:tabs>
+          <w:tab w:val="num" w:pos="3600"/>
+        </w:tabs>
+        <w:ind w:left="3600" w:hanging="360"/>
+      </w:pPr>
+      <w:rPr>
+        <w:rFonts w:ascii="Wingdings" w:hAnsi="Wingdings" w:hint="default"/>
+        <w:sz w:val="20"/>
+      </w:rPr>
+    </w:lvl>
+    <w:lvl w:ilvl="5" w:tentative="1">
+      <w:start w:val="1"/>
+      <w:numFmt w:val="bullet"/>
+      <w:lvlText w:val=""/>
+      <w:lvlJc w:val="left"/>
+      <w:pPr>
+        <w:tabs>
+          <w:tab w:val="num" w:pos="4320"/>
+        </w:tabs>
+        <w:ind w:left="4320" w:hanging="360"/>
+      </w:pPr>
+      <w:rPr>
+        <w:rFonts w:ascii="Wingdings" w:hAnsi="Wingdings" w:hint="default"/>
+        <w:sz w:val="20"/>
+      </w:rPr>
+    </w:lvl>
+    <w:lvl w:ilvl="6" w:tentative="1">
+      <w:start w:val="1"/>
+      <w:numFmt w:val="bullet"/>
+      <w:lvlText w:val=""/>
+      <w:lvlJc w:val="left"/>
+      <w:pPr>
+        <w:tabs>
+          <w:tab w:val="num" w:pos="5040"/>
+        </w:tabs>
+        <w:ind w:left="5040" w:hanging="360"/>
+      </w:pPr>
+      <w:rPr>
+        <w:rFonts w:ascii="Wingdings" w:hAnsi="Wingdings" w:hint="default"/>
+        <w:sz w:val="20"/>
+      </w:rPr>
+    </w:lvl>
+    <w:lvl w:ilvl="7" w:tentative="1">
+      <w:start w:val="1"/>
+      <w:numFmt w:val="bullet"/>
+      <w:lvlText w:val=""/>
+      <w:lvlJc w:val="left"/>
+      <w:pPr>
+        <w:tabs>
+          <w:tab w:val="num" w:pos="5760"/>
+        </w:tabs>
+        <w:ind w:left="5760" w:hanging="360"/>
+      </w:pPr>
+      <w:rPr>
+        <w:rFonts w:ascii="Wingdings" w:hAnsi="Wingdings" w:hint="default"/>
+        <w:sz w:val="20"/>
+      </w:rPr>
+    </w:lvl>
+    <w:lvl w:ilvl="8" w:tentative="1">
+      <w:start w:val="1"/>
+      <w:numFmt w:val="bullet"/>
+      <w:lvlText w:val=""/>
+      <w:lvlJc w:val="left"/>
+      <w:pPr>
+        <w:tabs>
+          <w:tab w:val="num" w:pos="6480"/>
+        </w:tabs>
+        <w:ind w:left="6480" w:hanging="360"/>
+      </w:pPr>
+      <w:rPr>
+        <w:rFonts w:ascii="Wingdings" w:hAnsi="Wingdings" w:hint="default"/>
+        <w:sz w:val="20"/>
+      </w:rPr>
+    </w:lvl>
+  </w:abstractNum>
+  <w:abstractNum w:abstractNumId="25" w15:restartNumberingAfterBreak="0">
     <w:nsid w:val="53B754AC"/>
     <w:multiLevelType w:val="multilevel"/>
     <w:tmpl w:val="0854C724"/>
@@ -17694,7 +19933,7 @@
       </w:rPr>
     </w:lvl>
   </w:abstractNum>
-  <w:abstractNum w:abstractNumId="23" w15:restartNumberingAfterBreak="0">
+  <w:abstractNum w:abstractNumId="26" w15:restartNumberingAfterBreak="0">
     <w:nsid w:val="55FC7277"/>
     <w:multiLevelType w:val="multilevel"/>
     <w:tmpl w:val="FCEED21E"/>
@@ -17807,7 +20046,7 @@
       </w:pPr>
     </w:lvl>
   </w:abstractNum>
-  <w:abstractNum w:abstractNumId="24" w15:restartNumberingAfterBreak="0">
+  <w:abstractNum w:abstractNumId="27" w15:restartNumberingAfterBreak="0">
     <w:nsid w:val="5A3741C6"/>
     <w:multiLevelType w:val="multilevel"/>
     <w:tmpl w:val="F5BA7EFE"/>
@@ -17956,7 +20195,7 @@
       </w:rPr>
     </w:lvl>
   </w:abstractNum>
-  <w:abstractNum w:abstractNumId="25" w15:restartNumberingAfterBreak="0">
+  <w:abstractNum w:abstractNumId="28" w15:restartNumberingAfterBreak="0">
     <w:nsid w:val="5C5023A8"/>
     <w:multiLevelType w:val="multilevel"/>
     <w:tmpl w:val="3E7EEADA"/>
@@ -18105,7 +20344,7 @@
       </w:rPr>
     </w:lvl>
   </w:abstractNum>
-  <w:abstractNum w:abstractNumId="26" w15:restartNumberingAfterBreak="0">
+  <w:abstractNum w:abstractNumId="29" w15:restartNumberingAfterBreak="0">
     <w:nsid w:val="5CC41962"/>
     <w:multiLevelType w:val="multilevel"/>
     <w:tmpl w:val="F98AD5E6"/>
@@ -18254,7 +20493,7 @@
       </w:rPr>
     </w:lvl>
   </w:abstractNum>
-  <w:abstractNum w:abstractNumId="27" w15:restartNumberingAfterBreak="0">
+  <w:abstractNum w:abstractNumId="30" w15:restartNumberingAfterBreak="0">
     <w:nsid w:val="64264E9A"/>
     <w:multiLevelType w:val="multilevel"/>
     <w:tmpl w:val="4196AC08"/>
@@ -18367,7 +20606,7 @@
       </w:pPr>
     </w:lvl>
   </w:abstractNum>
-  <w:abstractNum w:abstractNumId="28" w15:restartNumberingAfterBreak="0">
+  <w:abstractNum w:abstractNumId="31" w15:restartNumberingAfterBreak="0">
     <w:nsid w:val="69825E29"/>
     <w:multiLevelType w:val="multilevel"/>
     <w:tmpl w:val="09740A7C"/>
@@ -18516,7 +20755,156 @@
       </w:rPr>
     </w:lvl>
   </w:abstractNum>
-  <w:abstractNum w:abstractNumId="29" w15:restartNumberingAfterBreak="0">
+  <w:abstractNum w:abstractNumId="32" w15:restartNumberingAfterBreak="0">
+    <w:nsid w:val="698D2461"/>
+    <w:multiLevelType w:val="multilevel"/>
+    <w:tmpl w:val="A44C6D10"/>
+    <w:lvl w:ilvl="0">
+      <w:start w:val="1"/>
+      <w:numFmt w:val="bullet"/>
+      <w:lvlText w:val=""/>
+      <w:lvlJc w:val="left"/>
+      <w:pPr>
+        <w:tabs>
+          <w:tab w:val="num" w:pos="720"/>
+        </w:tabs>
+        <w:ind w:left="720" w:hanging="360"/>
+      </w:pPr>
+      <w:rPr>
+        <w:rFonts w:ascii="Symbol" w:hAnsi="Symbol" w:hint="default"/>
+        <w:sz w:val="20"/>
+      </w:rPr>
+    </w:lvl>
+    <w:lvl w:ilvl="1" w:tentative="1">
+      <w:start w:val="1"/>
+      <w:numFmt w:val="bullet"/>
+      <w:lvlText w:val="o"/>
+      <w:lvlJc w:val="left"/>
+      <w:pPr>
+        <w:tabs>
+          <w:tab w:val="num" w:pos="1440"/>
+        </w:tabs>
+        <w:ind w:left="1440" w:hanging="360"/>
+      </w:pPr>
+      <w:rPr>
+        <w:rFonts w:ascii="Courier New" w:hAnsi="Courier New" w:hint="default"/>
+        <w:sz w:val="20"/>
+      </w:rPr>
+    </w:lvl>
+    <w:lvl w:ilvl="2" w:tentative="1">
+      <w:start w:val="1"/>
+      <w:numFmt w:val="bullet"/>
+      <w:lvlText w:val=""/>
+      <w:lvlJc w:val="left"/>
+      <w:pPr>
+        <w:tabs>
+          <w:tab w:val="num" w:pos="2160"/>
+        </w:tabs>
+        <w:ind w:left="2160" w:hanging="360"/>
+      </w:pPr>
+      <w:rPr>
+        <w:rFonts w:ascii="Wingdings" w:hAnsi="Wingdings" w:hint="default"/>
+        <w:sz w:val="20"/>
+      </w:rPr>
+    </w:lvl>
+    <w:lvl w:ilvl="3" w:tentative="1">
+      <w:start w:val="1"/>
+      <w:numFmt w:val="bullet"/>
+      <w:lvlText w:val=""/>
+      <w:lvlJc w:val="left"/>
+      <w:pPr>
+        <w:tabs>
+          <w:tab w:val="num" w:pos="2880"/>
+        </w:tabs>
+        <w:ind w:left="2880" w:hanging="360"/>
+      </w:pPr>
+      <w:rPr>
+        <w:rFonts w:ascii="Wingdings" w:hAnsi="Wingdings" w:hint="default"/>
+        <w:sz w:val="20"/>
+      </w:rPr>
+    </w:lvl>
+    <w:lvl w:ilvl="4" w:tentative="1">
+      <w:start w:val="1"/>
+      <w:numFmt w:val="bullet"/>
+      <w:lvlText w:val=""/>
+      <w:lvlJc w:val="left"/>
+      <w:pPr>
+        <w:tabs>
+          <w:tab w:val="num" w:pos="3600"/>
+        </w:tabs>
+        <w:ind w:left="3600" w:hanging="360"/>
+      </w:pPr>
+      <w:rPr>
+        <w:rFonts w:ascii="Wingdings" w:hAnsi="Wingdings" w:hint="default"/>
+        <w:sz w:val="20"/>
+      </w:rPr>
+    </w:lvl>
+    <w:lvl w:ilvl="5" w:tentative="1">
+      <w:start w:val="1"/>
+      <w:numFmt w:val="bullet"/>
+      <w:lvlText w:val=""/>
+      <w:lvlJc w:val="left"/>
+      <w:pPr>
+        <w:tabs>
+          <w:tab w:val="num" w:pos="4320"/>
+        </w:tabs>
+        <w:ind w:left="4320" w:hanging="360"/>
+      </w:pPr>
+      <w:rPr>
+        <w:rFonts w:ascii="Wingdings" w:hAnsi="Wingdings" w:hint="default"/>
+        <w:sz w:val="20"/>
+      </w:rPr>
+    </w:lvl>
+    <w:lvl w:ilvl="6" w:tentative="1">
+      <w:start w:val="1"/>
+      <w:numFmt w:val="bullet"/>
+      <w:lvlText w:val=""/>
+      <w:lvlJc w:val="left"/>
+      <w:pPr>
+        <w:tabs>
+          <w:tab w:val="num" w:pos="5040"/>
+        </w:tabs>
+        <w:ind w:left="5040" w:hanging="360"/>
+      </w:pPr>
+      <w:rPr>
+        <w:rFonts w:ascii="Wingdings" w:hAnsi="Wingdings" w:hint="default"/>
+        <w:sz w:val="20"/>
+      </w:rPr>
+    </w:lvl>
+    <w:lvl w:ilvl="7" w:tentative="1">
+      <w:start w:val="1"/>
+      <w:numFmt w:val="bullet"/>
+      <w:lvlText w:val=""/>
+      <w:lvlJc w:val="left"/>
+      <w:pPr>
+        <w:tabs>
+          <w:tab w:val="num" w:pos="5760"/>
+        </w:tabs>
+        <w:ind w:left="5760" w:hanging="360"/>
+      </w:pPr>
+      <w:rPr>
+        <w:rFonts w:ascii="Wingdings" w:hAnsi="Wingdings" w:hint="default"/>
+        <w:sz w:val="20"/>
+      </w:rPr>
+    </w:lvl>
+    <w:lvl w:ilvl="8" w:tentative="1">
+      <w:start w:val="1"/>
+      <w:numFmt w:val="bullet"/>
+      <w:lvlText w:val=""/>
+      <w:lvlJc w:val="left"/>
+      <w:pPr>
+        <w:tabs>
+          <w:tab w:val="num" w:pos="6480"/>
+        </w:tabs>
+        <w:ind w:left="6480" w:hanging="360"/>
+      </w:pPr>
+      <w:rPr>
+        <w:rFonts w:ascii="Wingdings" w:hAnsi="Wingdings" w:hint="default"/>
+        <w:sz w:val="20"/>
+      </w:rPr>
+    </w:lvl>
+  </w:abstractNum>
+  <w:abstractNum w:abstractNumId="33" w15:restartNumberingAfterBreak="0">
     <w:nsid w:val="6F777BBB"/>
     <w:multiLevelType w:val="multilevel"/>
     <w:tmpl w:val="FFB6B6C8"/>
@@ -18665,7 +21053,7 @@
       </w:rPr>
     </w:lvl>
   </w:abstractNum>
-  <w:abstractNum w:abstractNumId="30" w15:restartNumberingAfterBreak="0">
+  <w:abstractNum w:abstractNumId="34" w15:restartNumberingAfterBreak="0">
     <w:nsid w:val="70732DB6"/>
     <w:multiLevelType w:val="multilevel"/>
     <w:tmpl w:val="A9C67EE8"/>
@@ -18778,7 +21166,7 @@
       </w:pPr>
     </w:lvl>
   </w:abstractNum>
-  <w:abstractNum w:abstractNumId="31" w15:restartNumberingAfterBreak="0">
+  <w:abstractNum w:abstractNumId="35" w15:restartNumberingAfterBreak="0">
     <w:nsid w:val="76DE0254"/>
     <w:multiLevelType w:val="multilevel"/>
     <w:tmpl w:val="24FE7538"/>
@@ -18927,7 +21315,7 @@
       </w:rPr>
     </w:lvl>
   </w:abstractNum>
-  <w:abstractNum w:abstractNumId="32" w15:restartNumberingAfterBreak="0">
+  <w:abstractNum w:abstractNumId="36" w15:restartNumberingAfterBreak="0">
     <w:nsid w:val="7C40730E"/>
     <w:multiLevelType w:val="multilevel"/>
     <w:tmpl w:val="4EC44F78"/>
@@ -19040,7 +21428,7 @@
       </w:pPr>
     </w:lvl>
   </w:abstractNum>
-  <w:abstractNum w:abstractNumId="33" w15:restartNumberingAfterBreak="0">
+  <w:abstractNum w:abstractNumId="37" w15:restartNumberingAfterBreak="0">
     <w:nsid w:val="7CCC01C9"/>
     <w:multiLevelType w:val="multilevel"/>
     <w:tmpl w:val="656C6610"/>
@@ -19153,7 +21541,7 @@
       </w:pPr>
     </w:lvl>
   </w:abstractNum>
-  <w:abstractNum w:abstractNumId="34" w15:restartNumberingAfterBreak="0">
+  <w:abstractNum w:abstractNumId="38" w15:restartNumberingAfterBreak="0">
     <w:nsid w:val="7FBA476D"/>
     <w:multiLevelType w:val="multilevel"/>
     <w:tmpl w:val="E5BA9576"/>
@@ -19303,79 +21691,79 @@
     </w:lvl>
   </w:abstractNum>
   <w:num w:numId="1" w16cid:durableId="305085771">
-    <w:abstractNumId w:val="17"/>
+    <w:abstractNumId w:val="19"/>
   </w:num>
   <w:num w:numId="2" w16cid:durableId="581524277">
-    <w:abstractNumId w:val="12"/>
+    <w:abstractNumId w:val="14"/>
   </w:num>
   <w:num w:numId="3" w16cid:durableId="695161013">
-    <w:abstractNumId w:val="22"/>
+    <w:abstractNumId w:val="25"/>
   </w:num>
   <w:num w:numId="4" w16cid:durableId="1966420648">
+    <w:abstractNumId w:val="34"/>
+  </w:num>
+  <w:num w:numId="5" w16cid:durableId="372508527">
     <w:abstractNumId w:val="30"/>
   </w:num>
-  <w:num w:numId="5" w16cid:durableId="372508527">
-    <w:abstractNumId w:val="27"/>
-  </w:num>
   <w:num w:numId="6" w16cid:durableId="988827085">
-    <w:abstractNumId w:val="25"/>
+    <w:abstractNumId w:val="28"/>
   </w:num>
   <w:num w:numId="7" w16cid:durableId="260647793">
-    <w:abstractNumId w:val="32"/>
+    <w:abstractNumId w:val="36"/>
   </w:num>
   <w:num w:numId="8" w16cid:durableId="202527156">
     <w:abstractNumId w:val="2"/>
   </w:num>
   <w:num w:numId="9" w16cid:durableId="706218535">
-    <w:abstractNumId w:val="31"/>
+    <w:abstractNumId w:val="35"/>
   </w:num>
   <w:num w:numId="10" w16cid:durableId="734400429">
-    <w:abstractNumId w:val="10"/>
+    <w:abstractNumId w:val="11"/>
   </w:num>
   <w:num w:numId="11" w16cid:durableId="1295868554">
-    <w:abstractNumId w:val="11"/>
+    <w:abstractNumId w:val="12"/>
   </w:num>
   <w:num w:numId="12" w16cid:durableId="1047141599">
+    <w:abstractNumId w:val="9"/>
+  </w:num>
+  <w:num w:numId="13" w16cid:durableId="583732473">
+    <w:abstractNumId w:val="21"/>
+  </w:num>
+  <w:num w:numId="14" w16cid:durableId="1058015792">
+    <w:abstractNumId w:val="18"/>
+  </w:num>
+  <w:num w:numId="15" w16cid:durableId="2020310721">
     <w:abstractNumId w:val="8"/>
   </w:num>
-  <w:num w:numId="13" w16cid:durableId="583732473">
-    <w:abstractNumId w:val="19"/>
-  </w:num>
-  <w:num w:numId="14" w16cid:durableId="1058015792">
-    <w:abstractNumId w:val="16"/>
-  </w:num>
-  <w:num w:numId="15" w16cid:durableId="2020310721">
-    <w:abstractNumId w:val="7"/>
-  </w:num>
   <w:num w:numId="16" w16cid:durableId="327368084">
-    <w:abstractNumId w:val="5"/>
+    <w:abstractNumId w:val="6"/>
   </w:num>
   <w:num w:numId="17" w16cid:durableId="34939295">
-    <w:abstractNumId w:val="33"/>
+    <w:abstractNumId w:val="37"/>
   </w:num>
   <w:num w:numId="18" w16cid:durableId="877009161">
     <w:abstractNumId w:val="0"/>
   </w:num>
   <w:num w:numId="19" w16cid:durableId="424228631">
-    <w:abstractNumId w:val="9"/>
+    <w:abstractNumId w:val="10"/>
   </w:num>
   <w:num w:numId="20" w16cid:durableId="1497957781">
-    <w:abstractNumId w:val="14"/>
+    <w:abstractNumId w:val="16"/>
   </w:num>
   <w:num w:numId="21" w16cid:durableId="833765505">
-    <w:abstractNumId w:val="23"/>
+    <w:abstractNumId w:val="26"/>
   </w:num>
   <w:num w:numId="22" w16cid:durableId="995450667">
-    <w:abstractNumId w:val="24"/>
+    <w:abstractNumId w:val="27"/>
   </w:num>
   <w:num w:numId="23" w16cid:durableId="920456383">
-    <w:abstractNumId w:val="26"/>
+    <w:abstractNumId w:val="29"/>
   </w:num>
   <w:num w:numId="24" w16cid:durableId="1360089471">
-    <w:abstractNumId w:val="20"/>
+    <w:abstractNumId w:val="22"/>
   </w:num>
   <w:num w:numId="25" w16cid:durableId="729579019">
-    <w:abstractNumId w:val="15"/>
+    <w:abstractNumId w:val="17"/>
   </w:num>
   <w:num w:numId="26" w16cid:durableId="1931309371">
     <w:abstractNumId w:val="3"/>
@@ -19384,28 +21772,40 @@
     <w:abstractNumId w:val="1"/>
   </w:num>
   <w:num w:numId="28" w16cid:durableId="1272282229">
-    <w:abstractNumId w:val="21"/>
+    <w:abstractNumId w:val="23"/>
   </w:num>
   <w:num w:numId="29" w16cid:durableId="1479955780">
-    <w:abstractNumId w:val="28"/>
+    <w:abstractNumId w:val="31"/>
   </w:num>
   <w:num w:numId="30" w16cid:durableId="1095589399">
-    <w:abstractNumId w:val="13"/>
+    <w:abstractNumId w:val="15"/>
   </w:num>
   <w:num w:numId="31" w16cid:durableId="2007399855">
-    <w:abstractNumId w:val="18"/>
+    <w:abstractNumId w:val="20"/>
   </w:num>
   <w:num w:numId="32" w16cid:durableId="627054175">
-    <w:abstractNumId w:val="34"/>
+    <w:abstractNumId w:val="38"/>
   </w:num>
   <w:num w:numId="33" w16cid:durableId="1371758995">
-    <w:abstractNumId w:val="29"/>
+    <w:abstractNumId w:val="33"/>
   </w:num>
   <w:num w:numId="34" w16cid:durableId="614141435">
+    <w:abstractNumId w:val="5"/>
+  </w:num>
+  <w:num w:numId="35" w16cid:durableId="417138005">
+    <w:abstractNumId w:val="7"/>
+  </w:num>
+  <w:num w:numId="36" w16cid:durableId="746461347">
+    <w:abstractNumId w:val="24"/>
+  </w:num>
+  <w:num w:numId="37" w16cid:durableId="1070497016">
+    <w:abstractNumId w:val="32"/>
+  </w:num>
+  <w:num w:numId="38" w16cid:durableId="2007512414">
     <w:abstractNumId w:val="4"/>
   </w:num>
-  <w:num w:numId="35" w16cid:durableId="417138005">
-    <w:abstractNumId w:val="6"/>
+  <w:num w:numId="39" w16cid:durableId="1937399125">
+    <w:abstractNumId w:val="13"/>
   </w:num>
 </w:numbering>
 </file>

</xml_diff>

<commit_message>
studied primitive and non-primitive datatypes
</commit_message>
<xml_diff>
--- a/JAVASCRIPT NOTES.docx
+++ b/JAVASCRIPT NOTES.docx
@@ -7906,6 +7906,9 @@
     </w:p>
     <w:p>
       <w:r>
+        <w:rPr>
+          <w:noProof/>
+        </w:rPr>
         <w:drawing>
           <wp:inline distT="0" distB="0" distL="0" distR="0" wp14:anchorId="7FD3F770" wp14:editId="62C134D0">
             <wp:extent cx="5731510" cy="4586605"/>
@@ -8259,6 +8262,9 @@
     </w:p>
     <w:p>
       <w:r>
+        <w:rPr>
+          <w:noProof/>
+        </w:rPr>
         <w:lastRenderedPageBreak/>
         <w:drawing>
           <wp:inline distT="0" distB="0" distL="0" distR="0" wp14:anchorId="131D0163" wp14:editId="1185317C">
@@ -8466,15 +8472,7 @@
       </w:r>
       <w:proofErr w:type="spellEnd"/>
       <w:r>
-        <w:t xml:space="preserve"> </w:t>
-      </w:r>
-      <w:proofErr w:type="spellStart"/>
-      <w:r>
-        <w:t>aage</w:t>
-      </w:r>
-      <w:proofErr w:type="spellEnd"/>
-      <w:r>
-        <w:t xml:space="preserve"> </w:t>
+        <w:t xml:space="preserve"> aage </w:t>
       </w:r>
       <w:proofErr w:type="spellStart"/>
       <w:r>
@@ -8498,6 +8496,9 @@
         <w:t xml:space="preserve">        </w:t>
       </w:r>
       <w:r>
+        <w:rPr>
+          <w:noProof/>
+        </w:rPr>
         <w:drawing>
           <wp:inline distT="0" distB="0" distL="0" distR="0" wp14:anchorId="71E73B40" wp14:editId="1DA60F5F">
             <wp:extent cx="5075822" cy="2859578"/>
@@ -9648,7 +9649,7 @@
       </w:r>
       <w:r>
         <w:pict w14:anchorId="65F7EE79">
-          <v:rect id="_x0000_i1055" style="width:0;height:1.5pt" o:hralign="center" o:hrstd="t" o:hr="t" fillcolor="#a0a0a0" stroked="f"/>
+          <v:rect id="_x0000_i1042" style="width:0;height:1.5pt" o:hralign="center" o:hrstd="t" o:hr="t" fillcolor="#a0a0a0" stroked="f"/>
         </w:pict>
       </w:r>
       <w:r>
@@ -9770,6 +9771,7 @@
         <w:rPr>
           <w:b/>
           <w:bCs/>
+          <w:noProof/>
         </w:rPr>
         <w:lastRenderedPageBreak/>
         <w:drawing>
@@ -9923,6 +9925,9 @@
     </w:p>
     <w:p>
       <w:r>
+        <w:rPr>
+          <w:noProof/>
+        </w:rPr>
         <w:drawing>
           <wp:inline distT="0" distB="0" distL="0" distR="0" wp14:anchorId="084537ED" wp14:editId="6EF6966A">
             <wp:extent cx="5731510" cy="1802130"/>
@@ -9961,7 +9966,7 @@
       </w:r>
       <w:r>
         <w:pict w14:anchorId="02A34EB6">
-          <v:rect id="_x0000_i1053" style="width:0;height:1.5pt" o:hralign="center" o:hrstd="t" o:hr="t" fillcolor="#a0a0a0" stroked="f"/>
+          <v:rect id="_x0000_i1043" style="width:0;height:1.5pt" o:hralign="center" o:hrstd="t" o:hr="t" fillcolor="#a0a0a0" stroked="f"/>
         </w:pict>
       </w:r>
       <w:r>
@@ -10038,6 +10043,7 @@
         <w:rPr>
           <w:b/>
           <w:bCs/>
+          <w:noProof/>
         </w:rPr>
         <w:drawing>
           <wp:inline distT="0" distB="0" distL="0" distR="0" wp14:anchorId="10909519" wp14:editId="6B3BAEE7">
@@ -10083,6 +10089,9 @@
         <w:t xml:space="preserve">    </w:t>
       </w:r>
       <w:r>
+        <w:rPr>
+          <w:noProof/>
+        </w:rPr>
         <w:drawing>
           <wp:inline distT="0" distB="0" distL="0" distR="0" wp14:anchorId="167B559A" wp14:editId="20E46A8E">
             <wp:extent cx="5422518" cy="4948518"/>
@@ -10121,7 +10130,7 @@
       </w:r>
       <w:r>
         <w:pict w14:anchorId="032ABCA9">
-          <v:rect id="_x0000_i1052" style="width:0;height:1.5pt" o:hralign="center" o:hrstd="t" o:hr="t" fillcolor="#a0a0a0" stroked="f"/>
+          <v:rect id="_x0000_i1044" style="width:0;height:1.5pt" o:hralign="center" o:hrstd="t" o:hr="t" fillcolor="#a0a0a0" stroked="f"/>
         </w:pict>
       </w:r>
       <w:r>
@@ -10256,6 +10265,9 @@
     </w:p>
     <w:p>
       <w:r>
+        <w:rPr>
+          <w:noProof/>
+        </w:rPr>
         <w:drawing>
           <wp:inline distT="0" distB="0" distL="0" distR="0" wp14:anchorId="49EF31A8" wp14:editId="7850D6CA">
             <wp:extent cx="3439005" cy="1038370"/>
@@ -10294,7 +10306,7 @@
       </w:r>
       <w:r>
         <w:pict w14:anchorId="7CE10984">
-          <v:rect id="_x0000_i1051" style="width:0;height:1.5pt" o:hralign="center" o:hrstd="t" o:hr="t" fillcolor="#a0a0a0" stroked="f"/>
+          <v:rect id="_x0000_i1045" style="width:0;height:1.5pt" o:hralign="center" o:hrstd="t" o:hr="t" fillcolor="#a0a0a0" stroked="f"/>
         </w:pict>
       </w:r>
     </w:p>
@@ -10643,6 +10655,9 @@
     </w:p>
     <w:p>
       <w:r>
+        <w:rPr>
+          <w:noProof/>
+        </w:rPr>
         <w:drawing>
           <wp:inline distT="0" distB="0" distL="0" distR="0" wp14:anchorId="3D5BA4AF" wp14:editId="4F77F784">
             <wp:extent cx="5731510" cy="3549650"/>
@@ -10713,17 +10728,7 @@
           <w:szCs w:val="36"/>
           <w:u w:val="single"/>
         </w:rPr>
-        <w:t>6</w:t>
-      </w:r>
-      <w:r>
-        <w:rPr>
-          <w:b/>
-          <w:bCs/>
-          <w:sz w:val="36"/>
-          <w:szCs w:val="36"/>
-          <w:u w:val="single"/>
-        </w:rPr>
-        <w:t>)</w:t>
+        <w:t>6)</w:t>
       </w:r>
     </w:p>
     <w:p>
@@ -10766,6 +10771,9 @@
     </w:p>
     <w:p>
       <w:r>
+        <w:rPr>
+          <w:noProof/>
+        </w:rPr>
         <w:drawing>
           <wp:inline distT="0" distB="0" distL="0" distR="0" wp14:anchorId="17C16AFE" wp14:editId="723242FA">
             <wp:extent cx="5668166" cy="2686425"/>
@@ -10805,6 +10813,9 @@
     </w:p>
     <w:p>
       <w:r>
+        <w:rPr>
+          <w:noProof/>
+        </w:rPr>
         <w:lastRenderedPageBreak/>
         <w:drawing>
           <wp:inline distT="0" distB="0" distL="0" distR="0" wp14:anchorId="202A4BF3" wp14:editId="76B23AD6">
@@ -10850,6 +10861,9 @@
         </w:rPr>
       </w:pPr>
       <w:r>
+        <w:rPr>
+          <w:noProof/>
+        </w:rPr>
         <w:drawing>
           <wp:inline distT="0" distB="0" distL="0" distR="0" wp14:anchorId="5FFA2460" wp14:editId="6939E30A">
             <wp:extent cx="5731510" cy="2537460"/>
@@ -10895,6 +10909,9 @@
     </w:p>
     <w:p>
       <w:r>
+        <w:rPr>
+          <w:noProof/>
+        </w:rPr>
         <w:drawing>
           <wp:inline distT="0" distB="0" distL="0" distR="0" wp14:anchorId="3C6E1AB9" wp14:editId="6703FB74">
             <wp:extent cx="5591955" cy="3867690"/>
@@ -10934,6 +10951,9 @@
     </w:p>
     <w:p>
       <w:r>
+        <w:rPr>
+          <w:noProof/>
+        </w:rPr>
         <w:lastRenderedPageBreak/>
         <w:drawing>
           <wp:inline distT="0" distB="0" distL="0" distR="0" wp14:anchorId="5CBCFA8E" wp14:editId="58E50BED">
@@ -11014,6 +11034,9 @@
     </w:p>
     <w:p>
       <w:r>
+        <w:rPr>
+          <w:noProof/>
+        </w:rPr>
         <w:drawing>
           <wp:inline distT="0" distB="0" distL="0" distR="0" wp14:anchorId="6D6D34EC" wp14:editId="2FE408F3">
             <wp:extent cx="5731510" cy="4372610"/>
@@ -11052,7 +11075,7 @@
       </w:r>
       <w:r>
         <w:pict w14:anchorId="75FA5BF0">
-          <v:rect id="_x0000_i1059" style="width:0;height:1.5pt" o:hralign="center" o:hrstd="t" o:hr="t" fillcolor="#a0a0a0" stroked="f"/>
+          <v:rect id="_x0000_i1047" style="width:0;height:1.5pt" o:hralign="center" o:hrstd="t" o:hr="t" fillcolor="#a0a0a0" stroked="f"/>
         </w:pict>
       </w:r>
     </w:p>
@@ -11084,17 +11107,7 @@
           <w:szCs w:val="36"/>
           <w:u w:val="single"/>
         </w:rPr>
-        <w:t>7</w:t>
-      </w:r>
-      <w:r>
-        <w:rPr>
-          <w:b/>
-          <w:bCs/>
-          <w:sz w:val="36"/>
-          <w:szCs w:val="36"/>
-          <w:u w:val="single"/>
-        </w:rPr>
-        <w:t>)</w:t>
+        <w:t>7)</w:t>
       </w:r>
     </w:p>
     <w:p>
@@ -11194,6 +11207,7 @@
         <w:rPr>
           <w:b/>
           <w:bCs/>
+          <w:noProof/>
         </w:rPr>
         <w:lastRenderedPageBreak/>
         <w:drawing>
@@ -11234,7 +11248,7 @@
       </w:r>
       <w:r>
         <w:pict w14:anchorId="4CD91A3A">
-          <v:rect id="_x0000_i1086" style="width:0;height:1.5pt" o:hralign="center" o:hrstd="t" o:hr="t" fillcolor="#a0a0a0" stroked="f"/>
+          <v:rect id="_x0000_i1048" style="width:0;height:1.5pt" o:hralign="center" o:hrstd="t" o:hr="t" fillcolor="#a0a0a0" stroked="f"/>
         </w:pict>
       </w:r>
       <w:r>
@@ -11322,7 +11336,7 @@
       </w:r>
       <w:r>
         <w:pict w14:anchorId="26E45C68">
-          <v:rect id="_x0000_i1089" style="width:0;height:1.5pt" o:hralign="center" o:hrstd="t" o:hr="t" fillcolor="#a0a0a0" stroked="f"/>
+          <v:rect id="_x0000_i1049" style="width:0;height:1.5pt" o:hralign="center" o:hrstd="t" o:hr="t" fillcolor="#a0a0a0" stroked="f"/>
         </w:pict>
       </w:r>
       <w:r>
@@ -11692,6 +11706,9 @@
     </w:p>
     <w:p>
       <w:r>
+        <w:rPr>
+          <w:noProof/>
+        </w:rPr>
         <w:lastRenderedPageBreak/>
         <w:drawing>
           <wp:inline distT="0" distB="0" distL="0" distR="0" wp14:anchorId="0EE9DB97" wp14:editId="3C99D7B8">
@@ -11732,6 +11749,9 @@
     </w:p>
     <w:p>
       <w:r>
+        <w:rPr>
+          <w:noProof/>
+        </w:rPr>
         <w:drawing>
           <wp:inline distT="0" distB="0" distL="0" distR="0" wp14:anchorId="4D267B58" wp14:editId="0EEC7CC3">
             <wp:extent cx="5731510" cy="3177540"/>
@@ -11770,7 +11790,7 @@
       </w:r>
       <w:r>
         <w:pict w14:anchorId="5B5828A8">
-          <v:rect id="_x0000_i1072" style="width:0;height:1.5pt" o:hralign="center" o:hrstd="t" o:hr="t" fillcolor="#a0a0a0" stroked="f"/>
+          <v:rect id="_x0000_i1050" style="width:0;height:1.5pt" o:hralign="center" o:hrstd="t" o:hr="t" fillcolor="#a0a0a0" stroked="f"/>
         </w:pict>
       </w:r>
     </w:p>
@@ -12085,23 +12105,7 @@
       </w:r>
       <w:proofErr w:type="spellEnd"/>
       <w:r>
-        <w:t xml:space="preserve"> </w:t>
-      </w:r>
-      <w:proofErr w:type="spellStart"/>
-      <w:r>
-        <w:t>karta</w:t>
-      </w:r>
-      <w:proofErr w:type="spellEnd"/>
-      <w:r>
-        <w:t xml:space="preserve"> </w:t>
-      </w:r>
-      <w:proofErr w:type="spellStart"/>
-      <w:r>
-        <w:t>hai</w:t>
-      </w:r>
-      <w:proofErr w:type="spellEnd"/>
-      <w:r>
-        <w:t>.</w:t>
+        <w:t xml:space="preserve"> karta hai.</w:t>
       </w:r>
       <w:r>
         <w:rPr>
@@ -12124,6 +12128,9 @@
         <w:t xml:space="preserve">                </w:t>
       </w:r>
       <w:r>
+        <w:rPr>
+          <w:noProof/>
+        </w:rPr>
         <w:drawing>
           <wp:inline distT="0" distB="0" distL="0" distR="0" wp14:anchorId="06BCD81C" wp14:editId="15BB5FAC">
             <wp:extent cx="4001058" cy="3524742"/>
@@ -12162,7 +12169,7 @@
       </w:r>
       <w:r>
         <w:pict w14:anchorId="601CA3C6">
-          <v:rect id="_x0000_i1073" style="width:0;height:1.5pt" o:hralign="center" o:hrstd="t" o:hr="t" fillcolor="#a0a0a0" stroked="f"/>
+          <v:rect id="_x0000_i1051" style="width:0;height:1.5pt" o:hralign="center" o:hrstd="t" o:hr="t" fillcolor="#a0a0a0" stroked="f"/>
         </w:pict>
       </w:r>
     </w:p>
@@ -12331,15 +12338,7 @@
       </w:r>
       <w:proofErr w:type="spellEnd"/>
       <w:r>
-        <w:t xml:space="preserve"> </w:t>
-      </w:r>
-      <w:proofErr w:type="spellStart"/>
-      <w:r>
-        <w:t>hai</w:t>
-      </w:r>
-      <w:proofErr w:type="spellEnd"/>
-      <w:r>
-        <w:t>.</w:t>
+        <w:t xml:space="preserve"> hai.</w:t>
       </w:r>
     </w:p>
     <w:p>
@@ -12347,6 +12346,9 @@
         <w:t xml:space="preserve">                  </w:t>
       </w:r>
       <w:r>
+        <w:rPr>
+          <w:noProof/>
+        </w:rPr>
         <w:drawing>
           <wp:inline distT="0" distB="0" distL="0" distR="0" wp14:anchorId="4DC23C62" wp14:editId="2F9363D4">
             <wp:extent cx="4029637" cy="2543530"/>
@@ -12396,6 +12398,9 @@
         <w:t xml:space="preserve">               </w:t>
       </w:r>
       <w:r>
+        <w:rPr>
+          <w:noProof/>
+        </w:rPr>
         <w:drawing>
           <wp:inline distT="0" distB="0" distL="0" distR="0" wp14:anchorId="5E345EEA" wp14:editId="1A2A1D5D">
             <wp:extent cx="4601217" cy="3753374"/>
@@ -12434,7 +12439,7 @@
       </w:r>
       <w:r>
         <w:pict w14:anchorId="693703E7">
-          <v:rect id="_x0000_i1080" style="width:0;height:1.5pt" o:hralign="center" o:hrstd="t" o:hr="t" fillcolor="#a0a0a0" stroked="f"/>
+          <v:rect id="_x0000_i1052" style="width:0;height:1.5pt" o:hralign="center" o:hrstd="t" o:hr="t" fillcolor="#a0a0a0" stroked="f"/>
         </w:pict>
       </w:r>
     </w:p>
@@ -12630,7 +12635,7 @@
     <w:p>
       <w:r>
         <w:pict w14:anchorId="51BEE1D9">
-          <v:rect id="_x0000_i1094" style="width:0;height:1.5pt" o:hralign="center" o:hrstd="t" o:hr="t" fillcolor="#a0a0a0" stroked="f"/>
+          <v:rect id="_x0000_i1053" style="width:0;height:1.5pt" o:hralign="center" o:hrstd="t" o:hr="t" fillcolor="#a0a0a0" stroked="f"/>
         </w:pict>
       </w:r>
     </w:p>
@@ -12662,17 +12667,7 @@
           <w:szCs w:val="36"/>
           <w:u w:val="single"/>
         </w:rPr>
-        <w:t>8</w:t>
-      </w:r>
-      <w:r>
-        <w:rPr>
-          <w:b/>
-          <w:bCs/>
-          <w:sz w:val="36"/>
-          <w:szCs w:val="36"/>
-          <w:u w:val="single"/>
-        </w:rPr>
-        <w:t>)</w:t>
+        <w:t>8)</w:t>
       </w:r>
     </w:p>
     <w:p>
@@ -12769,13 +12764,8 @@
       </w:r>
       <w:proofErr w:type="spellEnd"/>
       <w:r>
-        <w:t xml:space="preserve"> </w:t>
-      </w:r>
-      <w:proofErr w:type="spellStart"/>
-      <w:r>
-        <w:t>hai</w:t>
-      </w:r>
-      <w:proofErr w:type="spellEnd"/>
+        <w:t xml:space="preserve"> hai</w:t>
+      </w:r>
       <w:r>
         <w:t xml:space="preserve">.                        </w:t>
       </w:r>
@@ -12786,6 +12776,9 @@
         <w:t xml:space="preserve">                    </w:t>
       </w:r>
       <w:r>
+        <w:rPr>
+          <w:noProof/>
+        </w:rPr>
         <w:drawing>
           <wp:inline distT="0" distB="0" distL="0" distR="0" wp14:anchorId="7579555C" wp14:editId="4ACC9498">
             <wp:extent cx="3924848" cy="4086795"/>
@@ -12824,7 +12817,7 @@
       </w:r>
       <w:r>
         <w:pict w14:anchorId="2F82AC74">
-          <v:rect id="_x0000_i1124" style="width:0;height:1.5pt" o:hralign="center" o:hrstd="t" o:hr="t" fillcolor="#a0a0a0" stroked="f"/>
+          <v:rect id="_x0000_i1054" style="width:0;height:1.5pt" o:hralign="center" o:hrstd="t" o:hr="t" fillcolor="#a0a0a0" stroked="f"/>
         </w:pict>
       </w:r>
       <w:r>
@@ -13086,6 +13079,9 @@
         <w:t xml:space="preserve"> </w:t>
       </w:r>
       <w:r>
+        <w:rPr>
+          <w:noProof/>
+        </w:rPr>
         <w:drawing>
           <wp:inline distT="0" distB="0" distL="0" distR="0" wp14:anchorId="54DFAE1A" wp14:editId="3170C314">
             <wp:extent cx="5731510" cy="1499235"/>
@@ -13124,7 +13120,7 @@
       </w:r>
       <w:r>
         <w:pict w14:anchorId="6F0BAAE8">
-          <v:rect id="_x0000_i1113" style="width:0;height:1.5pt" o:hralign="center" o:hrstd="t" o:hr="t" fillcolor="#a0a0a0" stroked="f"/>
+          <v:rect id="_x0000_i1055" style="width:0;height:1.5pt" o:hralign="center" o:hrstd="t" o:hr="t" fillcolor="#a0a0a0" stroked="f"/>
         </w:pict>
       </w:r>
     </w:p>
@@ -13199,6 +13195,7 @@
         <w:rPr>
           <w:b/>
           <w:bCs/>
+          <w:noProof/>
         </w:rPr>
         <w:drawing>
           <wp:inline distT="0" distB="0" distL="0" distR="0" wp14:anchorId="0D153689" wp14:editId="7622A3A6">
@@ -13533,6 +13530,9 @@
     </w:p>
     <w:p>
       <w:r>
+        <w:rPr>
+          <w:noProof/>
+        </w:rPr>
         <w:drawing>
           <wp:inline distT="0" distB="0" distL="0" distR="0" wp14:anchorId="59E558AB" wp14:editId="6F42F20E">
             <wp:extent cx="5731510" cy="3352165"/>
@@ -13572,6 +13572,9 @@
     </w:p>
     <w:p>
       <w:r>
+        <w:rPr>
+          <w:noProof/>
+        </w:rPr>
         <w:drawing>
           <wp:inline distT="0" distB="0" distL="0" distR="0" wp14:anchorId="5EC7B1FD" wp14:editId="2D78BF6E">
             <wp:extent cx="5731510" cy="1828800"/>
@@ -13610,7 +13613,7 @@
       </w:r>
       <w:r>
         <w:pict w14:anchorId="2DA88330">
-          <v:rect id="_x0000_i1114" style="width:0;height:1.5pt" o:hralign="center" o:hrstd="t" o:hr="t" fillcolor="#a0a0a0" stroked="f"/>
+          <v:rect id="_x0000_i1056" style="width:0;height:1.5pt" o:hralign="center" o:hrstd="t" o:hr="t" fillcolor="#a0a0a0" stroked="f"/>
         </w:pict>
       </w:r>
     </w:p>
@@ -13762,6 +13765,9 @@
         <w:t xml:space="preserve">              </w:t>
       </w:r>
       <w:r>
+        <w:rPr>
+          <w:noProof/>
+        </w:rPr>
         <w:drawing>
           <wp:inline distT="0" distB="0" distL="0" distR="0" wp14:anchorId="3D6B0F01" wp14:editId="4F2B7C91">
             <wp:extent cx="4753638" cy="3772426"/>
@@ -13800,7 +13806,7 @@
       </w:r>
       <w:r>
         <w:pict w14:anchorId="765247DE">
-          <v:rect id="_x0000_i1126" style="width:0;height:1.5pt" o:hralign="center" o:hrstd="t" o:hr="t" fillcolor="#a0a0a0" stroked="f"/>
+          <v:rect id="_x0000_i1057" style="width:0;height:1.5pt" o:hralign="center" o:hrstd="t" o:hr="t" fillcolor="#a0a0a0" stroked="f"/>
         </w:pict>
       </w:r>
       <w:r>
@@ -14134,6 +14140,9 @@
     </w:p>
     <w:p>
       <w:r>
+        <w:rPr>
+          <w:noProof/>
+        </w:rPr>
         <w:lastRenderedPageBreak/>
         <w:drawing>
           <wp:inline distT="0" distB="0" distL="0" distR="0" wp14:anchorId="739E6F74" wp14:editId="3D362FEA">
@@ -14173,7 +14182,7 @@
       </w:r>
       <w:r>
         <w:pict w14:anchorId="34BD9A7C">
-          <v:rect id="_x0000_i1115" style="width:0;height:1.5pt" o:hralign="center" o:hrstd="t" o:hr="t" fillcolor="#a0a0a0" stroked="f"/>
+          <v:rect id="_x0000_i1058" style="width:0;height:1.5pt" o:hralign="center" o:hrstd="t" o:hr="t" fillcolor="#a0a0a0" stroked="f"/>
         </w:pict>
       </w:r>
     </w:p>
@@ -14393,7 +14402,7 @@
     <w:p>
       <w:r>
         <w:pict w14:anchorId="4534D3DC">
-          <v:rect id="_x0000_i1123" style="width:0;height:1.5pt" o:hralign="center" o:hrstd="t" o:hr="t" fillcolor="#a0a0a0" stroked="f"/>
+          <v:rect id="_x0000_i1059" style="width:0;height:1.5pt" o:hralign="center" o:hrstd="t" o:hr="t" fillcolor="#a0a0a0" stroked="f"/>
         </w:pict>
       </w:r>
     </w:p>
@@ -14425,17 +14434,7 @@
           <w:szCs w:val="36"/>
           <w:u w:val="single"/>
         </w:rPr>
-        <w:t>9</w:t>
-      </w:r>
-      <w:r>
-        <w:rPr>
-          <w:b/>
-          <w:bCs/>
-          <w:sz w:val="36"/>
-          <w:szCs w:val="36"/>
-          <w:u w:val="single"/>
-        </w:rPr>
-        <w:t>)</w:t>
+        <w:t>9)</w:t>
       </w:r>
     </w:p>
     <w:p>
@@ -14534,6 +14533,8 @@
         <w:rPr>
           <w:b/>
           <w:bCs/>
+          <w:sz w:val="32"/>
+          <w:szCs w:val="32"/>
         </w:rPr>
         <w:t>Primitve</w:t>
       </w:r>
@@ -14542,6 +14543,8 @@
         <w:rPr>
           <w:b/>
           <w:bCs/>
+          <w:sz w:val="32"/>
+          <w:szCs w:val="32"/>
         </w:rPr>
         <w:t xml:space="preserve"> (Call by Value):</w:t>
       </w:r>
@@ -14786,6 +14789,88 @@
       </w:r>
     </w:p>
     <w:p>
+      <w:r>
+        <w:t xml:space="preserve"> </w:t>
+      </w:r>
+      <w:r>
+        <w:drawing>
+          <wp:inline distT="0" distB="0" distL="0" distR="0" wp14:anchorId="2467FE13" wp14:editId="448AE975">
+            <wp:extent cx="3077004" cy="1638529"/>
+            <wp:effectExtent l="0" t="0" r="0" b="0"/>
+            <wp:docPr id="990974249" name="Picture 1"/>
+            <wp:cNvGraphicFramePr>
+              <a:graphicFrameLocks xmlns:a="http://schemas.openxmlformats.org/drawingml/2006/main" noChangeAspect="1"/>
+            </wp:cNvGraphicFramePr>
+            <a:graphic xmlns:a="http://schemas.openxmlformats.org/drawingml/2006/main">
+              <a:graphicData uri="http://schemas.openxmlformats.org/drawingml/2006/picture">
+                <pic:pic xmlns:pic="http://schemas.openxmlformats.org/drawingml/2006/picture">
+                  <pic:nvPicPr>
+                    <pic:cNvPr id="990974249" name=""/>
+                    <pic:cNvPicPr/>
+                  </pic:nvPicPr>
+                  <pic:blipFill>
+                    <a:blip r:embed="rId54"/>
+                    <a:stretch>
+                      <a:fillRect/>
+                    </a:stretch>
+                  </pic:blipFill>
+                  <pic:spPr>
+                    <a:xfrm>
+                      <a:off x="0" y="0"/>
+                      <a:ext cx="3077004" cy="1638529"/>
+                    </a:xfrm>
+                    <a:prstGeom prst="rect">
+                      <a:avLst/>
+                    </a:prstGeom>
+                  </pic:spPr>
+                </pic:pic>
+              </a:graphicData>
+            </a:graphic>
+          </wp:inline>
+        </w:drawing>
+      </w:r>
+    </w:p>
+    <w:p>
+      <w:r>
+        <w:lastRenderedPageBreak/>
+        <w:drawing>
+          <wp:inline distT="0" distB="0" distL="0" distR="0" wp14:anchorId="007EB6DC" wp14:editId="0270497F">
+            <wp:extent cx="5658416" cy="2579702"/>
+            <wp:effectExtent l="0" t="0" r="0" b="0"/>
+            <wp:docPr id="638947580" name="Picture 1"/>
+            <wp:cNvGraphicFramePr>
+              <a:graphicFrameLocks xmlns:a="http://schemas.openxmlformats.org/drawingml/2006/main" noChangeAspect="1"/>
+            </wp:cNvGraphicFramePr>
+            <a:graphic xmlns:a="http://schemas.openxmlformats.org/drawingml/2006/main">
+              <a:graphicData uri="http://schemas.openxmlformats.org/drawingml/2006/picture">
+                <pic:pic xmlns:pic="http://schemas.openxmlformats.org/drawingml/2006/picture">
+                  <pic:nvPicPr>
+                    <pic:cNvPr id="638947580" name=""/>
+                    <pic:cNvPicPr/>
+                  </pic:nvPicPr>
+                  <pic:blipFill>
+                    <a:blip r:embed="rId55"/>
+                    <a:stretch>
+                      <a:fillRect/>
+                    </a:stretch>
+                  </pic:blipFill>
+                  <pic:spPr>
+                    <a:xfrm>
+                      <a:off x="0" y="0"/>
+                      <a:ext cx="5681599" cy="2590271"/>
+                    </a:xfrm>
+                    <a:prstGeom prst="rect">
+                      <a:avLst/>
+                    </a:prstGeom>
+                  </pic:spPr>
+                </pic:pic>
+              </a:graphicData>
+            </a:graphic>
+          </wp:inline>
+        </w:drawing>
+      </w:r>
+    </w:p>
+    <w:p>
       <w:pPr>
         <w:numPr>
           <w:ilvl w:val="0"/>
@@ -14796,11 +14881,20 @@
         <w:rPr>
           <w:b/>
           <w:bCs/>
+          <w:sz w:val="32"/>
+          <w:szCs w:val="32"/>
         </w:rPr>
         <w:t>Non-Primitive / Reference (Call by Reference):</w:t>
       </w:r>
       <w:r>
-        <w:t xml:space="preserve"> Inka memory address (reference) </w:t>
+        <w:rPr>
+          <w:sz w:val="32"/>
+          <w:szCs w:val="32"/>
+        </w:rPr>
+        <w:t xml:space="preserve"> </w:t>
+      </w:r>
+      <w:r>
+        <w:t xml:space="preserve">Inka memory address (reference) </w:t>
       </w:r>
       <w:proofErr w:type="spellStart"/>
       <w:r>
@@ -14847,26 +14941,50 @@
     </w:p>
     <w:p>
       <w:r>
+        <w:t xml:space="preserve">           </w:t>
+      </w:r>
+      <w:r>
+        <w:drawing>
+          <wp:inline distT="0" distB="0" distL="0" distR="0" wp14:anchorId="393B619A" wp14:editId="18683D96">
+            <wp:extent cx="4956387" cy="4925086"/>
+            <wp:effectExtent l="0" t="0" r="0" b="8890"/>
+            <wp:docPr id="965760954" name="Picture 1"/>
+            <wp:cNvGraphicFramePr>
+              <a:graphicFrameLocks xmlns:a="http://schemas.openxmlformats.org/drawingml/2006/main" noChangeAspect="1"/>
+            </wp:cNvGraphicFramePr>
+            <a:graphic xmlns:a="http://schemas.openxmlformats.org/drawingml/2006/main">
+              <a:graphicData uri="http://schemas.openxmlformats.org/drawingml/2006/picture">
+                <pic:pic xmlns:pic="http://schemas.openxmlformats.org/drawingml/2006/picture">
+                  <pic:nvPicPr>
+                    <pic:cNvPr id="965760954" name=""/>
+                    <pic:cNvPicPr/>
+                  </pic:nvPicPr>
+                  <pic:blipFill>
+                    <a:blip r:embed="rId56"/>
+                    <a:stretch>
+                      <a:fillRect/>
+                    </a:stretch>
+                  </pic:blipFill>
+                  <pic:spPr>
+                    <a:xfrm>
+                      <a:off x="0" y="0"/>
+                      <a:ext cx="4995481" cy="4963933"/>
+                    </a:xfrm>
+                    <a:prstGeom prst="rect">
+                      <a:avLst/>
+                    </a:prstGeom>
+                  </pic:spPr>
+                </pic:pic>
+              </a:graphicData>
+            </a:graphic>
+          </wp:inline>
+        </w:drawing>
+      </w:r>
+      <w:r>
         <w:pict w14:anchorId="07E4BAE5">
-          <v:rect id="_x0000_i1146" style="width:0;height:1.5pt" o:hralign="center" o:hrstd="t" o:hr="t" fillcolor="#a0a0a0" stroked="f"/>
+          <v:rect id="_x0000_i1060" style="width:0;height:1.5pt" o:hralign="center" o:hrstd="t" o:hr="t" fillcolor="#a0a0a0" stroked="f"/>
         </w:pict>
       </w:r>
-    </w:p>
-    <w:p>
-      <w:pPr>
-        <w:rPr>
-          <w:b/>
-          <w:bCs/>
-        </w:rPr>
-      </w:pPr>
-    </w:p>
-    <w:p>
-      <w:pPr>
-        <w:rPr>
-          <w:b/>
-          <w:bCs/>
-        </w:rPr>
-      </w:pPr>
     </w:p>
     <w:p>
       <w:pPr>
@@ -14886,23 +15004,7 @@
     </w:p>
     <w:p>
       <w:r>
-        <w:t xml:space="preserve">Hitesh sir ne ek bahut </w:t>
-      </w:r>
-      <w:proofErr w:type="spellStart"/>
-      <w:r>
-        <w:t>badhiya</w:t>
-      </w:r>
-      <w:proofErr w:type="spellEnd"/>
-      <w:r>
-        <w:t xml:space="preserve"> point </w:t>
-      </w:r>
-      <w:proofErr w:type="spellStart"/>
-      <w:r>
-        <w:t>uthaya</w:t>
-      </w:r>
-      <w:proofErr w:type="spellEnd"/>
-      <w:r>
-        <w:t xml:space="preserve"> ki JS ek </w:t>
+        <w:t xml:space="preserve">JS ek </w:t>
       </w:r>
       <w:r>
         <w:rPr>
@@ -15049,6 +15151,115 @@
       <w:proofErr w:type="spellEnd"/>
       <w:r>
         <w:t xml:space="preserve"> (Statically typed).</w:t>
+      </w:r>
+    </w:p>
+    <w:p>
+      <w:r>
+        <w:rPr>
+          <w:b/>
+          <w:bCs/>
+          <w:u w:val="single"/>
+        </w:rPr>
+        <w:t>IN JAVASCRIPT</w:t>
+      </w:r>
+      <w:r>
+        <w:t>:</w:t>
+      </w:r>
+    </w:p>
+    <w:p>
+      <w:r>
+        <w:drawing>
+          <wp:inline distT="0" distB="0" distL="0" distR="0" wp14:anchorId="0E2D6BB2" wp14:editId="7F893DCA">
+            <wp:extent cx="2391109" cy="809738"/>
+            <wp:effectExtent l="0" t="0" r="9525" b="9525"/>
+            <wp:docPr id="1669588881" name="Picture 1"/>
+            <wp:cNvGraphicFramePr>
+              <a:graphicFrameLocks xmlns:a="http://schemas.openxmlformats.org/drawingml/2006/main" noChangeAspect="1"/>
+            </wp:cNvGraphicFramePr>
+            <a:graphic xmlns:a="http://schemas.openxmlformats.org/drawingml/2006/main">
+              <a:graphicData uri="http://schemas.openxmlformats.org/drawingml/2006/picture">
+                <pic:pic xmlns:pic="http://schemas.openxmlformats.org/drawingml/2006/picture">
+                  <pic:nvPicPr>
+                    <pic:cNvPr id="1669588881" name=""/>
+                    <pic:cNvPicPr/>
+                  </pic:nvPicPr>
+                  <pic:blipFill>
+                    <a:blip r:embed="rId57"/>
+                    <a:stretch>
+                      <a:fillRect/>
+                    </a:stretch>
+                  </pic:blipFill>
+                  <pic:spPr>
+                    <a:xfrm>
+                      <a:off x="0" y="0"/>
+                      <a:ext cx="2391109" cy="809738"/>
+                    </a:xfrm>
+                    <a:prstGeom prst="rect">
+                      <a:avLst/>
+                    </a:prstGeom>
+                  </pic:spPr>
+                </pic:pic>
+              </a:graphicData>
+            </a:graphic>
+          </wp:inline>
+        </w:drawing>
+      </w:r>
+    </w:p>
+    <w:p>
+      <w:r>
+        <w:rPr>
+          <w:b/>
+          <w:bCs/>
+          <w:u w:val="single"/>
+        </w:rPr>
+        <w:t>IN TYPESCRIPT</w:t>
+      </w:r>
+      <w:r>
+        <w:t>:</w:t>
+      </w:r>
+    </w:p>
+    <w:p>
+      <w:r>
+        <w:drawing>
+          <wp:inline distT="0" distB="0" distL="0" distR="0" wp14:anchorId="79652F9C" wp14:editId="39E059F3">
+            <wp:extent cx="3810532" cy="828791"/>
+            <wp:effectExtent l="0" t="0" r="0" b="9525"/>
+            <wp:docPr id="2096805994" name="Picture 1"/>
+            <wp:cNvGraphicFramePr>
+              <a:graphicFrameLocks xmlns:a="http://schemas.openxmlformats.org/drawingml/2006/main" noChangeAspect="1"/>
+            </wp:cNvGraphicFramePr>
+            <a:graphic xmlns:a="http://schemas.openxmlformats.org/drawingml/2006/main">
+              <a:graphicData uri="http://schemas.openxmlformats.org/drawingml/2006/picture">
+                <pic:pic xmlns:pic="http://schemas.openxmlformats.org/drawingml/2006/picture">
+                  <pic:nvPicPr>
+                    <pic:cNvPr id="2096805994" name=""/>
+                    <pic:cNvPicPr/>
+                  </pic:nvPicPr>
+                  <pic:blipFill>
+                    <a:blip r:embed="rId58"/>
+                    <a:stretch>
+                      <a:fillRect/>
+                    </a:stretch>
+                  </pic:blipFill>
+                  <pic:spPr>
+                    <a:xfrm>
+                      <a:off x="0" y="0"/>
+                      <a:ext cx="3810532" cy="828791"/>
+                    </a:xfrm>
+                    <a:prstGeom prst="rect">
+                      <a:avLst/>
+                    </a:prstGeom>
+                  </pic:spPr>
+                </pic:pic>
+              </a:graphicData>
+            </a:graphic>
+          </wp:inline>
+        </w:drawing>
+      </w:r>
+      <w:r>
+        <w:pict w14:anchorId="352B77FA">
+          <v:rect id="_x0000_i1068" style="width:0;height:1.5pt" o:hralign="center" o:hrstd="t" o:hr="t" fillcolor="#a0a0a0" stroked="f"/>
+        </w:pict>
       </w:r>
     </w:p>
     <w:p>
@@ -15330,8 +15541,45 @@
     </w:p>
     <w:p>
       <w:r>
+        <w:drawing>
+          <wp:inline distT="0" distB="0" distL="0" distR="0" wp14:anchorId="180CB2C4" wp14:editId="3A32BC74">
+            <wp:extent cx="4382112" cy="1581371"/>
+            <wp:effectExtent l="0" t="0" r="0" b="0"/>
+            <wp:docPr id="1858455497" name="Picture 1"/>
+            <wp:cNvGraphicFramePr>
+              <a:graphicFrameLocks xmlns:a="http://schemas.openxmlformats.org/drawingml/2006/main" noChangeAspect="1"/>
+            </wp:cNvGraphicFramePr>
+            <a:graphic xmlns:a="http://schemas.openxmlformats.org/drawingml/2006/main">
+              <a:graphicData uri="http://schemas.openxmlformats.org/drawingml/2006/picture">
+                <pic:pic xmlns:pic="http://schemas.openxmlformats.org/drawingml/2006/picture">
+                  <pic:nvPicPr>
+                    <pic:cNvPr id="1858455497" name=""/>
+                    <pic:cNvPicPr/>
+                  </pic:nvPicPr>
+                  <pic:blipFill>
+                    <a:blip r:embed="rId59"/>
+                    <a:stretch>
+                      <a:fillRect/>
+                    </a:stretch>
+                  </pic:blipFill>
+                  <pic:spPr>
+                    <a:xfrm>
+                      <a:off x="0" y="0"/>
+                      <a:ext cx="4382112" cy="1581371"/>
+                    </a:xfrm>
+                    <a:prstGeom prst="rect">
+                      <a:avLst/>
+                    </a:prstGeom>
+                  </pic:spPr>
+                </pic:pic>
+              </a:graphicData>
+            </a:graphic>
+          </wp:inline>
+        </w:drawing>
+      </w:r>
+      <w:r>
         <w:pict w14:anchorId="6CE2A799">
-          <v:rect id="_x0000_i1159" style="width:0;height:1.5pt" o:hralign="center" o:hrstd="t" o:hr="t" fillcolor="#a0a0a0" stroked="f"/>
+          <v:rect id="_x0000_i1061" style="width:0;height:1.5pt" o:hralign="center" o:hrstd="t" o:hr="t" fillcolor="#a0a0a0" stroked="f"/>
         </w:pict>
       </w:r>
     </w:p>
@@ -15525,22 +15773,25 @@
       </w:r>
     </w:p>
     <w:p>
-      <w:pPr>
-        <w:rPr>
-          <w:b/>
-          <w:bCs/>
-        </w:rPr>
-      </w:pPr>
       <w:r>
         <w:pict w14:anchorId="132C5164">
-          <v:rect id="_x0000_i1164" style="width:0;height:1.5pt" o:hralign="center" o:hrstd="t" o:hr="t" fillcolor="#a0a0a0" stroked="f"/>
+          <v:rect id="_x0000_i1072" style="width:0;height:1.5pt" o:hralign="center" o:bullet="t" o:hrstd="t" o:hr="t" fillcolor="#a0a0a0" stroked="f"/>
         </w:pict>
       </w:r>
-      <w:r>
-        <w:rPr>
-          <w:b/>
-          <w:bCs/>
-        </w:rPr>
+    </w:p>
+    <w:p>
+      <w:pPr>
+        <w:rPr>
+          <w:b/>
+          <w:bCs/>
+        </w:rPr>
+      </w:pPr>
+      <w:r>
+        <w:rPr>
+          <w:b/>
+          <w:bCs/>
+        </w:rPr>
+        <w:lastRenderedPageBreak/>
         <w:t xml:space="preserve">5. </w:t>
       </w:r>
       <w:proofErr w:type="spellStart"/>
@@ -15744,7 +15995,10 @@
       </w:r>
       <w:proofErr w:type="gramStart"/>
       <w:r>
-        <w:t xml:space="preserve">actually </w:t>
+        <w:t>actually</w:t>
+      </w:r>
+      <w:r>
+        <w:t xml:space="preserve"> </w:t>
       </w:r>
       <w:r>
         <w:rPr>
@@ -15776,8 +16030,45 @@
     </w:p>
     <w:p>
       <w:r>
+        <w:drawing>
+          <wp:inline distT="0" distB="0" distL="0" distR="0" wp14:anchorId="3E277DFB" wp14:editId="6D239543">
+            <wp:extent cx="5731510" cy="4662170"/>
+            <wp:effectExtent l="0" t="0" r="2540" b="5080"/>
+            <wp:docPr id="2141946686" name="Picture 1"/>
+            <wp:cNvGraphicFramePr>
+              <a:graphicFrameLocks xmlns:a="http://schemas.openxmlformats.org/drawingml/2006/main" noChangeAspect="1"/>
+            </wp:cNvGraphicFramePr>
+            <a:graphic xmlns:a="http://schemas.openxmlformats.org/drawingml/2006/main">
+              <a:graphicData uri="http://schemas.openxmlformats.org/drawingml/2006/picture">
+                <pic:pic xmlns:pic="http://schemas.openxmlformats.org/drawingml/2006/picture">
+                  <pic:nvPicPr>
+                    <pic:cNvPr id="2141946686" name=""/>
+                    <pic:cNvPicPr/>
+                  </pic:nvPicPr>
+                  <pic:blipFill>
+                    <a:blip r:embed="rId60"/>
+                    <a:stretch>
+                      <a:fillRect/>
+                    </a:stretch>
+                  </pic:blipFill>
+                  <pic:spPr>
+                    <a:xfrm>
+                      <a:off x="0" y="0"/>
+                      <a:ext cx="5731510" cy="4662170"/>
+                    </a:xfrm>
+                    <a:prstGeom prst="rect">
+                      <a:avLst/>
+                    </a:prstGeom>
+                  </pic:spPr>
+                </pic:pic>
+              </a:graphicData>
+            </a:graphic>
+          </wp:inline>
+        </w:drawing>
+      </w:r>
+      <w:r>
         <w:pict w14:anchorId="4E449291">
-          <v:rect id="_x0000_i1155" style="width:0;height:1.5pt" o:hralign="center" o:hrstd="t" o:hr="t" fillcolor="#a0a0a0" stroked="f"/>
+          <v:rect id="_x0000_i1063" style="width:0;height:1.5pt" o:hralign="center" o:hrstd="t" o:hr="t" fillcolor="#a0a0a0" stroked="f"/>
         </w:pict>
       </w:r>
     </w:p>
@@ -16034,6 +16325,7 @@
           </w:tcPr>
           <w:p>
             <w:r>
+              <w:lastRenderedPageBreak/>
               <w:t>Number</w:t>
             </w:r>
           </w:p>
@@ -16075,7 +16367,6 @@
           </w:tcPr>
           <w:p>
             <w:r>
-              <w:lastRenderedPageBreak/>
               <w:t>String</w:t>
             </w:r>
           </w:p>
@@ -16184,8 +16475,45 @@
     </w:tbl>
     <w:p>
       <w:r>
+        <w:drawing>
+          <wp:inline distT="0" distB="0" distL="0" distR="0" wp14:anchorId="5C09CFB5" wp14:editId="5CB8FFA5">
+            <wp:extent cx="5731510" cy="4039235"/>
+            <wp:effectExtent l="0" t="0" r="2540" b="0"/>
+            <wp:docPr id="410296276" name="Picture 1"/>
+            <wp:cNvGraphicFramePr>
+              <a:graphicFrameLocks xmlns:a="http://schemas.openxmlformats.org/drawingml/2006/main" noChangeAspect="1"/>
+            </wp:cNvGraphicFramePr>
+            <a:graphic xmlns:a="http://schemas.openxmlformats.org/drawingml/2006/main">
+              <a:graphicData uri="http://schemas.openxmlformats.org/drawingml/2006/picture">
+                <pic:pic xmlns:pic="http://schemas.openxmlformats.org/drawingml/2006/picture">
+                  <pic:nvPicPr>
+                    <pic:cNvPr id="410296276" name=""/>
+                    <pic:cNvPicPr/>
+                  </pic:nvPicPr>
+                  <pic:blipFill>
+                    <a:blip r:embed="rId61"/>
+                    <a:stretch>
+                      <a:fillRect/>
+                    </a:stretch>
+                  </pic:blipFill>
+                  <pic:spPr>
+                    <a:xfrm>
+                      <a:off x="0" y="0"/>
+                      <a:ext cx="5731510" cy="4039235"/>
+                    </a:xfrm>
+                    <a:prstGeom prst="rect">
+                      <a:avLst/>
+                    </a:prstGeom>
+                  </pic:spPr>
+                </pic:pic>
+              </a:graphicData>
+            </a:graphic>
+          </wp:inline>
+        </w:drawing>
+      </w:r>
+      <w:r>
         <w:pict w14:anchorId="32110DDF">
-          <v:rect id="_x0000_i1165" style="width:0;height:1.5pt" o:hralign="center" o:hrstd="t" o:hr="t" fillcolor="#a0a0a0" stroked="f"/>
+          <v:rect id="_x0000_i1067" style="width:0;height:1.5pt" o:hralign="center" o:hrstd="t" o:hr="t" fillcolor="#a0a0a0" stroked="f"/>
         </w:pict>
       </w:r>
     </w:p>
@@ -16204,7 +16532,12 @@
 <w:numbering xmlns:wpc="http://schemas.microsoft.com/office/word/2010/wordprocessingCanvas" xmlns:cx="http://schemas.microsoft.com/office/drawing/2014/chartex" xmlns:cx1="http://schemas.microsoft.com/office/drawing/2015/9/8/chartex" xmlns:cx2="http://schemas.microsoft.com/office/drawing/2015/10/21/chartex" xmlns:cx3="http://schemas.microsoft.com/office/drawing/2016/5/9/chartex" xmlns:cx4="http://schemas.microsoft.com/office/drawing/2016/5/10/chartex" xmlns:cx5="http://schemas.microsoft.com/office/drawing/2016/5/11/chartex" xmlns:cx6="http://schemas.microsoft.com/office/drawing/2016/5/12/chartex" xmlns:cx7="http://schemas.microsoft.com/office/drawing/2016/5/13/chartex" xmlns:cx8="http://schemas.microsoft.com/office/drawing/2016/5/14/chartex" xmlns:mc="http://schemas.openxmlformats.org/markup-compatibility/2006" xmlns:aink="http://schemas.microsoft.com/office/drawing/2016/ink" xmlns:am3d="http://schemas.microsoft.com/office/drawing/2017/model3d" xmlns:o="urn:schemas-microsoft-com:office:office" xmlns:oel="http://schemas.microsoft.com/office/2019/extlst" xmlns:r="http://schemas.openxmlformats.org/officeDocument/2006/relationships" xmlns:m="http://schemas.openxmlformats.org/officeDocument/2006/math" xmlns:v="urn:schemas-microsoft-com:vml" xmlns:wp14="http://schemas.microsoft.com/office/word/2010/wordprocessingDrawing" xmlns:wp="http://schemas.openxmlformats.org/drawingml/2006/wordprocessingDrawing" xmlns:w10="urn:schemas-microsoft-com:office:word" xmlns:w="http://schemas.openxmlformats.org/wordprocessingml/2006/main" xmlns:w14="http://schemas.microsoft.com/office/word/2010/wordml" xmlns:w15="http://schemas.microsoft.com/office/word/2012/wordml" xmlns:w16cex="http://schemas.microsoft.com/office/word/2018/wordml/cex" xmlns:w16cid="http://schemas.microsoft.com/office/word/2016/wordml/cid" xmlns:w16="http://schemas.microsoft.com/office/word/2018/wordml" xmlns:w16du="http://schemas.microsoft.com/office/word/2023/wordml/word16du" xmlns:w16sdtdh="http://schemas.microsoft.com/office/word/2020/wordml/sdtdatahash" xmlns:w16sdtfl="http://schemas.microsoft.com/office/word/2024/wordml/sdtformatlock" xmlns:w16se="http://schemas.microsoft.com/office/word/2015/wordml/symex" xmlns:wpg="http://schemas.microsoft.com/office/word/2010/wordprocessingGroup" xmlns:wpi="http://schemas.microsoft.com/office/word/2010/wordprocessingInk" xmlns:wne="http://schemas.microsoft.com/office/word/2006/wordml" xmlns:wps="http://schemas.microsoft.com/office/word/2010/wordprocessingShape" mc:Ignorable="w14 w15 w16se w16cid w16 w16cex w16sdtdh w16sdtfl w16du wp14">
   <w:numPicBullet w:numPicBulletId="0">
     <w:pict>
-      <v:rect id="_x0000_i1070" style="width:0;height:1.5pt" o:hralign="center" o:bullet="t" o:hrstd="t" o:hr="t" fillcolor="#a0a0a0" stroked="f"/>
+      <v:rect id="_x0000_i1046" style="width:0;height:1.5pt" o:hralign="center" o:bullet="t" o:hrstd="t" o:hr="t" fillcolor="#a0a0a0" stroked="f"/>
+    </w:pict>
+  </w:numPicBullet>
+  <w:numPicBullet w:numPicBulletId="1">
+    <w:pict>
+      <v:rect id="_x0000_i1047" style="width:0;height:1.5pt" o:hralign="center" o:bullet="t" o:hrstd="t" o:hr="t" fillcolor="#a0a0a0" stroked="f"/>
     </w:pict>
   </w:numPicBullet>
   <w:abstractNum w:abstractNumId="0" w15:restartNumberingAfterBreak="0">
@@ -22413,6 +22746,7 @@
   <w:style w:type="character" w:default="1" w:styleId="DefaultParagraphFont">
     <w:name w:val="Default Paragraph Font"/>
     <w:uiPriority w:val="1"/>
+    <w:semiHidden/>
     <w:unhideWhenUsed/>
   </w:style>
   <w:style w:type="table" w:default="1" w:styleId="TableNormal">

</xml_diff>

<commit_message>
studied stack and heap memory behaviour in datatypes
</commit_message>
<xml_diff>
--- a/JAVASCRIPT NOTES.docx
+++ b/JAVASCRIPT NOTES.docx
@@ -16517,6 +16517,1748 @@
         </w:pict>
       </w:r>
     </w:p>
+    <w:p>
+      <w:pPr>
+        <w:rPr>
+          <w:b/>
+          <w:bCs/>
+          <w:sz w:val="36"/>
+          <w:szCs w:val="36"/>
+          <w:u w:val="single"/>
+        </w:rPr>
+      </w:pPr>
+      <w:r>
+        <w:rPr>
+          <w:b/>
+          <w:bCs/>
+          <w:sz w:val="36"/>
+          <w:szCs w:val="36"/>
+          <w:u w:val="single"/>
+        </w:rPr>
+        <w:t>JAVASCRIPT NOTES (</w:t>
+      </w:r>
+      <w:r>
+        <w:rPr>
+          <w:b/>
+          <w:bCs/>
+          <w:sz w:val="36"/>
+          <w:szCs w:val="36"/>
+          <w:u w:val="single"/>
+        </w:rPr>
+        <w:t>10</w:t>
+      </w:r>
+      <w:r>
+        <w:rPr>
+          <w:b/>
+          <w:bCs/>
+          <w:sz w:val="36"/>
+          <w:szCs w:val="36"/>
+          <w:u w:val="single"/>
+        </w:rPr>
+        <w:t>)</w:t>
+      </w:r>
+    </w:p>
+    <w:p>
+      <w:pPr>
+        <w:rPr>
+          <w:b/>
+          <w:bCs/>
+        </w:rPr>
+      </w:pPr>
+      <w:r>
+        <w:rPr>
+          <w:b/>
+          <w:bCs/>
+        </w:rPr>
+        <w:t>1. Do Tarah ki Memory</w:t>
+      </w:r>
+    </w:p>
+    <w:p>
+      <w:r>
+        <w:t xml:space="preserve">JavaScript </w:t>
+      </w:r>
+      <w:proofErr w:type="spellStart"/>
+      <w:r>
+        <w:t>mein</w:t>
+      </w:r>
+      <w:proofErr w:type="spellEnd"/>
+      <w:r>
+        <w:t xml:space="preserve"> do </w:t>
+      </w:r>
+      <w:proofErr w:type="spellStart"/>
+      <w:r>
+        <w:t>jagah</w:t>
+      </w:r>
+      <w:proofErr w:type="spellEnd"/>
+      <w:r>
+        <w:t xml:space="preserve"> data store </w:t>
+      </w:r>
+      <w:proofErr w:type="spellStart"/>
+      <w:r>
+        <w:t>hota</w:t>
+      </w:r>
+      <w:proofErr w:type="spellEnd"/>
+      <w:r>
+        <w:t xml:space="preserve"> </w:t>
+      </w:r>
+      <w:proofErr w:type="spellStart"/>
+      <w:r>
+        <w:t>hai</w:t>
+      </w:r>
+      <w:proofErr w:type="spellEnd"/>
+      <w:r>
+        <w:t>:</w:t>
+      </w:r>
+    </w:p>
+    <w:p>
+      <w:pPr>
+        <w:numPr>
+          <w:ilvl w:val="0"/>
+          <w:numId w:val="40"/>
+        </w:numPr>
+      </w:pPr>
+      <w:r>
+        <w:rPr>
+          <w:b/>
+          <w:bCs/>
+        </w:rPr>
+        <w:t>Stack Memory:</w:t>
+      </w:r>
+      <w:r>
+        <w:t xml:space="preserve"> * Yahan </w:t>
+      </w:r>
+      <w:proofErr w:type="spellStart"/>
+      <w:r>
+        <w:t>saare</w:t>
+      </w:r>
+      <w:proofErr w:type="spellEnd"/>
+      <w:r>
+        <w:t xml:space="preserve"> </w:t>
+      </w:r>
+      <w:r>
+        <w:rPr>
+          <w:b/>
+          <w:bCs/>
+        </w:rPr>
+        <w:t>Primitive</w:t>
+      </w:r>
+      <w:r>
+        <w:t xml:space="preserve"> types (String, Number, Boolean, etc.) </w:t>
+      </w:r>
+      <w:proofErr w:type="spellStart"/>
+      <w:r>
+        <w:t>jate</w:t>
+      </w:r>
+      <w:proofErr w:type="spellEnd"/>
+      <w:r>
+        <w:t xml:space="preserve"> hain.</w:t>
+      </w:r>
+    </w:p>
+    <w:p>
+      <w:pPr>
+        <w:numPr>
+          <w:ilvl w:val="1"/>
+          <w:numId w:val="40"/>
+        </w:numPr>
+      </w:pPr>
+      <w:r>
+        <w:t xml:space="preserve">Jab tum ek variable ko </w:t>
+      </w:r>
+      <w:proofErr w:type="spellStart"/>
+      <w:r>
+        <w:t>dusre</w:t>
+      </w:r>
+      <w:proofErr w:type="spellEnd"/>
+      <w:r>
+        <w:t xml:space="preserve"> </w:t>
+      </w:r>
+      <w:proofErr w:type="spellStart"/>
+      <w:r>
+        <w:t>mein</w:t>
+      </w:r>
+      <w:proofErr w:type="spellEnd"/>
+      <w:r>
+        <w:t xml:space="preserve"> assign </w:t>
+      </w:r>
+      <w:proofErr w:type="spellStart"/>
+      <w:r>
+        <w:t>karte</w:t>
+      </w:r>
+      <w:proofErr w:type="spellEnd"/>
+      <w:r>
+        <w:t xml:space="preserve"> </w:t>
+      </w:r>
+      <w:proofErr w:type="spellStart"/>
+      <w:r>
+        <w:t>ho</w:t>
+      </w:r>
+      <w:proofErr w:type="spellEnd"/>
+      <w:r>
+        <w:t xml:space="preserve">, </w:t>
+      </w:r>
+      <w:proofErr w:type="spellStart"/>
+      <w:r>
+        <w:t>toh</w:t>
+      </w:r>
+      <w:proofErr w:type="spellEnd"/>
+      <w:r>
+        <w:t xml:space="preserve"> </w:t>
+      </w:r>
+      <w:proofErr w:type="spellStart"/>
+      <w:r>
+        <w:t>tumhe</w:t>
+      </w:r>
+      <w:proofErr w:type="spellEnd"/>
+      <w:r>
+        <w:t xml:space="preserve"> original value ki ek </w:t>
+      </w:r>
+      <w:r>
+        <w:rPr>
+          <w:b/>
+          <w:bCs/>
+        </w:rPr>
+        <w:t>Copy</w:t>
+      </w:r>
+      <w:r>
+        <w:t xml:space="preserve"> </w:t>
+      </w:r>
+      <w:proofErr w:type="spellStart"/>
+      <w:r>
+        <w:t>milti</w:t>
+      </w:r>
+      <w:proofErr w:type="spellEnd"/>
+      <w:r>
+        <w:t xml:space="preserve"> </w:t>
+      </w:r>
+      <w:proofErr w:type="spellStart"/>
+      <w:r>
+        <w:t>hai</w:t>
+      </w:r>
+      <w:proofErr w:type="spellEnd"/>
+      <w:r>
+        <w:t>.</w:t>
+      </w:r>
+    </w:p>
+    <w:p>
+      <w:pPr>
+        <w:numPr>
+          <w:ilvl w:val="0"/>
+          <w:numId w:val="40"/>
+        </w:numPr>
+      </w:pPr>
+      <w:r>
+        <w:rPr>
+          <w:b/>
+          <w:bCs/>
+        </w:rPr>
+        <w:t>Heap Memory:</w:t>
+      </w:r>
+      <w:r>
+        <w:t xml:space="preserve"> * Yahan </w:t>
+      </w:r>
+      <w:proofErr w:type="spellStart"/>
+      <w:r>
+        <w:t>saare</w:t>
+      </w:r>
+      <w:proofErr w:type="spellEnd"/>
+      <w:r>
+        <w:t xml:space="preserve"> </w:t>
+      </w:r>
+      <w:proofErr w:type="gramStart"/>
+      <w:r>
+        <w:rPr>
+          <w:b/>
+          <w:bCs/>
+        </w:rPr>
+        <w:t>Non-Primitive</w:t>
+      </w:r>
+      <w:proofErr w:type="gramEnd"/>
+      <w:r>
+        <w:t xml:space="preserve"> types (Objects, Arrays, Functions) </w:t>
+      </w:r>
+      <w:proofErr w:type="spellStart"/>
+      <w:r>
+        <w:t>jate</w:t>
+      </w:r>
+      <w:proofErr w:type="spellEnd"/>
+      <w:r>
+        <w:t xml:space="preserve"> hain.</w:t>
+      </w:r>
+    </w:p>
+    <w:p>
+      <w:pPr>
+        <w:numPr>
+          <w:ilvl w:val="1"/>
+          <w:numId w:val="40"/>
+        </w:numPr>
+      </w:pPr>
+      <w:r>
+        <w:lastRenderedPageBreak/>
+        <w:t xml:space="preserve">Jab tum </w:t>
+      </w:r>
+      <w:proofErr w:type="spellStart"/>
+      <w:r>
+        <w:t>yahan</w:t>
+      </w:r>
+      <w:proofErr w:type="spellEnd"/>
+      <w:r>
+        <w:t xml:space="preserve"> se data assign </w:t>
+      </w:r>
+      <w:proofErr w:type="spellStart"/>
+      <w:r>
+        <w:t>karte</w:t>
+      </w:r>
+      <w:proofErr w:type="spellEnd"/>
+      <w:r>
+        <w:t xml:space="preserve"> </w:t>
+      </w:r>
+      <w:proofErr w:type="spellStart"/>
+      <w:r>
+        <w:t>ho</w:t>
+      </w:r>
+      <w:proofErr w:type="spellEnd"/>
+      <w:r>
+        <w:t xml:space="preserve">, </w:t>
+      </w:r>
+      <w:proofErr w:type="spellStart"/>
+      <w:r>
+        <w:t>toh</w:t>
+      </w:r>
+      <w:proofErr w:type="spellEnd"/>
+      <w:r>
+        <w:t xml:space="preserve"> </w:t>
+      </w:r>
+      <w:proofErr w:type="spellStart"/>
+      <w:r>
+        <w:t>tumhe</w:t>
+      </w:r>
+      <w:proofErr w:type="spellEnd"/>
+      <w:r>
+        <w:t xml:space="preserve"> copy </w:t>
+      </w:r>
+      <w:proofErr w:type="spellStart"/>
+      <w:r>
+        <w:t>nahi</w:t>
+      </w:r>
+      <w:proofErr w:type="spellEnd"/>
+      <w:r>
+        <w:t xml:space="preserve"> </w:t>
+      </w:r>
+      <w:proofErr w:type="spellStart"/>
+      <w:r>
+        <w:t>balki</w:t>
+      </w:r>
+      <w:proofErr w:type="spellEnd"/>
+      <w:r>
+        <w:t xml:space="preserve"> original value ka </w:t>
+      </w:r>
+      <w:r>
+        <w:rPr>
+          <w:b/>
+          <w:bCs/>
+        </w:rPr>
+        <w:t>Reference (Address)</w:t>
+      </w:r>
+      <w:r>
+        <w:t xml:space="preserve"> </w:t>
+      </w:r>
+      <w:proofErr w:type="spellStart"/>
+      <w:r>
+        <w:t>milta</w:t>
+      </w:r>
+      <w:proofErr w:type="spellEnd"/>
+      <w:r>
+        <w:t xml:space="preserve"> </w:t>
+      </w:r>
+      <w:proofErr w:type="spellStart"/>
+      <w:r>
+        <w:t>hai</w:t>
+      </w:r>
+      <w:proofErr w:type="spellEnd"/>
+      <w:r>
+        <w:t>.</w:t>
+      </w:r>
+    </w:p>
+    <w:p>
+      <w:r>
+        <w:pict w14:anchorId="48E748DD">
+          <v:rect id="_x0000_i1091" style="width:0;height:1.5pt" o:hralign="center" o:hrstd="t" o:hr="t" fillcolor="#a0a0a0" stroked="f"/>
+        </w:pict>
+      </w:r>
+    </w:p>
+    <w:p>
+      <w:pPr>
+        <w:rPr>
+          <w:b/>
+          <w:bCs/>
+        </w:rPr>
+      </w:pPr>
+      <w:r>
+        <w:rPr>
+          <w:b/>
+          <w:bCs/>
+        </w:rPr>
+        <w:t>2. Stack Memory Example (Call by Value)</w:t>
+      </w:r>
+    </w:p>
+    <w:p>
+      <w:r>
+        <w:t>Sir ne ek example diya:</w:t>
+      </w:r>
+    </w:p>
+    <w:p>
+      <w:pPr>
+        <w:numPr>
+          <w:ilvl w:val="0"/>
+          <w:numId w:val="41"/>
+        </w:numPr>
+      </w:pPr>
+      <w:r>
+        <w:t xml:space="preserve">let </w:t>
+      </w:r>
+      <w:proofErr w:type="spellStart"/>
+      <w:r>
+        <w:t>myYoutubeName</w:t>
+      </w:r>
+      <w:proofErr w:type="spellEnd"/>
+      <w:r>
+        <w:t xml:space="preserve"> = "</w:t>
+      </w:r>
+      <w:proofErr w:type="spellStart"/>
+      <w:r>
+        <w:t>hiteshchoudharydotcom</w:t>
+      </w:r>
+      <w:proofErr w:type="spellEnd"/>
+      <w:r>
+        <w:t xml:space="preserve">" (Ye Stack </w:t>
+      </w:r>
+      <w:proofErr w:type="spellStart"/>
+      <w:r>
+        <w:t>mein</w:t>
+      </w:r>
+      <w:proofErr w:type="spellEnd"/>
+      <w:r>
+        <w:t xml:space="preserve"> </w:t>
+      </w:r>
+      <w:proofErr w:type="spellStart"/>
+      <w:r>
+        <w:t>gaya</w:t>
+      </w:r>
+      <w:proofErr w:type="spellEnd"/>
+      <w:r>
+        <w:t>).</w:t>
+      </w:r>
+    </w:p>
+    <w:p>
+      <w:pPr>
+        <w:numPr>
+          <w:ilvl w:val="0"/>
+          <w:numId w:val="41"/>
+        </w:numPr>
+      </w:pPr>
+      <w:r>
+        <w:t xml:space="preserve">let </w:t>
+      </w:r>
+      <w:proofErr w:type="spellStart"/>
+      <w:r>
+        <w:t>anotherName</w:t>
+      </w:r>
+      <w:proofErr w:type="spellEnd"/>
+      <w:r>
+        <w:t xml:space="preserve"> = </w:t>
+      </w:r>
+      <w:proofErr w:type="spellStart"/>
+      <w:r>
+        <w:t>myYoutubeName</w:t>
+      </w:r>
+      <w:proofErr w:type="spellEnd"/>
+      <w:r>
+        <w:t xml:space="preserve"> (Ab </w:t>
+      </w:r>
+      <w:proofErr w:type="spellStart"/>
+      <w:r>
+        <w:t>anotherName</w:t>
+      </w:r>
+      <w:proofErr w:type="spellEnd"/>
+      <w:r>
+        <w:t xml:space="preserve"> ko </w:t>
+      </w:r>
+      <w:proofErr w:type="spellStart"/>
+      <w:r>
+        <w:t>myYoutubeName</w:t>
+      </w:r>
+      <w:proofErr w:type="spellEnd"/>
+      <w:r>
+        <w:t xml:space="preserve"> ki ek </w:t>
+      </w:r>
+      <w:proofErr w:type="spellStart"/>
+      <w:r>
+        <w:rPr>
+          <w:b/>
+          <w:bCs/>
+        </w:rPr>
+        <w:t>alag</w:t>
+      </w:r>
+      <w:proofErr w:type="spellEnd"/>
+      <w:r>
+        <w:rPr>
+          <w:b/>
+          <w:bCs/>
+        </w:rPr>
+        <w:t xml:space="preserve"> copy</w:t>
+      </w:r>
+      <w:r>
+        <w:t xml:space="preserve"> </w:t>
+      </w:r>
+      <w:proofErr w:type="spellStart"/>
+      <w:r>
+        <w:t>mili</w:t>
+      </w:r>
+      <w:proofErr w:type="spellEnd"/>
+      <w:r>
+        <w:t>).</w:t>
+      </w:r>
+    </w:p>
+    <w:p>
+      <w:pPr>
+        <w:numPr>
+          <w:ilvl w:val="0"/>
+          <w:numId w:val="41"/>
+        </w:numPr>
+      </w:pPr>
+      <w:proofErr w:type="spellStart"/>
+      <w:r>
+        <w:t>anotherName</w:t>
+      </w:r>
+      <w:proofErr w:type="spellEnd"/>
+      <w:r>
+        <w:t xml:space="preserve"> = "chai aur code" (</w:t>
+      </w:r>
+      <w:proofErr w:type="spellStart"/>
+      <w:r>
+        <w:t>Tumne</w:t>
+      </w:r>
+      <w:proofErr w:type="spellEnd"/>
+      <w:r>
+        <w:t xml:space="preserve"> </w:t>
+      </w:r>
+      <w:proofErr w:type="spellStart"/>
+      <w:r>
+        <w:t>sirf</w:t>
+      </w:r>
+      <w:proofErr w:type="spellEnd"/>
+      <w:r>
+        <w:t xml:space="preserve"> copy </w:t>
+      </w:r>
+      <w:proofErr w:type="spellStart"/>
+      <w:r>
+        <w:t>badli</w:t>
+      </w:r>
+      <w:proofErr w:type="spellEnd"/>
+      <w:r>
+        <w:t>).</w:t>
+      </w:r>
+    </w:p>
+    <w:p>
+      <w:pPr>
+        <w:numPr>
+          <w:ilvl w:val="0"/>
+          <w:numId w:val="42"/>
+        </w:numPr>
+      </w:pPr>
+      <w:r>
+        <w:rPr>
+          <w:b/>
+          <w:bCs/>
+        </w:rPr>
+        <w:t>Result:</w:t>
+      </w:r>
+      <w:r>
+        <w:t xml:space="preserve"> </w:t>
+      </w:r>
+      <w:proofErr w:type="spellStart"/>
+      <w:r>
+        <w:t>myYoutubeName</w:t>
+      </w:r>
+      <w:proofErr w:type="spellEnd"/>
+      <w:r>
+        <w:t xml:space="preserve"> </w:t>
+      </w:r>
+      <w:proofErr w:type="spellStart"/>
+      <w:r>
+        <w:t>abhi</w:t>
+      </w:r>
+      <w:proofErr w:type="spellEnd"/>
+      <w:r>
+        <w:t xml:space="preserve"> </w:t>
+      </w:r>
+      <w:proofErr w:type="spellStart"/>
+      <w:r>
+        <w:t>bhi</w:t>
+      </w:r>
+      <w:proofErr w:type="spellEnd"/>
+      <w:r>
+        <w:t xml:space="preserve"> purana hi </w:t>
+      </w:r>
+      <w:proofErr w:type="spellStart"/>
+      <w:r>
+        <w:t>rahega</w:t>
+      </w:r>
+      <w:proofErr w:type="spellEnd"/>
+      <w:r>
+        <w:t xml:space="preserve">, </w:t>
+      </w:r>
+      <w:proofErr w:type="spellStart"/>
+      <w:r>
+        <w:t>kyunki</w:t>
+      </w:r>
+      <w:proofErr w:type="spellEnd"/>
+      <w:r>
+        <w:t xml:space="preserve"> </w:t>
+      </w:r>
+      <w:proofErr w:type="spellStart"/>
+      <w:r>
+        <w:t>dono</w:t>
+      </w:r>
+      <w:proofErr w:type="spellEnd"/>
+      <w:r>
+        <w:t xml:space="preserve"> </w:t>
+      </w:r>
+      <w:proofErr w:type="spellStart"/>
+      <w:r>
+        <w:t>alag-alag</w:t>
+      </w:r>
+      <w:proofErr w:type="spellEnd"/>
+      <w:r>
+        <w:t xml:space="preserve"> memory slots </w:t>
+      </w:r>
+      <w:proofErr w:type="spellStart"/>
+      <w:r>
+        <w:t>mein</w:t>
+      </w:r>
+      <w:proofErr w:type="spellEnd"/>
+      <w:r>
+        <w:t xml:space="preserve"> hain.</w:t>
+      </w:r>
+    </w:p>
+    <w:p>
+      <w:r>
+        <w:drawing>
+          <wp:inline distT="0" distB="0" distL="0" distR="0" wp14:anchorId="6638E3A3" wp14:editId="59B1DEC9">
+            <wp:extent cx="5731510" cy="3669665"/>
+            <wp:effectExtent l="0" t="0" r="2540" b="6985"/>
+            <wp:docPr id="39633123" name="Picture 1"/>
+            <wp:cNvGraphicFramePr>
+              <a:graphicFrameLocks xmlns:a="http://schemas.openxmlformats.org/drawingml/2006/main" noChangeAspect="1"/>
+            </wp:cNvGraphicFramePr>
+            <a:graphic xmlns:a="http://schemas.openxmlformats.org/drawingml/2006/main">
+              <a:graphicData uri="http://schemas.openxmlformats.org/drawingml/2006/picture">
+                <pic:pic xmlns:pic="http://schemas.openxmlformats.org/drawingml/2006/picture">
+                  <pic:nvPicPr>
+                    <pic:cNvPr id="39633123" name=""/>
+                    <pic:cNvPicPr/>
+                  </pic:nvPicPr>
+                  <pic:blipFill>
+                    <a:blip r:embed="rId62"/>
+                    <a:stretch>
+                      <a:fillRect/>
+                    </a:stretch>
+                  </pic:blipFill>
+                  <pic:spPr>
+                    <a:xfrm>
+                      <a:off x="0" y="0"/>
+                      <a:ext cx="5731510" cy="3669665"/>
+                    </a:xfrm>
+                    <a:prstGeom prst="rect">
+                      <a:avLst/>
+                    </a:prstGeom>
+                  </pic:spPr>
+                </pic:pic>
+              </a:graphicData>
+            </a:graphic>
+          </wp:inline>
+        </w:drawing>
+      </w:r>
+      <w:r>
+        <w:pict w14:anchorId="6BE32F55">
+          <v:rect id="_x0000_i1092" style="width:0;height:1.5pt" o:hralign="center" o:hrstd="t" o:hr="t" fillcolor="#a0a0a0" stroked="f"/>
+        </w:pict>
+      </w:r>
+    </w:p>
+    <w:p>
+      <w:pPr>
+        <w:rPr>
+          <w:b/>
+          <w:bCs/>
+        </w:rPr>
+      </w:pPr>
+      <w:r>
+        <w:rPr>
+          <w:b/>
+          <w:bCs/>
+        </w:rPr>
+        <w:t>3. Heap Memory Example (Call by Reference)</w:t>
+      </w:r>
+    </w:p>
+    <w:p>
+      <w:r>
+        <w:t xml:space="preserve">Ab objects ka </w:t>
+      </w:r>
+      <w:proofErr w:type="spellStart"/>
+      <w:r>
+        <w:t>khel</w:t>
+      </w:r>
+      <w:proofErr w:type="spellEnd"/>
+      <w:r>
+        <w:t xml:space="preserve"> </w:t>
+      </w:r>
+      <w:proofErr w:type="spellStart"/>
+      <w:r>
+        <w:t>dekho</w:t>
+      </w:r>
+      <w:proofErr w:type="spellEnd"/>
+      <w:r>
+        <w:t>:</w:t>
+      </w:r>
+    </w:p>
+    <w:p>
+      <w:pPr>
+        <w:numPr>
+          <w:ilvl w:val="0"/>
+          <w:numId w:val="43"/>
+        </w:numPr>
+      </w:pPr>
+      <w:r>
+        <w:t xml:space="preserve">let </w:t>
+      </w:r>
+      <w:proofErr w:type="spellStart"/>
+      <w:r>
+        <w:t>userOne</w:t>
+      </w:r>
+      <w:proofErr w:type="spellEnd"/>
+      <w:r>
+        <w:t xml:space="preserve"> = </w:t>
+      </w:r>
+      <w:proofErr w:type="gramStart"/>
+      <w:r>
+        <w:t>{ email</w:t>
+      </w:r>
+      <w:proofErr w:type="gramEnd"/>
+      <w:r>
+        <w:t xml:space="preserve">: "user@google.com", </w:t>
+      </w:r>
+      <w:proofErr w:type="spellStart"/>
+      <w:r>
+        <w:t>upi</w:t>
+      </w:r>
+      <w:proofErr w:type="spellEnd"/>
+      <w:r>
+        <w:t>: "</w:t>
+      </w:r>
+      <w:proofErr w:type="spellStart"/>
+      <w:r>
+        <w:t>user@ybl</w:t>
+      </w:r>
+      <w:proofErr w:type="spellEnd"/>
+      <w:proofErr w:type="gramStart"/>
+      <w:r>
+        <w:t>" }</w:t>
+      </w:r>
+      <w:proofErr w:type="gramEnd"/>
+      <w:r>
+        <w:t xml:space="preserve"> (Ye object </w:t>
+      </w:r>
+      <w:r>
+        <w:rPr>
+          <w:b/>
+          <w:bCs/>
+        </w:rPr>
+        <w:t>Heap</w:t>
+      </w:r>
+      <w:r>
+        <w:t xml:space="preserve"> </w:t>
+      </w:r>
+      <w:proofErr w:type="spellStart"/>
+      <w:r>
+        <w:t>mein</w:t>
+      </w:r>
+      <w:proofErr w:type="spellEnd"/>
+      <w:r>
+        <w:t xml:space="preserve"> store </w:t>
+      </w:r>
+      <w:proofErr w:type="spellStart"/>
+      <w:r>
+        <w:t>hua</w:t>
+      </w:r>
+      <w:proofErr w:type="spellEnd"/>
+      <w:r>
+        <w:t xml:space="preserve">, aur </w:t>
+      </w:r>
+      <w:proofErr w:type="spellStart"/>
+      <w:r>
+        <w:t>userOne</w:t>
+      </w:r>
+      <w:proofErr w:type="spellEnd"/>
+      <w:r>
+        <w:t xml:space="preserve"> </w:t>
+      </w:r>
+      <w:proofErr w:type="spellStart"/>
+      <w:r>
+        <w:t>ke</w:t>
+      </w:r>
+      <w:proofErr w:type="spellEnd"/>
+      <w:r>
+        <w:t xml:space="preserve"> </w:t>
+      </w:r>
+      <w:proofErr w:type="spellStart"/>
+      <w:r>
+        <w:t>paas</w:t>
+      </w:r>
+      <w:proofErr w:type="spellEnd"/>
+      <w:r>
+        <w:t xml:space="preserve"> </w:t>
+      </w:r>
+      <w:proofErr w:type="spellStart"/>
+      <w:r>
+        <w:t>uska</w:t>
+      </w:r>
+      <w:proofErr w:type="spellEnd"/>
+      <w:r>
+        <w:t xml:space="preserve"> address </w:t>
+      </w:r>
+      <w:proofErr w:type="spellStart"/>
+      <w:r>
+        <w:t>hai</w:t>
+      </w:r>
+      <w:proofErr w:type="spellEnd"/>
+      <w:r>
+        <w:t>).</w:t>
+      </w:r>
+    </w:p>
+    <w:p>
+      <w:pPr>
+        <w:numPr>
+          <w:ilvl w:val="0"/>
+          <w:numId w:val="43"/>
+        </w:numPr>
+      </w:pPr>
+      <w:r>
+        <w:t xml:space="preserve">let </w:t>
+      </w:r>
+      <w:proofErr w:type="spellStart"/>
+      <w:r>
+        <w:t>userTwo</w:t>
+      </w:r>
+      <w:proofErr w:type="spellEnd"/>
+      <w:r>
+        <w:t xml:space="preserve"> = </w:t>
+      </w:r>
+      <w:proofErr w:type="spellStart"/>
+      <w:r>
+        <w:t>userOne</w:t>
+      </w:r>
+      <w:proofErr w:type="spellEnd"/>
+      <w:r>
+        <w:t xml:space="preserve"> (Yahan </w:t>
+      </w:r>
+      <w:proofErr w:type="spellStart"/>
+      <w:r>
+        <w:t>userTwo</w:t>
+      </w:r>
+      <w:proofErr w:type="spellEnd"/>
+      <w:r>
+        <w:t xml:space="preserve"> ko copy </w:t>
+      </w:r>
+      <w:proofErr w:type="spellStart"/>
+      <w:r>
+        <w:t>nahi</w:t>
+      </w:r>
+      <w:proofErr w:type="spellEnd"/>
+      <w:r>
+        <w:t xml:space="preserve"> </w:t>
+      </w:r>
+      <w:proofErr w:type="spellStart"/>
+      <w:r>
+        <w:t>mili</w:t>
+      </w:r>
+      <w:proofErr w:type="spellEnd"/>
+      <w:r>
+        <w:t xml:space="preserve">, </w:t>
+      </w:r>
+      <w:proofErr w:type="spellStart"/>
+      <w:r>
+        <w:t>balki</w:t>
+      </w:r>
+      <w:proofErr w:type="spellEnd"/>
+      <w:r>
+        <w:t xml:space="preserve"> </w:t>
+      </w:r>
+      <w:proofErr w:type="spellStart"/>
+      <w:r>
+        <w:t>wahi</w:t>
+      </w:r>
+      <w:proofErr w:type="spellEnd"/>
+      <w:r>
+        <w:t xml:space="preserve"> </w:t>
+      </w:r>
+      <w:r>
+        <w:rPr>
+          <w:b/>
+          <w:bCs/>
+        </w:rPr>
+        <w:t>Address</w:t>
+      </w:r>
+      <w:r>
+        <w:t xml:space="preserve"> </w:t>
+      </w:r>
+      <w:proofErr w:type="spellStart"/>
+      <w:r>
+        <w:t>mila</w:t>
+      </w:r>
+      <w:proofErr w:type="spellEnd"/>
+      <w:r>
+        <w:t xml:space="preserve"> jo </w:t>
+      </w:r>
+      <w:proofErr w:type="spellStart"/>
+      <w:r>
+        <w:t>userOne</w:t>
+      </w:r>
+      <w:proofErr w:type="spellEnd"/>
+      <w:r>
+        <w:t xml:space="preserve"> </w:t>
+      </w:r>
+      <w:proofErr w:type="spellStart"/>
+      <w:r>
+        <w:t>ke</w:t>
+      </w:r>
+      <w:proofErr w:type="spellEnd"/>
+      <w:r>
+        <w:t xml:space="preserve"> </w:t>
+      </w:r>
+      <w:proofErr w:type="spellStart"/>
+      <w:r>
+        <w:t>paas</w:t>
+      </w:r>
+      <w:proofErr w:type="spellEnd"/>
+      <w:r>
+        <w:t xml:space="preserve"> </w:t>
+      </w:r>
+      <w:proofErr w:type="spellStart"/>
+      <w:r>
+        <w:t>tha</w:t>
+      </w:r>
+      <w:proofErr w:type="spellEnd"/>
+      <w:r>
+        <w:t>).</w:t>
+      </w:r>
+    </w:p>
+    <w:p>
+      <w:pPr>
+        <w:numPr>
+          <w:ilvl w:val="0"/>
+          <w:numId w:val="43"/>
+        </w:numPr>
+      </w:pPr>
+      <w:proofErr w:type="spellStart"/>
+      <w:r>
+        <w:lastRenderedPageBreak/>
+        <w:t>userTwo.email</w:t>
+      </w:r>
+      <w:proofErr w:type="spellEnd"/>
+      <w:r>
+        <w:t xml:space="preserve"> = "hitesh@google.com" (</w:t>
+      </w:r>
+      <w:proofErr w:type="spellStart"/>
+      <w:r>
+        <w:t>Tumne</w:t>
+      </w:r>
+      <w:proofErr w:type="spellEnd"/>
+      <w:r>
+        <w:t xml:space="preserve"> address par </w:t>
+      </w:r>
+      <w:proofErr w:type="spellStart"/>
+      <w:r>
+        <w:t>ja</w:t>
+      </w:r>
+      <w:proofErr w:type="spellEnd"/>
+      <w:r>
+        <w:t xml:space="preserve"> </w:t>
+      </w:r>
+      <w:proofErr w:type="spellStart"/>
+      <w:r>
+        <w:t>kar</w:t>
+      </w:r>
+      <w:proofErr w:type="spellEnd"/>
+      <w:r>
+        <w:t xml:space="preserve"> value </w:t>
+      </w:r>
+      <w:proofErr w:type="spellStart"/>
+      <w:r>
+        <w:t>badal</w:t>
+      </w:r>
+      <w:proofErr w:type="spellEnd"/>
+      <w:r>
+        <w:t xml:space="preserve"> di).</w:t>
+      </w:r>
+    </w:p>
+    <w:p>
+      <w:pPr>
+        <w:numPr>
+          <w:ilvl w:val="0"/>
+          <w:numId w:val="44"/>
+        </w:numPr>
+      </w:pPr>
+      <w:r>
+        <w:rPr>
+          <w:b/>
+          <w:bCs/>
+        </w:rPr>
+        <w:t>Result:</w:t>
+      </w:r>
+      <w:r>
+        <w:t xml:space="preserve"> </w:t>
+      </w:r>
+      <w:proofErr w:type="spellStart"/>
+      <w:r>
+        <w:t>userOne</w:t>
+      </w:r>
+      <w:proofErr w:type="spellEnd"/>
+      <w:r>
+        <w:t xml:space="preserve"> ka email </w:t>
+      </w:r>
+      <w:proofErr w:type="spellStart"/>
+      <w:r>
+        <w:t>bhi</w:t>
+      </w:r>
+      <w:proofErr w:type="spellEnd"/>
+      <w:r>
+        <w:t xml:space="preserve"> </w:t>
+      </w:r>
+      <w:proofErr w:type="spellStart"/>
+      <w:r>
+        <w:t>badal</w:t>
+      </w:r>
+      <w:proofErr w:type="spellEnd"/>
+      <w:r>
+        <w:t xml:space="preserve"> </w:t>
+      </w:r>
+      <w:proofErr w:type="spellStart"/>
+      <w:r>
+        <w:t>jayega</w:t>
+      </w:r>
+      <w:proofErr w:type="spellEnd"/>
+      <w:r>
+        <w:t xml:space="preserve">! </w:t>
+      </w:r>
+      <w:proofErr w:type="spellStart"/>
+      <w:r>
+        <w:t>Kyunki</w:t>
+      </w:r>
+      <w:proofErr w:type="spellEnd"/>
+      <w:r>
+        <w:t xml:space="preserve"> </w:t>
+      </w:r>
+      <w:proofErr w:type="spellStart"/>
+      <w:r>
+        <w:t>dono</w:t>
+      </w:r>
+      <w:proofErr w:type="spellEnd"/>
+      <w:r>
+        <w:t xml:space="preserve"> ek hi "</w:t>
+      </w:r>
+      <w:proofErr w:type="spellStart"/>
+      <w:r>
+        <w:t>dibbe</w:t>
+      </w:r>
+      <w:proofErr w:type="spellEnd"/>
+      <w:r>
+        <w:t xml:space="preserve">" (memory block) ko point </w:t>
+      </w:r>
+      <w:proofErr w:type="spellStart"/>
+      <w:r>
+        <w:t>kar</w:t>
+      </w:r>
+      <w:proofErr w:type="spellEnd"/>
+      <w:r>
+        <w:t xml:space="preserve"> </w:t>
+      </w:r>
+      <w:proofErr w:type="spellStart"/>
+      <w:r>
+        <w:t>rahe</w:t>
+      </w:r>
+      <w:proofErr w:type="spellEnd"/>
+      <w:r>
+        <w:t xml:space="preserve"> hain.</w:t>
+      </w:r>
+    </w:p>
+    <w:p>
+      <w:r>
+        <w:t xml:space="preserve">         </w:t>
+      </w:r>
+      <w:r>
+        <w:drawing>
+          <wp:inline distT="0" distB="0" distL="0" distR="0" wp14:anchorId="4C7E7CED" wp14:editId="2B8B5D0D">
+            <wp:extent cx="5134692" cy="2238687"/>
+            <wp:effectExtent l="0" t="0" r="8890" b="9525"/>
+            <wp:docPr id="1486367217" name="Picture 1"/>
+            <wp:cNvGraphicFramePr>
+              <a:graphicFrameLocks xmlns:a="http://schemas.openxmlformats.org/drawingml/2006/main" noChangeAspect="1"/>
+            </wp:cNvGraphicFramePr>
+            <a:graphic xmlns:a="http://schemas.openxmlformats.org/drawingml/2006/main">
+              <a:graphicData uri="http://schemas.openxmlformats.org/drawingml/2006/picture">
+                <pic:pic xmlns:pic="http://schemas.openxmlformats.org/drawingml/2006/picture">
+                  <pic:nvPicPr>
+                    <pic:cNvPr id="1486367217" name=""/>
+                    <pic:cNvPicPr/>
+                  </pic:nvPicPr>
+                  <pic:blipFill>
+                    <a:blip r:embed="rId63"/>
+                    <a:stretch>
+                      <a:fillRect/>
+                    </a:stretch>
+                  </pic:blipFill>
+                  <pic:spPr>
+                    <a:xfrm>
+                      <a:off x="0" y="0"/>
+                      <a:ext cx="5134692" cy="2238687"/>
+                    </a:xfrm>
+                    <a:prstGeom prst="rect">
+                      <a:avLst/>
+                    </a:prstGeom>
+                  </pic:spPr>
+                </pic:pic>
+              </a:graphicData>
+            </a:graphic>
+          </wp:inline>
+        </w:drawing>
+      </w:r>
+    </w:p>
+    <w:p>
+      <w:r>
+        <w:drawing>
+          <wp:inline distT="0" distB="0" distL="0" distR="0" wp14:anchorId="18323287" wp14:editId="43ADF2F2">
+            <wp:extent cx="5731510" cy="2332990"/>
+            <wp:effectExtent l="0" t="0" r="2540" b="0"/>
+            <wp:docPr id="64864089" name="Picture 1"/>
+            <wp:cNvGraphicFramePr>
+              <a:graphicFrameLocks xmlns:a="http://schemas.openxmlformats.org/drawingml/2006/main" noChangeAspect="1"/>
+            </wp:cNvGraphicFramePr>
+            <a:graphic xmlns:a="http://schemas.openxmlformats.org/drawingml/2006/main">
+              <a:graphicData uri="http://schemas.openxmlformats.org/drawingml/2006/picture">
+                <pic:pic xmlns:pic="http://schemas.openxmlformats.org/drawingml/2006/picture">
+                  <pic:nvPicPr>
+                    <pic:cNvPr id="64864089" name=""/>
+                    <pic:cNvPicPr/>
+                  </pic:nvPicPr>
+                  <pic:blipFill>
+                    <a:blip r:embed="rId64"/>
+                    <a:stretch>
+                      <a:fillRect/>
+                    </a:stretch>
+                  </pic:blipFill>
+                  <pic:spPr>
+                    <a:xfrm>
+                      <a:off x="0" y="0"/>
+                      <a:ext cx="5731510" cy="2332990"/>
+                    </a:xfrm>
+                    <a:prstGeom prst="rect">
+                      <a:avLst/>
+                    </a:prstGeom>
+                  </pic:spPr>
+                </pic:pic>
+              </a:graphicData>
+            </a:graphic>
+          </wp:inline>
+        </w:drawing>
+      </w:r>
+      <w:r>
+        <w:pict w14:anchorId="059BC30C">
+          <v:rect id="_x0000_i1093" style="width:0;height:1.5pt" o:hralign="center" o:hrstd="t" o:hr="t" fillcolor="#a0a0a0" stroked="f"/>
+        </w:pict>
+      </w:r>
+    </w:p>
+    <w:p>
+      <w:pPr>
+        <w:rPr>
+          <w:b/>
+          <w:bCs/>
+        </w:rPr>
+      </w:pPr>
+      <w:r>
+        <w:rPr>
+          <w:b/>
+          <w:bCs/>
+        </w:rPr>
+        <w:t>4. Why is this important?</w:t>
+      </w:r>
+    </w:p>
+    <w:p>
+      <w:r>
+        <w:t xml:space="preserve">Interview </w:t>
+      </w:r>
+      <w:proofErr w:type="spellStart"/>
+      <w:r>
+        <w:t>mein</w:t>
+      </w:r>
+      <w:proofErr w:type="spellEnd"/>
+      <w:r>
+        <w:t xml:space="preserve"> ye </w:t>
+      </w:r>
+      <w:proofErr w:type="spellStart"/>
+      <w:r>
+        <w:t>aksar</w:t>
+      </w:r>
+      <w:proofErr w:type="spellEnd"/>
+      <w:r>
+        <w:t xml:space="preserve"> </w:t>
+      </w:r>
+      <w:proofErr w:type="spellStart"/>
+      <w:r>
+        <w:t>pucha</w:t>
+      </w:r>
+      <w:proofErr w:type="spellEnd"/>
+      <w:r>
+        <w:t xml:space="preserve"> </w:t>
+      </w:r>
+      <w:proofErr w:type="spellStart"/>
+      <w:r>
+        <w:t>jata</w:t>
+      </w:r>
+      <w:proofErr w:type="spellEnd"/>
+      <w:r>
+        <w:t xml:space="preserve"> </w:t>
+      </w:r>
+      <w:proofErr w:type="spellStart"/>
+      <w:r>
+        <w:t>hai</w:t>
+      </w:r>
+      <w:proofErr w:type="spellEnd"/>
+      <w:r>
+        <w:t>.</w:t>
+      </w:r>
+    </w:p>
+    <w:p>
+      <w:pPr>
+        <w:numPr>
+          <w:ilvl w:val="0"/>
+          <w:numId w:val="45"/>
+        </w:numPr>
+      </w:pPr>
+      <w:r>
+        <w:rPr>
+          <w:b/>
+          <w:bCs/>
+        </w:rPr>
+        <w:t>Stack</w:t>
+      </w:r>
+      <w:r>
+        <w:t xml:space="preserve"> fast </w:t>
+      </w:r>
+      <w:proofErr w:type="spellStart"/>
+      <w:r>
+        <w:t>hoti</w:t>
+      </w:r>
+      <w:proofErr w:type="spellEnd"/>
+      <w:r>
+        <w:t xml:space="preserve"> </w:t>
+      </w:r>
+      <w:proofErr w:type="spellStart"/>
+      <w:r>
+        <w:t>hai</w:t>
+      </w:r>
+      <w:proofErr w:type="spellEnd"/>
+      <w:r>
+        <w:t xml:space="preserve"> par limited space </w:t>
+      </w:r>
+      <w:proofErr w:type="spellStart"/>
+      <w:r>
+        <w:t>hoti</w:t>
+      </w:r>
+      <w:proofErr w:type="spellEnd"/>
+      <w:r>
+        <w:t xml:space="preserve"> </w:t>
+      </w:r>
+      <w:proofErr w:type="spellStart"/>
+      <w:r>
+        <w:t>hai</w:t>
+      </w:r>
+      <w:proofErr w:type="spellEnd"/>
+      <w:r>
+        <w:t>.</w:t>
+      </w:r>
+    </w:p>
+    <w:p>
+      <w:pPr>
+        <w:numPr>
+          <w:ilvl w:val="0"/>
+          <w:numId w:val="45"/>
+        </w:numPr>
+      </w:pPr>
+      <w:r>
+        <w:rPr>
+          <w:b/>
+          <w:bCs/>
+        </w:rPr>
+        <w:t>Heap</w:t>
+      </w:r>
+      <w:r>
+        <w:t xml:space="preserve"> </w:t>
+      </w:r>
+      <w:proofErr w:type="spellStart"/>
+      <w:r>
+        <w:t>badi</w:t>
+      </w:r>
+      <w:proofErr w:type="spellEnd"/>
+      <w:r>
+        <w:t xml:space="preserve"> </w:t>
+      </w:r>
+      <w:proofErr w:type="spellStart"/>
+      <w:r>
+        <w:t>hoti</w:t>
+      </w:r>
+      <w:proofErr w:type="spellEnd"/>
+      <w:r>
+        <w:t xml:space="preserve"> </w:t>
+      </w:r>
+      <w:proofErr w:type="spellStart"/>
+      <w:r>
+        <w:t>hai</w:t>
+      </w:r>
+      <w:proofErr w:type="spellEnd"/>
+      <w:r>
+        <w:t xml:space="preserve"> aur complex data </w:t>
+      </w:r>
+      <w:proofErr w:type="spellStart"/>
+      <w:r>
+        <w:t>ke</w:t>
+      </w:r>
+      <w:proofErr w:type="spellEnd"/>
+      <w:r>
+        <w:t xml:space="preserve"> </w:t>
+      </w:r>
+      <w:proofErr w:type="spellStart"/>
+      <w:r>
+        <w:t>liye</w:t>
+      </w:r>
+      <w:proofErr w:type="spellEnd"/>
+      <w:r>
+        <w:t xml:space="preserve"> bani </w:t>
+      </w:r>
+      <w:proofErr w:type="spellStart"/>
+      <w:r>
+        <w:t>hai</w:t>
+      </w:r>
+      <w:proofErr w:type="spellEnd"/>
+      <w:r>
+        <w:t xml:space="preserve">, par reference handle </w:t>
+      </w:r>
+      <w:proofErr w:type="spellStart"/>
+      <w:r>
+        <w:t>karna</w:t>
+      </w:r>
+      <w:proofErr w:type="spellEnd"/>
+      <w:r>
+        <w:t xml:space="preserve"> </w:t>
+      </w:r>
+      <w:proofErr w:type="spellStart"/>
+      <w:r>
+        <w:t>padta</w:t>
+      </w:r>
+      <w:proofErr w:type="spellEnd"/>
+      <w:r>
+        <w:t xml:space="preserve"> </w:t>
+      </w:r>
+      <w:proofErr w:type="spellStart"/>
+      <w:r>
+        <w:t>hai</w:t>
+      </w:r>
+      <w:proofErr w:type="spellEnd"/>
+      <w:r>
+        <w:t>.</w:t>
+      </w:r>
+    </w:p>
+    <w:p>
+      <w:pPr>
+        <w:rPr>
+          <w:b/>
+          <w:bCs/>
+          <w:sz w:val="32"/>
+          <w:szCs w:val="32"/>
+        </w:rPr>
+      </w:pPr>
+    </w:p>
+    <w:p>
+      <w:pPr>
+        <w:rPr>
+          <w:b/>
+          <w:bCs/>
+          <w:sz w:val="32"/>
+          <w:szCs w:val="32"/>
+        </w:rPr>
+      </w:pPr>
+    </w:p>
+    <w:p>
+      <w:pPr>
+        <w:rPr>
+          <w:b/>
+          <w:bCs/>
+          <w:sz w:val="32"/>
+          <w:szCs w:val="32"/>
+        </w:rPr>
+      </w:pPr>
+    </w:p>
+    <w:p>
+      <w:pPr>
+        <w:rPr>
+          <w:b/>
+          <w:bCs/>
+          <w:sz w:val="32"/>
+          <w:szCs w:val="32"/>
+        </w:rPr>
+      </w:pPr>
+    </w:p>
+    <w:p>
+      <w:pPr>
+        <w:rPr>
+          <w:b/>
+          <w:bCs/>
+          <w:sz w:val="32"/>
+          <w:szCs w:val="32"/>
+        </w:rPr>
+      </w:pPr>
+      <w:r>
+        <w:rPr>
+          <w:b/>
+          <w:bCs/>
+          <w:sz w:val="32"/>
+          <w:szCs w:val="32"/>
+        </w:rPr>
+        <w:lastRenderedPageBreak/>
+        <w:t xml:space="preserve"># </w:t>
+      </w:r>
+      <w:r>
+        <w:rPr>
+          <w:b/>
+          <w:bCs/>
+          <w:sz w:val="32"/>
+          <w:szCs w:val="32"/>
+          <w:u w:val="single"/>
+        </w:rPr>
+        <w:t>VERY IMPORTANT</w:t>
+      </w:r>
+    </w:p>
+    <w:p>
+      <w:r>
+        <w:drawing>
+          <wp:inline distT="0" distB="0" distL="0" distR="0" wp14:anchorId="700D24AD" wp14:editId="434503F9">
+            <wp:extent cx="5687219" cy="3486637"/>
+            <wp:effectExtent l="0" t="0" r="8890" b="0"/>
+            <wp:docPr id="1925772865" name="Picture 1"/>
+            <wp:cNvGraphicFramePr>
+              <a:graphicFrameLocks xmlns:a="http://schemas.openxmlformats.org/drawingml/2006/main" noChangeAspect="1"/>
+            </wp:cNvGraphicFramePr>
+            <a:graphic xmlns:a="http://schemas.openxmlformats.org/drawingml/2006/main">
+              <a:graphicData uri="http://schemas.openxmlformats.org/drawingml/2006/picture">
+                <pic:pic xmlns:pic="http://schemas.openxmlformats.org/drawingml/2006/picture">
+                  <pic:nvPicPr>
+                    <pic:cNvPr id="1925772865" name=""/>
+                    <pic:cNvPicPr/>
+                  </pic:nvPicPr>
+                  <pic:blipFill>
+                    <a:blip r:embed="rId65"/>
+                    <a:stretch>
+                      <a:fillRect/>
+                    </a:stretch>
+                  </pic:blipFill>
+                  <pic:spPr>
+                    <a:xfrm>
+                      <a:off x="0" y="0"/>
+                      <a:ext cx="5687219" cy="3486637"/>
+                    </a:xfrm>
+                    <a:prstGeom prst="rect">
+                      <a:avLst/>
+                    </a:prstGeom>
+                  </pic:spPr>
+                </pic:pic>
+              </a:graphicData>
+            </a:graphic>
+          </wp:inline>
+        </w:drawing>
+      </w:r>
+    </w:p>
+    <w:p>
+      <w:r>
+        <w:drawing>
+          <wp:inline distT="0" distB="0" distL="0" distR="0" wp14:anchorId="2742AE75" wp14:editId="2602DDDC">
+            <wp:extent cx="5731510" cy="3208020"/>
+            <wp:effectExtent l="0" t="0" r="2540" b="0"/>
+            <wp:docPr id="924595396" name="Picture 1"/>
+            <wp:cNvGraphicFramePr>
+              <a:graphicFrameLocks xmlns:a="http://schemas.openxmlformats.org/drawingml/2006/main" noChangeAspect="1"/>
+            </wp:cNvGraphicFramePr>
+            <a:graphic xmlns:a="http://schemas.openxmlformats.org/drawingml/2006/main">
+              <a:graphicData uri="http://schemas.openxmlformats.org/drawingml/2006/picture">
+                <pic:pic xmlns:pic="http://schemas.openxmlformats.org/drawingml/2006/picture">
+                  <pic:nvPicPr>
+                    <pic:cNvPr id="924595396" name=""/>
+                    <pic:cNvPicPr/>
+                  </pic:nvPicPr>
+                  <pic:blipFill>
+                    <a:blip r:embed="rId66"/>
+                    <a:stretch>
+                      <a:fillRect/>
+                    </a:stretch>
+                  </pic:blipFill>
+                  <pic:spPr>
+                    <a:xfrm>
+                      <a:off x="0" y="0"/>
+                      <a:ext cx="5731510" cy="3208020"/>
+                    </a:xfrm>
+                    <a:prstGeom prst="rect">
+                      <a:avLst/>
+                    </a:prstGeom>
+                  </pic:spPr>
+                </pic:pic>
+              </a:graphicData>
+            </a:graphic>
+          </wp:inline>
+        </w:drawing>
+      </w:r>
+    </w:p>
+    <w:p>
+      <w:r>
+        <w:lastRenderedPageBreak/>
+        <w:drawing>
+          <wp:inline distT="0" distB="0" distL="0" distR="0" wp14:anchorId="0E2C3B32" wp14:editId="51E7A476">
+            <wp:extent cx="5572903" cy="1676634"/>
+            <wp:effectExtent l="0" t="0" r="8890" b="0"/>
+            <wp:docPr id="34258508" name="Picture 1"/>
+            <wp:cNvGraphicFramePr>
+              <a:graphicFrameLocks xmlns:a="http://schemas.openxmlformats.org/drawingml/2006/main" noChangeAspect="1"/>
+            </wp:cNvGraphicFramePr>
+            <a:graphic xmlns:a="http://schemas.openxmlformats.org/drawingml/2006/main">
+              <a:graphicData uri="http://schemas.openxmlformats.org/drawingml/2006/picture">
+                <pic:pic xmlns:pic="http://schemas.openxmlformats.org/drawingml/2006/picture">
+                  <pic:nvPicPr>
+                    <pic:cNvPr id="34258508" name=""/>
+                    <pic:cNvPicPr/>
+                  </pic:nvPicPr>
+                  <pic:blipFill>
+                    <a:blip r:embed="rId67"/>
+                    <a:stretch>
+                      <a:fillRect/>
+                    </a:stretch>
+                  </pic:blipFill>
+                  <pic:spPr>
+                    <a:xfrm>
+                      <a:off x="0" y="0"/>
+                      <a:ext cx="5572903" cy="1676634"/>
+                    </a:xfrm>
+                    <a:prstGeom prst="rect">
+                      <a:avLst/>
+                    </a:prstGeom>
+                  </pic:spPr>
+                </pic:pic>
+              </a:graphicData>
+            </a:graphic>
+          </wp:inline>
+        </w:drawing>
+      </w:r>
+      <w:r>
+        <w:pict w14:anchorId="76858314">
+          <v:rect id="_x0000_i1106" style="width:0;height:1.5pt" o:hralign="center" o:hrstd="t" o:hr="t" fillcolor="#a0a0a0" stroked="f"/>
+        </w:pict>
+      </w:r>
+      <w:r>
+        <w:rPr>
+          <w:b/>
+          <w:bCs/>
+        </w:rPr>
+        <w:t>Summary Checklist:</w:t>
+      </w:r>
+    </w:p>
+    <w:p>
+      <w:pPr>
+        <w:numPr>
+          <w:ilvl w:val="0"/>
+          <w:numId w:val="46"/>
+        </w:numPr>
+      </w:pPr>
+      <w:r>
+        <w:rPr>
+          <w:b/>
+          <w:bCs/>
+        </w:rPr>
+        <w:t>Primitive</w:t>
+      </w:r>
+      <w:r>
+        <w:t xml:space="preserve"> </w:t>
+      </w:r>
+      <w:r>
+        <w:t xml:space="preserve">=&gt; </w:t>
+      </w:r>
+      <w:r>
+        <w:t xml:space="preserve">Stack </w:t>
+      </w:r>
+      <w:r>
+        <w:t>=&gt;</w:t>
+      </w:r>
+      <w:r>
+        <w:t xml:space="preserve"> Copy </w:t>
+      </w:r>
+      <w:proofErr w:type="spellStart"/>
+      <w:r>
+        <w:t>milti</w:t>
+      </w:r>
+      <w:proofErr w:type="spellEnd"/>
+      <w:r>
+        <w:t xml:space="preserve"> </w:t>
+      </w:r>
+      <w:proofErr w:type="spellStart"/>
+      <w:r>
+        <w:t>hai</w:t>
+      </w:r>
+      <w:proofErr w:type="spellEnd"/>
+      <w:r>
+        <w:t>.</w:t>
+      </w:r>
+    </w:p>
+    <w:p>
+      <w:pPr>
+        <w:numPr>
+          <w:ilvl w:val="0"/>
+          <w:numId w:val="46"/>
+        </w:numPr>
+      </w:pPr>
+      <w:r>
+        <w:rPr>
+          <w:b/>
+          <w:bCs/>
+        </w:rPr>
+        <w:t>Non-Primitive</w:t>
+      </w:r>
+      <w:r>
+        <w:t xml:space="preserve"> </w:t>
+      </w:r>
+      <w:r>
+        <w:t xml:space="preserve">=&gt; </w:t>
+      </w:r>
+      <w:r>
+        <w:t xml:space="preserve">Heap </w:t>
+      </w:r>
+      <w:r>
+        <w:t xml:space="preserve">=&gt; </w:t>
+      </w:r>
+      <w:r>
+        <w:t xml:space="preserve">Reference (Original) </w:t>
+      </w:r>
+      <w:proofErr w:type="spellStart"/>
+      <w:r>
+        <w:t>milta</w:t>
+      </w:r>
+      <w:proofErr w:type="spellEnd"/>
+      <w:r>
+        <w:t xml:space="preserve"> </w:t>
+      </w:r>
+      <w:proofErr w:type="spellStart"/>
+      <w:r>
+        <w:t>hai</w:t>
+      </w:r>
+      <w:proofErr w:type="spellEnd"/>
+      <w:r>
+        <w:t>.</w:t>
+      </w:r>
+    </w:p>
+    <w:p>
+      <w:r>
+        <w:t xml:space="preserve">Primitives </w:t>
+      </w:r>
+      <w:proofErr w:type="spellStart"/>
+      <w:r>
+        <w:t>mein</w:t>
+      </w:r>
+      <w:proofErr w:type="spellEnd"/>
+      <w:r>
+        <w:t xml:space="preserve"> label shift </w:t>
+      </w:r>
+      <w:proofErr w:type="spellStart"/>
+      <w:r>
+        <w:t>hota</w:t>
+      </w:r>
+      <w:proofErr w:type="spellEnd"/>
+      <w:r>
+        <w:t xml:space="preserve"> </w:t>
+      </w:r>
+      <w:proofErr w:type="spellStart"/>
+      <w:r>
+        <w:t>hai</w:t>
+      </w:r>
+      <w:proofErr w:type="spellEnd"/>
+      <w:r>
+        <w:t xml:space="preserve"> </w:t>
+      </w:r>
+      <w:proofErr w:type="spellStart"/>
+      <w:r>
+        <w:t>nayi</w:t>
+      </w:r>
+      <w:proofErr w:type="spellEnd"/>
+      <w:r>
+        <w:t xml:space="preserve"> copy par, par Objects </w:t>
+      </w:r>
+      <w:proofErr w:type="spellStart"/>
+      <w:r>
+        <w:t>mein</w:t>
+      </w:r>
+      <w:proofErr w:type="spellEnd"/>
+      <w:r>
+        <w:t xml:space="preserve"> label </w:t>
+      </w:r>
+      <w:proofErr w:type="spellStart"/>
+      <w:r>
+        <w:t>usi</w:t>
+      </w:r>
+      <w:proofErr w:type="spellEnd"/>
+      <w:r>
+        <w:t xml:space="preserve"> </w:t>
+      </w:r>
+      <w:proofErr w:type="spellStart"/>
+      <w:r>
+        <w:t>purane</w:t>
+      </w:r>
+      <w:proofErr w:type="spellEnd"/>
+      <w:r>
+        <w:t xml:space="preserve"> heap address ko point </w:t>
+      </w:r>
+      <w:proofErr w:type="spellStart"/>
+      <w:r>
+        <w:t>karta</w:t>
+      </w:r>
+      <w:proofErr w:type="spellEnd"/>
+      <w:r>
+        <w:t xml:space="preserve"> </w:t>
+      </w:r>
+      <w:proofErr w:type="spellStart"/>
+      <w:r>
+        <w:t>rehta</w:t>
+      </w:r>
+      <w:proofErr w:type="spellEnd"/>
+      <w:r>
+        <w:t xml:space="preserve"> </w:t>
+      </w:r>
+      <w:proofErr w:type="spellStart"/>
+      <w:r>
+        <w:t>hai</w:t>
+      </w:r>
+      <w:proofErr w:type="spellEnd"/>
+      <w:r>
+        <w:t>.</w:t>
+      </w:r>
+      <w:r>
+        <w:pict w14:anchorId="14EBE4D8">
+          <v:rect id="_x0000_i1102" style="width:0;height:1.5pt" o:hralign="center" o:hrstd="t" o:hr="t" fillcolor="#a0a0a0" stroked="f"/>
+        </w:pict>
+      </w:r>
+    </w:p>
     <w:p/>
     <w:sectPr>
       <w:pgSz w:w="11906" w:h="16838"/>
@@ -16532,12 +18274,12 @@
 <w:numbering xmlns:wpc="http://schemas.microsoft.com/office/word/2010/wordprocessingCanvas" xmlns:cx="http://schemas.microsoft.com/office/drawing/2014/chartex" xmlns:cx1="http://schemas.microsoft.com/office/drawing/2015/9/8/chartex" xmlns:cx2="http://schemas.microsoft.com/office/drawing/2015/10/21/chartex" xmlns:cx3="http://schemas.microsoft.com/office/drawing/2016/5/9/chartex" xmlns:cx4="http://schemas.microsoft.com/office/drawing/2016/5/10/chartex" xmlns:cx5="http://schemas.microsoft.com/office/drawing/2016/5/11/chartex" xmlns:cx6="http://schemas.microsoft.com/office/drawing/2016/5/12/chartex" xmlns:cx7="http://schemas.microsoft.com/office/drawing/2016/5/13/chartex" xmlns:cx8="http://schemas.microsoft.com/office/drawing/2016/5/14/chartex" xmlns:mc="http://schemas.openxmlformats.org/markup-compatibility/2006" xmlns:aink="http://schemas.microsoft.com/office/drawing/2016/ink" xmlns:am3d="http://schemas.microsoft.com/office/drawing/2017/model3d" xmlns:o="urn:schemas-microsoft-com:office:office" xmlns:oel="http://schemas.microsoft.com/office/2019/extlst" xmlns:r="http://schemas.openxmlformats.org/officeDocument/2006/relationships" xmlns:m="http://schemas.openxmlformats.org/officeDocument/2006/math" xmlns:v="urn:schemas-microsoft-com:vml" xmlns:wp14="http://schemas.microsoft.com/office/word/2010/wordprocessingDrawing" xmlns:wp="http://schemas.openxmlformats.org/drawingml/2006/wordprocessingDrawing" xmlns:w10="urn:schemas-microsoft-com:office:word" xmlns:w="http://schemas.openxmlformats.org/wordprocessingml/2006/main" xmlns:w14="http://schemas.microsoft.com/office/word/2010/wordml" xmlns:w15="http://schemas.microsoft.com/office/word/2012/wordml" xmlns:w16cex="http://schemas.microsoft.com/office/word/2018/wordml/cex" xmlns:w16cid="http://schemas.microsoft.com/office/word/2016/wordml/cid" xmlns:w16="http://schemas.microsoft.com/office/word/2018/wordml" xmlns:w16du="http://schemas.microsoft.com/office/word/2023/wordml/word16du" xmlns:w16sdtdh="http://schemas.microsoft.com/office/word/2020/wordml/sdtdatahash" xmlns:w16sdtfl="http://schemas.microsoft.com/office/word/2024/wordml/sdtformatlock" xmlns:w16se="http://schemas.microsoft.com/office/word/2015/wordml/symex" xmlns:wpg="http://schemas.microsoft.com/office/word/2010/wordprocessingGroup" xmlns:wpi="http://schemas.microsoft.com/office/word/2010/wordprocessingInk" xmlns:wne="http://schemas.microsoft.com/office/word/2006/wordml" xmlns:wps="http://schemas.microsoft.com/office/word/2010/wordprocessingShape" mc:Ignorable="w14 w15 w16se w16cid w16 w16cex w16sdtdh w16sdtfl w16du wp14">
   <w:numPicBullet w:numPicBulletId="0">
     <w:pict>
-      <v:rect id="_x0000_i1046" style="width:0;height:1.5pt" o:hralign="center" o:bullet="t" o:hrstd="t" o:hr="t" fillcolor="#a0a0a0" stroked="f"/>
+      <v:rect id="_x0000_i1066" style="width:0;height:1.5pt" o:hralign="center" o:bullet="t" o:hrstd="t" o:hr="t" fillcolor="#a0a0a0" stroked="f"/>
     </w:pict>
   </w:numPicBullet>
   <w:numPicBullet w:numPicBulletId="1">
     <w:pict>
-      <v:rect id="_x0000_i1047" style="width:0;height:1.5pt" o:hralign="center" o:bullet="t" o:hrstd="t" o:hr="t" fillcolor="#a0a0a0" stroked="f"/>
+      <v:rect id="_x0000_i1067" style="width:0;height:1.5pt" o:hralign="center" o:bullet="t" o:hrstd="t" o:hr="t" fillcolor="#a0a0a0" stroked="f"/>
     </w:pict>
   </w:numPicBullet>
   <w:abstractNum w:abstractNumId="0" w15:restartNumberingAfterBreak="0">
@@ -16839,6 +18581,155 @@
     </w:lvl>
   </w:abstractNum>
   <w:abstractNum w:abstractNumId="2" w15:restartNumberingAfterBreak="0">
+    <w:nsid w:val="08D33FD0"/>
+    <w:multiLevelType w:val="multilevel"/>
+    <w:tmpl w:val="88328B72"/>
+    <w:lvl w:ilvl="0">
+      <w:start w:val="1"/>
+      <w:numFmt w:val="bullet"/>
+      <w:lvlText w:val=""/>
+      <w:lvlJc w:val="left"/>
+      <w:pPr>
+        <w:tabs>
+          <w:tab w:val="num" w:pos="720"/>
+        </w:tabs>
+        <w:ind w:left="720" w:hanging="360"/>
+      </w:pPr>
+      <w:rPr>
+        <w:rFonts w:ascii="Symbol" w:hAnsi="Symbol" w:hint="default"/>
+        <w:sz w:val="20"/>
+      </w:rPr>
+    </w:lvl>
+    <w:lvl w:ilvl="1" w:tentative="1">
+      <w:start w:val="1"/>
+      <w:numFmt w:val="bullet"/>
+      <w:lvlText w:val="o"/>
+      <w:lvlJc w:val="left"/>
+      <w:pPr>
+        <w:tabs>
+          <w:tab w:val="num" w:pos="1440"/>
+        </w:tabs>
+        <w:ind w:left="1440" w:hanging="360"/>
+      </w:pPr>
+      <w:rPr>
+        <w:rFonts w:ascii="Courier New" w:hAnsi="Courier New" w:hint="default"/>
+        <w:sz w:val="20"/>
+      </w:rPr>
+    </w:lvl>
+    <w:lvl w:ilvl="2" w:tentative="1">
+      <w:start w:val="1"/>
+      <w:numFmt w:val="bullet"/>
+      <w:lvlText w:val=""/>
+      <w:lvlJc w:val="left"/>
+      <w:pPr>
+        <w:tabs>
+          <w:tab w:val="num" w:pos="2160"/>
+        </w:tabs>
+        <w:ind w:left="2160" w:hanging="360"/>
+      </w:pPr>
+      <w:rPr>
+        <w:rFonts w:ascii="Wingdings" w:hAnsi="Wingdings" w:hint="default"/>
+        <w:sz w:val="20"/>
+      </w:rPr>
+    </w:lvl>
+    <w:lvl w:ilvl="3" w:tentative="1">
+      <w:start w:val="1"/>
+      <w:numFmt w:val="bullet"/>
+      <w:lvlText w:val=""/>
+      <w:lvlJc w:val="left"/>
+      <w:pPr>
+        <w:tabs>
+          <w:tab w:val="num" w:pos="2880"/>
+        </w:tabs>
+        <w:ind w:left="2880" w:hanging="360"/>
+      </w:pPr>
+      <w:rPr>
+        <w:rFonts w:ascii="Wingdings" w:hAnsi="Wingdings" w:hint="default"/>
+        <w:sz w:val="20"/>
+      </w:rPr>
+    </w:lvl>
+    <w:lvl w:ilvl="4" w:tentative="1">
+      <w:start w:val="1"/>
+      <w:numFmt w:val="bullet"/>
+      <w:lvlText w:val=""/>
+      <w:lvlJc w:val="left"/>
+      <w:pPr>
+        <w:tabs>
+          <w:tab w:val="num" w:pos="3600"/>
+        </w:tabs>
+        <w:ind w:left="3600" w:hanging="360"/>
+      </w:pPr>
+      <w:rPr>
+        <w:rFonts w:ascii="Wingdings" w:hAnsi="Wingdings" w:hint="default"/>
+        <w:sz w:val="20"/>
+      </w:rPr>
+    </w:lvl>
+    <w:lvl w:ilvl="5" w:tentative="1">
+      <w:start w:val="1"/>
+      <w:numFmt w:val="bullet"/>
+      <w:lvlText w:val=""/>
+      <w:lvlJc w:val="left"/>
+      <w:pPr>
+        <w:tabs>
+          <w:tab w:val="num" w:pos="4320"/>
+        </w:tabs>
+        <w:ind w:left="4320" w:hanging="360"/>
+      </w:pPr>
+      <w:rPr>
+        <w:rFonts w:ascii="Wingdings" w:hAnsi="Wingdings" w:hint="default"/>
+        <w:sz w:val="20"/>
+      </w:rPr>
+    </w:lvl>
+    <w:lvl w:ilvl="6" w:tentative="1">
+      <w:start w:val="1"/>
+      <w:numFmt w:val="bullet"/>
+      <w:lvlText w:val=""/>
+      <w:lvlJc w:val="left"/>
+      <w:pPr>
+        <w:tabs>
+          <w:tab w:val="num" w:pos="5040"/>
+        </w:tabs>
+        <w:ind w:left="5040" w:hanging="360"/>
+      </w:pPr>
+      <w:rPr>
+        <w:rFonts w:ascii="Wingdings" w:hAnsi="Wingdings" w:hint="default"/>
+        <w:sz w:val="20"/>
+      </w:rPr>
+    </w:lvl>
+    <w:lvl w:ilvl="7" w:tentative="1">
+      <w:start w:val="1"/>
+      <w:numFmt w:val="bullet"/>
+      <w:lvlText w:val=""/>
+      <w:lvlJc w:val="left"/>
+      <w:pPr>
+        <w:tabs>
+          <w:tab w:val="num" w:pos="5760"/>
+        </w:tabs>
+        <w:ind w:left="5760" w:hanging="360"/>
+      </w:pPr>
+      <w:rPr>
+        <w:rFonts w:ascii="Wingdings" w:hAnsi="Wingdings" w:hint="default"/>
+        <w:sz w:val="20"/>
+      </w:rPr>
+    </w:lvl>
+    <w:lvl w:ilvl="8" w:tentative="1">
+      <w:start w:val="1"/>
+      <w:numFmt w:val="bullet"/>
+      <w:lvlText w:val=""/>
+      <w:lvlJc w:val="left"/>
+      <w:pPr>
+        <w:tabs>
+          <w:tab w:val="num" w:pos="6480"/>
+        </w:tabs>
+        <w:ind w:left="6480" w:hanging="360"/>
+      </w:pPr>
+      <w:rPr>
+        <w:rFonts w:ascii="Wingdings" w:hAnsi="Wingdings" w:hint="default"/>
+        <w:sz w:val="20"/>
+      </w:rPr>
+    </w:lvl>
+  </w:abstractNum>
+  <w:abstractNum w:abstractNumId="3" w15:restartNumberingAfterBreak="0">
     <w:nsid w:val="096C22F2"/>
     <w:multiLevelType w:val="multilevel"/>
     <w:tmpl w:val="B3625C66"/>
@@ -16987,7 +18878,156 @@
       </w:rPr>
     </w:lvl>
   </w:abstractNum>
-  <w:abstractNum w:abstractNumId="3" w15:restartNumberingAfterBreak="0">
+  <w:abstractNum w:abstractNumId="4" w15:restartNumberingAfterBreak="0">
+    <w:nsid w:val="09ED04BA"/>
+    <w:multiLevelType w:val="multilevel"/>
+    <w:tmpl w:val="1D861FCC"/>
+    <w:lvl w:ilvl="0">
+      <w:start w:val="1"/>
+      <w:numFmt w:val="bullet"/>
+      <w:lvlText w:val=""/>
+      <w:lvlJc w:val="left"/>
+      <w:pPr>
+        <w:tabs>
+          <w:tab w:val="num" w:pos="720"/>
+        </w:tabs>
+        <w:ind w:left="720" w:hanging="360"/>
+      </w:pPr>
+      <w:rPr>
+        <w:rFonts w:ascii="Symbol" w:hAnsi="Symbol" w:hint="default"/>
+        <w:sz w:val="20"/>
+      </w:rPr>
+    </w:lvl>
+    <w:lvl w:ilvl="1" w:tentative="1">
+      <w:start w:val="1"/>
+      <w:numFmt w:val="bullet"/>
+      <w:lvlText w:val="o"/>
+      <w:lvlJc w:val="left"/>
+      <w:pPr>
+        <w:tabs>
+          <w:tab w:val="num" w:pos="1440"/>
+        </w:tabs>
+        <w:ind w:left="1440" w:hanging="360"/>
+      </w:pPr>
+      <w:rPr>
+        <w:rFonts w:ascii="Courier New" w:hAnsi="Courier New" w:hint="default"/>
+        <w:sz w:val="20"/>
+      </w:rPr>
+    </w:lvl>
+    <w:lvl w:ilvl="2" w:tentative="1">
+      <w:start w:val="1"/>
+      <w:numFmt w:val="bullet"/>
+      <w:lvlText w:val=""/>
+      <w:lvlJc w:val="left"/>
+      <w:pPr>
+        <w:tabs>
+          <w:tab w:val="num" w:pos="2160"/>
+        </w:tabs>
+        <w:ind w:left="2160" w:hanging="360"/>
+      </w:pPr>
+      <w:rPr>
+        <w:rFonts w:ascii="Wingdings" w:hAnsi="Wingdings" w:hint="default"/>
+        <w:sz w:val="20"/>
+      </w:rPr>
+    </w:lvl>
+    <w:lvl w:ilvl="3" w:tentative="1">
+      <w:start w:val="1"/>
+      <w:numFmt w:val="bullet"/>
+      <w:lvlText w:val=""/>
+      <w:lvlJc w:val="left"/>
+      <w:pPr>
+        <w:tabs>
+          <w:tab w:val="num" w:pos="2880"/>
+        </w:tabs>
+        <w:ind w:left="2880" w:hanging="360"/>
+      </w:pPr>
+      <w:rPr>
+        <w:rFonts w:ascii="Wingdings" w:hAnsi="Wingdings" w:hint="default"/>
+        <w:sz w:val="20"/>
+      </w:rPr>
+    </w:lvl>
+    <w:lvl w:ilvl="4" w:tentative="1">
+      <w:start w:val="1"/>
+      <w:numFmt w:val="bullet"/>
+      <w:lvlText w:val=""/>
+      <w:lvlJc w:val="left"/>
+      <w:pPr>
+        <w:tabs>
+          <w:tab w:val="num" w:pos="3600"/>
+        </w:tabs>
+        <w:ind w:left="3600" w:hanging="360"/>
+      </w:pPr>
+      <w:rPr>
+        <w:rFonts w:ascii="Wingdings" w:hAnsi="Wingdings" w:hint="default"/>
+        <w:sz w:val="20"/>
+      </w:rPr>
+    </w:lvl>
+    <w:lvl w:ilvl="5" w:tentative="1">
+      <w:start w:val="1"/>
+      <w:numFmt w:val="bullet"/>
+      <w:lvlText w:val=""/>
+      <w:lvlJc w:val="left"/>
+      <w:pPr>
+        <w:tabs>
+          <w:tab w:val="num" w:pos="4320"/>
+        </w:tabs>
+        <w:ind w:left="4320" w:hanging="360"/>
+      </w:pPr>
+      <w:rPr>
+        <w:rFonts w:ascii="Wingdings" w:hAnsi="Wingdings" w:hint="default"/>
+        <w:sz w:val="20"/>
+      </w:rPr>
+    </w:lvl>
+    <w:lvl w:ilvl="6" w:tentative="1">
+      <w:start w:val="1"/>
+      <w:numFmt w:val="bullet"/>
+      <w:lvlText w:val=""/>
+      <w:lvlJc w:val="left"/>
+      <w:pPr>
+        <w:tabs>
+          <w:tab w:val="num" w:pos="5040"/>
+        </w:tabs>
+        <w:ind w:left="5040" w:hanging="360"/>
+      </w:pPr>
+      <w:rPr>
+        <w:rFonts w:ascii="Wingdings" w:hAnsi="Wingdings" w:hint="default"/>
+        <w:sz w:val="20"/>
+      </w:rPr>
+    </w:lvl>
+    <w:lvl w:ilvl="7" w:tentative="1">
+      <w:start w:val="1"/>
+      <w:numFmt w:val="bullet"/>
+      <w:lvlText w:val=""/>
+      <w:lvlJc w:val="left"/>
+      <w:pPr>
+        <w:tabs>
+          <w:tab w:val="num" w:pos="5760"/>
+        </w:tabs>
+        <w:ind w:left="5760" w:hanging="360"/>
+      </w:pPr>
+      <w:rPr>
+        <w:rFonts w:ascii="Wingdings" w:hAnsi="Wingdings" w:hint="default"/>
+        <w:sz w:val="20"/>
+      </w:rPr>
+    </w:lvl>
+    <w:lvl w:ilvl="8" w:tentative="1">
+      <w:start w:val="1"/>
+      <w:numFmt w:val="bullet"/>
+      <w:lvlText w:val=""/>
+      <w:lvlJc w:val="left"/>
+      <w:pPr>
+        <w:tabs>
+          <w:tab w:val="num" w:pos="6480"/>
+        </w:tabs>
+        <w:ind w:left="6480" w:hanging="360"/>
+      </w:pPr>
+      <w:rPr>
+        <w:rFonts w:ascii="Wingdings" w:hAnsi="Wingdings" w:hint="default"/>
+        <w:sz w:val="20"/>
+      </w:rPr>
+    </w:lvl>
+  </w:abstractNum>
+  <w:abstractNum w:abstractNumId="5" w15:restartNumberingAfterBreak="0">
     <w:nsid w:val="0A7E2759"/>
     <w:multiLevelType w:val="multilevel"/>
     <w:tmpl w:val="5762C7D6"/>
@@ -17100,7 +19140,120 @@
       </w:pPr>
     </w:lvl>
   </w:abstractNum>
-  <w:abstractNum w:abstractNumId="4" w15:restartNumberingAfterBreak="0">
+  <w:abstractNum w:abstractNumId="6" w15:restartNumberingAfterBreak="0">
+    <w:nsid w:val="0B2D60C9"/>
+    <w:multiLevelType w:val="multilevel"/>
+    <w:tmpl w:val="7D3A80A2"/>
+    <w:lvl w:ilvl="0">
+      <w:start w:val="1"/>
+      <w:numFmt w:val="decimal"/>
+      <w:lvlText w:val="%1."/>
+      <w:lvlJc w:val="left"/>
+      <w:pPr>
+        <w:tabs>
+          <w:tab w:val="num" w:pos="720"/>
+        </w:tabs>
+        <w:ind w:left="720" w:hanging="360"/>
+      </w:pPr>
+    </w:lvl>
+    <w:lvl w:ilvl="1" w:tentative="1">
+      <w:start w:val="1"/>
+      <w:numFmt w:val="decimal"/>
+      <w:lvlText w:val="%2."/>
+      <w:lvlJc w:val="left"/>
+      <w:pPr>
+        <w:tabs>
+          <w:tab w:val="num" w:pos="1440"/>
+        </w:tabs>
+        <w:ind w:left="1440" w:hanging="360"/>
+      </w:pPr>
+    </w:lvl>
+    <w:lvl w:ilvl="2" w:tentative="1">
+      <w:start w:val="1"/>
+      <w:numFmt w:val="decimal"/>
+      <w:lvlText w:val="%3."/>
+      <w:lvlJc w:val="left"/>
+      <w:pPr>
+        <w:tabs>
+          <w:tab w:val="num" w:pos="2160"/>
+        </w:tabs>
+        <w:ind w:left="2160" w:hanging="360"/>
+      </w:pPr>
+    </w:lvl>
+    <w:lvl w:ilvl="3" w:tentative="1">
+      <w:start w:val="1"/>
+      <w:numFmt w:val="decimal"/>
+      <w:lvlText w:val="%4."/>
+      <w:lvlJc w:val="left"/>
+      <w:pPr>
+        <w:tabs>
+          <w:tab w:val="num" w:pos="2880"/>
+        </w:tabs>
+        <w:ind w:left="2880" w:hanging="360"/>
+      </w:pPr>
+    </w:lvl>
+    <w:lvl w:ilvl="4" w:tentative="1">
+      <w:start w:val="1"/>
+      <w:numFmt w:val="decimal"/>
+      <w:lvlText w:val="%5."/>
+      <w:lvlJc w:val="left"/>
+      <w:pPr>
+        <w:tabs>
+          <w:tab w:val="num" w:pos="3600"/>
+        </w:tabs>
+        <w:ind w:left="3600" w:hanging="360"/>
+      </w:pPr>
+    </w:lvl>
+    <w:lvl w:ilvl="5" w:tentative="1">
+      <w:start w:val="1"/>
+      <w:numFmt w:val="decimal"/>
+      <w:lvlText w:val="%6."/>
+      <w:lvlJc w:val="left"/>
+      <w:pPr>
+        <w:tabs>
+          <w:tab w:val="num" w:pos="4320"/>
+        </w:tabs>
+        <w:ind w:left="4320" w:hanging="360"/>
+      </w:pPr>
+    </w:lvl>
+    <w:lvl w:ilvl="6" w:tentative="1">
+      <w:start w:val="1"/>
+      <w:numFmt w:val="decimal"/>
+      <w:lvlText w:val="%7."/>
+      <w:lvlJc w:val="left"/>
+      <w:pPr>
+        <w:tabs>
+          <w:tab w:val="num" w:pos="5040"/>
+        </w:tabs>
+        <w:ind w:left="5040" w:hanging="360"/>
+      </w:pPr>
+    </w:lvl>
+    <w:lvl w:ilvl="7" w:tentative="1">
+      <w:start w:val="1"/>
+      <w:numFmt w:val="decimal"/>
+      <w:lvlText w:val="%8."/>
+      <w:lvlJc w:val="left"/>
+      <w:pPr>
+        <w:tabs>
+          <w:tab w:val="num" w:pos="5760"/>
+        </w:tabs>
+        <w:ind w:left="5760" w:hanging="360"/>
+      </w:pPr>
+    </w:lvl>
+    <w:lvl w:ilvl="8" w:tentative="1">
+      <w:start w:val="1"/>
+      <w:numFmt w:val="decimal"/>
+      <w:lvlText w:val="%9."/>
+      <w:lvlJc w:val="left"/>
+      <w:pPr>
+        <w:tabs>
+          <w:tab w:val="num" w:pos="6480"/>
+        </w:tabs>
+        <w:ind w:left="6480" w:hanging="360"/>
+      </w:pPr>
+    </w:lvl>
+  </w:abstractNum>
+  <w:abstractNum w:abstractNumId="7" w15:restartNumberingAfterBreak="0">
     <w:nsid w:val="0CB8336F"/>
     <w:multiLevelType w:val="multilevel"/>
     <w:tmpl w:val="D2BABCD6"/>
@@ -17249,7 +19402,7 @@
       </w:rPr>
     </w:lvl>
   </w:abstractNum>
-  <w:abstractNum w:abstractNumId="5" w15:restartNumberingAfterBreak="0">
+  <w:abstractNum w:abstractNumId="8" w15:restartNumberingAfterBreak="0">
     <w:nsid w:val="0EF45C76"/>
     <w:multiLevelType w:val="multilevel"/>
     <w:tmpl w:val="BCCC5AD6"/>
@@ -17398,7 +19551,7 @@
       </w:rPr>
     </w:lvl>
   </w:abstractNum>
-  <w:abstractNum w:abstractNumId="6" w15:restartNumberingAfterBreak="0">
+  <w:abstractNum w:abstractNumId="9" w15:restartNumberingAfterBreak="0">
     <w:nsid w:val="0F4A44EE"/>
     <w:multiLevelType w:val="multilevel"/>
     <w:tmpl w:val="54D281CE"/>
@@ -17547,7 +19700,7 @@
       </w:rPr>
     </w:lvl>
   </w:abstractNum>
-  <w:abstractNum w:abstractNumId="7" w15:restartNumberingAfterBreak="0">
+  <w:abstractNum w:abstractNumId="10" w15:restartNumberingAfterBreak="0">
     <w:nsid w:val="11064EE4"/>
     <w:multiLevelType w:val="multilevel"/>
     <w:tmpl w:val="83F86878"/>
@@ -17660,7 +19813,7 @@
       </w:pPr>
     </w:lvl>
   </w:abstractNum>
-  <w:abstractNum w:abstractNumId="8" w15:restartNumberingAfterBreak="0">
+  <w:abstractNum w:abstractNumId="11" w15:restartNumberingAfterBreak="0">
     <w:nsid w:val="146754DF"/>
     <w:multiLevelType w:val="multilevel"/>
     <w:tmpl w:val="82881C24"/>
@@ -17809,7 +19962,7 @@
       </w:rPr>
     </w:lvl>
   </w:abstractNum>
-  <w:abstractNum w:abstractNumId="9" w15:restartNumberingAfterBreak="0">
+  <w:abstractNum w:abstractNumId="12" w15:restartNumberingAfterBreak="0">
     <w:nsid w:val="14831423"/>
     <w:multiLevelType w:val="multilevel"/>
     <w:tmpl w:val="6142A946"/>
@@ -17954,7 +20107,7 @@
       </w:rPr>
     </w:lvl>
   </w:abstractNum>
-  <w:abstractNum w:abstractNumId="10" w15:restartNumberingAfterBreak="0">
+  <w:abstractNum w:abstractNumId="13" w15:restartNumberingAfterBreak="0">
     <w:nsid w:val="17387F48"/>
     <w:multiLevelType w:val="multilevel"/>
     <w:tmpl w:val="827A1642"/>
@@ -18103,7 +20256,7 @@
       </w:rPr>
     </w:lvl>
   </w:abstractNum>
-  <w:abstractNum w:abstractNumId="11" w15:restartNumberingAfterBreak="0">
+  <w:abstractNum w:abstractNumId="14" w15:restartNumberingAfterBreak="0">
     <w:nsid w:val="1B9E2DC0"/>
     <w:multiLevelType w:val="multilevel"/>
     <w:tmpl w:val="9E1C2A48"/>
@@ -18216,7 +20369,7 @@
       </w:pPr>
     </w:lvl>
   </w:abstractNum>
-  <w:abstractNum w:abstractNumId="12" w15:restartNumberingAfterBreak="0">
+  <w:abstractNum w:abstractNumId="15" w15:restartNumberingAfterBreak="0">
     <w:nsid w:val="22344C3B"/>
     <w:multiLevelType w:val="multilevel"/>
     <w:tmpl w:val="8DBE15BE"/>
@@ -18365,7 +20518,7 @@
       </w:rPr>
     </w:lvl>
   </w:abstractNum>
-  <w:abstractNum w:abstractNumId="13" w15:restartNumberingAfterBreak="0">
+  <w:abstractNum w:abstractNumId="16" w15:restartNumberingAfterBreak="0">
     <w:nsid w:val="23006C20"/>
     <w:multiLevelType w:val="multilevel"/>
     <w:tmpl w:val="98381408"/>
@@ -18514,7 +20667,7 @@
       </w:rPr>
     </w:lvl>
   </w:abstractNum>
-  <w:abstractNum w:abstractNumId="14" w15:restartNumberingAfterBreak="0">
+  <w:abstractNum w:abstractNumId="17" w15:restartNumberingAfterBreak="0">
     <w:nsid w:val="257838BF"/>
     <w:multiLevelType w:val="multilevel"/>
     <w:tmpl w:val="931E5548"/>
@@ -18663,7 +20816,7 @@
       </w:rPr>
     </w:lvl>
   </w:abstractNum>
-  <w:abstractNum w:abstractNumId="15" w15:restartNumberingAfterBreak="0">
+  <w:abstractNum w:abstractNumId="18" w15:restartNumberingAfterBreak="0">
     <w:nsid w:val="284349D0"/>
     <w:multiLevelType w:val="multilevel"/>
     <w:tmpl w:val="D36A1922"/>
@@ -18776,7 +20929,7 @@
       </w:pPr>
     </w:lvl>
   </w:abstractNum>
-  <w:abstractNum w:abstractNumId="16" w15:restartNumberingAfterBreak="0">
+  <w:abstractNum w:abstractNumId="19" w15:restartNumberingAfterBreak="0">
     <w:nsid w:val="29F31054"/>
     <w:multiLevelType w:val="multilevel"/>
     <w:tmpl w:val="357C58B0"/>
@@ -18925,7 +21078,269 @@
       </w:rPr>
     </w:lvl>
   </w:abstractNum>
-  <w:abstractNum w:abstractNumId="17" w15:restartNumberingAfterBreak="0">
+  <w:abstractNum w:abstractNumId="20" w15:restartNumberingAfterBreak="0">
+    <w:nsid w:val="2BF47506"/>
+    <w:multiLevelType w:val="multilevel"/>
+    <w:tmpl w:val="8040AAB4"/>
+    <w:lvl w:ilvl="0">
+      <w:start w:val="1"/>
+      <w:numFmt w:val="bullet"/>
+      <w:lvlText w:val=""/>
+      <w:lvlJc w:val="left"/>
+      <w:pPr>
+        <w:tabs>
+          <w:tab w:val="num" w:pos="720"/>
+        </w:tabs>
+        <w:ind w:left="720" w:hanging="360"/>
+      </w:pPr>
+      <w:rPr>
+        <w:rFonts w:ascii="Symbol" w:hAnsi="Symbol" w:hint="default"/>
+        <w:sz w:val="20"/>
+      </w:rPr>
+    </w:lvl>
+    <w:lvl w:ilvl="1" w:tentative="1">
+      <w:start w:val="1"/>
+      <w:numFmt w:val="bullet"/>
+      <w:lvlText w:val="o"/>
+      <w:lvlJc w:val="left"/>
+      <w:pPr>
+        <w:tabs>
+          <w:tab w:val="num" w:pos="1440"/>
+        </w:tabs>
+        <w:ind w:left="1440" w:hanging="360"/>
+      </w:pPr>
+      <w:rPr>
+        <w:rFonts w:ascii="Courier New" w:hAnsi="Courier New" w:hint="default"/>
+        <w:sz w:val="20"/>
+      </w:rPr>
+    </w:lvl>
+    <w:lvl w:ilvl="2" w:tentative="1">
+      <w:start w:val="1"/>
+      <w:numFmt w:val="bullet"/>
+      <w:lvlText w:val=""/>
+      <w:lvlJc w:val="left"/>
+      <w:pPr>
+        <w:tabs>
+          <w:tab w:val="num" w:pos="2160"/>
+        </w:tabs>
+        <w:ind w:left="2160" w:hanging="360"/>
+      </w:pPr>
+      <w:rPr>
+        <w:rFonts w:ascii="Wingdings" w:hAnsi="Wingdings" w:hint="default"/>
+        <w:sz w:val="20"/>
+      </w:rPr>
+    </w:lvl>
+    <w:lvl w:ilvl="3" w:tentative="1">
+      <w:start w:val="1"/>
+      <w:numFmt w:val="bullet"/>
+      <w:lvlText w:val=""/>
+      <w:lvlJc w:val="left"/>
+      <w:pPr>
+        <w:tabs>
+          <w:tab w:val="num" w:pos="2880"/>
+        </w:tabs>
+        <w:ind w:left="2880" w:hanging="360"/>
+      </w:pPr>
+      <w:rPr>
+        <w:rFonts w:ascii="Wingdings" w:hAnsi="Wingdings" w:hint="default"/>
+        <w:sz w:val="20"/>
+      </w:rPr>
+    </w:lvl>
+    <w:lvl w:ilvl="4" w:tentative="1">
+      <w:start w:val="1"/>
+      <w:numFmt w:val="bullet"/>
+      <w:lvlText w:val=""/>
+      <w:lvlJc w:val="left"/>
+      <w:pPr>
+        <w:tabs>
+          <w:tab w:val="num" w:pos="3600"/>
+        </w:tabs>
+        <w:ind w:left="3600" w:hanging="360"/>
+      </w:pPr>
+      <w:rPr>
+        <w:rFonts w:ascii="Wingdings" w:hAnsi="Wingdings" w:hint="default"/>
+        <w:sz w:val="20"/>
+      </w:rPr>
+    </w:lvl>
+    <w:lvl w:ilvl="5" w:tentative="1">
+      <w:start w:val="1"/>
+      <w:numFmt w:val="bullet"/>
+      <w:lvlText w:val=""/>
+      <w:lvlJc w:val="left"/>
+      <w:pPr>
+        <w:tabs>
+          <w:tab w:val="num" w:pos="4320"/>
+        </w:tabs>
+        <w:ind w:left="4320" w:hanging="360"/>
+      </w:pPr>
+      <w:rPr>
+        <w:rFonts w:ascii="Wingdings" w:hAnsi="Wingdings" w:hint="default"/>
+        <w:sz w:val="20"/>
+      </w:rPr>
+    </w:lvl>
+    <w:lvl w:ilvl="6" w:tentative="1">
+      <w:start w:val="1"/>
+      <w:numFmt w:val="bullet"/>
+      <w:lvlText w:val=""/>
+      <w:lvlJc w:val="left"/>
+      <w:pPr>
+        <w:tabs>
+          <w:tab w:val="num" w:pos="5040"/>
+        </w:tabs>
+        <w:ind w:left="5040" w:hanging="360"/>
+      </w:pPr>
+      <w:rPr>
+        <w:rFonts w:ascii="Wingdings" w:hAnsi="Wingdings" w:hint="default"/>
+        <w:sz w:val="20"/>
+      </w:rPr>
+    </w:lvl>
+    <w:lvl w:ilvl="7" w:tentative="1">
+      <w:start w:val="1"/>
+      <w:numFmt w:val="bullet"/>
+      <w:lvlText w:val=""/>
+      <w:lvlJc w:val="left"/>
+      <w:pPr>
+        <w:tabs>
+          <w:tab w:val="num" w:pos="5760"/>
+        </w:tabs>
+        <w:ind w:left="5760" w:hanging="360"/>
+      </w:pPr>
+      <w:rPr>
+        <w:rFonts w:ascii="Wingdings" w:hAnsi="Wingdings" w:hint="default"/>
+        <w:sz w:val="20"/>
+      </w:rPr>
+    </w:lvl>
+    <w:lvl w:ilvl="8" w:tentative="1">
+      <w:start w:val="1"/>
+      <w:numFmt w:val="bullet"/>
+      <w:lvlText w:val=""/>
+      <w:lvlJc w:val="left"/>
+      <w:pPr>
+        <w:tabs>
+          <w:tab w:val="num" w:pos="6480"/>
+        </w:tabs>
+        <w:ind w:left="6480" w:hanging="360"/>
+      </w:pPr>
+      <w:rPr>
+        <w:rFonts w:ascii="Wingdings" w:hAnsi="Wingdings" w:hint="default"/>
+        <w:sz w:val="20"/>
+      </w:rPr>
+    </w:lvl>
+  </w:abstractNum>
+  <w:abstractNum w:abstractNumId="21" w15:restartNumberingAfterBreak="0">
+    <w:nsid w:val="2D026B30"/>
+    <w:multiLevelType w:val="multilevel"/>
+    <w:tmpl w:val="BE38EFC6"/>
+    <w:lvl w:ilvl="0">
+      <w:start w:val="1"/>
+      <w:numFmt w:val="decimal"/>
+      <w:lvlText w:val="%1."/>
+      <w:lvlJc w:val="left"/>
+      <w:pPr>
+        <w:tabs>
+          <w:tab w:val="num" w:pos="720"/>
+        </w:tabs>
+        <w:ind w:left="720" w:hanging="360"/>
+      </w:pPr>
+    </w:lvl>
+    <w:lvl w:ilvl="1" w:tentative="1">
+      <w:start w:val="1"/>
+      <w:numFmt w:val="decimal"/>
+      <w:lvlText w:val="%2."/>
+      <w:lvlJc w:val="left"/>
+      <w:pPr>
+        <w:tabs>
+          <w:tab w:val="num" w:pos="1440"/>
+        </w:tabs>
+        <w:ind w:left="1440" w:hanging="360"/>
+      </w:pPr>
+    </w:lvl>
+    <w:lvl w:ilvl="2" w:tentative="1">
+      <w:start w:val="1"/>
+      <w:numFmt w:val="decimal"/>
+      <w:lvlText w:val="%3."/>
+      <w:lvlJc w:val="left"/>
+      <w:pPr>
+        <w:tabs>
+          <w:tab w:val="num" w:pos="2160"/>
+        </w:tabs>
+        <w:ind w:left="2160" w:hanging="360"/>
+      </w:pPr>
+    </w:lvl>
+    <w:lvl w:ilvl="3" w:tentative="1">
+      <w:start w:val="1"/>
+      <w:numFmt w:val="decimal"/>
+      <w:lvlText w:val="%4."/>
+      <w:lvlJc w:val="left"/>
+      <w:pPr>
+        <w:tabs>
+          <w:tab w:val="num" w:pos="2880"/>
+        </w:tabs>
+        <w:ind w:left="2880" w:hanging="360"/>
+      </w:pPr>
+    </w:lvl>
+    <w:lvl w:ilvl="4" w:tentative="1">
+      <w:start w:val="1"/>
+      <w:numFmt w:val="decimal"/>
+      <w:lvlText w:val="%5."/>
+      <w:lvlJc w:val="left"/>
+      <w:pPr>
+        <w:tabs>
+          <w:tab w:val="num" w:pos="3600"/>
+        </w:tabs>
+        <w:ind w:left="3600" w:hanging="360"/>
+      </w:pPr>
+    </w:lvl>
+    <w:lvl w:ilvl="5" w:tentative="1">
+      <w:start w:val="1"/>
+      <w:numFmt w:val="decimal"/>
+      <w:lvlText w:val="%6."/>
+      <w:lvlJc w:val="left"/>
+      <w:pPr>
+        <w:tabs>
+          <w:tab w:val="num" w:pos="4320"/>
+        </w:tabs>
+        <w:ind w:left="4320" w:hanging="360"/>
+      </w:pPr>
+    </w:lvl>
+    <w:lvl w:ilvl="6" w:tentative="1">
+      <w:start w:val="1"/>
+      <w:numFmt w:val="decimal"/>
+      <w:lvlText w:val="%7."/>
+      <w:lvlJc w:val="left"/>
+      <w:pPr>
+        <w:tabs>
+          <w:tab w:val="num" w:pos="5040"/>
+        </w:tabs>
+        <w:ind w:left="5040" w:hanging="360"/>
+      </w:pPr>
+    </w:lvl>
+    <w:lvl w:ilvl="7" w:tentative="1">
+      <w:start w:val="1"/>
+      <w:numFmt w:val="decimal"/>
+      <w:lvlText w:val="%8."/>
+      <w:lvlJc w:val="left"/>
+      <w:pPr>
+        <w:tabs>
+          <w:tab w:val="num" w:pos="5760"/>
+        </w:tabs>
+        <w:ind w:left="5760" w:hanging="360"/>
+      </w:pPr>
+    </w:lvl>
+    <w:lvl w:ilvl="8" w:tentative="1">
+      <w:start w:val="1"/>
+      <w:numFmt w:val="decimal"/>
+      <w:lvlText w:val="%9."/>
+      <w:lvlJc w:val="left"/>
+      <w:pPr>
+        <w:tabs>
+          <w:tab w:val="num" w:pos="6480"/>
+        </w:tabs>
+        <w:ind w:left="6480" w:hanging="360"/>
+      </w:pPr>
+    </w:lvl>
+  </w:abstractNum>
+  <w:abstractNum w:abstractNumId="22" w15:restartNumberingAfterBreak="0">
     <w:nsid w:val="328F4473"/>
     <w:multiLevelType w:val="multilevel"/>
     <w:tmpl w:val="3F7616B4"/>
@@ -19074,7 +21489,7 @@
       </w:rPr>
     </w:lvl>
   </w:abstractNum>
-  <w:abstractNum w:abstractNumId="18" w15:restartNumberingAfterBreak="0">
+  <w:abstractNum w:abstractNumId="23" w15:restartNumberingAfterBreak="0">
     <w:nsid w:val="33923578"/>
     <w:multiLevelType w:val="multilevel"/>
     <w:tmpl w:val="EB42FD92"/>
@@ -19223,7 +21638,7 @@
       </w:rPr>
     </w:lvl>
   </w:abstractNum>
-  <w:abstractNum w:abstractNumId="19" w15:restartNumberingAfterBreak="0">
+  <w:abstractNum w:abstractNumId="24" w15:restartNumberingAfterBreak="0">
     <w:nsid w:val="35EE1AD9"/>
     <w:multiLevelType w:val="multilevel"/>
     <w:tmpl w:val="52063FB2"/>
@@ -19372,7 +21787,7 @@
       </w:rPr>
     </w:lvl>
   </w:abstractNum>
-  <w:abstractNum w:abstractNumId="20" w15:restartNumberingAfterBreak="0">
+  <w:abstractNum w:abstractNumId="25" w15:restartNumberingAfterBreak="0">
     <w:nsid w:val="36644E19"/>
     <w:multiLevelType w:val="multilevel"/>
     <w:tmpl w:val="9C0E3822"/>
@@ -19521,7 +21936,156 @@
       </w:rPr>
     </w:lvl>
   </w:abstractNum>
-  <w:abstractNum w:abstractNumId="21" w15:restartNumberingAfterBreak="0">
+  <w:abstractNum w:abstractNumId="26" w15:restartNumberingAfterBreak="0">
+    <w:nsid w:val="3A341981"/>
+    <w:multiLevelType w:val="multilevel"/>
+    <w:tmpl w:val="5E68283A"/>
+    <w:lvl w:ilvl="0">
+      <w:start w:val="1"/>
+      <w:numFmt w:val="bullet"/>
+      <w:lvlText w:val=""/>
+      <w:lvlJc w:val="left"/>
+      <w:pPr>
+        <w:tabs>
+          <w:tab w:val="num" w:pos="720"/>
+        </w:tabs>
+        <w:ind w:left="720" w:hanging="360"/>
+      </w:pPr>
+      <w:rPr>
+        <w:rFonts w:ascii="Symbol" w:hAnsi="Symbol" w:hint="default"/>
+        <w:sz w:val="20"/>
+      </w:rPr>
+    </w:lvl>
+    <w:lvl w:ilvl="1" w:tentative="1">
+      <w:start w:val="1"/>
+      <w:numFmt w:val="bullet"/>
+      <w:lvlText w:val="o"/>
+      <w:lvlJc w:val="left"/>
+      <w:pPr>
+        <w:tabs>
+          <w:tab w:val="num" w:pos="1440"/>
+        </w:tabs>
+        <w:ind w:left="1440" w:hanging="360"/>
+      </w:pPr>
+      <w:rPr>
+        <w:rFonts w:ascii="Courier New" w:hAnsi="Courier New" w:hint="default"/>
+        <w:sz w:val="20"/>
+      </w:rPr>
+    </w:lvl>
+    <w:lvl w:ilvl="2" w:tentative="1">
+      <w:start w:val="1"/>
+      <w:numFmt w:val="bullet"/>
+      <w:lvlText w:val=""/>
+      <w:lvlJc w:val="left"/>
+      <w:pPr>
+        <w:tabs>
+          <w:tab w:val="num" w:pos="2160"/>
+        </w:tabs>
+        <w:ind w:left="2160" w:hanging="360"/>
+      </w:pPr>
+      <w:rPr>
+        <w:rFonts w:ascii="Wingdings" w:hAnsi="Wingdings" w:hint="default"/>
+        <w:sz w:val="20"/>
+      </w:rPr>
+    </w:lvl>
+    <w:lvl w:ilvl="3" w:tentative="1">
+      <w:start w:val="1"/>
+      <w:numFmt w:val="bullet"/>
+      <w:lvlText w:val=""/>
+      <w:lvlJc w:val="left"/>
+      <w:pPr>
+        <w:tabs>
+          <w:tab w:val="num" w:pos="2880"/>
+        </w:tabs>
+        <w:ind w:left="2880" w:hanging="360"/>
+      </w:pPr>
+      <w:rPr>
+        <w:rFonts w:ascii="Wingdings" w:hAnsi="Wingdings" w:hint="default"/>
+        <w:sz w:val="20"/>
+      </w:rPr>
+    </w:lvl>
+    <w:lvl w:ilvl="4" w:tentative="1">
+      <w:start w:val="1"/>
+      <w:numFmt w:val="bullet"/>
+      <w:lvlText w:val=""/>
+      <w:lvlJc w:val="left"/>
+      <w:pPr>
+        <w:tabs>
+          <w:tab w:val="num" w:pos="3600"/>
+        </w:tabs>
+        <w:ind w:left="3600" w:hanging="360"/>
+      </w:pPr>
+      <w:rPr>
+        <w:rFonts w:ascii="Wingdings" w:hAnsi="Wingdings" w:hint="default"/>
+        <w:sz w:val="20"/>
+      </w:rPr>
+    </w:lvl>
+    <w:lvl w:ilvl="5" w:tentative="1">
+      <w:start w:val="1"/>
+      <w:numFmt w:val="bullet"/>
+      <w:lvlText w:val=""/>
+      <w:lvlJc w:val="left"/>
+      <w:pPr>
+        <w:tabs>
+          <w:tab w:val="num" w:pos="4320"/>
+        </w:tabs>
+        <w:ind w:left="4320" w:hanging="360"/>
+      </w:pPr>
+      <w:rPr>
+        <w:rFonts w:ascii="Wingdings" w:hAnsi="Wingdings" w:hint="default"/>
+        <w:sz w:val="20"/>
+      </w:rPr>
+    </w:lvl>
+    <w:lvl w:ilvl="6" w:tentative="1">
+      <w:start w:val="1"/>
+      <w:numFmt w:val="bullet"/>
+      <w:lvlText w:val=""/>
+      <w:lvlJc w:val="left"/>
+      <w:pPr>
+        <w:tabs>
+          <w:tab w:val="num" w:pos="5040"/>
+        </w:tabs>
+        <w:ind w:left="5040" w:hanging="360"/>
+      </w:pPr>
+      <w:rPr>
+        <w:rFonts w:ascii="Wingdings" w:hAnsi="Wingdings" w:hint="default"/>
+        <w:sz w:val="20"/>
+      </w:rPr>
+    </w:lvl>
+    <w:lvl w:ilvl="7" w:tentative="1">
+      <w:start w:val="1"/>
+      <w:numFmt w:val="bullet"/>
+      <w:lvlText w:val=""/>
+      <w:lvlJc w:val="left"/>
+      <w:pPr>
+        <w:tabs>
+          <w:tab w:val="num" w:pos="5760"/>
+        </w:tabs>
+        <w:ind w:left="5760" w:hanging="360"/>
+      </w:pPr>
+      <w:rPr>
+        <w:rFonts w:ascii="Wingdings" w:hAnsi="Wingdings" w:hint="default"/>
+        <w:sz w:val="20"/>
+      </w:rPr>
+    </w:lvl>
+    <w:lvl w:ilvl="8" w:tentative="1">
+      <w:start w:val="1"/>
+      <w:numFmt w:val="bullet"/>
+      <w:lvlText w:val=""/>
+      <w:lvlJc w:val="left"/>
+      <w:pPr>
+        <w:tabs>
+          <w:tab w:val="num" w:pos="6480"/>
+        </w:tabs>
+        <w:ind w:left="6480" w:hanging="360"/>
+      </w:pPr>
+      <w:rPr>
+        <w:rFonts w:ascii="Wingdings" w:hAnsi="Wingdings" w:hint="default"/>
+        <w:sz w:val="20"/>
+      </w:rPr>
+    </w:lvl>
+  </w:abstractNum>
+  <w:abstractNum w:abstractNumId="27" w15:restartNumberingAfterBreak="0">
     <w:nsid w:val="3C763A2D"/>
     <w:multiLevelType w:val="multilevel"/>
     <w:tmpl w:val="373A1C18"/>
@@ -19670,7 +22234,7 @@
       </w:rPr>
     </w:lvl>
   </w:abstractNum>
-  <w:abstractNum w:abstractNumId="22" w15:restartNumberingAfterBreak="0">
+  <w:abstractNum w:abstractNumId="28" w15:restartNumberingAfterBreak="0">
     <w:nsid w:val="3F991AB3"/>
     <w:multiLevelType w:val="multilevel"/>
     <w:tmpl w:val="D7C07BB0"/>
@@ -19819,7 +22383,7 @@
       </w:rPr>
     </w:lvl>
   </w:abstractNum>
-  <w:abstractNum w:abstractNumId="23" w15:restartNumberingAfterBreak="0">
+  <w:abstractNum w:abstractNumId="29" w15:restartNumberingAfterBreak="0">
     <w:nsid w:val="41FF10EF"/>
     <w:multiLevelType w:val="multilevel"/>
     <w:tmpl w:val="A5008A5C"/>
@@ -19968,7 +22532,7 @@
       </w:rPr>
     </w:lvl>
   </w:abstractNum>
-  <w:abstractNum w:abstractNumId="24" w15:restartNumberingAfterBreak="0">
+  <w:abstractNum w:abstractNumId="30" w15:restartNumberingAfterBreak="0">
     <w:nsid w:val="4A9D2491"/>
     <w:multiLevelType w:val="multilevel"/>
     <w:tmpl w:val="17F68EBC"/>
@@ -20117,7 +22681,7 @@
       </w:rPr>
     </w:lvl>
   </w:abstractNum>
-  <w:abstractNum w:abstractNumId="25" w15:restartNumberingAfterBreak="0">
+  <w:abstractNum w:abstractNumId="31" w15:restartNumberingAfterBreak="0">
     <w:nsid w:val="53B754AC"/>
     <w:multiLevelType w:val="multilevel"/>
     <w:tmpl w:val="0854C724"/>
@@ -20266,7 +22830,7 @@
       </w:rPr>
     </w:lvl>
   </w:abstractNum>
-  <w:abstractNum w:abstractNumId="26" w15:restartNumberingAfterBreak="0">
+  <w:abstractNum w:abstractNumId="32" w15:restartNumberingAfterBreak="0">
     <w:nsid w:val="55FC7277"/>
     <w:multiLevelType w:val="multilevel"/>
     <w:tmpl w:val="FCEED21E"/>
@@ -20379,7 +22943,7 @@
       </w:pPr>
     </w:lvl>
   </w:abstractNum>
-  <w:abstractNum w:abstractNumId="27" w15:restartNumberingAfterBreak="0">
+  <w:abstractNum w:abstractNumId="33" w15:restartNumberingAfterBreak="0">
     <w:nsid w:val="5A3741C6"/>
     <w:multiLevelType w:val="multilevel"/>
     <w:tmpl w:val="F5BA7EFE"/>
@@ -20528,7 +23092,7 @@
       </w:rPr>
     </w:lvl>
   </w:abstractNum>
-  <w:abstractNum w:abstractNumId="28" w15:restartNumberingAfterBreak="0">
+  <w:abstractNum w:abstractNumId="34" w15:restartNumberingAfterBreak="0">
     <w:nsid w:val="5C5023A8"/>
     <w:multiLevelType w:val="multilevel"/>
     <w:tmpl w:val="3E7EEADA"/>
@@ -20677,7 +23241,7 @@
       </w:rPr>
     </w:lvl>
   </w:abstractNum>
-  <w:abstractNum w:abstractNumId="29" w15:restartNumberingAfterBreak="0">
+  <w:abstractNum w:abstractNumId="35" w15:restartNumberingAfterBreak="0">
     <w:nsid w:val="5CC41962"/>
     <w:multiLevelType w:val="multilevel"/>
     <w:tmpl w:val="F98AD5E6"/>
@@ -20826,7 +23390,7 @@
       </w:rPr>
     </w:lvl>
   </w:abstractNum>
-  <w:abstractNum w:abstractNumId="30" w15:restartNumberingAfterBreak="0">
+  <w:abstractNum w:abstractNumId="36" w15:restartNumberingAfterBreak="0">
     <w:nsid w:val="64264E9A"/>
     <w:multiLevelType w:val="multilevel"/>
     <w:tmpl w:val="4196AC08"/>
@@ -20939,7 +23503,156 @@
       </w:pPr>
     </w:lvl>
   </w:abstractNum>
-  <w:abstractNum w:abstractNumId="31" w15:restartNumberingAfterBreak="0">
+  <w:abstractNum w:abstractNumId="37" w15:restartNumberingAfterBreak="0">
+    <w:nsid w:val="66175DC8"/>
+    <w:multiLevelType w:val="multilevel"/>
+    <w:tmpl w:val="07EEAD78"/>
+    <w:lvl w:ilvl="0">
+      <w:start w:val="1"/>
+      <w:numFmt w:val="bullet"/>
+      <w:lvlText w:val=""/>
+      <w:lvlJc w:val="left"/>
+      <w:pPr>
+        <w:tabs>
+          <w:tab w:val="num" w:pos="720"/>
+        </w:tabs>
+        <w:ind w:left="720" w:hanging="360"/>
+      </w:pPr>
+      <w:rPr>
+        <w:rFonts w:ascii="Symbol" w:hAnsi="Symbol" w:hint="default"/>
+        <w:sz w:val="20"/>
+      </w:rPr>
+    </w:lvl>
+    <w:lvl w:ilvl="1">
+      <w:start w:val="1"/>
+      <w:numFmt w:val="bullet"/>
+      <w:lvlText w:val="o"/>
+      <w:lvlJc w:val="left"/>
+      <w:pPr>
+        <w:tabs>
+          <w:tab w:val="num" w:pos="1440"/>
+        </w:tabs>
+        <w:ind w:left="1440" w:hanging="360"/>
+      </w:pPr>
+      <w:rPr>
+        <w:rFonts w:ascii="Courier New" w:hAnsi="Courier New" w:hint="default"/>
+        <w:sz w:val="20"/>
+      </w:rPr>
+    </w:lvl>
+    <w:lvl w:ilvl="2" w:tentative="1">
+      <w:start w:val="1"/>
+      <w:numFmt w:val="bullet"/>
+      <w:lvlText w:val=""/>
+      <w:lvlJc w:val="left"/>
+      <w:pPr>
+        <w:tabs>
+          <w:tab w:val="num" w:pos="2160"/>
+        </w:tabs>
+        <w:ind w:left="2160" w:hanging="360"/>
+      </w:pPr>
+      <w:rPr>
+        <w:rFonts w:ascii="Wingdings" w:hAnsi="Wingdings" w:hint="default"/>
+        <w:sz w:val="20"/>
+      </w:rPr>
+    </w:lvl>
+    <w:lvl w:ilvl="3" w:tentative="1">
+      <w:start w:val="1"/>
+      <w:numFmt w:val="bullet"/>
+      <w:lvlText w:val=""/>
+      <w:lvlJc w:val="left"/>
+      <w:pPr>
+        <w:tabs>
+          <w:tab w:val="num" w:pos="2880"/>
+        </w:tabs>
+        <w:ind w:left="2880" w:hanging="360"/>
+      </w:pPr>
+      <w:rPr>
+        <w:rFonts w:ascii="Wingdings" w:hAnsi="Wingdings" w:hint="default"/>
+        <w:sz w:val="20"/>
+      </w:rPr>
+    </w:lvl>
+    <w:lvl w:ilvl="4" w:tentative="1">
+      <w:start w:val="1"/>
+      <w:numFmt w:val="bullet"/>
+      <w:lvlText w:val=""/>
+      <w:lvlJc w:val="left"/>
+      <w:pPr>
+        <w:tabs>
+          <w:tab w:val="num" w:pos="3600"/>
+        </w:tabs>
+        <w:ind w:left="3600" w:hanging="360"/>
+      </w:pPr>
+      <w:rPr>
+        <w:rFonts w:ascii="Wingdings" w:hAnsi="Wingdings" w:hint="default"/>
+        <w:sz w:val="20"/>
+      </w:rPr>
+    </w:lvl>
+    <w:lvl w:ilvl="5" w:tentative="1">
+      <w:start w:val="1"/>
+      <w:numFmt w:val="bullet"/>
+      <w:lvlText w:val=""/>
+      <w:lvlJc w:val="left"/>
+      <w:pPr>
+        <w:tabs>
+          <w:tab w:val="num" w:pos="4320"/>
+        </w:tabs>
+        <w:ind w:left="4320" w:hanging="360"/>
+      </w:pPr>
+      <w:rPr>
+        <w:rFonts w:ascii="Wingdings" w:hAnsi="Wingdings" w:hint="default"/>
+        <w:sz w:val="20"/>
+      </w:rPr>
+    </w:lvl>
+    <w:lvl w:ilvl="6" w:tentative="1">
+      <w:start w:val="1"/>
+      <w:numFmt w:val="bullet"/>
+      <w:lvlText w:val=""/>
+      <w:lvlJc w:val="left"/>
+      <w:pPr>
+        <w:tabs>
+          <w:tab w:val="num" w:pos="5040"/>
+        </w:tabs>
+        <w:ind w:left="5040" w:hanging="360"/>
+      </w:pPr>
+      <w:rPr>
+        <w:rFonts w:ascii="Wingdings" w:hAnsi="Wingdings" w:hint="default"/>
+        <w:sz w:val="20"/>
+      </w:rPr>
+    </w:lvl>
+    <w:lvl w:ilvl="7" w:tentative="1">
+      <w:start w:val="1"/>
+      <w:numFmt w:val="bullet"/>
+      <w:lvlText w:val=""/>
+      <w:lvlJc w:val="left"/>
+      <w:pPr>
+        <w:tabs>
+          <w:tab w:val="num" w:pos="5760"/>
+        </w:tabs>
+        <w:ind w:left="5760" w:hanging="360"/>
+      </w:pPr>
+      <w:rPr>
+        <w:rFonts w:ascii="Wingdings" w:hAnsi="Wingdings" w:hint="default"/>
+        <w:sz w:val="20"/>
+      </w:rPr>
+    </w:lvl>
+    <w:lvl w:ilvl="8" w:tentative="1">
+      <w:start w:val="1"/>
+      <w:numFmt w:val="bullet"/>
+      <w:lvlText w:val=""/>
+      <w:lvlJc w:val="left"/>
+      <w:pPr>
+        <w:tabs>
+          <w:tab w:val="num" w:pos="6480"/>
+        </w:tabs>
+        <w:ind w:left="6480" w:hanging="360"/>
+      </w:pPr>
+      <w:rPr>
+        <w:rFonts w:ascii="Wingdings" w:hAnsi="Wingdings" w:hint="default"/>
+        <w:sz w:val="20"/>
+      </w:rPr>
+    </w:lvl>
+  </w:abstractNum>
+  <w:abstractNum w:abstractNumId="38" w15:restartNumberingAfterBreak="0">
     <w:nsid w:val="69825E29"/>
     <w:multiLevelType w:val="multilevel"/>
     <w:tmpl w:val="09740A7C"/>
@@ -21088,7 +23801,7 @@
       </w:rPr>
     </w:lvl>
   </w:abstractNum>
-  <w:abstractNum w:abstractNumId="32" w15:restartNumberingAfterBreak="0">
+  <w:abstractNum w:abstractNumId="39" w15:restartNumberingAfterBreak="0">
     <w:nsid w:val="698D2461"/>
     <w:multiLevelType w:val="multilevel"/>
     <w:tmpl w:val="A44C6D10"/>
@@ -21237,7 +23950,7 @@
       </w:rPr>
     </w:lvl>
   </w:abstractNum>
-  <w:abstractNum w:abstractNumId="33" w15:restartNumberingAfterBreak="0">
+  <w:abstractNum w:abstractNumId="40" w15:restartNumberingAfterBreak="0">
     <w:nsid w:val="6F777BBB"/>
     <w:multiLevelType w:val="multilevel"/>
     <w:tmpl w:val="FFB6B6C8"/>
@@ -21386,7 +24099,7 @@
       </w:rPr>
     </w:lvl>
   </w:abstractNum>
-  <w:abstractNum w:abstractNumId="34" w15:restartNumberingAfterBreak="0">
+  <w:abstractNum w:abstractNumId="41" w15:restartNumberingAfterBreak="0">
     <w:nsid w:val="70732DB6"/>
     <w:multiLevelType w:val="multilevel"/>
     <w:tmpl w:val="A9C67EE8"/>
@@ -21499,7 +24212,7 @@
       </w:pPr>
     </w:lvl>
   </w:abstractNum>
-  <w:abstractNum w:abstractNumId="35" w15:restartNumberingAfterBreak="0">
+  <w:abstractNum w:abstractNumId="42" w15:restartNumberingAfterBreak="0">
     <w:nsid w:val="76DE0254"/>
     <w:multiLevelType w:val="multilevel"/>
     <w:tmpl w:val="24FE7538"/>
@@ -21648,7 +24361,7 @@
       </w:rPr>
     </w:lvl>
   </w:abstractNum>
-  <w:abstractNum w:abstractNumId="36" w15:restartNumberingAfterBreak="0">
+  <w:abstractNum w:abstractNumId="43" w15:restartNumberingAfterBreak="0">
     <w:nsid w:val="7C40730E"/>
     <w:multiLevelType w:val="multilevel"/>
     <w:tmpl w:val="4EC44F78"/>
@@ -21761,7 +24474,7 @@
       </w:pPr>
     </w:lvl>
   </w:abstractNum>
-  <w:abstractNum w:abstractNumId="37" w15:restartNumberingAfterBreak="0">
+  <w:abstractNum w:abstractNumId="44" w15:restartNumberingAfterBreak="0">
     <w:nsid w:val="7CCC01C9"/>
     <w:multiLevelType w:val="multilevel"/>
     <w:tmpl w:val="656C6610"/>
@@ -21874,7 +24587,7 @@
       </w:pPr>
     </w:lvl>
   </w:abstractNum>
-  <w:abstractNum w:abstractNumId="38" w15:restartNumberingAfterBreak="0">
+  <w:abstractNum w:abstractNumId="45" w15:restartNumberingAfterBreak="0">
     <w:nsid w:val="7FBA476D"/>
     <w:multiLevelType w:val="multilevel"/>
     <w:tmpl w:val="E5BA9576"/>
@@ -22024,121 +24737,142 @@
     </w:lvl>
   </w:abstractNum>
   <w:num w:numId="1" w16cid:durableId="305085771">
-    <w:abstractNumId w:val="19"/>
+    <w:abstractNumId w:val="24"/>
   </w:num>
   <w:num w:numId="2" w16cid:durableId="581524277">
+    <w:abstractNumId w:val="17"/>
+  </w:num>
+  <w:num w:numId="3" w16cid:durableId="695161013">
+    <w:abstractNumId w:val="31"/>
+  </w:num>
+  <w:num w:numId="4" w16cid:durableId="1966420648">
+    <w:abstractNumId w:val="41"/>
+  </w:num>
+  <w:num w:numId="5" w16cid:durableId="372508527">
+    <w:abstractNumId w:val="36"/>
+  </w:num>
+  <w:num w:numId="6" w16cid:durableId="988827085">
+    <w:abstractNumId w:val="34"/>
+  </w:num>
+  <w:num w:numId="7" w16cid:durableId="260647793">
+    <w:abstractNumId w:val="43"/>
+  </w:num>
+  <w:num w:numId="8" w16cid:durableId="202527156">
+    <w:abstractNumId w:val="3"/>
+  </w:num>
+  <w:num w:numId="9" w16cid:durableId="706218535">
+    <w:abstractNumId w:val="42"/>
+  </w:num>
+  <w:num w:numId="10" w16cid:durableId="734400429">
     <w:abstractNumId w:val="14"/>
   </w:num>
-  <w:num w:numId="3" w16cid:durableId="695161013">
-    <w:abstractNumId w:val="25"/>
+  <w:num w:numId="11" w16cid:durableId="1295868554">
+    <w:abstractNumId w:val="15"/>
   </w:num>
-  <w:num w:numId="4" w16cid:durableId="1966420648">
-    <w:abstractNumId w:val="34"/>
+  <w:num w:numId="12" w16cid:durableId="1047141599">
+    <w:abstractNumId w:val="12"/>
   </w:num>
-  <w:num w:numId="5" w16cid:durableId="372508527">
-    <w:abstractNumId w:val="30"/>
+  <w:num w:numId="13" w16cid:durableId="583732473">
+    <w:abstractNumId w:val="27"/>
   </w:num>
-  <w:num w:numId="6" w16cid:durableId="988827085">
-    <w:abstractNumId w:val="28"/>
+  <w:num w:numId="14" w16cid:durableId="1058015792">
+    <w:abstractNumId w:val="23"/>
   </w:num>
-  <w:num w:numId="7" w16cid:durableId="260647793">
-    <w:abstractNumId w:val="36"/>
-  </w:num>
-  <w:num w:numId="8" w16cid:durableId="202527156">
-    <w:abstractNumId w:val="2"/>
-  </w:num>
-  <w:num w:numId="9" w16cid:durableId="706218535">
-    <w:abstractNumId w:val="35"/>
-  </w:num>
-  <w:num w:numId="10" w16cid:durableId="734400429">
+  <w:num w:numId="15" w16cid:durableId="2020310721">
     <w:abstractNumId w:val="11"/>
   </w:num>
-  <w:num w:numId="11" w16cid:durableId="1295868554">
-    <w:abstractNumId w:val="12"/>
-  </w:num>
-  <w:num w:numId="12" w16cid:durableId="1047141599">
+  <w:num w:numId="16" w16cid:durableId="327368084">
     <w:abstractNumId w:val="9"/>
   </w:num>
-  <w:num w:numId="13" w16cid:durableId="583732473">
-    <w:abstractNumId w:val="21"/>
-  </w:num>
-  <w:num w:numId="14" w16cid:durableId="1058015792">
-    <w:abstractNumId w:val="18"/>
-  </w:num>
-  <w:num w:numId="15" w16cid:durableId="2020310721">
-    <w:abstractNumId w:val="8"/>
-  </w:num>
-  <w:num w:numId="16" w16cid:durableId="327368084">
-    <w:abstractNumId w:val="6"/>
-  </w:num>
   <w:num w:numId="17" w16cid:durableId="34939295">
-    <w:abstractNumId w:val="37"/>
+    <w:abstractNumId w:val="44"/>
   </w:num>
   <w:num w:numId="18" w16cid:durableId="877009161">
     <w:abstractNumId w:val="0"/>
   </w:num>
   <w:num w:numId="19" w16cid:durableId="424228631">
-    <w:abstractNumId w:val="10"/>
+    <w:abstractNumId w:val="13"/>
   </w:num>
   <w:num w:numId="20" w16cid:durableId="1497957781">
-    <w:abstractNumId w:val="16"/>
+    <w:abstractNumId w:val="19"/>
   </w:num>
   <w:num w:numId="21" w16cid:durableId="833765505">
-    <w:abstractNumId w:val="26"/>
+    <w:abstractNumId w:val="32"/>
   </w:num>
   <w:num w:numId="22" w16cid:durableId="995450667">
-    <w:abstractNumId w:val="27"/>
+    <w:abstractNumId w:val="33"/>
   </w:num>
   <w:num w:numId="23" w16cid:durableId="920456383">
-    <w:abstractNumId w:val="29"/>
+    <w:abstractNumId w:val="35"/>
   </w:num>
   <w:num w:numId="24" w16cid:durableId="1360089471">
+    <w:abstractNumId w:val="28"/>
+  </w:num>
+  <w:num w:numId="25" w16cid:durableId="729579019">
     <w:abstractNumId w:val="22"/>
   </w:num>
-  <w:num w:numId="25" w16cid:durableId="729579019">
-    <w:abstractNumId w:val="17"/>
-  </w:num>
   <w:num w:numId="26" w16cid:durableId="1931309371">
-    <w:abstractNumId w:val="3"/>
+    <w:abstractNumId w:val="5"/>
   </w:num>
   <w:num w:numId="27" w16cid:durableId="1216313033">
     <w:abstractNumId w:val="1"/>
   </w:num>
   <w:num w:numId="28" w16cid:durableId="1272282229">
-    <w:abstractNumId w:val="23"/>
+    <w:abstractNumId w:val="29"/>
   </w:num>
   <w:num w:numId="29" w16cid:durableId="1479955780">
-    <w:abstractNumId w:val="31"/>
+    <w:abstractNumId w:val="38"/>
   </w:num>
   <w:num w:numId="30" w16cid:durableId="1095589399">
-    <w:abstractNumId w:val="15"/>
+    <w:abstractNumId w:val="18"/>
   </w:num>
   <w:num w:numId="31" w16cid:durableId="2007399855">
+    <w:abstractNumId w:val="25"/>
+  </w:num>
+  <w:num w:numId="32" w16cid:durableId="627054175">
+    <w:abstractNumId w:val="45"/>
+  </w:num>
+  <w:num w:numId="33" w16cid:durableId="1371758995">
+    <w:abstractNumId w:val="40"/>
+  </w:num>
+  <w:num w:numId="34" w16cid:durableId="614141435">
+    <w:abstractNumId w:val="8"/>
+  </w:num>
+  <w:num w:numId="35" w16cid:durableId="417138005">
+    <w:abstractNumId w:val="10"/>
+  </w:num>
+  <w:num w:numId="36" w16cid:durableId="746461347">
+    <w:abstractNumId w:val="30"/>
+  </w:num>
+  <w:num w:numId="37" w16cid:durableId="1070497016">
+    <w:abstractNumId w:val="39"/>
+  </w:num>
+  <w:num w:numId="38" w16cid:durableId="2007512414">
+    <w:abstractNumId w:val="7"/>
+  </w:num>
+  <w:num w:numId="39" w16cid:durableId="1937399125">
+    <w:abstractNumId w:val="16"/>
+  </w:num>
+  <w:num w:numId="40" w16cid:durableId="815148458">
+    <w:abstractNumId w:val="37"/>
+  </w:num>
+  <w:num w:numId="41" w16cid:durableId="834495547">
+    <w:abstractNumId w:val="6"/>
+  </w:num>
+  <w:num w:numId="42" w16cid:durableId="199172776">
+    <w:abstractNumId w:val="4"/>
+  </w:num>
+  <w:num w:numId="43" w16cid:durableId="529798496">
+    <w:abstractNumId w:val="21"/>
+  </w:num>
+  <w:num w:numId="44" w16cid:durableId="1666202151">
+    <w:abstractNumId w:val="26"/>
+  </w:num>
+  <w:num w:numId="45" w16cid:durableId="356202115">
     <w:abstractNumId w:val="20"/>
   </w:num>
-  <w:num w:numId="32" w16cid:durableId="627054175">
-    <w:abstractNumId w:val="38"/>
-  </w:num>
-  <w:num w:numId="33" w16cid:durableId="1371758995">
-    <w:abstractNumId w:val="33"/>
-  </w:num>
-  <w:num w:numId="34" w16cid:durableId="614141435">
-    <w:abstractNumId w:val="5"/>
-  </w:num>
-  <w:num w:numId="35" w16cid:durableId="417138005">
-    <w:abstractNumId w:val="7"/>
-  </w:num>
-  <w:num w:numId="36" w16cid:durableId="746461347">
-    <w:abstractNumId w:val="24"/>
-  </w:num>
-  <w:num w:numId="37" w16cid:durableId="1070497016">
-    <w:abstractNumId w:val="32"/>
-  </w:num>
-  <w:num w:numId="38" w16cid:durableId="2007512414">
-    <w:abstractNumId w:val="4"/>
-  </w:num>
-  <w:num w:numId="39" w16cid:durableId="1937399125">
-    <w:abstractNumId w:val="13"/>
+  <w:num w:numId="46" w16cid:durableId="509225482">
+    <w:abstractNumId w:val="2"/>
   </w:num>
 </w:numbering>
 </file>
@@ -22746,7 +25480,6 @@
   <w:style w:type="character" w:default="1" w:styleId="DefaultParagraphFont">
     <w:name w:val="Default Paragraph Font"/>
     <w:uiPriority w:val="1"/>
-    <w:semiHidden/>
     <w:unhideWhenUsed/>
   </w:style>
   <w:style w:type="table" w:default="1" w:styleId="TableNormal">

</xml_diff>